<commit_message>
doc and read me updated
</commit_message>
<xml_diff>
--- a/CW_Doc.docx
+++ b/CW_Doc.docx
@@ -8403,7 +8403,13 @@
           <w:rFonts w:ascii="Aptos" w:hAnsi="Aptos" w:cs="Angsana New"/>
         </w:rPr>
         <w:lastRenderedPageBreak/>
-        <w:t>Prediction Scenarios</w:t>
+        <w:t xml:space="preserve">Prediction </w:t>
+      </w:r>
+      <w:r>
+        <w:rPr>
+          <w:rFonts w:ascii="Aptos" w:hAnsi="Aptos" w:cs="Angsana New"/>
+        </w:rPr>
+        <w:t>Types</w:t>
       </w:r>
     </w:p>
     <w:p>
@@ -8440,12 +8446,16 @@
       <w:pPr>
         <w:pStyle w:val="BodyText"/>
         <w:widowControl w:val="0"/>
+        <w:numPr>
+          <w:ilvl w:val="0"/>
+          <w:numId w:val="64"/>
+        </w:numPr>
         <w:tabs>
           <w:tab w:val="left" w:pos="709"/>
         </w:tabs>
         <w:suppressAutoHyphens/>
         <w:rPr>
-          <w:rFonts w:ascii="Aptos" w:hAnsi="Aptos"/>
+          <w:rFonts w:ascii="Aptos" w:hAnsi="Aptos" w:cs="Angsana New"/>
         </w:rPr>
       </w:pPr>
       <w:r>
@@ -8461,18 +8471,201 @@
         </w:rPr>
         <w:t>: For usecases where it does not need realtime for example scoring a database of large number of users overnight for target mailings.</w:t>
       </w:r>
+      <w:r>
+        <w:rPr>
+          <w:rFonts w:ascii="Aptos" w:hAnsi="Aptos" w:cs="Angsana New"/>
+        </w:rPr>
+        <w:t>API Tes</w:t>
+      </w:r>
+      <w:r>
+        <w:rPr>
+          <w:rFonts w:ascii="Aptos" w:hAnsi="Aptos" w:cs="Angsana New"/>
+        </w:rPr>
+        <w:t>ts</w:t>
+      </w:r>
+    </w:p>
+    <w:p>
+      <w:pPr>
+        <w:pStyle w:val="BodyText"/>
+      </w:pPr>
+      <w:r>
+        <w:t>We have implemented a test suites for api validations whech is meant to local and CI level execution.</w:t>
+      </w:r>
+    </w:p>
+    <w:p>
+      <w:pPr>
+        <w:pStyle w:val="BodyText"/>
+      </w:pPr>
+      <w:r>
+        <w:t>Currently It has Following Verification cases and figure 13 depicts the test cases.</w:t>
+      </w:r>
+    </w:p>
+    <w:p>
+      <w:pPr>
+        <w:pStyle w:val="BodyText"/>
+        <w:numPr>
+          <w:ilvl w:val="0"/>
+          <w:numId w:val="76"/>
+        </w:numPr>
+        <w:ind w:left="709"/>
+      </w:pPr>
+      <w:r>
+        <w:t>Single Prediction (Low</w:t>
+      </w:r>
+      <w:r>
+        <w:t xml:space="preserve"> </w:t>
+      </w:r>
+      <w:r>
+        <w:t>Income)</w:t>
+      </w:r>
+      <w:r>
+        <w:t>: Young person with with no capital gains</w:t>
+      </w:r>
+    </w:p>
+    <w:p>
+      <w:pPr>
+        <w:pStyle w:val="BodyText"/>
+        <w:numPr>
+          <w:ilvl w:val="0"/>
+          <w:numId w:val="76"/>
+        </w:numPr>
+        <w:ind w:left="709"/>
+      </w:pPr>
+      <w:r>
+        <w:t>Single Prediction (</w:t>
+      </w:r>
+      <w:r>
+        <w:t xml:space="preserve">High </w:t>
+      </w:r>
+      <w:r>
+        <w:t>Income)</w:t>
+      </w:r>
+      <w:r>
+        <w:t>:</w:t>
+      </w:r>
+      <w:r>
+        <w:t xml:space="preserve"> Professional with good capital gain and Master level education</w:t>
+      </w:r>
+    </w:p>
+    <w:p>
+      <w:pPr>
+        <w:pStyle w:val="BodyText"/>
+        <w:numPr>
+          <w:ilvl w:val="0"/>
+          <w:numId w:val="76"/>
+        </w:numPr>
+        <w:ind w:left="709"/>
+      </w:pPr>
+      <w:r>
+        <w:t>Batch Prediction: Send profiels as batch array for verification</w:t>
+      </w:r>
     </w:p>
     <w:p>
       <w:pPr>
         <w:pStyle w:val="BodyText"/>
         <w:widowControl w:val="0"/>
+        <w:suppressAutoHyphens/>
+        <w:rPr>
+          <w:rFonts w:ascii="Aptos" w:hAnsi="Aptos"/>
+        </w:rPr>
+      </w:pPr>
+    </w:p>
+    <w:p>
+      <w:pPr>
+        <w:pStyle w:val="BodyText"/>
+        <w:widowControl w:val="0"/>
         <w:tabs>
           <w:tab w:val="left" w:pos="709"/>
         </w:tabs>
         <w:suppressAutoHyphens/>
-        <w:rPr>
-          <w:rFonts w:ascii="Aptos" w:hAnsi="Aptos" w:cs="Angsana New"/>
-        </w:rPr>
+        <w:jc w:val="center"/>
+        <w:rPr>
+          <w:rFonts w:ascii="Aptos" w:hAnsi="Aptos"/>
+        </w:rPr>
+      </w:pPr>
+      <w:r>
+        <w:rPr>
+          <w:rFonts w:ascii="Aptos" w:hAnsi="Aptos"/>
+        </w:rPr>
+        <w:drawing>
+          <wp:inline distT="0" distB="0" distL="0" distR="0" wp14:anchorId="3BEC5FC4" wp14:editId="7622B60B">
+            <wp:extent cx="2577056" cy="4481168"/>
+            <wp:effectExtent l="0" t="0" r="1270" b="2540"/>
+            <wp:docPr id="1029005242" name="Picture 1" descr="A screen shot of a computer screen&#10;&#10;AI-generated content may be incorrect."/>
+            <wp:cNvGraphicFramePr>
+              <a:graphicFrameLocks xmlns:a="http://schemas.openxmlformats.org/drawingml/2006/main" noChangeAspect="1"/>
+            </wp:cNvGraphicFramePr>
+            <a:graphic xmlns:a="http://schemas.openxmlformats.org/drawingml/2006/main">
+              <a:graphicData uri="http://schemas.openxmlformats.org/drawingml/2006/picture">
+                <pic:pic xmlns:pic="http://schemas.openxmlformats.org/drawingml/2006/picture">
+                  <pic:nvPicPr>
+                    <pic:cNvPr id="1029005242" name="Picture 1" descr="A screen shot of a computer screen&#10;&#10;AI-generated content may be incorrect."/>
+                    <pic:cNvPicPr/>
+                  </pic:nvPicPr>
+                  <pic:blipFill>
+                    <a:blip r:embed="rId18"/>
+                    <a:stretch>
+                      <a:fillRect/>
+                    </a:stretch>
+                  </pic:blipFill>
+                  <pic:spPr>
+                    <a:xfrm>
+                      <a:off x="0" y="0"/>
+                      <a:ext cx="2607877" cy="4534761"/>
+                    </a:xfrm>
+                    <a:prstGeom prst="rect">
+                      <a:avLst/>
+                    </a:prstGeom>
+                  </pic:spPr>
+                </pic:pic>
+              </a:graphicData>
+            </a:graphic>
+          </wp:inline>
+        </w:drawing>
+      </w:r>
+    </w:p>
+    <w:p>
+      <w:pPr>
+        <w:pStyle w:val="BodyText"/>
+        <w:widowControl w:val="0"/>
+        <w:tabs>
+          <w:tab w:val="left" w:pos="709"/>
+        </w:tabs>
+        <w:suppressAutoHyphens/>
+        <w:jc w:val="center"/>
+        <w:rPr>
+          <w:rFonts w:ascii="Aptos" w:hAnsi="Aptos"/>
+        </w:rPr>
+      </w:pPr>
+      <w:r>
+        <w:rPr>
+          <w:rFonts w:ascii="Aptos" w:hAnsi="Aptos" w:cs="Angsana New"/>
+          <w:sz w:val="20"/>
+          <w:szCs w:val="20"/>
+        </w:rPr>
+        <w:t>Figure 1</w:t>
+      </w:r>
+      <w:r>
+        <w:rPr>
+          <w:rFonts w:ascii="Aptos" w:hAnsi="Aptos" w:cs="Angsana New"/>
+          <w:sz w:val="20"/>
+          <w:szCs w:val="20"/>
+        </w:rPr>
+        <w:t xml:space="preserve">3: </w:t>
+      </w:r>
+      <w:r>
+        <w:rPr>
+          <w:rFonts w:ascii="Aptos" w:hAnsi="Aptos" w:cs="Angsana New"/>
+          <w:sz w:val="20"/>
+          <w:szCs w:val="20"/>
+        </w:rPr>
+        <w:t xml:space="preserve">Test Suite </w:t>
+      </w:r>
+    </w:p>
+    <w:p>
+      <w:pPr>
+        <w:pStyle w:val="BodyText"/>
+        <w:ind w:left="709"/>
       </w:pPr>
     </w:p>
     <w:p>
@@ -8490,6 +8683,7 @@
         <w:rPr>
           <w:rFonts w:ascii="Aptos" w:hAnsi="Aptos" w:cs="Angsana New"/>
         </w:rPr>
+        <w:lastRenderedPageBreak/>
         <w:t>Clean Architecture &amp; Dependency Injection Implementation</w:t>
       </w:r>
     </w:p>
@@ -8656,7 +8850,19 @@
         <w:rPr>
           <w:rFonts w:ascii="Aptos" w:hAnsi="Aptos"/>
         </w:rPr>
-        <w:t>: IncomePredictionUseCase depicted in figure 13 below.</w:t>
+        <w:t>: IncomePredictionUseCase depicted in figure 1</w:t>
+      </w:r>
+      <w:r>
+        <w:rPr>
+          <w:rFonts w:ascii="Aptos" w:hAnsi="Aptos"/>
+        </w:rPr>
+        <w:t>4</w:t>
+      </w:r>
+      <w:r>
+        <w:rPr>
+          <w:rFonts w:ascii="Aptos" w:hAnsi="Aptos"/>
+        </w:rPr>
+        <w:t xml:space="preserve"> below.</w:t>
       </w:r>
     </w:p>
     <w:p>
@@ -8796,7 +9002,19 @@
         <w:rPr>
           <w:rFonts w:ascii="Aptos" w:hAnsi="Aptos"/>
         </w:rPr>
-        <w:t>: Implements the concrete API routing and controller logic by satisfying the IApiServer interface (ApiServerImp) Figure 14 below depcits ApiServer implmentation.</w:t>
+        <w:t>: Implements the concrete API routing and controller logic by satisfying the IApiServer interface (ApiServerImp) Figure 1</w:t>
+      </w:r>
+      <w:r>
+        <w:rPr>
+          <w:rFonts w:ascii="Aptos" w:hAnsi="Aptos"/>
+        </w:rPr>
+        <w:t>5</w:t>
+      </w:r>
+      <w:r>
+        <w:rPr>
+          <w:rFonts w:ascii="Aptos" w:hAnsi="Aptos"/>
+        </w:rPr>
+        <w:t xml:space="preserve"> below depcits ApiServer implmentation.</w:t>
       </w:r>
     </w:p>
     <w:p>
@@ -8847,7 +9065,7 @@
                     <pic:cNvPicPr/>
                   </pic:nvPicPr>
                   <pic:blipFill>
-                    <a:blip r:embed="rId18"/>
+                    <a:blip r:embed="rId19"/>
                     <a:stretch>
                       <a:fillRect/>
                     </a:stretch>
@@ -8889,7 +9107,23 @@
           <w:sz w:val="20"/>
           <w:szCs w:val="20"/>
         </w:rPr>
-        <w:t xml:space="preserve">Figure 13: </w:t>
+        <w:t>Figure 1</w:t>
+      </w:r>
+      <w:r>
+        <w:rPr>
+          <w:rFonts w:ascii="Aptos" w:hAnsi="Aptos" w:cs="Angsana New"/>
+          <w:sz w:val="20"/>
+          <w:szCs w:val="20"/>
+        </w:rPr>
+        <w:t>4</w:t>
+      </w:r>
+      <w:r>
+        <w:rPr>
+          <w:rFonts w:ascii="Aptos" w:hAnsi="Aptos" w:cs="Angsana New"/>
+          <w:sz w:val="20"/>
+          <w:szCs w:val="20"/>
+        </w:rPr>
+        <w:t xml:space="preserve">: </w:t>
       </w:r>
       <w:r>
         <w:rPr>
@@ -8934,7 +9168,7 @@
                     <pic:cNvPicPr/>
                   </pic:nvPicPr>
                   <pic:blipFill>
-                    <a:blip r:embed="rId19"/>
+                    <a:blip r:embed="rId20"/>
                     <a:stretch>
                       <a:fillRect/>
                     </a:stretch>
@@ -8976,7 +9210,23 @@
           <w:sz w:val="20"/>
           <w:szCs w:val="20"/>
         </w:rPr>
-        <w:t xml:space="preserve">Figure 14: </w:t>
+        <w:t>Figure 1</w:t>
+      </w:r>
+      <w:r>
+        <w:rPr>
+          <w:rFonts w:ascii="Aptos" w:hAnsi="Aptos" w:cs="Angsana New"/>
+          <w:sz w:val="20"/>
+          <w:szCs w:val="20"/>
+        </w:rPr>
+        <w:t>5</w:t>
+      </w:r>
+      <w:r>
+        <w:rPr>
+          <w:rFonts w:ascii="Aptos" w:hAnsi="Aptos" w:cs="Angsana New"/>
+          <w:sz w:val="20"/>
+          <w:szCs w:val="20"/>
+        </w:rPr>
+        <w:t xml:space="preserve">: </w:t>
       </w:r>
       <w:r>
         <w:rPr>
@@ -9063,7 +9313,13 @@
         <w:rPr>
           <w:rFonts w:ascii="Aptos" w:hAnsi="Aptos"/>
         </w:rPr>
-        <w:t>depicted in figure 15</w:t>
+        <w:t>depicted in figure 1</w:t>
+      </w:r>
+      <w:r>
+        <w:rPr>
+          <w:rFonts w:ascii="Aptos" w:hAnsi="Aptos"/>
+        </w:rPr>
+        <w:t>6</w:t>
       </w:r>
     </w:p>
     <w:p>
@@ -9154,7 +9410,7 @@
                     <pic:cNvPicPr/>
                   </pic:nvPicPr>
                   <pic:blipFill>
-                    <a:blip r:embed="rId20"/>
+                    <a:blip r:embed="rId21"/>
                     <a:stretch>
                       <a:fillRect/>
                     </a:stretch>
@@ -9191,7 +9447,23 @@
           <w:sz w:val="20"/>
           <w:szCs w:val="20"/>
         </w:rPr>
-        <w:t>Figure 15: Dependency Injection Container</w:t>
+        <w:t>Figure 1</w:t>
+      </w:r>
+      <w:r>
+        <w:rPr>
+          <w:rFonts w:ascii="Aptos" w:hAnsi="Aptos" w:cs="Angsana New"/>
+          <w:sz w:val="20"/>
+          <w:szCs w:val="20"/>
+        </w:rPr>
+        <w:t>6</w:t>
+      </w:r>
+      <w:r>
+        <w:rPr>
+          <w:rFonts w:ascii="Aptos" w:hAnsi="Aptos" w:cs="Angsana New"/>
+          <w:sz w:val="20"/>
+          <w:szCs w:val="20"/>
+        </w:rPr>
+        <w:t>: Dependency Injection Container</w:t>
       </w:r>
     </w:p>
     <w:p>
@@ -9364,7 +9636,13 @@
         <w:rPr>
           <w:rFonts w:ascii="Aptos" w:hAnsi="Aptos"/>
         </w:rPr>
-        <w:t xml:space="preserve"> as depicted in figure 16</w:t>
+        <w:t xml:space="preserve"> as depicted in figure 1</w:t>
+      </w:r>
+      <w:r>
+        <w:rPr>
+          <w:rFonts w:ascii="Aptos" w:hAnsi="Aptos"/>
+        </w:rPr>
+        <w:t>7</w:t>
       </w:r>
     </w:p>
     <w:p>
@@ -9386,9 +9664,9 @@
           <w:noProof/>
         </w:rPr>
         <w:drawing>
-          <wp:inline distT="0" distB="0" distL="0" distR="0" wp14:anchorId="718BFDCC" wp14:editId="57EFB9AC">
-            <wp:extent cx="3873500" cy="1651000"/>
-            <wp:effectExtent l="0" t="0" r="0" b="0"/>
+          <wp:inline distT="0" distB="0" distL="0" distR="0" wp14:anchorId="718BFDCC" wp14:editId="7E9024FC">
+            <wp:extent cx="3603156" cy="1535771"/>
+            <wp:effectExtent l="0" t="0" r="3810" b="1270"/>
             <wp:docPr id="225841718" name="Picture 3" descr="A screenshot of a computer&#10;&#10;AI-generated content may be incorrect."/>
             <wp:cNvGraphicFramePr>
               <a:graphicFrameLocks xmlns:a="http://schemas.openxmlformats.org/drawingml/2006/main" noChangeAspect="1"/>
@@ -9401,7 +9679,7 @@
                     <pic:cNvPicPr/>
                   </pic:nvPicPr>
                   <pic:blipFill>
-                    <a:blip r:embed="rId21">
+                    <a:blip r:embed="rId22">
                       <a:extLst>
                         <a:ext uri="{28A0092B-C50C-407E-A947-70E740481C1C}">
                           <a14:useLocalDpi xmlns:a14="http://schemas.microsoft.com/office/drawing/2010/main" val="0"/>
@@ -9415,7 +9693,7 @@
                   <pic:spPr>
                     <a:xfrm>
                       <a:off x="0" y="0"/>
-                      <a:ext cx="3873500" cy="1651000"/>
+                      <a:ext cx="3618447" cy="1542288"/>
                     </a:xfrm>
                     <a:prstGeom prst="rect">
                       <a:avLst/>
@@ -9449,8 +9727,23 @@
           <w:sz w:val="20"/>
           <w:szCs w:val="20"/>
         </w:rPr>
-        <w:lastRenderedPageBreak/>
-        <w:t>Figure 16: Pointer file(xgboost_model.joblib.dvc) created for XGBost classifier model</w:t>
+        <w:t>Figure 1</w:t>
+      </w:r>
+      <w:r>
+        <w:rPr>
+          <w:rFonts w:ascii="Aptos" w:hAnsi="Aptos"/>
+          <w:sz w:val="20"/>
+          <w:szCs w:val="20"/>
+        </w:rPr>
+        <w:t>7</w:t>
+      </w:r>
+      <w:r>
+        <w:rPr>
+          <w:rFonts w:ascii="Aptos" w:hAnsi="Aptos"/>
+          <w:sz w:val="20"/>
+          <w:szCs w:val="20"/>
+        </w:rPr>
+        <w:t>: Pointer file(xgboost_model.joblib.dvc) created for XGBost classifier model</w:t>
       </w:r>
     </w:p>
     <w:p>
@@ -9473,6 +9766,7 @@
         <w:rPr>
           <w:rFonts w:ascii="Aptos" w:hAnsi="Aptos"/>
         </w:rPr>
+        <w:lastRenderedPageBreak/>
         <w:t xml:space="preserve">The .dvc file </w:t>
       </w:r>
       <w:r>
@@ -9631,6 +9925,12 @@
           <w:rFonts w:ascii="Aptos" w:hAnsi="Aptos"/>
         </w:rPr>
         <w:t xml:space="preserve"> model tracking. It adds the model to DVCand pushes the binary artifact to the remote storage.</w:t>
+      </w:r>
+      <w:r>
+        <w:rPr>
+          <w:rFonts w:ascii="Aptos" w:hAnsi="Aptos"/>
+        </w:rPr>
+        <w:t xml:space="preserve"> Figure 18 depctis the logic written in python.</w:t>
       </w:r>
     </w:p>
     <w:p>
@@ -9670,7 +9970,7 @@
                     <pic:cNvPicPr/>
                   </pic:nvPicPr>
                   <pic:blipFill>
-                    <a:blip r:embed="rId22"/>
+                    <a:blip r:embed="rId23"/>
                     <a:stretch>
                       <a:fillRect/>
                     </a:stretch>
@@ -9712,7 +10012,23 @@
           <w:sz w:val="20"/>
           <w:szCs w:val="20"/>
         </w:rPr>
-        <w:t>Figure 17: Publishing model to defined storage</w:t>
+        <w:t>Figure 1</w:t>
+      </w:r>
+      <w:r>
+        <w:rPr>
+          <w:rFonts w:ascii="Aptos" w:hAnsi="Aptos"/>
+          <w:sz w:val="20"/>
+          <w:szCs w:val="20"/>
+        </w:rPr>
+        <w:t>8</w:t>
+      </w:r>
+      <w:r>
+        <w:rPr>
+          <w:rFonts w:ascii="Aptos" w:hAnsi="Aptos"/>
+          <w:sz w:val="20"/>
+          <w:szCs w:val="20"/>
+        </w:rPr>
+        <w:t>: Publishing model to defined storage</w:t>
       </w:r>
     </w:p>
     <w:p>
@@ -9844,7 +10160,35 @@
           <w:rFonts w:ascii="Aptos" w:hAnsi="Aptos"/>
           <w:bCs/>
         </w:rPr>
-        <w:t xml:space="preserve"> as depcited in Figure 18 and 19 below.</w:t>
+        <w:t xml:space="preserve"> as depcited in Figure 1</w:t>
+      </w:r>
+      <w:r>
+        <w:rPr>
+          <w:rFonts w:ascii="Aptos" w:hAnsi="Aptos"/>
+          <w:bCs/>
+        </w:rPr>
+        <w:t>9</w:t>
+      </w:r>
+      <w:r>
+        <w:rPr>
+          <w:rFonts w:ascii="Aptos" w:hAnsi="Aptos"/>
+          <w:bCs/>
+        </w:rPr>
+        <w:t xml:space="preserve"> </w:t>
+      </w:r>
+      <w:r>
+        <w:rPr>
+          <w:rFonts w:ascii="Aptos" w:hAnsi="Aptos"/>
+          <w:bCs/>
+        </w:rPr>
+        <w:t>and b</w:t>
+      </w:r>
+      <w:r>
+        <w:rPr>
+          <w:rFonts w:ascii="Aptos" w:hAnsi="Aptos"/>
+          <w:bCs/>
+        </w:rPr>
+        <w:t>below.</w:t>
       </w:r>
     </w:p>
     <w:p>
@@ -9883,7 +10227,7 @@
                     <pic:cNvPicPr/>
                   </pic:nvPicPr>
                   <pic:blipFill>
-                    <a:blip r:embed="rId23">
+                    <a:blip r:embed="rId24">
                       <a:extLst>
                         <a:ext uri="{28A0092B-C50C-407E-A947-70E740481C1C}">
                           <a14:useLocalDpi xmlns:a14="http://schemas.microsoft.com/office/drawing/2010/main" val="0"/>
@@ -9930,7 +10274,21 @@
           <w:sz w:val="20"/>
           <w:szCs w:val="20"/>
         </w:rPr>
-        <w:t xml:space="preserve">Figure 18 : </w:t>
+        <w:t>Figure 1</w:t>
+      </w:r>
+      <w:r>
+        <w:rPr>
+          <w:sz w:val="20"/>
+          <w:szCs w:val="20"/>
+        </w:rPr>
+        <w:t>9a</w:t>
+      </w:r>
+      <w:r>
+        <w:rPr>
+          <w:sz w:val="20"/>
+          <w:szCs w:val="20"/>
+        </w:rPr>
+        <w:t xml:space="preserve"> : </w:t>
       </w:r>
       <w:r>
         <w:rPr>
@@ -9958,6 +10316,7 @@
       <w:r>
         <w:rPr>
           <w:rFonts w:ascii="Aptos" w:hAnsi="Aptos" w:cs="Courier New"/>
+          <w:noProof/>
           <w:color w:val="92D050"/>
         </w:rPr>
         <w:lastRenderedPageBreak/>
@@ -9977,7 +10336,7 @@
                     <pic:cNvPicPr/>
                   </pic:nvPicPr>
                   <pic:blipFill>
-                    <a:blip r:embed="rId24"/>
+                    <a:blip r:embed="rId25"/>
                     <a:stretch>
                       <a:fillRect/>
                     </a:stretch>
@@ -10025,27 +10384,34 @@
           <w:sz w:val="20"/>
           <w:szCs w:val="20"/>
         </w:rPr>
-        <w:t xml:space="preserve"> : Load m</w:t>
+        <w:t>b</w:t>
       </w:r>
       <w:r>
         <w:rPr>
           <w:sz w:val="20"/>
           <w:szCs w:val="20"/>
         </w:rPr>
-        <w:t xml:space="preserve">odel </w:t>
+        <w:t xml:space="preserve"> : Load m</w:t>
       </w:r>
       <w:r>
         <w:rPr>
           <w:sz w:val="20"/>
           <w:szCs w:val="20"/>
         </w:rPr>
-        <w:t>from DVC storage</w:t>
+        <w:t xml:space="preserve">odel </w:t>
       </w:r>
       <w:r>
         <w:rPr>
           <w:sz w:val="20"/>
           <w:szCs w:val="20"/>
         </w:rPr>
+        <w:t>from DVC storage</w:t>
+      </w:r>
+      <w:r>
+        <w:rPr>
+          <w:sz w:val="20"/>
+          <w:szCs w:val="20"/>
+        </w:rPr>
         <w:t xml:space="preserve"> specifying git tag as the version</w:t>
       </w:r>
     </w:p>
@@ -10056,6 +10422,110 @@
           <w:rFonts w:ascii="Aptos" w:hAnsi="Aptos" w:cs="Angsana New"/>
         </w:rPr>
       </w:pPr>
+    </w:p>
+    <w:p>
+      <w:pPr>
+        <w:pStyle w:val="Heading3"/>
+        <w:numPr>
+          <w:ilvl w:val="0"/>
+          <w:numId w:val="0"/>
+        </w:numPr>
+        <w:rPr>
+          <w:rFonts w:ascii="Aptos" w:hAnsi="Aptos" w:cs="Angsana New"/>
+        </w:rPr>
+      </w:pPr>
+      <w:r>
+        <w:rPr>
+          <w:rFonts w:ascii="Aptos" w:hAnsi="Aptos" w:cs="Angsana New"/>
+        </w:rPr>
+        <w:t>Continuous Integration and Continuous Deployment (CI/CD</w:t>
+      </w:r>
+      <w:r>
+        <w:rPr>
+          <w:rFonts w:ascii="Aptos" w:hAnsi="Aptos" w:cs="Angsana New"/>
+        </w:rPr>
+        <w:t>)</w:t>
+      </w:r>
+    </w:p>
+    <w:p>
+      <w:pPr>
+        <w:pStyle w:val="BodyText"/>
+        <w:rPr>
+          <w:rFonts w:ascii="Aptos" w:hAnsi="Aptos" w:cs="Angsana New"/>
+        </w:rPr>
+      </w:pPr>
+      <w:r>
+        <w:rPr>
+          <w:rFonts w:ascii="Aptos" w:hAnsi="Aptos" w:cs="Angsana New"/>
+        </w:rPr>
+        <w:t>We use Buildkite for CI/CD workflows. Figure 20 depicts buildkite steps configuration yaml.</w:t>
+      </w:r>
+    </w:p>
+    <w:p>
+      <w:pPr>
+        <w:pStyle w:val="BodyText"/>
+        <w:numPr>
+          <w:ilvl w:val="0"/>
+          <w:numId w:val="73"/>
+        </w:numPr>
+        <w:rPr>
+          <w:rFonts w:ascii="Aptos" w:hAnsi="Aptos" w:cs="Angsana New"/>
+        </w:rPr>
+      </w:pPr>
+      <w:r>
+        <w:rPr>
+          <w:b/>
+        </w:rPr>
+        <w:t>Continuous Integration</w:t>
+      </w:r>
+      <w:r>
+        <w:rPr>
+          <w:b/>
+        </w:rPr>
+        <w:t xml:space="preserve">: </w:t>
+      </w:r>
+      <w:r>
+        <w:rPr>
+          <w:bCs/>
+        </w:rPr>
+        <w:t>For every Pull Request to git, buildkite triggers the static and unit tests step</w:t>
+      </w:r>
+    </w:p>
+    <w:p>
+      <w:pPr>
+        <w:pStyle w:val="BodyText"/>
+        <w:numPr>
+          <w:ilvl w:val="0"/>
+          <w:numId w:val="73"/>
+        </w:numPr>
+        <w:rPr>
+          <w:rFonts w:ascii="Aptos" w:hAnsi="Aptos" w:cs="Angsana New"/>
+        </w:rPr>
+      </w:pPr>
+      <w:r>
+        <w:rPr>
+          <w:b/>
+        </w:rPr>
+        <w:t>Continuous Deployment</w:t>
+      </w:r>
+      <w:r>
+        <w:rPr>
+          <w:b/>
+        </w:rPr>
+        <w:t xml:space="preserve">: </w:t>
+      </w:r>
+      <w:r>
+        <w:t xml:space="preserve">Once the testing step passes </w:t>
+      </w:r>
+      <w:r>
+        <w:t>b</w:t>
+      </w:r>
+      <w:r>
+        <w:t>uildkite executes the build step</w:t>
+      </w:r>
+      <w:r>
+        <w:t>. Maintain release branch filterting to execute these stsps.</w:t>
+      </w:r>
     </w:p>
     <w:p>
       <w:pPr>
@@ -10065,2204 +10535,232 @@
           <w:rFonts w:ascii="Aptos" w:hAnsi="Aptos" w:cs="Angsana New"/>
         </w:rPr>
       </w:pPr>
+      <w:r>
+        <w:rPr>
+          <w:rFonts w:ascii="Aptos" w:hAnsi="Aptos" w:cs="Angsana New"/>
+        </w:rPr>
+        <w:drawing>
+          <wp:inline distT="0" distB="0" distL="0" distR="0" wp14:anchorId="167604CD" wp14:editId="3F914C6B">
+            <wp:extent cx="5144621" cy="4055165"/>
+            <wp:effectExtent l="0" t="0" r="0" b="0"/>
+            <wp:docPr id="978657955" name="Picture 1" descr="A screen shot of a computer program&#10;&#10;AI-generated content may be incorrect."/>
+            <wp:cNvGraphicFramePr>
+              <a:graphicFrameLocks xmlns:a="http://schemas.openxmlformats.org/drawingml/2006/main" noChangeAspect="1"/>
+            </wp:cNvGraphicFramePr>
+            <a:graphic xmlns:a="http://schemas.openxmlformats.org/drawingml/2006/main">
+              <a:graphicData uri="http://schemas.openxmlformats.org/drawingml/2006/picture">
+                <pic:pic xmlns:pic="http://schemas.openxmlformats.org/drawingml/2006/picture">
+                  <pic:nvPicPr>
+                    <pic:cNvPr id="978657955" name="Picture 1" descr="A screen shot of a computer program&#10;&#10;AI-generated content may be incorrect."/>
+                    <pic:cNvPicPr/>
+                  </pic:nvPicPr>
+                  <pic:blipFill>
+                    <a:blip r:embed="rId26"/>
+                    <a:stretch>
+                      <a:fillRect/>
+                    </a:stretch>
+                  </pic:blipFill>
+                  <pic:spPr>
+                    <a:xfrm>
+                      <a:off x="0" y="0"/>
+                      <a:ext cx="5225719" cy="4119089"/>
+                    </a:xfrm>
+                    <a:prstGeom prst="rect">
+                      <a:avLst/>
+                    </a:prstGeom>
+                  </pic:spPr>
+                </pic:pic>
+              </a:graphicData>
+            </a:graphic>
+          </wp:inline>
+        </w:drawing>
+      </w:r>
     </w:p>
     <w:p>
       <w:pPr>
         <w:pStyle w:val="BodyText"/>
-        <w:rPr>
-          <w:rFonts w:ascii="Aptos" w:hAnsi="Aptos" w:cs="Angsana New"/>
-        </w:rPr>
-      </w:pPr>
-    </w:p>
-    <w:p>
-      <w:pPr>
-        <w:pStyle w:val="BodyText"/>
-        <w:rPr>
-          <w:rFonts w:ascii="Aptos" w:hAnsi="Aptos" w:cs="Angsana New"/>
-        </w:rPr>
-      </w:pPr>
-    </w:p>
-    <w:p>
-      <w:pPr>
-        <w:pStyle w:val="BodyText"/>
-        <w:rPr>
-          <w:rFonts w:ascii="Aptos" w:hAnsi="Aptos" w:cs="Angsana New"/>
-        </w:rPr>
-      </w:pPr>
-    </w:p>
-    <w:p>
-      <w:pPr>
-        <w:pStyle w:val="BodyText"/>
-        <w:rPr>
-          <w:rFonts w:ascii="Aptos" w:hAnsi="Aptos" w:cs="Angsana New"/>
-        </w:rPr>
-      </w:pPr>
-    </w:p>
-    <w:p>
-      <w:pPr>
-        <w:pStyle w:val="BodyText"/>
-        <w:rPr>
-          <w:rFonts w:ascii="Aptos" w:hAnsi="Aptos" w:cs="Angsana New"/>
-        </w:rPr>
-      </w:pPr>
-      <w:r>
-        <w:rPr>
-          <w:rFonts w:ascii="Aptos" w:hAnsi="Aptos" w:cs="Angsana New"/>
-        </w:rPr>
-        <w:t xml:space="preserve">New model publising on CI server </w:t>
-      </w:r>
-      <w:r>
-        <w:rPr>
-          <w:rFonts w:ascii="Aptos" w:hAnsi="Aptos" w:cs="Angsana New"/>
-        </w:rPr>
-        <w:br/>
-      </w:r>
-      <w:r>
-        <w:rPr>
-          <w:rFonts w:ascii="Aptos" w:hAnsi="Aptos" w:cs="Angsana New"/>
-        </w:rPr>
-        <w:br/>
-        <w:t>1. Push commits and create release branch</w:t>
-      </w:r>
-    </w:p>
-    <w:p>
-      <w:pPr>
-        <w:pStyle w:val="BodyText"/>
-        <w:rPr>
-          <w:rFonts w:ascii="Aptos" w:hAnsi="Aptos" w:cs="Angsana New"/>
-        </w:rPr>
-      </w:pPr>
-      <w:r>
-        <w:rPr>
-          <w:rFonts w:ascii="Aptos" w:hAnsi="Aptos" w:cs="Angsana New"/>
-        </w:rPr>
-        <w:t>Train model</w:t>
-      </w:r>
-    </w:p>
-    <w:p>
-      <w:pPr>
-        <w:pStyle w:val="BodyText"/>
-        <w:rPr>
-          <w:rFonts w:ascii="Aptos" w:hAnsi="Aptos" w:cs="Angsana New"/>
-        </w:rPr>
-      </w:pPr>
-      <w:r>
-        <w:rPr>
-          <w:rStyle w:val="mtk10"/>
-          <w:rFonts w:ascii="Aptos" w:hAnsi="Aptos" w:cs="Angsana New"/>
-          <w:color w:val="9CDCFE"/>
-          <w:sz w:val="17"/>
-          <w:szCs w:val="17"/>
-          <w:bdr w:val="single" w:sz="2" w:space="0" w:color="auto" w:frame="1"/>
-        </w:rPr>
-        <w:t>PYTHONPATH</w:t>
-      </w:r>
-      <w:r>
-        <w:rPr>
-          <w:rStyle w:val="mtk3"/>
-          <w:rFonts w:ascii="Aptos" w:hAnsi="Aptos" w:cs="Angsana New"/>
-          <w:color w:val="D4D4D4"/>
-          <w:sz w:val="17"/>
-          <w:szCs w:val="17"/>
-          <w:bdr w:val="single" w:sz="2" w:space="0" w:color="auto" w:frame="1"/>
-        </w:rPr>
-        <w:t>=</w:t>
-      </w:r>
-      <w:r>
-        <w:rPr>
-          <w:rStyle w:val="mtk12"/>
-          <w:rFonts w:ascii="Aptos" w:hAnsi="Aptos" w:cs="Angsana New"/>
-          <w:color w:val="CE9178"/>
-          <w:sz w:val="17"/>
-          <w:szCs w:val="17"/>
-          <w:bdr w:val="single" w:sz="2" w:space="0" w:color="auto" w:frame="1"/>
-        </w:rPr>
-        <w:t>Q1/src</w:t>
-      </w:r>
-      <w:r>
-        <w:rPr>
-          <w:rStyle w:val="mtk1"/>
-          <w:rFonts w:ascii="Aptos" w:hAnsi="Aptos" w:cs="Angsana New"/>
-          <w:color w:val="CCCCCC"/>
-          <w:sz w:val="17"/>
-          <w:szCs w:val="17"/>
-          <w:bdr w:val="single" w:sz="2" w:space="0" w:color="auto" w:frame="1"/>
-        </w:rPr>
-        <w:t xml:space="preserve"> </w:t>
-      </w:r>
-      <w:r>
-        <w:rPr>
-          <w:rStyle w:val="mtk16"/>
-          <w:rFonts w:ascii="Aptos" w:hAnsi="Aptos" w:cs="Angsana New"/>
-          <w:color w:val="DCDCAA"/>
-          <w:sz w:val="17"/>
-          <w:szCs w:val="17"/>
-          <w:bdr w:val="single" w:sz="2" w:space="0" w:color="auto" w:frame="1"/>
-        </w:rPr>
-        <w:t>./.venv/bin/python</w:t>
-      </w:r>
-      <w:r>
-        <w:rPr>
-          <w:rStyle w:val="mtk1"/>
-          <w:rFonts w:ascii="Aptos" w:hAnsi="Aptos" w:cs="Angsana New"/>
-          <w:color w:val="CCCCCC"/>
-          <w:sz w:val="17"/>
-          <w:szCs w:val="17"/>
-          <w:bdr w:val="single" w:sz="2" w:space="0" w:color="auto" w:frame="1"/>
-        </w:rPr>
-        <w:t xml:space="preserve"> </w:t>
-      </w:r>
-      <w:r>
-        <w:rPr>
-          <w:rStyle w:val="mtk12"/>
-          <w:rFonts w:ascii="Aptos" w:hAnsi="Aptos" w:cs="Angsana New"/>
-          <w:color w:val="CE9178"/>
-          <w:sz w:val="17"/>
-          <w:szCs w:val="17"/>
-          <w:bdr w:val="single" w:sz="2" w:space="0" w:color="auto" w:frame="1"/>
-        </w:rPr>
-        <w:t>Q1/app.py</w:t>
-      </w:r>
-      <w:r>
-        <w:rPr>
-          <w:rStyle w:val="mtk1"/>
-          <w:rFonts w:ascii="Aptos" w:hAnsi="Aptos" w:cs="Angsana New"/>
-          <w:color w:val="CCCCCC"/>
-          <w:sz w:val="17"/>
-          <w:szCs w:val="17"/>
-          <w:bdr w:val="single" w:sz="2" w:space="0" w:color="auto" w:frame="1"/>
-        </w:rPr>
-        <w:t xml:space="preserve"> </w:t>
-      </w:r>
-      <w:r>
-        <w:rPr>
-          <w:rStyle w:val="mtk12"/>
-          <w:rFonts w:ascii="Aptos" w:hAnsi="Aptos" w:cs="Angsana New"/>
-          <w:color w:val="CE9178"/>
-          <w:sz w:val="17"/>
-          <w:szCs w:val="17"/>
-          <w:bdr w:val="single" w:sz="2" w:space="0" w:color="auto" w:frame="1"/>
-        </w:rPr>
-        <w:t>t3</w:t>
-      </w:r>
-    </w:p>
-    <w:p>
-      <w:pPr>
-        <w:pStyle w:val="BodyText"/>
-        <w:rPr>
-          <w:rStyle w:val="mtk12"/>
-          <w:rFonts w:ascii="Aptos" w:hAnsi="Aptos" w:cs="Angsana New"/>
-          <w:color w:val="CE9178"/>
-          <w:sz w:val="17"/>
-          <w:szCs w:val="17"/>
-          <w:bdr w:val="single" w:sz="2" w:space="0" w:color="auto" w:frame="1"/>
-        </w:rPr>
-      </w:pPr>
-      <w:r>
-        <w:rPr>
-          <w:rFonts w:ascii="Aptos" w:hAnsi="Aptos" w:cs="Angsana New"/>
-        </w:rPr>
-        <w:t>Publish new model</w:t>
-      </w:r>
-      <w:r>
-        <w:rPr>
-          <w:rFonts w:ascii="Aptos" w:hAnsi="Aptos" w:cs="Angsana New"/>
-        </w:rPr>
-        <w:br/>
-      </w:r>
-      <w:r>
-        <w:rPr>
-          <w:rStyle w:val="mtk10"/>
-          <w:rFonts w:ascii="Aptos" w:hAnsi="Aptos" w:cs="Angsana New"/>
-          <w:color w:val="9CDCFE"/>
-          <w:sz w:val="17"/>
-          <w:szCs w:val="17"/>
-          <w:bdr w:val="single" w:sz="2" w:space="0" w:color="auto" w:frame="1"/>
-        </w:rPr>
-        <w:t>PYTHONPATH</w:t>
-      </w:r>
-      <w:r>
-        <w:rPr>
-          <w:rStyle w:val="mtk3"/>
-          <w:rFonts w:ascii="Aptos" w:hAnsi="Aptos" w:cs="Angsana New"/>
-          <w:color w:val="D4D4D4"/>
-          <w:sz w:val="17"/>
-          <w:szCs w:val="17"/>
-          <w:bdr w:val="single" w:sz="2" w:space="0" w:color="auto" w:frame="1"/>
-        </w:rPr>
-        <w:t>=</w:t>
-      </w:r>
-      <w:r>
-        <w:rPr>
-          <w:rStyle w:val="mtk12"/>
-          <w:rFonts w:ascii="Aptos" w:hAnsi="Aptos" w:cs="Angsana New"/>
-          <w:color w:val="CE9178"/>
-          <w:sz w:val="17"/>
-          <w:szCs w:val="17"/>
-          <w:bdr w:val="single" w:sz="2" w:space="0" w:color="auto" w:frame="1"/>
-        </w:rPr>
-        <w:t>Q1/src</w:t>
-      </w:r>
-      <w:r>
-        <w:rPr>
-          <w:rStyle w:val="mtk1"/>
-          <w:rFonts w:ascii="Aptos" w:hAnsi="Aptos" w:cs="Angsana New"/>
-          <w:color w:val="CCCCCC"/>
-          <w:sz w:val="17"/>
-          <w:szCs w:val="17"/>
-          <w:bdr w:val="single" w:sz="2" w:space="0" w:color="auto" w:frame="1"/>
-        </w:rPr>
-        <w:t xml:space="preserve"> </w:t>
-      </w:r>
-      <w:r>
-        <w:rPr>
-          <w:rStyle w:val="mtk16"/>
-          <w:rFonts w:ascii="Aptos" w:hAnsi="Aptos" w:cs="Angsana New"/>
-          <w:color w:val="DCDCAA"/>
-          <w:sz w:val="17"/>
-          <w:szCs w:val="17"/>
-          <w:bdr w:val="single" w:sz="2" w:space="0" w:color="auto" w:frame="1"/>
-        </w:rPr>
-        <w:t>./.venv/bin/python</w:t>
-      </w:r>
-      <w:r>
-        <w:rPr>
-          <w:rStyle w:val="mtk1"/>
-          <w:rFonts w:ascii="Aptos" w:hAnsi="Aptos" w:cs="Angsana New"/>
-          <w:color w:val="CCCCCC"/>
-          <w:sz w:val="17"/>
-          <w:szCs w:val="17"/>
-          <w:bdr w:val="single" w:sz="2" w:space="0" w:color="auto" w:frame="1"/>
-        </w:rPr>
-        <w:t xml:space="preserve"> </w:t>
-      </w:r>
-      <w:r>
-        <w:rPr>
-          <w:rStyle w:val="mtk12"/>
-          <w:rFonts w:ascii="Aptos" w:hAnsi="Aptos" w:cs="Angsana New"/>
-          <w:color w:val="CE9178"/>
-          <w:sz w:val="17"/>
-          <w:szCs w:val="17"/>
-          <w:bdr w:val="single" w:sz="2" w:space="0" w:color="auto" w:frame="1"/>
-        </w:rPr>
-        <w:t>Q1/app.py</w:t>
-      </w:r>
-      <w:r>
-        <w:rPr>
-          <w:rStyle w:val="mtk1"/>
-          <w:rFonts w:ascii="Aptos" w:hAnsi="Aptos" w:cs="Angsana New"/>
-          <w:color w:val="CCCCCC"/>
-          <w:sz w:val="17"/>
-          <w:szCs w:val="17"/>
-          <w:bdr w:val="single" w:sz="2" w:space="0" w:color="auto" w:frame="1"/>
-        </w:rPr>
-        <w:t xml:space="preserve"> </w:t>
-      </w:r>
-      <w:r>
-        <w:rPr>
-          <w:rStyle w:val="mtk12"/>
-          <w:rFonts w:ascii="Aptos" w:hAnsi="Aptos" w:cs="Angsana New"/>
-          <w:color w:val="CE9178"/>
-          <w:sz w:val="17"/>
-          <w:szCs w:val="17"/>
-          <w:bdr w:val="single" w:sz="2" w:space="0" w:color="auto" w:frame="1"/>
-        </w:rPr>
-        <w:t>t7</w:t>
-      </w:r>
-    </w:p>
-    <w:p>
-      <w:pPr>
-        <w:pStyle w:val="BodyText"/>
-        <w:rPr>
-          <w:rStyle w:val="mtk12"/>
-          <w:rFonts w:ascii="Aptos" w:hAnsi="Aptos" w:cs="Angsana New"/>
-          <w:color w:val="CE9178"/>
-          <w:sz w:val="17"/>
-          <w:szCs w:val="17"/>
-          <w:bdr w:val="single" w:sz="2" w:space="0" w:color="auto" w:frame="1"/>
-        </w:rPr>
-      </w:pPr>
-      <w:r>
-        <w:rPr>
-          <w:rStyle w:val="mtk12"/>
-          <w:rFonts w:ascii="Aptos" w:hAnsi="Aptos" w:cs="Angsana New"/>
-          <w:color w:val="CE9178"/>
-          <w:sz w:val="17"/>
-          <w:szCs w:val="17"/>
-          <w:bdr w:val="single" w:sz="2" w:space="0" w:color="auto" w:frame="1"/>
-        </w:rPr>
-        <w:t>Rebuild the contaner</w:t>
-      </w:r>
-    </w:p>
-    <w:p>
-      <w:pPr>
-        <w:pStyle w:val="BodyText"/>
-        <w:rPr>
-          <w:rFonts w:ascii="Aptos" w:hAnsi="Aptos" w:cs="Angsana New"/>
-        </w:rPr>
-      </w:pPr>
-      <w:r>
-        <w:rPr>
-          <w:rStyle w:val="mtk16"/>
-          <w:rFonts w:ascii="Aptos" w:hAnsi="Aptos" w:cs="Angsana New"/>
-          <w:color w:val="DCDCAA"/>
-          <w:sz w:val="17"/>
-          <w:szCs w:val="17"/>
-          <w:bdr w:val="single" w:sz="2" w:space="0" w:color="auto" w:frame="1"/>
-        </w:rPr>
-        <w:t>docker-compose</w:t>
-      </w:r>
-      <w:r>
-        <w:rPr>
-          <w:rStyle w:val="mtk1"/>
-          <w:rFonts w:ascii="Aptos" w:hAnsi="Aptos" w:cs="Angsana New"/>
-          <w:color w:val="CCCCCC"/>
-          <w:sz w:val="17"/>
-          <w:szCs w:val="17"/>
-          <w:bdr w:val="single" w:sz="2" w:space="0" w:color="auto" w:frame="1"/>
-        </w:rPr>
-        <w:t xml:space="preserve"> </w:t>
-      </w:r>
-      <w:r>
-        <w:rPr>
-          <w:rStyle w:val="mtk6"/>
-          <w:rFonts w:ascii="Aptos" w:hAnsi="Aptos" w:cs="Angsana New"/>
-          <w:color w:val="569CD6"/>
-          <w:sz w:val="17"/>
-          <w:szCs w:val="17"/>
-          <w:bdr w:val="single" w:sz="2" w:space="0" w:color="auto" w:frame="1"/>
-        </w:rPr>
-        <w:t>-f</w:t>
-      </w:r>
-      <w:r>
-        <w:rPr>
-          <w:rStyle w:val="mtk1"/>
-          <w:rFonts w:ascii="Aptos" w:hAnsi="Aptos" w:cs="Angsana New"/>
-          <w:color w:val="CCCCCC"/>
-          <w:sz w:val="17"/>
-          <w:szCs w:val="17"/>
-          <w:bdr w:val="single" w:sz="2" w:space="0" w:color="auto" w:frame="1"/>
-        </w:rPr>
-        <w:t xml:space="preserve"> </w:t>
-      </w:r>
-      <w:r>
-        <w:rPr>
-          <w:rStyle w:val="mtk12"/>
-          <w:rFonts w:ascii="Aptos" w:hAnsi="Aptos" w:cs="Angsana New"/>
-          <w:color w:val="CE9178"/>
-          <w:sz w:val="17"/>
-          <w:szCs w:val="17"/>
-          <w:bdr w:val="single" w:sz="2" w:space="0" w:color="auto" w:frame="1"/>
-        </w:rPr>
-        <w:t>Q1/docker-compose.yml</w:t>
-      </w:r>
-      <w:r>
-        <w:rPr>
-          <w:rStyle w:val="mtk1"/>
-          <w:rFonts w:ascii="Aptos" w:hAnsi="Aptos" w:cs="Angsana New"/>
-          <w:color w:val="CCCCCC"/>
-          <w:sz w:val="17"/>
-          <w:szCs w:val="17"/>
-          <w:bdr w:val="single" w:sz="2" w:space="0" w:color="auto" w:frame="1"/>
-        </w:rPr>
-        <w:t xml:space="preserve"> </w:t>
-      </w:r>
-      <w:r>
-        <w:rPr>
-          <w:rStyle w:val="mtk12"/>
-          <w:rFonts w:ascii="Aptos" w:hAnsi="Aptos" w:cs="Angsana New"/>
-          <w:color w:val="CE9178"/>
-          <w:sz w:val="17"/>
-          <w:szCs w:val="17"/>
-          <w:bdr w:val="single" w:sz="2" w:space="0" w:color="auto" w:frame="1"/>
-        </w:rPr>
-        <w:t>up</w:t>
-      </w:r>
-      <w:r>
-        <w:rPr>
-          <w:rStyle w:val="mtk1"/>
-          <w:rFonts w:ascii="Aptos" w:hAnsi="Aptos" w:cs="Angsana New"/>
-          <w:color w:val="CCCCCC"/>
-          <w:sz w:val="17"/>
-          <w:szCs w:val="17"/>
-          <w:bdr w:val="single" w:sz="2" w:space="0" w:color="auto" w:frame="1"/>
-        </w:rPr>
-        <w:t xml:space="preserve"> </w:t>
-      </w:r>
-      <w:r>
-        <w:rPr>
-          <w:rStyle w:val="mtk6"/>
-          <w:rFonts w:ascii="Aptos" w:hAnsi="Aptos" w:cs="Angsana New"/>
-          <w:color w:val="569CD6"/>
-          <w:sz w:val="17"/>
-          <w:szCs w:val="17"/>
-          <w:bdr w:val="single" w:sz="2" w:space="0" w:color="auto" w:frame="1"/>
-        </w:rPr>
-        <w:t>--build</w:t>
-      </w:r>
-    </w:p>
-    <w:p>
-      <w:pPr>
-        <w:pStyle w:val="BodyText"/>
-        <w:rPr>
-          <w:rFonts w:ascii="Aptos" w:hAnsi="Aptos" w:cs="Angsana New"/>
-        </w:rPr>
-      </w:pPr>
-    </w:p>
-    <w:p>
-      <w:pPr>
-        <w:pStyle w:val="BodyText"/>
-        <w:rPr>
-          <w:rFonts w:ascii="Aptos" w:hAnsi="Aptos" w:cs="Angsana New"/>
-        </w:rPr>
-      </w:pPr>
-    </w:p>
-    <w:p>
-      <w:pPr>
-        <w:pStyle w:val="BodyText"/>
-        <w:rPr>
-          <w:rFonts w:ascii="Aptos" w:hAnsi="Aptos" w:cs="Angsana New"/>
-        </w:rPr>
-      </w:pPr>
-    </w:p>
-    <w:p>
-      <w:pPr>
-        <w:pStyle w:val="BodyText"/>
-        <w:rPr>
-          <w:rFonts w:ascii="Aptos" w:hAnsi="Aptos" w:cs="Angsana New"/>
-        </w:rPr>
-      </w:pPr>
-    </w:p>
-    <w:p>
-      <w:pPr>
-        <w:pStyle w:val="BodyText"/>
-        <w:rPr>
-          <w:rFonts w:ascii="Aptos" w:hAnsi="Aptos" w:cs="Angsana New"/>
-        </w:rPr>
-      </w:pPr>
-    </w:p>
-    <w:p>
-      <w:pPr>
-        <w:pStyle w:val="BodyText"/>
-        <w:rPr>
-          <w:rFonts w:ascii="Aptos" w:hAnsi="Aptos" w:cs="Angsana New"/>
-        </w:rPr>
-      </w:pPr>
-    </w:p>
-    <w:p>
-      <w:pPr>
-        <w:pStyle w:val="BodyText"/>
-        <w:rPr>
-          <w:rFonts w:ascii="Aptos" w:hAnsi="Aptos" w:cs="Angsana New"/>
-        </w:rPr>
-      </w:pPr>
-    </w:p>
-    <w:p>
-      <w:pPr>
-        <w:pStyle w:val="BodyText"/>
-        <w:rPr>
-          <w:rFonts w:ascii="Aptos" w:hAnsi="Aptos" w:cs="Angsana New"/>
-        </w:rPr>
-      </w:pPr>
-    </w:p>
-    <w:p>
-      <w:pPr>
-        <w:pStyle w:val="BodyText"/>
-        <w:rPr>
-          <w:rFonts w:ascii="Aptos" w:hAnsi="Aptos" w:cs="Angsana New"/>
-        </w:rPr>
-      </w:pPr>
-    </w:p>
-    <w:p>
-      <w:pPr>
-        <w:pStyle w:val="NormalWeb"/>
-        <w:pBdr>
-          <w:top w:val="single" w:sz="2" w:space="0" w:color="auto"/>
-          <w:left w:val="single" w:sz="2" w:space="0" w:color="auto"/>
-          <w:bottom w:val="single" w:sz="2" w:space="0" w:color="auto"/>
-          <w:right w:val="single" w:sz="2" w:space="0" w:color="auto"/>
-        </w:pBdr>
-        <w:shd w:val="clear" w:color="auto" w:fill="181818"/>
-        <w:spacing w:before="0" w:beforeAutospacing="0" w:after="0" w:afterAutospacing="0"/>
-        <w:rPr>
-          <w:rFonts w:ascii="Aptos" w:hAnsi="Aptos" w:cs="Angsana New"/>
-          <w:color w:val="CCCCCC"/>
+        <w:jc w:val="center"/>
+        <w:rPr>
           <w:sz w:val="20"/>
           <w:szCs w:val="20"/>
         </w:rPr>
       </w:pPr>
       <w:r>
         <w:rPr>
-          <w:rFonts w:ascii="Aptos" w:hAnsi="Aptos" w:cs="Angsana New"/>
-          <w:color w:val="CCCCCC"/>
           <w:sz w:val="20"/>
           <w:szCs w:val="20"/>
         </w:rPr>
-        <w:t>Here are the commands you can run locally from your workspace root directory:</w:t>
-      </w:r>
-    </w:p>
-    <w:p>
-      <w:pPr>
-        <w:pStyle w:val="Heading3"/>
-        <w:pBdr>
-          <w:top w:val="single" w:sz="2" w:space="0" w:color="auto"/>
-          <w:left w:val="single" w:sz="2" w:space="0" w:color="auto"/>
-          <w:bottom w:val="single" w:sz="2" w:space="0" w:color="auto"/>
-          <w:right w:val="single" w:sz="2" w:space="0" w:color="auto"/>
-        </w:pBdr>
-        <w:shd w:val="clear" w:color="auto" w:fill="181818"/>
-        <w:rPr>
-          <w:rFonts w:ascii="Aptos" w:hAnsi="Aptos" w:cs="Angsana New"/>
-          <w:b w:val="0"/>
-          <w:bCs w:val="0"/>
-          <w:color w:val="CCCCCC"/>
-          <w:sz w:val="27"/>
-          <w:szCs w:val="27"/>
-        </w:rPr>
-      </w:pPr>
-      <w:r>
-        <w:rPr>
-          <w:rFonts w:ascii="Aptos" w:hAnsi="Aptos" w:cs="Angsana New"/>
-          <w:b w:val="0"/>
-          <w:bCs w:val="0"/>
-          <w:color w:val="CCCCCC"/>
-        </w:rPr>
-        <w:t>1. Run the FastAPI Server Locally</w:t>
-      </w:r>
-    </w:p>
-    <w:p>
-      <w:pPr>
-        <w:pStyle w:val="NormalWeb"/>
-        <w:pBdr>
-          <w:top w:val="single" w:sz="2" w:space="0" w:color="auto"/>
-          <w:left w:val="single" w:sz="2" w:space="0" w:color="auto"/>
-          <w:bottom w:val="single" w:sz="2" w:space="0" w:color="auto"/>
-          <w:right w:val="single" w:sz="2" w:space="0" w:color="auto"/>
-        </w:pBdr>
-        <w:shd w:val="clear" w:color="auto" w:fill="181818"/>
-        <w:spacing w:before="0" w:beforeAutospacing="0" w:after="0" w:afterAutospacing="0"/>
-        <w:rPr>
-          <w:rFonts w:ascii="Aptos" w:hAnsi="Aptos" w:cs="Angsana New"/>
-          <w:color w:val="CCCCCC"/>
+        <w:t xml:space="preserve">Figure </w:t>
+      </w:r>
+      <w:r>
+        <w:rPr>
           <w:sz w:val="20"/>
           <w:szCs w:val="20"/>
         </w:rPr>
-      </w:pPr>
-      <w:r>
-        <w:rPr>
-          <w:rFonts w:ascii="Aptos" w:hAnsi="Aptos" w:cs="Angsana New"/>
-          <w:color w:val="CCCCCC"/>
+        <w:t>20</w:t>
+      </w:r>
+      <w:r>
+        <w:rPr>
           <w:sz w:val="20"/>
           <w:szCs w:val="20"/>
         </w:rPr>
-        <w:t>Start the server directly using your virtual environment:</w:t>
-      </w:r>
-    </w:p>
-    <w:p>
-      <w:pPr>
-        <w:pStyle w:val="HTMLPreformatted"/>
-        <w:pBdr>
-          <w:top w:val="single" w:sz="2" w:space="0" w:color="auto"/>
-          <w:left w:val="single" w:sz="2" w:space="0" w:color="auto"/>
-          <w:bottom w:val="single" w:sz="2" w:space="0" w:color="auto"/>
-          <w:right w:val="single" w:sz="2" w:space="0" w:color="auto"/>
-        </w:pBdr>
-        <w:shd w:val="clear" w:color="auto" w:fill="181818"/>
-        <w:rPr>
-          <w:rFonts w:ascii="Aptos" w:hAnsi="Aptos" w:cs="Angsana New"/>
-          <w:color w:val="CCCCCC"/>
-        </w:rPr>
-      </w:pPr>
-      <w:r>
-        <w:rPr>
-          <w:rFonts w:ascii="Aptos" w:hAnsi="Aptos" w:cs="Angsana New"/>
-          <w:color w:val="CCCCCC"/>
-        </w:rPr>
-        <w:t>bash</w:t>
-      </w:r>
-    </w:p>
-    <w:p>
-      <w:pPr>
-        <w:pStyle w:val="HTMLPreformatted"/>
-        <w:pBdr>
-          <w:top w:val="single" w:sz="2" w:space="0" w:color="auto"/>
-          <w:left w:val="single" w:sz="2" w:space="0" w:color="auto"/>
-          <w:bottom w:val="single" w:sz="2" w:space="0" w:color="auto"/>
-          <w:right w:val="single" w:sz="2" w:space="0" w:color="auto"/>
-        </w:pBdr>
-        <w:shd w:val="clear" w:color="auto" w:fill="181818"/>
-        <w:rPr>
-          <w:rFonts w:ascii="Aptos" w:hAnsi="Aptos" w:cs="Angsana New"/>
-          <w:color w:val="CCCCCC"/>
-        </w:rPr>
-      </w:pPr>
-      <w:r>
-        <w:rPr>
-          <w:rStyle w:val="mtk10"/>
-          <w:rFonts w:ascii="Aptos" w:hAnsi="Aptos" w:cs="Angsana New"/>
-          <w:color w:val="9CDCFE"/>
-          <w:bdr w:val="single" w:sz="2" w:space="0" w:color="auto" w:frame="1"/>
-        </w:rPr>
-        <w:t>PYTHONPATH</w:t>
-      </w:r>
-      <w:r>
-        <w:rPr>
-          <w:rStyle w:val="mtk3"/>
-          <w:rFonts w:ascii="Aptos" w:hAnsi="Aptos" w:cs="Angsana New"/>
-          <w:color w:val="D4D4D4"/>
-          <w:bdr w:val="single" w:sz="2" w:space="0" w:color="auto" w:frame="1"/>
-        </w:rPr>
-        <w:t>=</w:t>
-      </w:r>
-      <w:r>
-        <w:rPr>
-          <w:rStyle w:val="mtk12"/>
-          <w:rFonts w:ascii="Aptos" w:hAnsi="Aptos" w:cs="Angsana New"/>
-          <w:color w:val="CE9178"/>
-          <w:bdr w:val="single" w:sz="2" w:space="0" w:color="auto" w:frame="1"/>
-        </w:rPr>
-        <w:t>Q1/src</w:t>
-      </w:r>
-      <w:r>
-        <w:rPr>
-          <w:rStyle w:val="mtk1"/>
-          <w:rFonts w:ascii="Aptos" w:hAnsi="Aptos" w:cs="Angsana New"/>
-          <w:color w:val="CCCCCC"/>
-          <w:bdr w:val="single" w:sz="2" w:space="0" w:color="auto" w:frame="1"/>
+        <w:t xml:space="preserve"> :</w:t>
+      </w:r>
+      <w:r>
+        <w:rPr>
+          <w:sz w:val="20"/>
+          <w:szCs w:val="20"/>
         </w:rPr>
         <w:t xml:space="preserve"> </w:t>
       </w:r>
       <w:r>
         <w:rPr>
-          <w:rStyle w:val="mtk16"/>
-          <w:rFonts w:ascii="Aptos" w:hAnsi="Aptos" w:cs="Angsana New"/>
-          <w:color w:val="DCDCAA"/>
-          <w:bdr w:val="single" w:sz="2" w:space="0" w:color="auto" w:frame="1"/>
-        </w:rPr>
-        <w:t>./.venv/bin/python</w:t>
-      </w:r>
-      <w:r>
-        <w:rPr>
-          <w:rStyle w:val="mtk1"/>
-          <w:rFonts w:ascii="Aptos" w:hAnsi="Aptos" w:cs="Angsana New"/>
-          <w:color w:val="CCCCCC"/>
-          <w:bdr w:val="single" w:sz="2" w:space="0" w:color="auto" w:frame="1"/>
-        </w:rPr>
-        <w:t xml:space="preserve"> </w:t>
-      </w:r>
-      <w:r>
-        <w:rPr>
-          <w:rStyle w:val="mtk12"/>
-          <w:rFonts w:ascii="Aptos" w:hAnsi="Aptos" w:cs="Angsana New"/>
-          <w:color w:val="CE9178"/>
-          <w:bdr w:val="single" w:sz="2" w:space="0" w:color="auto" w:frame="1"/>
-        </w:rPr>
-        <w:t>Q1/app.py</w:t>
-      </w:r>
-      <w:r>
-        <w:rPr>
-          <w:rStyle w:val="mtk1"/>
-          <w:rFonts w:ascii="Aptos" w:hAnsi="Aptos" w:cs="Angsana New"/>
-          <w:color w:val="CCCCCC"/>
-          <w:bdr w:val="single" w:sz="2" w:space="0" w:color="auto" w:frame="1"/>
-        </w:rPr>
-        <w:t xml:space="preserve"> </w:t>
-      </w:r>
-      <w:r>
-        <w:rPr>
-          <w:rStyle w:val="mtk12"/>
-          <w:rFonts w:ascii="Aptos" w:hAnsi="Aptos" w:cs="Angsana New"/>
-          <w:color w:val="CE9178"/>
-          <w:bdr w:val="single" w:sz="2" w:space="0" w:color="auto" w:frame="1"/>
-        </w:rPr>
-        <w:t>t6</w:t>
-      </w:r>
-    </w:p>
-    <w:p>
-      <w:pPr>
+          <w:sz w:val="20"/>
+          <w:szCs w:val="20"/>
+        </w:rPr>
+        <w:t>Buildkite Steps</w:t>
+      </w:r>
+    </w:p>
+    <w:p>
+      <w:pPr>
+        <w:pStyle w:val="BodyText"/>
+        <w:jc w:val="center"/>
+        <w:rPr>
+          <w:sz w:val="20"/>
+          <w:szCs w:val="20"/>
+        </w:rPr>
+      </w:pPr>
+    </w:p>
+    <w:p>
+      <w:pPr>
+        <w:pStyle w:val="Heading3"/>
         <w:numPr>
           <w:ilvl w:val="0"/>
-          <w:numId w:val="59"/>
+          <w:numId w:val="0"/>
         </w:numPr>
-        <w:pBdr>
-          <w:top w:val="single" w:sz="2" w:space="0" w:color="auto"/>
-          <w:left w:val="single" w:sz="2" w:space="0" w:color="auto"/>
-          <w:bottom w:val="single" w:sz="2" w:space="0" w:color="auto"/>
-          <w:right w:val="single" w:sz="2" w:space="0" w:color="auto"/>
-        </w:pBdr>
-        <w:shd w:val="clear" w:color="auto" w:fill="181818"/>
-        <w:spacing w:before="100" w:beforeAutospacing="1" w:after="100" w:afterAutospacing="1"/>
-        <w:rPr>
-          <w:rFonts w:ascii="Aptos" w:hAnsi="Aptos" w:cs="Angsana New"/>
-          <w:color w:val="CCCCCC"/>
+        <w:rPr>
+          <w:rFonts w:ascii="Aptos" w:hAnsi="Aptos" w:cs="Angsana New"/>
+        </w:rPr>
+      </w:pPr>
+      <w:r>
+        <w:rPr>
+          <w:rFonts w:ascii="Aptos" w:hAnsi="Aptos" w:cs="Angsana New"/>
+        </w:rPr>
+        <w:t>Docker Compose</w:t>
+      </w:r>
+      <w:r>
+        <w:rPr>
+          <w:rFonts w:ascii="Aptos" w:hAnsi="Aptos" w:cs="Angsana New"/>
+        </w:rPr>
+        <w:t xml:space="preserve"> – </w:t>
+      </w:r>
+      <w:r>
+        <w:rPr>
+          <w:rFonts w:ascii="Aptos" w:hAnsi="Aptos" w:cs="Angsana New"/>
+        </w:rPr>
+        <w:t>Containeriz</w:t>
+      </w:r>
+      <w:r>
+        <w:rPr>
+          <w:rFonts w:ascii="Aptos" w:hAnsi="Aptos" w:cs="Angsana New"/>
+        </w:rPr>
+        <w:t>ation</w:t>
+      </w:r>
+    </w:p>
+    <w:p>
+      <w:pPr>
+        <w:pStyle w:val="BodyText"/>
+      </w:pPr>
+      <w:r>
+        <w:t>We define a local docker environment using docker compose yml as depcited in figure 21. Here we mount he locally hosted remote storage for data version control. Because DVC api can access model cached files for get them inside docker.</w:t>
+      </w:r>
+    </w:p>
+    <w:p>
+      <w:pPr>
+        <w:pStyle w:val="BodyText"/>
+        <w:jc w:val="center"/>
+        <w:rPr>
           <w:sz w:val="20"/>
           <w:szCs w:val="20"/>
         </w:rPr>
       </w:pPr>
       <w:r>
         <w:rPr>
-          <w:rStyle w:val="Strong"/>
-          <w:rFonts w:ascii="Aptos" w:hAnsi="Aptos" w:cs="Angsana New"/>
-          <w:color w:val="CCCCCC"/>
           <w:sz w:val="20"/>
           <w:szCs w:val="20"/>
-          <w:bdr w:val="single" w:sz="2" w:space="0" w:color="auto" w:frame="1"/>
-        </w:rPr>
-        <w:t>What it does</w:t>
-      </w:r>
-      <w:r>
-        <w:rPr>
-          <w:rFonts w:ascii="Aptos" w:hAnsi="Aptos" w:cs="Angsana New"/>
-          <w:color w:val="CCCCCC"/>
+        </w:rPr>
+        <w:drawing>
+          <wp:inline distT="0" distB="0" distL="0" distR="0" wp14:anchorId="38A26065" wp14:editId="13B52338">
+            <wp:extent cx="4902200" cy="3556000"/>
+            <wp:effectExtent l="0" t="0" r="0" b="0"/>
+            <wp:docPr id="829811962" name="Picture 1" descr="A screen shot of a computer program&#10;&#10;AI-generated content may be incorrect."/>
+            <wp:cNvGraphicFramePr>
+              <a:graphicFrameLocks xmlns:a="http://schemas.openxmlformats.org/drawingml/2006/main" noChangeAspect="1"/>
+            </wp:cNvGraphicFramePr>
+            <a:graphic xmlns:a="http://schemas.openxmlformats.org/drawingml/2006/main">
+              <a:graphicData uri="http://schemas.openxmlformats.org/drawingml/2006/picture">
+                <pic:pic xmlns:pic="http://schemas.openxmlformats.org/drawingml/2006/picture">
+                  <pic:nvPicPr>
+                    <pic:cNvPr id="829811962" name="Picture 1" descr="A screen shot of a computer program&#10;&#10;AI-generated content may be incorrect."/>
+                    <pic:cNvPicPr/>
+                  </pic:nvPicPr>
+                  <pic:blipFill>
+                    <a:blip r:embed="rId27"/>
+                    <a:stretch>
+                      <a:fillRect/>
+                    </a:stretch>
+                  </pic:blipFill>
+                  <pic:spPr>
+                    <a:xfrm>
+                      <a:off x="0" y="0"/>
+                      <a:ext cx="4902200" cy="3556000"/>
+                    </a:xfrm>
+                    <a:prstGeom prst="rect">
+                      <a:avLst/>
+                    </a:prstGeom>
+                  </pic:spPr>
+                </pic:pic>
+              </a:graphicData>
+            </a:graphic>
+          </wp:inline>
+        </w:drawing>
+      </w:r>
+    </w:p>
+    <w:p>
+      <w:pPr>
+        <w:pStyle w:val="BodyText"/>
+        <w:jc w:val="center"/>
+        <w:rPr>
           <w:sz w:val="20"/>
           <w:szCs w:val="20"/>
         </w:rPr>
-        <w:t>: Launches a local </w:t>
-      </w:r>
-      <w:hyperlink r:id="rId25" w:history="1">
-        <w:r>
-          <w:rPr>
-            <w:rStyle w:val="Hyperlink"/>
-            <w:rFonts w:ascii="Aptos" w:hAnsi="Aptos" w:cs="Angsana New"/>
-            <w:color w:val="4DAAFC"/>
-            <w:sz w:val="20"/>
-            <w:szCs w:val="20"/>
-            <w:bdr w:val="single" w:sz="2" w:space="0" w:color="auto" w:frame="1"/>
-          </w:rPr>
-          <w:t>Uvicorn</w:t>
-        </w:r>
-      </w:hyperlink>
-      <w:r>
-        <w:rPr>
-          <w:rFonts w:ascii="Aptos" w:hAnsi="Aptos" w:cs="Angsana New"/>
-          <w:color w:val="CCCCCC"/>
+      </w:pPr>
+      <w:r>
+        <w:rPr>
           <w:sz w:val="20"/>
           <w:szCs w:val="20"/>
         </w:rPr>
-        <w:t> server on </w:t>
-      </w:r>
-      <w:r>
-        <w:rPr>
-          <w:rStyle w:val="HTMLCode"/>
-          <w:rFonts w:ascii="Aptos" w:eastAsiaTheme="minorEastAsia" w:hAnsi="Aptos" w:cs="Angsana New"/>
-          <w:color w:val="D0D0D0"/>
-          <w:sz w:val="18"/>
-          <w:szCs w:val="18"/>
-          <w:bdr w:val="single" w:sz="2" w:space="0" w:color="auto" w:frame="1"/>
-          <w:shd w:val="clear" w:color="auto" w:fill="3C3C3C"/>
-        </w:rPr>
-        <w:t>http://localhost:8000</w:t>
-      </w:r>
-      <w:r>
-        <w:rPr>
-          <w:rFonts w:ascii="Aptos" w:hAnsi="Aptos" w:cs="Angsana New"/>
-          <w:color w:val="CCCCCC"/>
+        <w:t xml:space="preserve">Figure </w:t>
+      </w:r>
+      <w:r>
+        <w:rPr>
           <w:sz w:val="20"/>
           <w:szCs w:val="20"/>
         </w:rPr>
-        <w:t>. You can browse to </w:t>
-      </w:r>
-      <w:r>
-        <w:rPr>
-          <w:rStyle w:val="HTMLCode"/>
-          <w:rFonts w:ascii="Aptos" w:eastAsiaTheme="minorEastAsia" w:hAnsi="Aptos" w:cs="Angsana New"/>
-          <w:color w:val="D0D0D0"/>
-          <w:sz w:val="18"/>
-          <w:szCs w:val="18"/>
-          <w:bdr w:val="single" w:sz="2" w:space="0" w:color="auto" w:frame="1"/>
-          <w:shd w:val="clear" w:color="auto" w:fill="3C3C3C"/>
-        </w:rPr>
-        <w:t>http://localhost:8000/docs</w:t>
-      </w:r>
-      <w:r>
-        <w:rPr>
-          <w:rFonts w:ascii="Aptos" w:hAnsi="Aptos" w:cs="Angsana New"/>
-          <w:color w:val="CCCCCC"/>
+        <w:t>2</w:t>
+      </w:r>
+      <w:r>
+        <w:rPr>
           <w:sz w:val="20"/>
           <w:szCs w:val="20"/>
         </w:rPr>
-        <w:t> to view and interact with the automatically generated Swagger API documentation.</w:t>
-      </w:r>
-    </w:p>
-    <w:p>
-      <w:pPr>
-        <w:rPr>
-          <w:rFonts w:ascii="Aptos" w:hAnsi="Aptos" w:cs="Angsana New"/>
-          <w:sz w:val="20"/>
-          <w:szCs w:val="20"/>
-        </w:rPr>
-      </w:pPr>
-      <w:r>
-        <w:rPr>
-          <w:rFonts w:ascii="Aptos" w:hAnsi="Aptos" w:cs="Angsana New"/>
-          <w:noProof/>
-        </w:rPr>
-      </w:r>
-      <w:r>
-        <w:rPr>
-          <w:rFonts w:ascii="Aptos" w:hAnsi="Aptos" w:cs="Angsana New"/>
-          <w:noProof/>
-        </w:rPr>
-        <w:pict w14:anchorId="0A71FAF3">
-          <v:rect id="_x0000_i1025" alt="" style="width:222.05pt;height:.75pt;mso-width-percent:0;mso-height-percent:0;mso-width-percent:0;mso-height-percent:0" o:hrpct="0" o:hralign="center" o:hrstd="t" o:hr="t" fillcolor="#a0a0a0" stroked="f"/>
-        </w:pict>
-      </w:r>
-    </w:p>
-    <w:p>
-      <w:pPr>
-        <w:pStyle w:val="Heading3"/>
-        <w:pBdr>
-          <w:top w:val="single" w:sz="2" w:space="0" w:color="auto"/>
-          <w:left w:val="single" w:sz="2" w:space="0" w:color="auto"/>
-          <w:bottom w:val="single" w:sz="2" w:space="0" w:color="auto"/>
-          <w:right w:val="single" w:sz="2" w:space="0" w:color="auto"/>
-        </w:pBdr>
-        <w:shd w:val="clear" w:color="auto" w:fill="181818"/>
-        <w:rPr>
-          <w:rFonts w:ascii="Aptos" w:hAnsi="Aptos" w:cs="Angsana New"/>
-          <w:b w:val="0"/>
-          <w:bCs w:val="0"/>
-          <w:color w:val="CCCCCC"/>
-          <w:sz w:val="27"/>
-          <w:szCs w:val="27"/>
-        </w:rPr>
-      </w:pPr>
-      <w:r>
-        <w:rPr>
-          <w:rFonts w:ascii="Aptos" w:hAnsi="Aptos" w:cs="Angsana New"/>
-          <w:b w:val="0"/>
-          <w:bCs w:val="0"/>
-          <w:color w:val="CCCCCC"/>
-        </w:rPr>
-        <w:t>2. Run API Unit and Integration Tests</w:t>
-      </w:r>
-    </w:p>
-    <w:p>
-      <w:pPr>
-        <w:pStyle w:val="NormalWeb"/>
-        <w:pBdr>
-          <w:top w:val="single" w:sz="2" w:space="0" w:color="auto"/>
-          <w:left w:val="single" w:sz="2" w:space="0" w:color="auto"/>
-          <w:bottom w:val="single" w:sz="2" w:space="0" w:color="auto"/>
-          <w:right w:val="single" w:sz="2" w:space="0" w:color="auto"/>
-        </w:pBdr>
-        <w:shd w:val="clear" w:color="auto" w:fill="181818"/>
-        <w:spacing w:before="0" w:beforeAutospacing="0" w:after="0" w:afterAutospacing="0"/>
-        <w:rPr>
-          <w:rFonts w:ascii="Aptos" w:hAnsi="Aptos" w:cs="Angsana New"/>
-          <w:color w:val="CCCCCC"/>
-          <w:sz w:val="20"/>
-          <w:szCs w:val="20"/>
-        </w:rPr>
-      </w:pPr>
-      <w:r>
-        <w:rPr>
-          <w:rFonts w:ascii="Aptos" w:hAnsi="Aptos" w:cs="Angsana New"/>
-          <w:color w:val="CCCCCC"/>
-          <w:sz w:val="20"/>
-          <w:szCs w:val="20"/>
-        </w:rPr>
-        <w:t>Execute the test suite to verify prediction accuracy and API health:</w:t>
-      </w:r>
-    </w:p>
-    <w:p>
-      <w:pPr>
-        <w:pStyle w:val="HTMLPreformatted"/>
-        <w:pBdr>
-          <w:top w:val="single" w:sz="2" w:space="0" w:color="auto"/>
-          <w:left w:val="single" w:sz="2" w:space="0" w:color="auto"/>
-          <w:bottom w:val="single" w:sz="2" w:space="0" w:color="auto"/>
-          <w:right w:val="single" w:sz="2" w:space="0" w:color="auto"/>
-        </w:pBdr>
-        <w:shd w:val="clear" w:color="auto" w:fill="181818"/>
-        <w:rPr>
-          <w:rFonts w:ascii="Aptos" w:hAnsi="Aptos" w:cs="Angsana New"/>
-          <w:color w:val="CCCCCC"/>
-        </w:rPr>
-      </w:pPr>
-      <w:r>
-        <w:rPr>
-          <w:rFonts w:ascii="Aptos" w:hAnsi="Aptos" w:cs="Angsana New"/>
-          <w:color w:val="CCCCCC"/>
-        </w:rPr>
-        <w:t>bash</w:t>
-      </w:r>
-    </w:p>
-    <w:p>
-      <w:pPr>
-        <w:pStyle w:val="HTMLPreformatted"/>
-        <w:pBdr>
-          <w:top w:val="single" w:sz="2" w:space="0" w:color="auto"/>
-          <w:left w:val="single" w:sz="2" w:space="0" w:color="auto"/>
-          <w:bottom w:val="single" w:sz="2" w:space="0" w:color="auto"/>
-          <w:right w:val="single" w:sz="2" w:space="0" w:color="auto"/>
-        </w:pBdr>
-        <w:shd w:val="clear" w:color="auto" w:fill="181818"/>
-        <w:rPr>
-          <w:rFonts w:ascii="Aptos" w:hAnsi="Aptos" w:cs="Angsana New"/>
-          <w:color w:val="CCCCCC"/>
-        </w:rPr>
-      </w:pPr>
-      <w:r>
-        <w:rPr>
-          <w:rStyle w:val="mtk10"/>
-          <w:rFonts w:ascii="Aptos" w:hAnsi="Aptos" w:cs="Angsana New"/>
-          <w:color w:val="9CDCFE"/>
-          <w:bdr w:val="single" w:sz="2" w:space="0" w:color="auto" w:frame="1"/>
-        </w:rPr>
-        <w:t>PYTHONPATH</w:t>
-      </w:r>
-      <w:r>
-        <w:rPr>
-          <w:rStyle w:val="mtk3"/>
-          <w:rFonts w:ascii="Aptos" w:hAnsi="Aptos" w:cs="Angsana New"/>
-          <w:color w:val="D4D4D4"/>
-          <w:bdr w:val="single" w:sz="2" w:space="0" w:color="auto" w:frame="1"/>
-        </w:rPr>
-        <w:t>=</w:t>
-      </w:r>
-      <w:r>
-        <w:rPr>
-          <w:rStyle w:val="mtk12"/>
-          <w:rFonts w:ascii="Aptos" w:hAnsi="Aptos" w:cs="Angsana New"/>
-          <w:color w:val="CE9178"/>
-          <w:bdr w:val="single" w:sz="2" w:space="0" w:color="auto" w:frame="1"/>
-        </w:rPr>
-        <w:t>Q1/src</w:t>
-      </w:r>
-      <w:r>
-        <w:rPr>
-          <w:rStyle w:val="mtk1"/>
-          <w:rFonts w:ascii="Aptos" w:hAnsi="Aptos" w:cs="Angsana New"/>
-          <w:color w:val="CCCCCC"/>
-          <w:bdr w:val="single" w:sz="2" w:space="0" w:color="auto" w:frame="1"/>
-        </w:rPr>
-        <w:t xml:space="preserve"> </w:t>
-      </w:r>
-      <w:r>
-        <w:rPr>
-          <w:rStyle w:val="mtk16"/>
-          <w:rFonts w:ascii="Aptos" w:hAnsi="Aptos" w:cs="Angsana New"/>
-          <w:color w:val="DCDCAA"/>
-          <w:bdr w:val="single" w:sz="2" w:space="0" w:color="auto" w:frame="1"/>
-        </w:rPr>
-        <w:t>./.venv/bin/pytest</w:t>
-      </w:r>
-      <w:r>
-        <w:rPr>
-          <w:rStyle w:val="mtk1"/>
-          <w:rFonts w:ascii="Aptos" w:hAnsi="Aptos" w:cs="Angsana New"/>
-          <w:color w:val="CCCCCC"/>
-          <w:bdr w:val="single" w:sz="2" w:space="0" w:color="auto" w:frame="1"/>
-        </w:rPr>
-        <w:t xml:space="preserve"> </w:t>
-      </w:r>
-      <w:r>
-        <w:rPr>
-          <w:rStyle w:val="mtk12"/>
-          <w:rFonts w:ascii="Aptos" w:hAnsi="Aptos" w:cs="Angsana New"/>
-          <w:color w:val="CE9178"/>
-          <w:bdr w:val="single" w:sz="2" w:space="0" w:color="auto" w:frame="1"/>
-        </w:rPr>
-        <w:t>Q1/src/task_6/tests/</w:t>
-      </w:r>
-    </w:p>
-    <w:p>
-      <w:pPr>
-        <w:numPr>
-          <w:ilvl w:val="0"/>
-          <w:numId w:val="60"/>
-        </w:numPr>
-        <w:pBdr>
-          <w:top w:val="single" w:sz="2" w:space="0" w:color="auto"/>
-          <w:left w:val="single" w:sz="2" w:space="0" w:color="auto"/>
-          <w:bottom w:val="single" w:sz="2" w:space="0" w:color="auto"/>
-          <w:right w:val="single" w:sz="2" w:space="0" w:color="auto"/>
-        </w:pBdr>
-        <w:shd w:val="clear" w:color="auto" w:fill="181818"/>
-        <w:spacing w:before="100" w:beforeAutospacing="1" w:after="100" w:afterAutospacing="1"/>
-        <w:rPr>
-          <w:rFonts w:ascii="Aptos" w:hAnsi="Aptos" w:cs="Angsana New"/>
-          <w:color w:val="CCCCCC"/>
-          <w:sz w:val="20"/>
-          <w:szCs w:val="20"/>
-        </w:rPr>
-      </w:pPr>
-      <w:r>
-        <w:rPr>
-          <w:rStyle w:val="Strong"/>
-          <w:rFonts w:ascii="Aptos" w:hAnsi="Aptos" w:cs="Angsana New"/>
-          <w:color w:val="CCCCCC"/>
-          <w:sz w:val="20"/>
-          <w:szCs w:val="20"/>
-          <w:bdr w:val="single" w:sz="2" w:space="0" w:color="auto" w:frame="1"/>
-        </w:rPr>
-        <w:t>What it does</w:t>
-      </w:r>
-      <w:r>
-        <w:rPr>
-          <w:rFonts w:ascii="Aptos" w:hAnsi="Aptos" w:cs="Angsana New"/>
-          <w:color w:val="CCCCCC"/>
-          <w:sz w:val="20"/>
-          <w:szCs w:val="20"/>
-        </w:rPr>
-        <w:t>: Uses </w:t>
-      </w:r>
-      <w:r>
-        <w:rPr>
-          <w:rStyle w:val="HTMLCode"/>
-          <w:rFonts w:ascii="Aptos" w:eastAsiaTheme="minorEastAsia" w:hAnsi="Aptos" w:cs="Angsana New"/>
-          <w:color w:val="D0D0D0"/>
-          <w:sz w:val="18"/>
-          <w:szCs w:val="18"/>
-          <w:bdr w:val="single" w:sz="2" w:space="0" w:color="auto" w:frame="1"/>
-          <w:shd w:val="clear" w:color="auto" w:fill="3C3C3C"/>
-        </w:rPr>
-        <w:t>pytest</w:t>
-      </w:r>
-      <w:r>
-        <w:rPr>
-          <w:rFonts w:ascii="Aptos" w:hAnsi="Aptos" w:cs="Angsana New"/>
-          <w:color w:val="CCCCCC"/>
-          <w:sz w:val="20"/>
-          <w:szCs w:val="20"/>
-        </w:rPr>
-        <w:t> to test client calls to the </w:t>
-      </w:r>
-      <w:r>
-        <w:rPr>
-          <w:rStyle w:val="HTMLCode"/>
-          <w:rFonts w:ascii="Aptos" w:eastAsiaTheme="minorEastAsia" w:hAnsi="Aptos" w:cs="Angsana New"/>
-          <w:color w:val="D0D0D0"/>
-          <w:sz w:val="18"/>
-          <w:szCs w:val="18"/>
-          <w:bdr w:val="single" w:sz="2" w:space="0" w:color="auto" w:frame="1"/>
-          <w:shd w:val="clear" w:color="auto" w:fill="3C3C3C"/>
-        </w:rPr>
-        <w:t>/health</w:t>
-      </w:r>
-      <w:r>
-        <w:rPr>
-          <w:rFonts w:ascii="Aptos" w:hAnsi="Aptos" w:cs="Angsana New"/>
-          <w:color w:val="CCCCCC"/>
-          <w:sz w:val="20"/>
-          <w:szCs w:val="20"/>
-        </w:rPr>
-        <w:t>, </w:t>
-      </w:r>
-      <w:r>
-        <w:rPr>
-          <w:rStyle w:val="HTMLCode"/>
-          <w:rFonts w:ascii="Aptos" w:eastAsiaTheme="minorEastAsia" w:hAnsi="Aptos" w:cs="Angsana New"/>
-          <w:color w:val="D0D0D0"/>
-          <w:sz w:val="18"/>
-          <w:szCs w:val="18"/>
-          <w:bdr w:val="single" w:sz="2" w:space="0" w:color="auto" w:frame="1"/>
-          <w:shd w:val="clear" w:color="auto" w:fill="3C3C3C"/>
-        </w:rPr>
-        <w:t>/predict</w:t>
-      </w:r>
-      <w:r>
-        <w:rPr>
-          <w:rFonts w:ascii="Aptos" w:hAnsi="Aptos" w:cs="Angsana New"/>
-          <w:color w:val="CCCCCC"/>
-          <w:sz w:val="20"/>
-          <w:szCs w:val="20"/>
-        </w:rPr>
-        <w:t> (single), and </w:t>
-      </w:r>
-      <w:r>
-        <w:rPr>
-          <w:rStyle w:val="HTMLCode"/>
-          <w:rFonts w:ascii="Aptos" w:eastAsiaTheme="minorEastAsia" w:hAnsi="Aptos" w:cs="Angsana New"/>
-          <w:color w:val="D0D0D0"/>
-          <w:sz w:val="18"/>
-          <w:szCs w:val="18"/>
-          <w:bdr w:val="single" w:sz="2" w:space="0" w:color="auto" w:frame="1"/>
-          <w:shd w:val="clear" w:color="auto" w:fill="3C3C3C"/>
-        </w:rPr>
-        <w:t>/predict_batch</w:t>
-      </w:r>
-      <w:r>
-        <w:rPr>
-          <w:rFonts w:ascii="Aptos" w:hAnsi="Aptos" w:cs="Angsana New"/>
-          <w:color w:val="CCCCCC"/>
-          <w:sz w:val="20"/>
-          <w:szCs w:val="20"/>
-        </w:rPr>
-        <w:t> endpoints.</w:t>
-      </w:r>
-    </w:p>
-    <w:p>
-      <w:pPr>
-        <w:rPr>
-          <w:rFonts w:ascii="Aptos" w:hAnsi="Aptos" w:cs="Angsana New"/>
-          <w:sz w:val="20"/>
-          <w:szCs w:val="20"/>
-        </w:rPr>
-      </w:pPr>
-      <w:r>
-        <w:rPr>
-          <w:rFonts w:ascii="Aptos" w:hAnsi="Aptos" w:cs="Angsana New"/>
-          <w:noProof/>
-        </w:rPr>
-      </w:r>
-      <w:r>
-        <w:rPr>
-          <w:rFonts w:ascii="Aptos" w:hAnsi="Aptos" w:cs="Angsana New"/>
-          <w:noProof/>
-        </w:rPr>
-        <w:pict w14:anchorId="1922F771">
-          <v:rect id="_x0000_i1026" alt="" style="width:222.05pt;height:.75pt;mso-width-percent:0;mso-height-percent:0;mso-width-percent:0;mso-height-percent:0" o:hrpct="0" o:hralign="center" o:hrstd="t" o:hr="t" fillcolor="#a0a0a0" stroked="f"/>
-        </w:pict>
-      </w:r>
-    </w:p>
-    <w:p>
-      <w:pPr>
-        <w:pStyle w:val="Heading3"/>
-        <w:pBdr>
-          <w:top w:val="single" w:sz="2" w:space="0" w:color="auto"/>
-          <w:left w:val="single" w:sz="2" w:space="0" w:color="auto"/>
-          <w:bottom w:val="single" w:sz="2" w:space="0" w:color="auto"/>
-          <w:right w:val="single" w:sz="2" w:space="0" w:color="auto"/>
-        </w:pBdr>
-        <w:shd w:val="clear" w:color="auto" w:fill="181818"/>
-        <w:rPr>
-          <w:rFonts w:ascii="Aptos" w:hAnsi="Aptos" w:cs="Angsana New"/>
-          <w:b w:val="0"/>
-          <w:bCs w:val="0"/>
-          <w:color w:val="CCCCCC"/>
-          <w:sz w:val="27"/>
-          <w:szCs w:val="27"/>
-        </w:rPr>
-      </w:pPr>
-      <w:r>
-        <w:rPr>
-          <w:rFonts w:ascii="Aptos" w:hAnsi="Aptos" w:cs="Angsana New"/>
-          <w:b w:val="0"/>
-          <w:bCs w:val="0"/>
-          <w:color w:val="CCCCCC"/>
-        </w:rPr>
-        <w:t>3. Build and Orchestrate via Docker</w:t>
-      </w:r>
-    </w:p>
-    <w:p>
-      <w:pPr>
-        <w:pStyle w:val="NormalWeb"/>
-        <w:pBdr>
-          <w:top w:val="single" w:sz="2" w:space="0" w:color="auto"/>
-          <w:left w:val="single" w:sz="2" w:space="0" w:color="auto"/>
-          <w:bottom w:val="single" w:sz="2" w:space="0" w:color="auto"/>
-          <w:right w:val="single" w:sz="2" w:space="0" w:color="auto"/>
-        </w:pBdr>
-        <w:shd w:val="clear" w:color="auto" w:fill="181818"/>
-        <w:spacing w:before="0" w:beforeAutospacing="0" w:after="0" w:afterAutospacing="0"/>
-        <w:rPr>
-          <w:rFonts w:ascii="Aptos" w:hAnsi="Aptos" w:cs="Angsana New"/>
-          <w:color w:val="CCCCCC"/>
-          <w:sz w:val="20"/>
-          <w:szCs w:val="20"/>
-        </w:rPr>
-      </w:pPr>
-      <w:r>
-        <w:rPr>
-          <w:rFonts w:ascii="Aptos" w:hAnsi="Aptos" w:cs="Angsana New"/>
-          <w:color w:val="CCCCCC"/>
-          <w:sz w:val="20"/>
-          <w:szCs w:val="20"/>
-        </w:rPr>
-        <w:t>If you have Docker running locally, you can build and serve the application inside an isolated container:</w:t>
-      </w:r>
-    </w:p>
-    <w:p>
-      <w:pPr>
-        <w:pStyle w:val="NormalWeb"/>
-        <w:numPr>
-          <w:ilvl w:val="0"/>
-          <w:numId w:val="61"/>
-        </w:numPr>
-        <w:pBdr>
-          <w:top w:val="single" w:sz="2" w:space="0" w:color="auto"/>
-          <w:left w:val="single" w:sz="2" w:space="0" w:color="auto"/>
-          <w:bottom w:val="single" w:sz="2" w:space="0" w:color="auto"/>
-          <w:right w:val="single" w:sz="2" w:space="0" w:color="auto"/>
-        </w:pBdr>
-        <w:shd w:val="clear" w:color="auto" w:fill="181818"/>
-        <w:spacing w:before="0" w:beforeAutospacing="0" w:after="0" w:afterAutospacing="0"/>
-        <w:rPr>
-          <w:rFonts w:ascii="Aptos" w:hAnsi="Aptos" w:cs="Angsana New"/>
-          <w:color w:val="CCCCCC"/>
-          <w:sz w:val="20"/>
-          <w:szCs w:val="20"/>
-        </w:rPr>
-      </w:pPr>
-      <w:r>
-        <w:rPr>
-          <w:rStyle w:val="Strong"/>
-          <w:rFonts w:ascii="Aptos" w:hAnsi="Aptos" w:cs="Angsana New"/>
-          <w:color w:val="CCCCCC"/>
-          <w:sz w:val="20"/>
-          <w:szCs w:val="20"/>
-          <w:bdr w:val="single" w:sz="2" w:space="0" w:color="auto" w:frame="1"/>
-        </w:rPr>
-        <w:t>Build the Docker Image</w:t>
-      </w:r>
-      <w:r>
-        <w:rPr>
-          <w:rFonts w:ascii="Aptos" w:hAnsi="Aptos" w:cs="Angsana New"/>
-          <w:color w:val="CCCCCC"/>
-          <w:sz w:val="20"/>
-          <w:szCs w:val="20"/>
-        </w:rPr>
-        <w:t>:</w:t>
-      </w:r>
-    </w:p>
-    <w:p>
-      <w:pPr>
-        <w:pStyle w:val="HTMLPreformatted"/>
-        <w:pBdr>
-          <w:top w:val="single" w:sz="2" w:space="0" w:color="auto"/>
-          <w:left w:val="single" w:sz="2" w:space="0" w:color="auto"/>
-          <w:bottom w:val="single" w:sz="2" w:space="0" w:color="auto"/>
-          <w:right w:val="single" w:sz="2" w:space="0" w:color="auto"/>
-        </w:pBdr>
-        <w:shd w:val="clear" w:color="auto" w:fill="181818"/>
-        <w:ind w:left="720"/>
-        <w:rPr>
-          <w:rFonts w:ascii="Aptos" w:hAnsi="Aptos" w:cs="Angsana New"/>
-          <w:color w:val="CCCCCC"/>
-        </w:rPr>
-      </w:pPr>
-      <w:r>
-        <w:rPr>
-          <w:rFonts w:ascii="Aptos" w:hAnsi="Aptos" w:cs="Angsana New"/>
-          <w:color w:val="CCCCCC"/>
-        </w:rPr>
-        <w:t>bash</w:t>
-      </w:r>
-    </w:p>
-    <w:p>
-      <w:pPr>
-        <w:pStyle w:val="HTMLPreformatted"/>
-        <w:pBdr>
-          <w:top w:val="single" w:sz="2" w:space="0" w:color="auto"/>
-          <w:left w:val="single" w:sz="2" w:space="0" w:color="auto"/>
-          <w:bottom w:val="single" w:sz="2" w:space="0" w:color="auto"/>
-          <w:right w:val="single" w:sz="2" w:space="0" w:color="auto"/>
-        </w:pBdr>
-        <w:shd w:val="clear" w:color="auto" w:fill="181818"/>
-        <w:ind w:left="720"/>
-        <w:rPr>
-          <w:rFonts w:ascii="Aptos" w:hAnsi="Aptos" w:cs="Angsana New"/>
-          <w:color w:val="CCCCCC"/>
-        </w:rPr>
-      </w:pPr>
-      <w:r>
-        <w:rPr>
-          <w:rStyle w:val="mtk16"/>
-          <w:rFonts w:ascii="Aptos" w:hAnsi="Aptos" w:cs="Angsana New"/>
-          <w:color w:val="DCDCAA"/>
-          <w:bdr w:val="single" w:sz="2" w:space="0" w:color="auto" w:frame="1"/>
-        </w:rPr>
-        <w:t>docker</w:t>
-      </w:r>
-      <w:r>
-        <w:rPr>
-          <w:rStyle w:val="mtk1"/>
-          <w:rFonts w:ascii="Aptos" w:hAnsi="Aptos" w:cs="Angsana New"/>
-          <w:color w:val="CCCCCC"/>
-          <w:bdr w:val="single" w:sz="2" w:space="0" w:color="auto" w:frame="1"/>
-        </w:rPr>
-        <w:t xml:space="preserve"> </w:t>
-      </w:r>
-      <w:r>
-        <w:rPr>
-          <w:rStyle w:val="mtk12"/>
-          <w:rFonts w:ascii="Aptos" w:hAnsi="Aptos" w:cs="Angsana New"/>
-          <w:color w:val="CE9178"/>
-          <w:bdr w:val="single" w:sz="2" w:space="0" w:color="auto" w:frame="1"/>
-        </w:rPr>
-        <w:t>build</w:t>
-      </w:r>
-      <w:r>
-        <w:rPr>
-          <w:rStyle w:val="mtk1"/>
-          <w:rFonts w:ascii="Aptos" w:hAnsi="Aptos" w:cs="Angsana New"/>
-          <w:color w:val="CCCCCC"/>
-          <w:bdr w:val="single" w:sz="2" w:space="0" w:color="auto" w:frame="1"/>
-        </w:rPr>
-        <w:t xml:space="preserve"> </w:t>
-      </w:r>
-      <w:r>
-        <w:rPr>
-          <w:rStyle w:val="mtk6"/>
-          <w:rFonts w:ascii="Aptos" w:hAnsi="Aptos" w:cs="Angsana New"/>
-          <w:color w:val="569CD6"/>
-          <w:bdr w:val="single" w:sz="2" w:space="0" w:color="auto" w:frame="1"/>
-        </w:rPr>
-        <w:t>-t</w:t>
-      </w:r>
-      <w:r>
-        <w:rPr>
-          <w:rStyle w:val="mtk1"/>
-          <w:rFonts w:ascii="Aptos" w:hAnsi="Aptos" w:cs="Angsana New"/>
-          <w:color w:val="CCCCCC"/>
-          <w:bdr w:val="single" w:sz="2" w:space="0" w:color="auto" w:frame="1"/>
-        </w:rPr>
-        <w:t xml:space="preserve"> </w:t>
-      </w:r>
-      <w:r>
-        <w:rPr>
-          <w:rStyle w:val="mtk12"/>
-          <w:rFonts w:ascii="Aptos" w:hAnsi="Aptos" w:cs="Angsana New"/>
-          <w:color w:val="CE9178"/>
-          <w:bdr w:val="single" w:sz="2" w:space="0" w:color="auto" w:frame="1"/>
-        </w:rPr>
-        <w:t>adult-income-api</w:t>
-      </w:r>
-      <w:r>
-        <w:rPr>
-          <w:rStyle w:val="mtk1"/>
-          <w:rFonts w:ascii="Aptos" w:hAnsi="Aptos" w:cs="Angsana New"/>
-          <w:color w:val="CCCCCC"/>
-          <w:bdr w:val="single" w:sz="2" w:space="0" w:color="auto" w:frame="1"/>
-        </w:rPr>
-        <w:t xml:space="preserve"> </w:t>
-      </w:r>
-      <w:r>
-        <w:rPr>
-          <w:rStyle w:val="mtk12"/>
-          <w:rFonts w:ascii="Aptos" w:hAnsi="Aptos" w:cs="Angsana New"/>
-          <w:color w:val="CE9178"/>
-          <w:bdr w:val="single" w:sz="2" w:space="0" w:color="auto" w:frame="1"/>
-        </w:rPr>
-        <w:t>Q1/</w:t>
-      </w:r>
-    </w:p>
-    <w:p>
-      <w:pPr>
-        <w:numPr>
-          <w:ilvl w:val="1"/>
-          <w:numId w:val="61"/>
-        </w:numPr>
-        <w:pBdr>
-          <w:top w:val="single" w:sz="2" w:space="0" w:color="auto"/>
-          <w:left w:val="single" w:sz="2" w:space="0" w:color="auto"/>
-          <w:bottom w:val="single" w:sz="2" w:space="0" w:color="auto"/>
-          <w:right w:val="single" w:sz="2" w:space="0" w:color="auto"/>
-        </w:pBdr>
-        <w:shd w:val="clear" w:color="auto" w:fill="181818"/>
-        <w:spacing w:before="100" w:beforeAutospacing="1" w:after="100" w:afterAutospacing="1"/>
-        <w:rPr>
-          <w:rStyle w:val="context-scope-mention"/>
-          <w:rFonts w:ascii="Aptos" w:hAnsi="Aptos" w:cs="Angsana New"/>
-          <w:sz w:val="20"/>
-          <w:szCs w:val="20"/>
-          <w:bdr w:val="single" w:sz="2" w:space="0" w:color="auto" w:frame="1"/>
-        </w:rPr>
-      </w:pPr>
-      <w:r>
-        <w:rPr>
-          <w:rStyle w:val="Strong"/>
-          <w:rFonts w:ascii="Aptos" w:hAnsi="Aptos" w:cs="Angsana New"/>
-          <w:color w:val="CCCCCC"/>
-          <w:sz w:val="20"/>
-          <w:szCs w:val="20"/>
-          <w:bdr w:val="single" w:sz="2" w:space="0" w:color="auto" w:frame="1"/>
-        </w:rPr>
-        <w:t>What it does</w:t>
-      </w:r>
-      <w:r>
-        <w:rPr>
-          <w:rFonts w:ascii="Aptos" w:hAnsi="Aptos" w:cs="Angsana New"/>
-          <w:color w:val="CCCCCC"/>
-          <w:sz w:val="20"/>
-          <w:szCs w:val="20"/>
-        </w:rPr>
-        <w:t>: Compiles your code and XGBoost model into a lightweight, containerized environment using </w:t>
-      </w:r>
-    </w:p>
-    <w:p>
-      <w:pPr>
-        <w:pBdr>
-          <w:top w:val="single" w:sz="2" w:space="0" w:color="auto"/>
-          <w:left w:val="single" w:sz="2" w:space="0" w:color="auto"/>
-          <w:bottom w:val="single" w:sz="2" w:space="0" w:color="auto"/>
-          <w:right w:val="single" w:sz="2" w:space="0" w:color="auto"/>
-        </w:pBdr>
-        <w:shd w:val="clear" w:color="auto" w:fill="181818"/>
-        <w:spacing w:before="100" w:beforeAutospacing="1" w:after="100" w:afterAutospacing="1"/>
-        <w:ind w:left="1440"/>
-        <w:rPr>
-          <w:rFonts w:ascii="Aptos" w:hAnsi="Aptos" w:cs="Angsana New"/>
-        </w:rPr>
-      </w:pPr>
-      <w:r>
-        <w:rPr>
-          <w:rFonts w:ascii="Aptos" w:hAnsi="Aptos" w:cs="Angsana New"/>
-          <w:color w:val="CCCCCC"/>
-          <w:sz w:val="20"/>
-          <w:szCs w:val="20"/>
-          <w:bdr w:val="single" w:sz="2" w:space="0" w:color="auto" w:frame="1"/>
-        </w:rPr>
-        <w:fldChar w:fldCharType="begin"/>
-      </w:r>
-      <w:r>
-        <w:rPr>
-          <w:rFonts w:ascii="Aptos" w:hAnsi="Aptos" w:cs="Angsana New"/>
-          <w:color w:val="CCCCCC"/>
-          <w:sz w:val="20"/>
-          <w:szCs w:val="20"/>
-          <w:bdr w:val="single" w:sz="2" w:space="0" w:color="auto" w:frame="1"/>
-        </w:rPr>
-        <w:instrText xml:space="preserve"> INCLUDEPICTURE "vscode-file://vscode-app/Applications/Antigravity%20IDE.app/Contents/Resources/app/extensions/theme-symbols/src/icons/files/document.svg" \* MERGEFORMATINET </w:instrText>
-      </w:r>
-      <w:r>
-        <w:rPr>
-          <w:rFonts w:ascii="Aptos" w:hAnsi="Aptos" w:cs="Angsana New"/>
-          <w:color w:val="CCCCCC"/>
-          <w:sz w:val="20"/>
-          <w:szCs w:val="20"/>
-          <w:bdr w:val="single" w:sz="2" w:space="0" w:color="auto" w:frame="1"/>
-        </w:rPr>
-        <w:fldChar w:fldCharType="separate"/>
-      </w:r>
-      <w:r>
-        <w:rPr>
-          <w:rFonts w:ascii="Aptos" w:hAnsi="Aptos" w:cs="Angsana New"/>
-          <w:noProof/>
-          <w:color w:val="CCCCCC"/>
-          <w:sz w:val="20"/>
-          <w:szCs w:val="20"/>
-          <w:bdr w:val="single" w:sz="2" w:space="0" w:color="auto" w:frame="1"/>
-        </w:rPr>
-        <mc:AlternateContent>
-          <mc:Choice Requires="wps">
-            <w:drawing>
-              <wp:inline distT="0" distB="0" distL="0" distR="0" wp14:anchorId="3E40A1EE" wp14:editId="3EE5EDC1">
-                <wp:extent cx="302260" cy="302260"/>
-                <wp:effectExtent l="0" t="0" r="0" b="0"/>
-                <wp:docPr id="2007556848" name="Rectangle 2"/>
-                <wp:cNvGraphicFramePr>
-                  <a:graphicFrameLocks xmlns:a="http://schemas.openxmlformats.org/drawingml/2006/main" noChangeAspect="1"/>
-                </wp:cNvGraphicFramePr>
-                <a:graphic xmlns:a="http://schemas.openxmlformats.org/drawingml/2006/main">
-                  <a:graphicData uri="http://schemas.microsoft.com/office/word/2010/wordprocessingShape">
-                    <wps:wsp>
-                      <wps:cNvSpPr>
-                        <a:spLocks noChangeAspect="1" noChangeArrowheads="1"/>
-                      </wps:cNvSpPr>
-                      <wps:spPr bwMode="auto">
-                        <a:xfrm>
-                          <a:off x="0" y="0"/>
-                          <a:ext cx="302260" cy="302260"/>
-                        </a:xfrm>
-                        <a:prstGeom prst="rect">
-                          <a:avLst/>
-                        </a:prstGeom>
-                        <a:noFill/>
-                        <a:ln>
-                          <a:noFill/>
-                        </a:ln>
-                        <a:extLst>
-                          <a:ext uri="{909E8E84-426E-40DD-AFC4-6F175D3DCCD1}">
-                            <a14:hiddenFill xmlns:a14="http://schemas.microsoft.com/office/drawing/2010/main">
-                              <a:solidFill>
-                                <a:srgbClr val="FFFFFF"/>
-                              </a:solidFill>
-                            </a14:hiddenFill>
-                          </a:ext>
-                          <a:ext uri="{91240B29-F687-4F45-9708-019B960494DF}">
-                            <a14:hiddenLine xmlns:a14="http://schemas.microsoft.com/office/drawing/2010/main" w="9525">
-                              <a:solidFill>
-                                <a:srgbClr val="000000"/>
-                              </a:solidFill>
-                              <a:miter lim="800000"/>
-                              <a:headEnd/>
-                              <a:tailEnd/>
-                            </a14:hiddenLine>
-                          </a:ext>
-                        </a:extLst>
-                      </wps:spPr>
-                      <wps:bodyPr rot="0" vert="horz" wrap="square" lIns="91440" tIns="45720" rIns="91440" bIns="45720" anchor="t" anchorCtr="0" upright="1">
-                        <a:noAutofit/>
-                      </wps:bodyPr>
-                    </wps:wsp>
-                  </a:graphicData>
-                </a:graphic>
-              </wp:inline>
-            </w:drawing>
-          </mc:Choice>
-          <mc:Fallback>
-            <w:pict>
-              <v:rect w14:anchorId="681E5E38" id="Rectangle 2" o:spid="_x0000_s1026" style="width:23.8pt;height:23.8pt;visibility:visible;mso-wrap-style:square;mso-left-percent:-10001;mso-top-percent:-10001;mso-position-horizontal:absolute;mso-position-horizontal-relative:char;mso-position-vertical:absolute;mso-position-vertical-relative:line;mso-left-percent:-10001;mso-top-percent:-10001;v-text-anchor:top" o:gfxdata="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" filled="f" stroked="f">
-                <o:lock v:ext="edit" aspectratio="t"/>
-                <w10:anchorlock/>
-              </v:rect>
-            </w:pict>
-          </mc:Fallback>
-        </mc:AlternateContent>
-      </w:r>
-      <w:r>
-        <w:rPr>
-          <w:rFonts w:ascii="Aptos" w:hAnsi="Aptos" w:cs="Angsana New"/>
-          <w:color w:val="CCCCCC"/>
-          <w:sz w:val="20"/>
-          <w:szCs w:val="20"/>
-          <w:bdr w:val="single" w:sz="2" w:space="0" w:color="auto" w:frame="1"/>
-        </w:rPr>
-        <w:fldChar w:fldCharType="end"/>
-      </w:r>
-    </w:p>
-    <w:p>
-      <w:pPr>
-        <w:pBdr>
-          <w:top w:val="single" w:sz="2" w:space="0" w:color="auto"/>
-          <w:left w:val="single" w:sz="2" w:space="0" w:color="auto"/>
-          <w:bottom w:val="single" w:sz="2" w:space="0" w:color="auto"/>
-          <w:right w:val="single" w:sz="2" w:space="0" w:color="auto"/>
-        </w:pBdr>
-        <w:shd w:val="clear" w:color="auto" w:fill="181818"/>
-        <w:spacing w:before="100" w:beforeAutospacing="1" w:after="100" w:afterAutospacing="1"/>
-        <w:ind w:left="1440"/>
-        <w:rPr>
-          <w:rFonts w:ascii="Aptos" w:hAnsi="Aptos" w:cs="Angsana New"/>
-          <w:color w:val="CCCCCC"/>
-          <w:sz w:val="20"/>
-          <w:szCs w:val="20"/>
-        </w:rPr>
-      </w:pPr>
-      <w:r>
-        <w:rPr>
-          <w:rStyle w:val="inline-flex"/>
-          <w:rFonts w:ascii="Aptos" w:hAnsi="Aptos" w:cs="Angsana New"/>
-          <w:color w:val="CCCCCC"/>
-          <w:sz w:val="20"/>
-          <w:szCs w:val="20"/>
-          <w:bdr w:val="single" w:sz="2" w:space="0" w:color="auto" w:frame="1"/>
-        </w:rPr>
-        <w:t>Dockerfile</w:t>
-      </w:r>
-      <w:r>
-        <w:rPr>
-          <w:rFonts w:ascii="Aptos" w:hAnsi="Aptos" w:cs="Angsana New"/>
-          <w:color w:val="CCCCCC"/>
-          <w:sz w:val="20"/>
-          <w:szCs w:val="20"/>
-        </w:rPr>
-        <w:t>.</w:t>
-      </w:r>
-    </w:p>
-    <w:p>
-      <w:pPr>
-        <w:pStyle w:val="NormalWeb"/>
-        <w:numPr>
-          <w:ilvl w:val="0"/>
-          <w:numId w:val="61"/>
-        </w:numPr>
-        <w:pBdr>
-          <w:top w:val="single" w:sz="2" w:space="0" w:color="auto"/>
-          <w:left w:val="single" w:sz="2" w:space="0" w:color="auto"/>
-          <w:bottom w:val="single" w:sz="2" w:space="0" w:color="auto"/>
-          <w:right w:val="single" w:sz="2" w:space="0" w:color="auto"/>
-        </w:pBdr>
-        <w:shd w:val="clear" w:color="auto" w:fill="181818"/>
-        <w:spacing w:before="0" w:beforeAutospacing="0" w:after="0" w:afterAutospacing="0"/>
-        <w:rPr>
-          <w:rFonts w:ascii="Aptos" w:hAnsi="Aptos" w:cs="Angsana New"/>
-          <w:color w:val="CCCCCC"/>
-          <w:sz w:val="20"/>
-          <w:szCs w:val="20"/>
-        </w:rPr>
-      </w:pPr>
-      <w:r>
-        <w:rPr>
-          <w:rStyle w:val="Strong"/>
-          <w:rFonts w:ascii="Aptos" w:hAnsi="Aptos" w:cs="Angsana New"/>
-          <w:color w:val="CCCCCC"/>
-          <w:sz w:val="20"/>
-          <w:szCs w:val="20"/>
-          <w:bdr w:val="single" w:sz="2" w:space="0" w:color="auto" w:frame="1"/>
-        </w:rPr>
-        <w:t>Run the Container</w:t>
-      </w:r>
-      <w:r>
-        <w:rPr>
-          <w:rFonts w:ascii="Aptos" w:hAnsi="Aptos" w:cs="Angsana New"/>
-          <w:color w:val="CCCCCC"/>
-          <w:sz w:val="20"/>
-          <w:szCs w:val="20"/>
-        </w:rPr>
-        <w:t>:</w:t>
-      </w:r>
-    </w:p>
-    <w:p>
-      <w:pPr>
-        <w:pStyle w:val="HTMLPreformatted"/>
-        <w:pBdr>
-          <w:top w:val="single" w:sz="2" w:space="0" w:color="auto"/>
-          <w:left w:val="single" w:sz="2" w:space="0" w:color="auto"/>
-          <w:bottom w:val="single" w:sz="2" w:space="0" w:color="auto"/>
-          <w:right w:val="single" w:sz="2" w:space="0" w:color="auto"/>
-        </w:pBdr>
-        <w:shd w:val="clear" w:color="auto" w:fill="181818"/>
-        <w:ind w:left="720"/>
-        <w:rPr>
-          <w:rFonts w:ascii="Aptos" w:hAnsi="Aptos" w:cs="Angsana New"/>
-          <w:color w:val="CCCCCC"/>
-        </w:rPr>
-      </w:pPr>
-      <w:r>
-        <w:rPr>
-          <w:rFonts w:ascii="Aptos" w:hAnsi="Aptos" w:cs="Angsana New"/>
-          <w:color w:val="CCCCCC"/>
-        </w:rPr>
-        <w:t>bash</w:t>
-      </w:r>
-    </w:p>
-    <w:p>
-      <w:pPr>
-        <w:pStyle w:val="HTMLPreformatted"/>
-        <w:pBdr>
-          <w:top w:val="single" w:sz="2" w:space="0" w:color="auto"/>
-          <w:left w:val="single" w:sz="2" w:space="0" w:color="auto"/>
-          <w:bottom w:val="single" w:sz="2" w:space="0" w:color="auto"/>
-          <w:right w:val="single" w:sz="2" w:space="0" w:color="auto"/>
-        </w:pBdr>
-        <w:shd w:val="clear" w:color="auto" w:fill="181818"/>
-        <w:ind w:left="720"/>
-        <w:rPr>
-          <w:rFonts w:ascii="Aptos" w:hAnsi="Aptos" w:cs="Angsana New"/>
-          <w:color w:val="CCCCCC"/>
-        </w:rPr>
-      </w:pPr>
-      <w:r>
-        <w:rPr>
-          <w:rStyle w:val="mtk16"/>
-          <w:rFonts w:ascii="Aptos" w:hAnsi="Aptos" w:cs="Angsana New"/>
-          <w:color w:val="DCDCAA"/>
-          <w:bdr w:val="single" w:sz="2" w:space="0" w:color="auto" w:frame="1"/>
-        </w:rPr>
-        <w:t>docker</w:t>
-      </w:r>
-      <w:r>
-        <w:rPr>
-          <w:rStyle w:val="mtk1"/>
-          <w:rFonts w:ascii="Aptos" w:hAnsi="Aptos" w:cs="Angsana New"/>
-          <w:color w:val="CCCCCC"/>
-          <w:bdr w:val="single" w:sz="2" w:space="0" w:color="auto" w:frame="1"/>
-        </w:rPr>
-        <w:t xml:space="preserve"> </w:t>
-      </w:r>
-      <w:r>
-        <w:rPr>
-          <w:rStyle w:val="mtk12"/>
-          <w:rFonts w:ascii="Aptos" w:hAnsi="Aptos" w:cs="Angsana New"/>
-          <w:color w:val="CE9178"/>
-          <w:bdr w:val="single" w:sz="2" w:space="0" w:color="auto" w:frame="1"/>
-        </w:rPr>
-        <w:t>run</w:t>
-      </w:r>
-      <w:r>
-        <w:rPr>
-          <w:rStyle w:val="mtk1"/>
-          <w:rFonts w:ascii="Aptos" w:hAnsi="Aptos" w:cs="Angsana New"/>
-          <w:color w:val="CCCCCC"/>
-          <w:bdr w:val="single" w:sz="2" w:space="0" w:color="auto" w:frame="1"/>
-        </w:rPr>
-        <w:t xml:space="preserve"> </w:t>
-      </w:r>
-      <w:r>
-        <w:rPr>
-          <w:rStyle w:val="mtk6"/>
-          <w:rFonts w:ascii="Aptos" w:hAnsi="Aptos" w:cs="Angsana New"/>
-          <w:color w:val="569CD6"/>
-          <w:bdr w:val="single" w:sz="2" w:space="0" w:color="auto" w:frame="1"/>
-        </w:rPr>
-        <w:t>-p</w:t>
-      </w:r>
-      <w:r>
-        <w:rPr>
-          <w:rStyle w:val="mtk1"/>
-          <w:rFonts w:ascii="Aptos" w:hAnsi="Aptos" w:cs="Angsana New"/>
-          <w:color w:val="CCCCCC"/>
-          <w:bdr w:val="single" w:sz="2" w:space="0" w:color="auto" w:frame="1"/>
-        </w:rPr>
-        <w:t xml:space="preserve"> </w:t>
-      </w:r>
-      <w:r>
-        <w:rPr>
-          <w:rStyle w:val="mtk12"/>
-          <w:rFonts w:ascii="Aptos" w:hAnsi="Aptos" w:cs="Angsana New"/>
-          <w:color w:val="CE9178"/>
-          <w:bdr w:val="single" w:sz="2" w:space="0" w:color="auto" w:frame="1"/>
-        </w:rPr>
-        <w:t>8000:8000</w:t>
-      </w:r>
-      <w:r>
-        <w:rPr>
-          <w:rStyle w:val="mtk1"/>
-          <w:rFonts w:ascii="Aptos" w:hAnsi="Aptos" w:cs="Angsana New"/>
-          <w:color w:val="CCCCCC"/>
-          <w:bdr w:val="single" w:sz="2" w:space="0" w:color="auto" w:frame="1"/>
-        </w:rPr>
-        <w:t xml:space="preserve"> </w:t>
-      </w:r>
-      <w:r>
-        <w:rPr>
-          <w:rStyle w:val="mtk12"/>
-          <w:rFonts w:ascii="Aptos" w:hAnsi="Aptos" w:cs="Angsana New"/>
-          <w:color w:val="CE9178"/>
-          <w:bdr w:val="single" w:sz="2" w:space="0" w:color="auto" w:frame="1"/>
-        </w:rPr>
-        <w:t>adult-income-api</w:t>
-      </w:r>
-    </w:p>
-    <w:p>
-      <w:pPr>
-        <w:numPr>
-          <w:ilvl w:val="1"/>
-          <w:numId w:val="61"/>
-        </w:numPr>
-        <w:pBdr>
-          <w:top w:val="single" w:sz="2" w:space="0" w:color="auto"/>
-          <w:left w:val="single" w:sz="2" w:space="0" w:color="auto"/>
-          <w:bottom w:val="single" w:sz="2" w:space="0" w:color="auto"/>
-          <w:right w:val="single" w:sz="2" w:space="0" w:color="auto"/>
-        </w:pBdr>
-        <w:shd w:val="clear" w:color="auto" w:fill="181818"/>
-        <w:spacing w:before="100" w:beforeAutospacing="1" w:after="100" w:afterAutospacing="1"/>
-        <w:rPr>
-          <w:rFonts w:ascii="Aptos" w:hAnsi="Aptos" w:cs="Angsana New"/>
-          <w:color w:val="CCCCCC"/>
-          <w:sz w:val="20"/>
-          <w:szCs w:val="20"/>
-        </w:rPr>
-      </w:pPr>
-      <w:r>
-        <w:rPr>
-          <w:rStyle w:val="Strong"/>
-          <w:rFonts w:ascii="Aptos" w:hAnsi="Aptos" w:cs="Angsana New"/>
-          <w:color w:val="CCCCCC"/>
-          <w:sz w:val="20"/>
-          <w:szCs w:val="20"/>
-          <w:bdr w:val="single" w:sz="2" w:space="0" w:color="auto" w:frame="1"/>
-        </w:rPr>
-        <w:t>What it does</w:t>
-      </w:r>
-      <w:r>
-        <w:rPr>
-          <w:rFonts w:ascii="Aptos" w:hAnsi="Aptos" w:cs="Angsana New"/>
-          <w:color w:val="CCCCCC"/>
-          <w:sz w:val="20"/>
-          <w:szCs w:val="20"/>
-        </w:rPr>
-        <w:t>: Boots up the container and exposes it on </w:t>
-      </w:r>
-      <w:r>
-        <w:rPr>
-          <w:rStyle w:val="HTMLCode"/>
-          <w:rFonts w:ascii="Aptos" w:eastAsiaTheme="minorEastAsia" w:hAnsi="Aptos" w:cs="Angsana New"/>
-          <w:color w:val="D0D0D0"/>
-          <w:sz w:val="18"/>
-          <w:szCs w:val="18"/>
-          <w:bdr w:val="single" w:sz="2" w:space="0" w:color="auto" w:frame="1"/>
-          <w:shd w:val="clear" w:color="auto" w:fill="3C3C3C"/>
-        </w:rPr>
-        <w:t>http://localhost:8000</w:t>
-      </w:r>
-      <w:r>
-        <w:rPr>
-          <w:rFonts w:ascii="Aptos" w:hAnsi="Aptos" w:cs="Angsana New"/>
-          <w:color w:val="CCCCCC"/>
-          <w:sz w:val="20"/>
-          <w:szCs w:val="20"/>
-        </w:rPr>
-        <w:t>.</w:t>
-      </w:r>
-    </w:p>
-    <w:p>
-      <w:pPr>
-        <w:pStyle w:val="NormalWeb"/>
-        <w:numPr>
-          <w:ilvl w:val="0"/>
-          <w:numId w:val="61"/>
-        </w:numPr>
-        <w:pBdr>
-          <w:top w:val="single" w:sz="2" w:space="0" w:color="auto"/>
-          <w:left w:val="single" w:sz="2" w:space="0" w:color="auto"/>
-          <w:bottom w:val="single" w:sz="2" w:space="0" w:color="auto"/>
-          <w:right w:val="single" w:sz="2" w:space="0" w:color="auto"/>
-        </w:pBdr>
-        <w:shd w:val="clear" w:color="auto" w:fill="181818"/>
-        <w:spacing w:before="0" w:beforeAutospacing="0" w:after="0" w:afterAutospacing="0"/>
-        <w:rPr>
-          <w:rFonts w:ascii="Aptos" w:hAnsi="Aptos" w:cs="Angsana New"/>
-          <w:color w:val="CCCCCC"/>
-          <w:sz w:val="20"/>
-          <w:szCs w:val="20"/>
-        </w:rPr>
-      </w:pPr>
-      <w:r>
-        <w:rPr>
-          <w:rStyle w:val="Strong"/>
-          <w:rFonts w:ascii="Aptos" w:hAnsi="Aptos" w:cs="Angsana New"/>
-          <w:color w:val="CCCCCC"/>
-          <w:sz w:val="20"/>
-          <w:szCs w:val="20"/>
-          <w:bdr w:val="single" w:sz="2" w:space="0" w:color="auto" w:frame="1"/>
-        </w:rPr>
-        <w:t>Run using Docker Compose</w:t>
-      </w:r>
-      <w:r>
-        <w:rPr>
-          <w:rFonts w:ascii="Aptos" w:hAnsi="Aptos" w:cs="Angsana New"/>
-          <w:color w:val="CCCCCC"/>
-          <w:sz w:val="20"/>
-          <w:szCs w:val="20"/>
-        </w:rPr>
-        <w:t> (combines build and run):</w:t>
-      </w:r>
-    </w:p>
-    <w:p>
-      <w:pPr>
-        <w:pStyle w:val="HTMLPreformatted"/>
-        <w:pBdr>
-          <w:top w:val="single" w:sz="2" w:space="0" w:color="auto"/>
-          <w:left w:val="single" w:sz="2" w:space="0" w:color="auto"/>
-          <w:bottom w:val="single" w:sz="2" w:space="0" w:color="auto"/>
-          <w:right w:val="single" w:sz="2" w:space="0" w:color="auto"/>
-        </w:pBdr>
-        <w:shd w:val="clear" w:color="auto" w:fill="181818"/>
-        <w:ind w:left="720"/>
-        <w:rPr>
-          <w:rFonts w:ascii="Aptos" w:hAnsi="Aptos" w:cs="Angsana New"/>
-          <w:color w:val="CCCCCC"/>
-        </w:rPr>
-      </w:pPr>
-      <w:r>
-        <w:rPr>
-          <w:rFonts w:ascii="Aptos" w:hAnsi="Aptos" w:cs="Angsana New"/>
-          <w:color w:val="CCCCCC"/>
-        </w:rPr>
-        <w:t>bash</w:t>
-      </w:r>
-    </w:p>
-    <w:p>
-      <w:pPr>
-        <w:pStyle w:val="HTMLPreformatted"/>
-        <w:pBdr>
-          <w:top w:val="single" w:sz="2" w:space="0" w:color="auto"/>
-          <w:left w:val="single" w:sz="2" w:space="0" w:color="auto"/>
-          <w:bottom w:val="single" w:sz="2" w:space="0" w:color="auto"/>
-          <w:right w:val="single" w:sz="2" w:space="0" w:color="auto"/>
-        </w:pBdr>
-        <w:shd w:val="clear" w:color="auto" w:fill="181818"/>
-        <w:ind w:left="720"/>
-        <w:rPr>
-          <w:rFonts w:ascii="Aptos" w:hAnsi="Aptos" w:cs="Angsana New"/>
-          <w:color w:val="CCCCCC"/>
-        </w:rPr>
-      </w:pPr>
-      <w:r>
-        <w:rPr>
-          <w:rStyle w:val="mtk16"/>
-          <w:rFonts w:ascii="Aptos" w:hAnsi="Aptos" w:cs="Angsana New"/>
-          <w:color w:val="DCDCAA"/>
-          <w:bdr w:val="single" w:sz="2" w:space="0" w:color="auto" w:frame="1"/>
-        </w:rPr>
-        <w:t>docker-compose</w:t>
-      </w:r>
-      <w:r>
-        <w:rPr>
-          <w:rStyle w:val="mtk1"/>
-          <w:rFonts w:ascii="Aptos" w:hAnsi="Aptos" w:cs="Angsana New"/>
-          <w:color w:val="CCCCCC"/>
-          <w:bdr w:val="single" w:sz="2" w:space="0" w:color="auto" w:frame="1"/>
-        </w:rPr>
-        <w:t xml:space="preserve"> </w:t>
-      </w:r>
-      <w:r>
-        <w:rPr>
-          <w:rStyle w:val="mtk6"/>
-          <w:rFonts w:ascii="Aptos" w:hAnsi="Aptos" w:cs="Angsana New"/>
-          <w:color w:val="569CD6"/>
-          <w:bdr w:val="single" w:sz="2" w:space="0" w:color="auto" w:frame="1"/>
-        </w:rPr>
-        <w:t>-f</w:t>
-      </w:r>
-      <w:r>
-        <w:rPr>
-          <w:rStyle w:val="mtk1"/>
-          <w:rFonts w:ascii="Aptos" w:hAnsi="Aptos" w:cs="Angsana New"/>
-          <w:color w:val="CCCCCC"/>
-          <w:bdr w:val="single" w:sz="2" w:space="0" w:color="auto" w:frame="1"/>
-        </w:rPr>
-        <w:t xml:space="preserve"> </w:t>
-      </w:r>
-      <w:r>
-        <w:rPr>
-          <w:rStyle w:val="mtk12"/>
-          <w:rFonts w:ascii="Aptos" w:hAnsi="Aptos" w:cs="Angsana New"/>
-          <w:color w:val="CE9178"/>
-          <w:bdr w:val="single" w:sz="2" w:space="0" w:color="auto" w:frame="1"/>
-        </w:rPr>
-        <w:t>Q1/docker-compose.yml</w:t>
-      </w:r>
-      <w:r>
-        <w:rPr>
-          <w:rStyle w:val="mtk1"/>
-          <w:rFonts w:ascii="Aptos" w:hAnsi="Aptos" w:cs="Angsana New"/>
-          <w:color w:val="CCCCCC"/>
-          <w:bdr w:val="single" w:sz="2" w:space="0" w:color="auto" w:frame="1"/>
-        </w:rPr>
-        <w:t xml:space="preserve"> </w:t>
-      </w:r>
-      <w:r>
-        <w:rPr>
-          <w:rStyle w:val="mtk12"/>
-          <w:rFonts w:ascii="Aptos" w:hAnsi="Aptos" w:cs="Angsana New"/>
-          <w:color w:val="CE9178"/>
-          <w:bdr w:val="single" w:sz="2" w:space="0" w:color="auto" w:frame="1"/>
-        </w:rPr>
-        <w:t>up</w:t>
-      </w:r>
-      <w:r>
-        <w:rPr>
-          <w:rStyle w:val="mtk1"/>
-          <w:rFonts w:ascii="Aptos" w:hAnsi="Aptos" w:cs="Angsana New"/>
-          <w:color w:val="CCCCCC"/>
-          <w:bdr w:val="single" w:sz="2" w:space="0" w:color="auto" w:frame="1"/>
-        </w:rPr>
-        <w:t xml:space="preserve"> </w:t>
-      </w:r>
-      <w:r>
-        <w:rPr>
-          <w:rStyle w:val="mtk6"/>
-          <w:rFonts w:ascii="Aptos" w:hAnsi="Aptos" w:cs="Angsana New"/>
-          <w:color w:val="569CD6"/>
-          <w:bdr w:val="single" w:sz="2" w:space="0" w:color="auto" w:frame="1"/>
-        </w:rPr>
-        <w:t>--build</w:t>
-      </w:r>
-    </w:p>
-    <w:p>
-      <w:pPr>
-        <w:numPr>
-          <w:ilvl w:val="1"/>
-          <w:numId w:val="61"/>
-        </w:numPr>
-        <w:pBdr>
-          <w:top w:val="single" w:sz="2" w:space="0" w:color="auto"/>
-          <w:left w:val="single" w:sz="2" w:space="0" w:color="auto"/>
-          <w:bottom w:val="single" w:sz="2" w:space="0" w:color="auto"/>
-          <w:right w:val="single" w:sz="2" w:space="0" w:color="auto"/>
-        </w:pBdr>
-        <w:shd w:val="clear" w:color="auto" w:fill="181818"/>
-        <w:spacing w:before="100" w:beforeAutospacing="1" w:after="100" w:afterAutospacing="1"/>
-        <w:rPr>
-          <w:rStyle w:val="context-scope-mention"/>
-          <w:rFonts w:ascii="Aptos" w:hAnsi="Aptos" w:cs="Angsana New"/>
-          <w:sz w:val="20"/>
-          <w:szCs w:val="20"/>
-          <w:bdr w:val="single" w:sz="2" w:space="0" w:color="auto" w:frame="1"/>
-        </w:rPr>
-      </w:pPr>
-      <w:r>
-        <w:rPr>
-          <w:rStyle w:val="Strong"/>
-          <w:rFonts w:ascii="Aptos" w:hAnsi="Aptos" w:cs="Angsana New"/>
-          <w:color w:val="CCCCCC"/>
-          <w:sz w:val="20"/>
-          <w:szCs w:val="20"/>
-          <w:bdr w:val="single" w:sz="2" w:space="0" w:color="auto" w:frame="1"/>
-        </w:rPr>
-        <w:t>What it does</w:t>
-      </w:r>
-      <w:r>
-        <w:rPr>
-          <w:rFonts w:ascii="Aptos" w:hAnsi="Aptos" w:cs="Angsana New"/>
-          <w:color w:val="CCCCCC"/>
-          <w:sz w:val="20"/>
-          <w:szCs w:val="20"/>
-        </w:rPr>
-        <w:t>: Leverages </w:t>
-      </w:r>
-    </w:p>
-    <w:p>
-      <w:pPr>
-        <w:pBdr>
-          <w:top w:val="single" w:sz="2" w:space="0" w:color="auto"/>
-          <w:left w:val="single" w:sz="2" w:space="0" w:color="auto"/>
-          <w:bottom w:val="single" w:sz="2" w:space="0" w:color="auto"/>
-          <w:right w:val="single" w:sz="2" w:space="0" w:color="auto"/>
-        </w:pBdr>
-        <w:shd w:val="clear" w:color="auto" w:fill="181818"/>
-        <w:spacing w:before="100" w:beforeAutospacing="1" w:after="100" w:afterAutospacing="1"/>
-        <w:ind w:left="1440"/>
-        <w:rPr>
-          <w:rFonts w:ascii="Aptos" w:hAnsi="Aptos" w:cs="Angsana New"/>
-        </w:rPr>
-      </w:pPr>
-      <w:r>
-        <w:rPr>
-          <w:rFonts w:ascii="Aptos" w:hAnsi="Aptos" w:cs="Angsana New"/>
-          <w:color w:val="CCCCCC"/>
-          <w:sz w:val="20"/>
-          <w:szCs w:val="20"/>
-          <w:bdr w:val="single" w:sz="2" w:space="0" w:color="auto" w:frame="1"/>
-        </w:rPr>
-        <w:fldChar w:fldCharType="begin"/>
-      </w:r>
-      <w:r>
-        <w:rPr>
-          <w:rFonts w:ascii="Aptos" w:hAnsi="Aptos" w:cs="Angsana New"/>
-          <w:color w:val="CCCCCC"/>
-          <w:sz w:val="20"/>
-          <w:szCs w:val="20"/>
-          <w:bdr w:val="single" w:sz="2" w:space="0" w:color="auto" w:frame="1"/>
-        </w:rPr>
-        <w:instrText xml:space="preserve"> INCLUDEPICTURE "vscode-file://vscode-app/Applications/Antigravity%20IDE.app/Contents/Resources/app/extensions/theme-symbols/src/icons/files/docker.svg" \* MERGEFORMATINET </w:instrText>
-      </w:r>
-      <w:r>
-        <w:rPr>
-          <w:rFonts w:ascii="Aptos" w:hAnsi="Aptos" w:cs="Angsana New"/>
-          <w:color w:val="CCCCCC"/>
-          <w:sz w:val="20"/>
-          <w:szCs w:val="20"/>
-          <w:bdr w:val="single" w:sz="2" w:space="0" w:color="auto" w:frame="1"/>
-        </w:rPr>
-        <w:fldChar w:fldCharType="separate"/>
-      </w:r>
-      <w:r>
-        <w:rPr>
-          <w:rFonts w:ascii="Aptos" w:hAnsi="Aptos" w:cs="Angsana New"/>
-          <w:noProof/>
-          <w:color w:val="CCCCCC"/>
-          <w:sz w:val="20"/>
-          <w:szCs w:val="20"/>
-          <w:bdr w:val="single" w:sz="2" w:space="0" w:color="auto" w:frame="1"/>
-        </w:rPr>
-        <mc:AlternateContent>
-          <mc:Choice Requires="wps">
-            <w:drawing>
-              <wp:inline distT="0" distB="0" distL="0" distR="0" wp14:anchorId="5090FAC8" wp14:editId="4EDF1FAC">
-                <wp:extent cx="302260" cy="302260"/>
-                <wp:effectExtent l="0" t="0" r="0" b="0"/>
-                <wp:docPr id="1987639034" name="Rectangle 1"/>
-                <wp:cNvGraphicFramePr>
-                  <a:graphicFrameLocks xmlns:a="http://schemas.openxmlformats.org/drawingml/2006/main" noChangeAspect="1"/>
-                </wp:cNvGraphicFramePr>
-                <a:graphic xmlns:a="http://schemas.openxmlformats.org/drawingml/2006/main">
-                  <a:graphicData uri="http://schemas.microsoft.com/office/word/2010/wordprocessingShape">
-                    <wps:wsp>
-                      <wps:cNvSpPr>
-                        <a:spLocks noChangeAspect="1" noChangeArrowheads="1"/>
-                      </wps:cNvSpPr>
-                      <wps:spPr bwMode="auto">
-                        <a:xfrm>
-                          <a:off x="0" y="0"/>
-                          <a:ext cx="302260" cy="302260"/>
-                        </a:xfrm>
-                        <a:prstGeom prst="rect">
-                          <a:avLst/>
-                        </a:prstGeom>
-                        <a:noFill/>
-                        <a:ln>
-                          <a:noFill/>
-                        </a:ln>
-                        <a:extLst>
-                          <a:ext uri="{909E8E84-426E-40DD-AFC4-6F175D3DCCD1}">
-                            <a14:hiddenFill xmlns:a14="http://schemas.microsoft.com/office/drawing/2010/main">
-                              <a:solidFill>
-                                <a:srgbClr val="FFFFFF"/>
-                              </a:solidFill>
-                            </a14:hiddenFill>
-                          </a:ext>
-                          <a:ext uri="{91240B29-F687-4F45-9708-019B960494DF}">
-                            <a14:hiddenLine xmlns:a14="http://schemas.microsoft.com/office/drawing/2010/main" w="9525">
-                              <a:solidFill>
-                                <a:srgbClr val="000000"/>
-                              </a:solidFill>
-                              <a:miter lim="800000"/>
-                              <a:headEnd/>
-                              <a:tailEnd/>
-                            </a14:hiddenLine>
-                          </a:ext>
-                        </a:extLst>
-                      </wps:spPr>
-                      <wps:bodyPr rot="0" vert="horz" wrap="square" lIns="91440" tIns="45720" rIns="91440" bIns="45720" anchor="t" anchorCtr="0" upright="1">
-                        <a:noAutofit/>
-                      </wps:bodyPr>
-                    </wps:wsp>
-                  </a:graphicData>
-                </a:graphic>
-              </wp:inline>
-            </w:drawing>
-          </mc:Choice>
-          <mc:Fallback>
-            <w:pict>
-              <v:rect w14:anchorId="6AEA5892" id="Rectangle 1" o:spid="_x0000_s1026" style="width:23.8pt;height:23.8pt;visibility:visible;mso-wrap-style:square;mso-left-percent:-10001;mso-top-percent:-10001;mso-position-horizontal:absolute;mso-position-horizontal-relative:char;mso-position-vertical:absolute;mso-position-vertical-relative:line;mso-left-percent:-10001;mso-top-percent:-10001;v-text-anchor:top" o:gfxdata="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" filled="f" stroked="f">
-                <o:lock v:ext="edit" aspectratio="t"/>
-                <w10:anchorlock/>
-              </v:rect>
-            </w:pict>
-          </mc:Fallback>
-        </mc:AlternateContent>
-      </w:r>
-      <w:r>
-        <w:rPr>
-          <w:rFonts w:ascii="Aptos" w:hAnsi="Aptos" w:cs="Angsana New"/>
-          <w:color w:val="CCCCCC"/>
-          <w:sz w:val="20"/>
-          <w:szCs w:val="20"/>
-          <w:bdr w:val="single" w:sz="2" w:space="0" w:color="auto" w:frame="1"/>
-        </w:rPr>
-        <w:fldChar w:fldCharType="end"/>
-      </w:r>
-    </w:p>
-    <w:p>
-      <w:pPr>
-        <w:pBdr>
-          <w:top w:val="single" w:sz="2" w:space="0" w:color="auto"/>
-          <w:left w:val="single" w:sz="2" w:space="0" w:color="auto"/>
-          <w:bottom w:val="single" w:sz="2" w:space="0" w:color="auto"/>
-          <w:right w:val="single" w:sz="2" w:space="0" w:color="auto"/>
-        </w:pBdr>
-        <w:shd w:val="clear" w:color="auto" w:fill="181818"/>
-        <w:spacing w:before="100" w:beforeAutospacing="1" w:after="100" w:afterAutospacing="1"/>
-        <w:ind w:left="1440"/>
-        <w:rPr>
-          <w:rFonts w:ascii="Aptos" w:hAnsi="Aptos" w:cs="Angsana New"/>
-          <w:color w:val="CCCCCC"/>
-          <w:sz w:val="20"/>
-          <w:szCs w:val="20"/>
-        </w:rPr>
-      </w:pPr>
-      <w:r>
-        <w:rPr>
-          <w:rStyle w:val="inline-flex"/>
-          <w:rFonts w:ascii="Aptos" w:hAnsi="Aptos" w:cs="Angsana New"/>
-          <w:color w:val="CCCCCC"/>
-          <w:sz w:val="20"/>
-          <w:szCs w:val="20"/>
-          <w:bdr w:val="single" w:sz="2" w:space="0" w:color="auto" w:frame="1"/>
-        </w:rPr>
-        <w:t>docker-compose.yml</w:t>
-      </w:r>
-      <w:r>
-        <w:rPr>
-          <w:rFonts w:ascii="Aptos" w:hAnsi="Aptos" w:cs="Angsana New"/>
-          <w:color w:val="CCCCCC"/>
-          <w:sz w:val="20"/>
-          <w:szCs w:val="20"/>
-        </w:rPr>
-        <w:t> to automatically build the container and deploy it with restarts enabled.</w:t>
+        <w:t>1: docker-compose yml</w:t>
       </w:r>
     </w:p>
     <w:p>
       <w:pPr>
         <w:pStyle w:val="BodyText"/>
+        <w:jc w:val="center"/>
         <w:rPr>
           <w:rFonts w:ascii="Aptos" w:hAnsi="Aptos" w:cs="Angsana New"/>
         </w:rPr>
@@ -12275,12 +10773,6 @@
           <w:rFonts w:ascii="Aptos" w:hAnsi="Aptos" w:cs="Angsana New"/>
         </w:rPr>
       </w:pPr>
-      <w:r>
-        <w:rPr>
-          <w:rFonts w:ascii="Aptos" w:hAnsi="Aptos" w:cs="Angsana New"/>
-        </w:rPr>
-        <w:t>Docker Share</w:t>
-      </w:r>
     </w:p>
     <w:p>
       <w:pPr>
@@ -12297,12 +10789,6 @@
           <w:rFonts w:ascii="Aptos" w:hAnsi="Aptos" w:cs="Angsana New"/>
         </w:rPr>
       </w:pPr>
-      <w:r>
-        <w:rPr>
-          <w:rFonts w:ascii="Aptos" w:hAnsi="Aptos" w:cs="Angsana New"/>
-        </w:rPr>
-        <w:t>Local</w:t>
-      </w:r>
     </w:p>
     <w:p>
       <w:pPr>
@@ -12314,564 +10800,6 @@
     </w:p>
     <w:p>
       <w:pPr>
-        <w:numPr>
-          <w:ilvl w:val="0"/>
-          <w:numId w:val="62"/>
-        </w:numPr>
-        <w:pBdr>
-          <w:top w:val="single" w:sz="2" w:space="0" w:color="auto"/>
-          <w:left w:val="single" w:sz="2" w:space="0" w:color="auto"/>
-          <w:bottom w:val="single" w:sz="2" w:space="0" w:color="auto"/>
-          <w:right w:val="single" w:sz="2" w:space="0" w:color="auto"/>
-        </w:pBdr>
-        <w:shd w:val="clear" w:color="auto" w:fill="181818"/>
-        <w:spacing w:before="100" w:beforeAutospacing="1" w:after="100" w:afterAutospacing="1"/>
-        <w:rPr>
-          <w:rFonts w:ascii="Aptos" w:hAnsi="Aptos" w:cs="Angsana New"/>
-          <w:color w:val="CCCCCC"/>
-          <w:sz w:val="20"/>
-          <w:szCs w:val="20"/>
-        </w:rPr>
-      </w:pPr>
-      <w:r>
-        <w:rPr>
-          <w:rStyle w:val="Strong"/>
-          <w:rFonts w:ascii="Aptos" w:hAnsi="Aptos" w:cs="Angsana New"/>
-          <w:color w:val="CCCCCC"/>
-          <w:sz w:val="20"/>
-          <w:szCs w:val="20"/>
-          <w:bdr w:val="single" w:sz="2" w:space="0" w:color="auto" w:frame="1"/>
-        </w:rPr>
-        <w:t>On your current machine</w:t>
-      </w:r>
-      <w:r>
-        <w:rPr>
-          <w:rFonts w:ascii="Aptos" w:hAnsi="Aptos" w:cs="Angsana New"/>
-          <w:color w:val="CCCCCC"/>
-          <w:sz w:val="20"/>
-          <w:szCs w:val="20"/>
-        </w:rPr>
-        <w:t>, save the image to a </w:t>
-      </w:r>
-      <w:r>
-        <w:rPr>
-          <w:rStyle w:val="HTMLCode"/>
-          <w:rFonts w:ascii="Aptos" w:hAnsi="Aptos" w:cs="Angsana New"/>
-          <w:color w:val="D0D0D0"/>
-          <w:sz w:val="18"/>
-          <w:szCs w:val="18"/>
-          <w:bdr w:val="single" w:sz="2" w:space="0" w:color="auto" w:frame="1"/>
-          <w:shd w:val="clear" w:color="auto" w:fill="3C3C3C"/>
-        </w:rPr>
-        <w:t>.tar</w:t>
-      </w:r>
-      <w:r>
-        <w:rPr>
-          <w:rFonts w:ascii="Aptos" w:hAnsi="Aptos" w:cs="Angsana New"/>
-          <w:color w:val="CCCCCC"/>
-          <w:sz w:val="20"/>
-          <w:szCs w:val="20"/>
-        </w:rPr>
-        <w:t> archive file:</w:t>
-      </w:r>
-    </w:p>
-    <w:p>
-      <w:pPr>
-        <w:pStyle w:val="HTMLPreformatted"/>
-        <w:pBdr>
-          <w:top w:val="single" w:sz="2" w:space="0" w:color="auto"/>
-          <w:left w:val="single" w:sz="2" w:space="0" w:color="auto"/>
-          <w:bottom w:val="single" w:sz="2" w:space="0" w:color="auto"/>
-          <w:right w:val="single" w:sz="2" w:space="0" w:color="auto"/>
-        </w:pBdr>
-        <w:shd w:val="clear" w:color="auto" w:fill="181818"/>
-        <w:ind w:left="720"/>
-        <w:rPr>
-          <w:rFonts w:ascii="Aptos" w:hAnsi="Aptos" w:cs="Angsana New"/>
-          <w:color w:val="CCCCCC"/>
-        </w:rPr>
-      </w:pPr>
-      <w:r>
-        <w:rPr>
-          <w:rFonts w:ascii="Aptos" w:hAnsi="Aptos" w:cs="Angsana New"/>
-          <w:color w:val="CCCCCC"/>
-        </w:rPr>
-        <w:t>bash</w:t>
-      </w:r>
-    </w:p>
-    <w:p>
-      <w:pPr>
-        <w:pStyle w:val="HTMLPreformatted"/>
-        <w:pBdr>
-          <w:top w:val="single" w:sz="2" w:space="0" w:color="auto"/>
-          <w:left w:val="single" w:sz="2" w:space="0" w:color="auto"/>
-          <w:bottom w:val="single" w:sz="2" w:space="0" w:color="auto"/>
-          <w:right w:val="single" w:sz="2" w:space="0" w:color="auto"/>
-        </w:pBdr>
-        <w:shd w:val="clear" w:color="auto" w:fill="181818"/>
-        <w:ind w:left="720"/>
-        <w:rPr>
-          <w:rFonts w:ascii="Aptos" w:hAnsi="Aptos" w:cs="Angsana New"/>
-          <w:color w:val="CCCCCC"/>
-        </w:rPr>
-      </w:pPr>
-      <w:r>
-        <w:rPr>
-          <w:rStyle w:val="mtk16"/>
-          <w:rFonts w:ascii="Aptos" w:hAnsi="Aptos" w:cs="Angsana New"/>
-          <w:color w:val="DCDCAA"/>
-          <w:bdr w:val="single" w:sz="2" w:space="0" w:color="auto" w:frame="1"/>
-        </w:rPr>
-        <w:t>docker</w:t>
-      </w:r>
-      <w:r>
-        <w:rPr>
-          <w:rStyle w:val="mtk1"/>
-          <w:rFonts w:ascii="Aptos" w:hAnsi="Aptos" w:cs="Angsana New"/>
-          <w:color w:val="CCCCCC"/>
-          <w:bdr w:val="single" w:sz="2" w:space="0" w:color="auto" w:frame="1"/>
-        </w:rPr>
-        <w:t xml:space="preserve"> </w:t>
-      </w:r>
-      <w:r>
-        <w:rPr>
-          <w:rStyle w:val="mtk12"/>
-          <w:rFonts w:ascii="Aptos" w:hAnsi="Aptos" w:cs="Angsana New"/>
-          <w:color w:val="CE9178"/>
-          <w:bdr w:val="single" w:sz="2" w:space="0" w:color="auto" w:frame="1"/>
-        </w:rPr>
-        <w:t>save</w:t>
-      </w:r>
-      <w:r>
-        <w:rPr>
-          <w:rStyle w:val="mtk1"/>
-          <w:rFonts w:ascii="Aptos" w:hAnsi="Aptos" w:cs="Angsana New"/>
-          <w:color w:val="CCCCCC"/>
-          <w:bdr w:val="single" w:sz="2" w:space="0" w:color="auto" w:frame="1"/>
-        </w:rPr>
-        <w:t xml:space="preserve"> </w:t>
-      </w:r>
-      <w:r>
-        <w:rPr>
-          <w:rStyle w:val="mtk6"/>
-          <w:rFonts w:ascii="Aptos" w:hAnsi="Aptos" w:cs="Angsana New"/>
-          <w:color w:val="569CD6"/>
-          <w:bdr w:val="single" w:sz="2" w:space="0" w:color="auto" w:frame="1"/>
-        </w:rPr>
-        <w:t>-o</w:t>
-      </w:r>
-      <w:r>
-        <w:rPr>
-          <w:rStyle w:val="mtk1"/>
-          <w:rFonts w:ascii="Aptos" w:hAnsi="Aptos" w:cs="Angsana New"/>
-          <w:color w:val="CCCCCC"/>
-          <w:bdr w:val="single" w:sz="2" w:space="0" w:color="auto" w:frame="1"/>
-        </w:rPr>
-        <w:t xml:space="preserve"> </w:t>
-      </w:r>
-      <w:r>
-        <w:rPr>
-          <w:rStyle w:val="mtk12"/>
-          <w:rFonts w:ascii="Aptos" w:hAnsi="Aptos" w:cs="Angsana New"/>
-          <w:color w:val="CE9178"/>
-          <w:bdr w:val="single" w:sz="2" w:space="0" w:color="auto" w:frame="1"/>
-        </w:rPr>
-        <w:t>adult-income-api.tar</w:t>
-      </w:r>
-      <w:r>
-        <w:rPr>
-          <w:rStyle w:val="mtk1"/>
-          <w:rFonts w:ascii="Aptos" w:hAnsi="Aptos" w:cs="Angsana New"/>
-          <w:color w:val="CCCCCC"/>
-          <w:bdr w:val="single" w:sz="2" w:space="0" w:color="auto" w:frame="1"/>
-        </w:rPr>
-        <w:t xml:space="preserve"> </w:t>
-      </w:r>
-      <w:r>
-        <w:rPr>
-          <w:rStyle w:val="mtk12"/>
-          <w:rFonts w:ascii="Aptos" w:hAnsi="Aptos" w:cs="Angsana New"/>
-          <w:color w:val="CE9178"/>
-          <w:bdr w:val="single" w:sz="2" w:space="0" w:color="auto" w:frame="1"/>
-        </w:rPr>
-        <w:t>adult-income-prediction-api:latest</w:t>
-      </w:r>
-    </w:p>
-    <w:p>
-      <w:pPr>
-        <w:numPr>
-          <w:ilvl w:val="0"/>
-          <w:numId w:val="62"/>
-        </w:numPr>
-        <w:pBdr>
-          <w:top w:val="single" w:sz="2" w:space="0" w:color="auto"/>
-          <w:left w:val="single" w:sz="2" w:space="0" w:color="auto"/>
-          <w:bottom w:val="single" w:sz="2" w:space="0" w:color="auto"/>
-          <w:right w:val="single" w:sz="2" w:space="0" w:color="auto"/>
-        </w:pBdr>
-        <w:shd w:val="clear" w:color="auto" w:fill="181818"/>
-        <w:spacing w:before="100" w:beforeAutospacing="1" w:after="100" w:afterAutospacing="1"/>
-        <w:rPr>
-          <w:rFonts w:ascii="Aptos" w:hAnsi="Aptos" w:cs="Angsana New"/>
-          <w:color w:val="CCCCCC"/>
-          <w:sz w:val="20"/>
-          <w:szCs w:val="20"/>
-        </w:rPr>
-      </w:pPr>
-      <w:r>
-        <w:rPr>
-          <w:rStyle w:val="Strong"/>
-          <w:rFonts w:ascii="Aptos" w:hAnsi="Aptos" w:cs="Angsana New"/>
-          <w:color w:val="CCCCCC"/>
-          <w:sz w:val="20"/>
-          <w:szCs w:val="20"/>
-          <w:bdr w:val="single" w:sz="2" w:space="0" w:color="auto" w:frame="1"/>
-        </w:rPr>
-        <w:t>Transfer</w:t>
-      </w:r>
-      <w:r>
-        <w:rPr>
-          <w:rFonts w:ascii="Aptos" w:hAnsi="Aptos" w:cs="Angsana New"/>
-          <w:color w:val="CCCCCC"/>
-          <w:sz w:val="20"/>
-          <w:szCs w:val="20"/>
-        </w:rPr>
-        <w:t> the </w:t>
-      </w:r>
-      <w:r>
-        <w:rPr>
-          <w:rStyle w:val="HTMLCode"/>
-          <w:rFonts w:ascii="Aptos" w:hAnsi="Aptos" w:cs="Angsana New"/>
-          <w:color w:val="D0D0D0"/>
-          <w:sz w:val="18"/>
-          <w:szCs w:val="18"/>
-          <w:bdr w:val="single" w:sz="2" w:space="0" w:color="auto" w:frame="1"/>
-          <w:shd w:val="clear" w:color="auto" w:fill="3C3C3C"/>
-        </w:rPr>
-        <w:t>adult-income-api.tar</w:t>
-      </w:r>
-      <w:r>
-        <w:rPr>
-          <w:rFonts w:ascii="Aptos" w:hAnsi="Aptos" w:cs="Angsana New"/>
-          <w:color w:val="CCCCCC"/>
-          <w:sz w:val="20"/>
-          <w:szCs w:val="20"/>
-        </w:rPr>
-        <w:t> file to the destination machine.</w:t>
-      </w:r>
-    </w:p>
-    <w:p>
-      <w:pPr>
-        <w:numPr>
-          <w:ilvl w:val="0"/>
-          <w:numId w:val="62"/>
-        </w:numPr>
-        <w:pBdr>
-          <w:top w:val="single" w:sz="2" w:space="0" w:color="auto"/>
-          <w:left w:val="single" w:sz="2" w:space="0" w:color="auto"/>
-          <w:bottom w:val="single" w:sz="2" w:space="0" w:color="auto"/>
-          <w:right w:val="single" w:sz="2" w:space="0" w:color="auto"/>
-        </w:pBdr>
-        <w:shd w:val="clear" w:color="auto" w:fill="181818"/>
-        <w:spacing w:before="100" w:beforeAutospacing="1" w:after="100" w:afterAutospacing="1"/>
-        <w:rPr>
-          <w:rFonts w:ascii="Aptos" w:hAnsi="Aptos" w:cs="Angsana New"/>
-          <w:color w:val="CCCCCC"/>
-          <w:sz w:val="20"/>
-          <w:szCs w:val="20"/>
-        </w:rPr>
-      </w:pPr>
-      <w:r>
-        <w:rPr>
-          <w:rStyle w:val="Strong"/>
-          <w:rFonts w:ascii="Aptos" w:hAnsi="Aptos" w:cs="Angsana New"/>
-          <w:color w:val="CCCCCC"/>
-          <w:sz w:val="20"/>
-          <w:szCs w:val="20"/>
-          <w:bdr w:val="single" w:sz="2" w:space="0" w:color="auto" w:frame="1"/>
-        </w:rPr>
-        <w:t>On the target machine</w:t>
-      </w:r>
-      <w:r>
-        <w:rPr>
-          <w:rFonts w:ascii="Aptos" w:hAnsi="Aptos" w:cs="Angsana New"/>
-          <w:color w:val="CCCCCC"/>
-          <w:sz w:val="20"/>
-          <w:szCs w:val="20"/>
-        </w:rPr>
-        <w:t> (with Docker running), load the image:</w:t>
-      </w:r>
-    </w:p>
-    <w:p>
-      <w:pPr>
-        <w:pStyle w:val="HTMLPreformatted"/>
-        <w:pBdr>
-          <w:top w:val="single" w:sz="2" w:space="0" w:color="auto"/>
-          <w:left w:val="single" w:sz="2" w:space="0" w:color="auto"/>
-          <w:bottom w:val="single" w:sz="2" w:space="0" w:color="auto"/>
-          <w:right w:val="single" w:sz="2" w:space="0" w:color="auto"/>
-        </w:pBdr>
-        <w:shd w:val="clear" w:color="auto" w:fill="181818"/>
-        <w:ind w:left="720"/>
-        <w:rPr>
-          <w:rFonts w:ascii="Aptos" w:hAnsi="Aptos" w:cs="Angsana New"/>
-          <w:color w:val="CCCCCC"/>
-        </w:rPr>
-      </w:pPr>
-      <w:r>
-        <w:rPr>
-          <w:rFonts w:ascii="Aptos" w:hAnsi="Aptos" w:cs="Angsana New"/>
-          <w:color w:val="CCCCCC"/>
-        </w:rPr>
-        <w:t>bash</w:t>
-      </w:r>
-    </w:p>
-    <w:p>
-      <w:pPr>
-        <w:pStyle w:val="HTMLPreformatted"/>
-        <w:pBdr>
-          <w:top w:val="single" w:sz="2" w:space="0" w:color="auto"/>
-          <w:left w:val="single" w:sz="2" w:space="0" w:color="auto"/>
-          <w:bottom w:val="single" w:sz="2" w:space="0" w:color="auto"/>
-          <w:right w:val="single" w:sz="2" w:space="0" w:color="auto"/>
-        </w:pBdr>
-        <w:shd w:val="clear" w:color="auto" w:fill="181818"/>
-        <w:ind w:left="720"/>
-        <w:rPr>
-          <w:rFonts w:ascii="Aptos" w:hAnsi="Aptos" w:cs="Angsana New"/>
-          <w:color w:val="CCCCCC"/>
-        </w:rPr>
-      </w:pPr>
-      <w:r>
-        <w:rPr>
-          <w:rStyle w:val="mtk16"/>
-          <w:rFonts w:ascii="Aptos" w:hAnsi="Aptos" w:cs="Angsana New"/>
-          <w:color w:val="DCDCAA"/>
-          <w:bdr w:val="single" w:sz="2" w:space="0" w:color="auto" w:frame="1"/>
-        </w:rPr>
-        <w:t>docker</w:t>
-      </w:r>
-      <w:r>
-        <w:rPr>
-          <w:rStyle w:val="mtk1"/>
-          <w:rFonts w:ascii="Aptos" w:hAnsi="Aptos" w:cs="Angsana New"/>
-          <w:color w:val="CCCCCC"/>
-          <w:bdr w:val="single" w:sz="2" w:space="0" w:color="auto" w:frame="1"/>
-        </w:rPr>
-        <w:t xml:space="preserve"> </w:t>
-      </w:r>
-      <w:r>
-        <w:rPr>
-          <w:rStyle w:val="mtk12"/>
-          <w:rFonts w:ascii="Aptos" w:hAnsi="Aptos" w:cs="Angsana New"/>
-          <w:color w:val="CE9178"/>
-          <w:bdr w:val="single" w:sz="2" w:space="0" w:color="auto" w:frame="1"/>
-        </w:rPr>
-        <w:t>load</w:t>
-      </w:r>
-      <w:r>
-        <w:rPr>
-          <w:rStyle w:val="mtk1"/>
-          <w:rFonts w:ascii="Aptos" w:hAnsi="Aptos" w:cs="Angsana New"/>
-          <w:color w:val="CCCCCC"/>
-          <w:bdr w:val="single" w:sz="2" w:space="0" w:color="auto" w:frame="1"/>
-        </w:rPr>
-        <w:t xml:space="preserve"> </w:t>
-      </w:r>
-      <w:r>
-        <w:rPr>
-          <w:rStyle w:val="mtk6"/>
-          <w:rFonts w:ascii="Aptos" w:hAnsi="Aptos" w:cs="Angsana New"/>
-          <w:color w:val="569CD6"/>
-          <w:bdr w:val="single" w:sz="2" w:space="0" w:color="auto" w:frame="1"/>
-        </w:rPr>
-        <w:t>-i</w:t>
-      </w:r>
-      <w:r>
-        <w:rPr>
-          <w:rStyle w:val="mtk1"/>
-          <w:rFonts w:ascii="Aptos" w:hAnsi="Aptos" w:cs="Angsana New"/>
-          <w:color w:val="CCCCCC"/>
-          <w:bdr w:val="single" w:sz="2" w:space="0" w:color="auto" w:frame="1"/>
-        </w:rPr>
-        <w:t xml:space="preserve"> </w:t>
-      </w:r>
-      <w:r>
-        <w:rPr>
-          <w:rStyle w:val="mtk12"/>
-          <w:rFonts w:ascii="Aptos" w:hAnsi="Aptos" w:cs="Angsana New"/>
-          <w:color w:val="CE9178"/>
-          <w:bdr w:val="single" w:sz="2" w:space="0" w:color="auto" w:frame="1"/>
-        </w:rPr>
-        <w:t>adult-income-api.tar</w:t>
-      </w:r>
-    </w:p>
-    <w:p>
-      <w:pPr>
-        <w:numPr>
-          <w:ilvl w:val="0"/>
-          <w:numId w:val="62"/>
-        </w:numPr>
-        <w:pBdr>
-          <w:top w:val="single" w:sz="2" w:space="0" w:color="auto"/>
-          <w:left w:val="single" w:sz="2" w:space="0" w:color="auto"/>
-          <w:bottom w:val="single" w:sz="2" w:space="0" w:color="auto"/>
-          <w:right w:val="single" w:sz="2" w:space="0" w:color="auto"/>
-        </w:pBdr>
-        <w:shd w:val="clear" w:color="auto" w:fill="181818"/>
-        <w:spacing w:before="100" w:beforeAutospacing="1" w:after="100" w:afterAutospacing="1"/>
-        <w:rPr>
-          <w:rFonts w:ascii="Aptos" w:hAnsi="Aptos" w:cs="Angsana New"/>
-          <w:color w:val="CCCCCC"/>
-          <w:sz w:val="20"/>
-          <w:szCs w:val="20"/>
-        </w:rPr>
-      </w:pPr>
-      <w:r>
-        <w:rPr>
-          <w:rStyle w:val="Strong"/>
-          <w:rFonts w:ascii="Aptos" w:hAnsi="Aptos" w:cs="Angsana New"/>
-          <w:color w:val="CCCCCC"/>
-          <w:sz w:val="20"/>
-          <w:szCs w:val="20"/>
-          <w:bdr w:val="single" w:sz="2" w:space="0" w:color="auto" w:frame="1"/>
-        </w:rPr>
-        <w:t>Run</w:t>
-      </w:r>
-      <w:r>
-        <w:rPr>
-          <w:rFonts w:ascii="Aptos" w:hAnsi="Aptos" w:cs="Angsana New"/>
-          <w:color w:val="CCCCCC"/>
-          <w:sz w:val="20"/>
-          <w:szCs w:val="20"/>
-        </w:rPr>
-        <w:t> the container on the target machine:</w:t>
-      </w:r>
-    </w:p>
-    <w:p>
-      <w:pPr>
-        <w:pStyle w:val="HTMLPreformatted"/>
-        <w:pBdr>
-          <w:top w:val="single" w:sz="2" w:space="0" w:color="auto"/>
-          <w:left w:val="single" w:sz="2" w:space="0" w:color="auto"/>
-          <w:bottom w:val="single" w:sz="2" w:space="0" w:color="auto"/>
-          <w:right w:val="single" w:sz="2" w:space="0" w:color="auto"/>
-        </w:pBdr>
-        <w:shd w:val="clear" w:color="auto" w:fill="181818"/>
-        <w:ind w:left="720"/>
-        <w:rPr>
-          <w:rFonts w:ascii="Aptos" w:hAnsi="Aptos" w:cs="Angsana New"/>
-          <w:color w:val="CCCCCC"/>
-        </w:rPr>
-      </w:pPr>
-      <w:r>
-        <w:rPr>
-          <w:rFonts w:ascii="Aptos" w:hAnsi="Aptos" w:cs="Angsana New"/>
-          <w:color w:val="CCCCCC"/>
-        </w:rPr>
-        <w:t>bash</w:t>
-      </w:r>
-    </w:p>
-    <w:p>
-      <w:pPr>
-        <w:pStyle w:val="HTMLPreformatted"/>
-        <w:pBdr>
-          <w:top w:val="single" w:sz="2" w:space="0" w:color="auto"/>
-          <w:left w:val="single" w:sz="2" w:space="0" w:color="auto"/>
-          <w:bottom w:val="single" w:sz="2" w:space="0" w:color="auto"/>
-          <w:right w:val="single" w:sz="2" w:space="0" w:color="auto"/>
-        </w:pBdr>
-        <w:shd w:val="clear" w:color="auto" w:fill="181818"/>
-        <w:ind w:left="720"/>
-        <w:rPr>
-          <w:rFonts w:ascii="Aptos" w:hAnsi="Aptos" w:cs="Angsana New"/>
-          <w:color w:val="CCCCCC"/>
-        </w:rPr>
-      </w:pPr>
-      <w:r>
-        <w:rPr>
-          <w:rStyle w:val="mtk16"/>
-          <w:rFonts w:ascii="Aptos" w:hAnsi="Aptos" w:cs="Angsana New"/>
-          <w:color w:val="DCDCAA"/>
-          <w:bdr w:val="single" w:sz="2" w:space="0" w:color="auto" w:frame="1"/>
-        </w:rPr>
-        <w:t>docker</w:t>
-      </w:r>
-      <w:r>
-        <w:rPr>
-          <w:rStyle w:val="mtk1"/>
-          <w:rFonts w:ascii="Aptos" w:hAnsi="Aptos" w:cs="Angsana New"/>
-          <w:color w:val="CCCCCC"/>
-          <w:bdr w:val="single" w:sz="2" w:space="0" w:color="auto" w:frame="1"/>
-        </w:rPr>
-        <w:t xml:space="preserve"> </w:t>
-      </w:r>
-      <w:r>
-        <w:rPr>
-          <w:rStyle w:val="mtk12"/>
-          <w:rFonts w:ascii="Aptos" w:hAnsi="Aptos" w:cs="Angsana New"/>
-          <w:color w:val="CE9178"/>
-          <w:bdr w:val="single" w:sz="2" w:space="0" w:color="auto" w:frame="1"/>
-        </w:rPr>
-        <w:t>run</w:t>
-      </w:r>
-      <w:r>
-        <w:rPr>
-          <w:rStyle w:val="mtk1"/>
-          <w:rFonts w:ascii="Aptos" w:hAnsi="Aptos" w:cs="Angsana New"/>
-          <w:color w:val="CCCCCC"/>
-          <w:bdr w:val="single" w:sz="2" w:space="0" w:color="auto" w:frame="1"/>
-        </w:rPr>
-        <w:t xml:space="preserve"> </w:t>
-      </w:r>
-      <w:r>
-        <w:rPr>
-          <w:rStyle w:val="mtk6"/>
-          <w:rFonts w:ascii="Aptos" w:hAnsi="Aptos" w:cs="Angsana New"/>
-          <w:color w:val="569CD6"/>
-          <w:bdr w:val="single" w:sz="2" w:space="0" w:color="auto" w:frame="1"/>
-        </w:rPr>
-        <w:t>-p</w:t>
-      </w:r>
-      <w:r>
-        <w:rPr>
-          <w:rStyle w:val="mtk1"/>
-          <w:rFonts w:ascii="Aptos" w:hAnsi="Aptos" w:cs="Angsana New"/>
-          <w:color w:val="CCCCCC"/>
-          <w:bdr w:val="single" w:sz="2" w:space="0" w:color="auto" w:frame="1"/>
-        </w:rPr>
-        <w:t xml:space="preserve"> </w:t>
-      </w:r>
-      <w:r>
-        <w:rPr>
-          <w:rStyle w:val="mtk12"/>
-          <w:rFonts w:ascii="Aptos" w:hAnsi="Aptos" w:cs="Angsana New"/>
-          <w:color w:val="CE9178"/>
-          <w:bdr w:val="single" w:sz="2" w:space="0" w:color="auto" w:frame="1"/>
-        </w:rPr>
-        <w:t>8000:8000</w:t>
-      </w:r>
-      <w:r>
-        <w:rPr>
-          <w:rStyle w:val="mtk1"/>
-          <w:rFonts w:ascii="Aptos" w:hAnsi="Aptos" w:cs="Angsana New"/>
-          <w:color w:val="CCCCCC"/>
-          <w:bdr w:val="single" w:sz="2" w:space="0" w:color="auto" w:frame="1"/>
-        </w:rPr>
-        <w:t xml:space="preserve"> </w:t>
-      </w:r>
-      <w:r>
-        <w:rPr>
-          <w:rStyle w:val="mtk12"/>
-          <w:rFonts w:ascii="Aptos" w:hAnsi="Aptos" w:cs="Angsana New"/>
-          <w:color w:val="CE9178"/>
-          <w:bdr w:val="single" w:sz="2" w:space="0" w:color="auto" w:frame="1"/>
-        </w:rPr>
-        <w:t>adult-income-prediction-api:latest</w:t>
-      </w:r>
-    </w:p>
-    <w:p>
-      <w:pPr>
         <w:pStyle w:val="BodyText"/>
         <w:rPr>
           <w:rFonts w:ascii="Aptos" w:hAnsi="Aptos" w:cs="Angsana New"/>
@@ -12893,12 +10821,46 @@
           <w:rFonts w:ascii="Aptos" w:hAnsi="Aptos" w:cs="Angsana New"/>
         </w:rPr>
       </w:pPr>
-      <w:r>
-        <w:rPr>
-          <w:rFonts w:ascii="Aptos" w:hAnsi="Aptos" w:cs="Angsana New"/>
-        </w:rPr>
-        <w:t>∂</w:t>
-      </w:r>
+    </w:p>
+    <w:p>
+      <w:pPr>
+        <w:pStyle w:val="BodyText"/>
+        <w:rPr>
+          <w:rFonts w:ascii="Aptos" w:hAnsi="Aptos" w:cs="Angsana New"/>
+        </w:rPr>
+      </w:pPr>
+    </w:p>
+    <w:p>
+      <w:pPr>
+        <w:pStyle w:val="BodyText"/>
+        <w:rPr>
+          <w:rFonts w:ascii="Aptos" w:hAnsi="Aptos" w:cs="Angsana New"/>
+        </w:rPr>
+      </w:pPr>
+    </w:p>
+    <w:p>
+      <w:pPr>
+        <w:pStyle w:val="BodyText"/>
+        <w:rPr>
+          <w:rFonts w:ascii="Aptos" w:hAnsi="Aptos" w:cs="Angsana New"/>
+        </w:rPr>
+      </w:pPr>
+    </w:p>
+    <w:p>
+      <w:pPr>
+        <w:pStyle w:val="BodyText"/>
+        <w:rPr>
+          <w:rFonts w:ascii="Aptos" w:hAnsi="Aptos" w:cs="Angsana New"/>
+        </w:rPr>
+      </w:pPr>
+    </w:p>
+    <w:p>
+      <w:pPr>
+        <w:pStyle w:val="BodyText"/>
+        <w:rPr>
+          <w:rFonts w:ascii="Aptos" w:hAnsi="Aptos" w:cs="Angsana New"/>
+        </w:rPr>
+      </w:pPr>
     </w:p>
     <w:sectPr>
       <w:pgSz w:w="11906" w:h="16838"/>
@@ -13577,6 +11539,95 @@
     </w:lvl>
   </w:abstractNum>
   <w:abstractNum w:abstractNumId="6" w15:restartNumberingAfterBreak="0">
+    <w:nsid w:val="09B6400A"/>
+    <w:multiLevelType w:val="hybridMultilevel"/>
+    <w:tmpl w:val="5AD4FBBA"/>
+    <w:lvl w:ilvl="0" w:tplc="0809000F">
+      <w:start w:val="1"/>
+      <w:numFmt w:val="decimal"/>
+      <w:lvlText w:val="%1."/>
+      <w:lvlJc w:val="left"/>
+      <w:pPr>
+        <w:ind w:left="720" w:hanging="360"/>
+      </w:pPr>
+      <w:rPr>
+        <w:rFonts w:hint="default"/>
+      </w:rPr>
+    </w:lvl>
+    <w:lvl w:ilvl="1" w:tplc="08090019">
+      <w:start w:val="1"/>
+      <w:numFmt w:val="lowerLetter"/>
+      <w:lvlText w:val="%2."/>
+      <w:lvlJc w:val="left"/>
+      <w:pPr>
+        <w:ind w:left="1440" w:hanging="360"/>
+      </w:pPr>
+    </w:lvl>
+    <w:lvl w:ilvl="2" w:tplc="0809001B" w:tentative="1">
+      <w:start w:val="1"/>
+      <w:numFmt w:val="lowerRoman"/>
+      <w:lvlText w:val="%3."/>
+      <w:lvlJc w:val="right"/>
+      <w:pPr>
+        <w:ind w:left="2160" w:hanging="180"/>
+      </w:pPr>
+    </w:lvl>
+    <w:lvl w:ilvl="3" w:tplc="0809000F" w:tentative="1">
+      <w:start w:val="1"/>
+      <w:numFmt w:val="decimal"/>
+      <w:lvlText w:val="%4."/>
+      <w:lvlJc w:val="left"/>
+      <w:pPr>
+        <w:ind w:left="2880" w:hanging="360"/>
+      </w:pPr>
+    </w:lvl>
+    <w:lvl w:ilvl="4" w:tplc="08090019" w:tentative="1">
+      <w:start w:val="1"/>
+      <w:numFmt w:val="lowerLetter"/>
+      <w:lvlText w:val="%5."/>
+      <w:lvlJc w:val="left"/>
+      <w:pPr>
+        <w:ind w:left="3600" w:hanging="360"/>
+      </w:pPr>
+    </w:lvl>
+    <w:lvl w:ilvl="5" w:tplc="0809001B" w:tentative="1">
+      <w:start w:val="1"/>
+      <w:numFmt w:val="lowerRoman"/>
+      <w:lvlText w:val="%6."/>
+      <w:lvlJc w:val="right"/>
+      <w:pPr>
+        <w:ind w:left="4320" w:hanging="180"/>
+      </w:pPr>
+    </w:lvl>
+    <w:lvl w:ilvl="6" w:tplc="0809000F" w:tentative="1">
+      <w:start w:val="1"/>
+      <w:numFmt w:val="decimal"/>
+      <w:lvlText w:val="%7."/>
+      <w:lvlJc w:val="left"/>
+      <w:pPr>
+        <w:ind w:left="5040" w:hanging="360"/>
+      </w:pPr>
+    </w:lvl>
+    <w:lvl w:ilvl="7" w:tplc="08090019" w:tentative="1">
+      <w:start w:val="1"/>
+      <w:numFmt w:val="lowerLetter"/>
+      <w:lvlText w:val="%8."/>
+      <w:lvlJc w:val="left"/>
+      <w:pPr>
+        <w:ind w:left="5760" w:hanging="360"/>
+      </w:pPr>
+    </w:lvl>
+    <w:lvl w:ilvl="8" w:tplc="0809001B" w:tentative="1">
+      <w:start w:val="1"/>
+      <w:numFmt w:val="lowerRoman"/>
+      <w:lvlText w:val="%9."/>
+      <w:lvlJc w:val="right"/>
+      <w:pPr>
+        <w:ind w:left="6480" w:hanging="180"/>
+      </w:pPr>
+    </w:lvl>
+  </w:abstractNum>
+  <w:abstractNum w:abstractNumId="7" w15:restartNumberingAfterBreak="0">
     <w:nsid w:val="0BEA3F5F"/>
     <w:multiLevelType w:val="multilevel"/>
     <w:tmpl w:val="D95C38D0"/>
@@ -13689,7 +11740,7 @@
       </w:pPr>
     </w:lvl>
   </w:abstractNum>
-  <w:abstractNum w:abstractNumId="7" w15:restartNumberingAfterBreak="0">
+  <w:abstractNum w:abstractNumId="8" w15:restartNumberingAfterBreak="0">
     <w:nsid w:val="0F723653"/>
     <w:multiLevelType w:val="hybridMultilevel"/>
     <w:tmpl w:val="9B96719A"/>
@@ -13775,7 +11826,7 @@
       </w:pPr>
     </w:lvl>
   </w:abstractNum>
-  <w:abstractNum w:abstractNumId="8" w15:restartNumberingAfterBreak="0">
+  <w:abstractNum w:abstractNumId="9" w15:restartNumberingAfterBreak="0">
     <w:nsid w:val="140A0A72"/>
     <w:multiLevelType w:val="multilevel"/>
     <w:tmpl w:val="3AE6F6DE"/>
@@ -13888,7 +11939,7 @@
       </w:pPr>
     </w:lvl>
   </w:abstractNum>
-  <w:abstractNum w:abstractNumId="9" w15:restartNumberingAfterBreak="0">
+  <w:abstractNum w:abstractNumId="10" w15:restartNumberingAfterBreak="0">
     <w:nsid w:val="152C6DF0"/>
     <w:multiLevelType w:val="multilevel"/>
     <w:tmpl w:val="C6EC08BA"/>
@@ -14037,7 +12088,7 @@
       </w:rPr>
     </w:lvl>
   </w:abstractNum>
-  <w:abstractNum w:abstractNumId="10" w15:restartNumberingAfterBreak="0">
+  <w:abstractNum w:abstractNumId="11" w15:restartNumberingAfterBreak="0">
     <w:nsid w:val="165A2156"/>
     <w:multiLevelType w:val="multilevel"/>
     <w:tmpl w:val="40D0C17E"/>
@@ -14186,7 +12237,7 @@
       </w:rPr>
     </w:lvl>
   </w:abstractNum>
-  <w:abstractNum w:abstractNumId="11" w15:restartNumberingAfterBreak="0">
+  <w:abstractNum w:abstractNumId="12" w15:restartNumberingAfterBreak="0">
     <w:nsid w:val="19296353"/>
     <w:multiLevelType w:val="hybridMultilevel"/>
     <w:tmpl w:val="49ACDB06"/>
@@ -14300,7 +12351,7 @@
       </w:rPr>
     </w:lvl>
   </w:abstractNum>
-  <w:abstractNum w:abstractNumId="12" w15:restartNumberingAfterBreak="0">
+  <w:abstractNum w:abstractNumId="13" w15:restartNumberingAfterBreak="0">
     <w:nsid w:val="1AF0283E"/>
     <w:multiLevelType w:val="multilevel"/>
     <w:tmpl w:val="F7425054"/>
@@ -14413,7 +12464,7 @@
       </w:pPr>
     </w:lvl>
   </w:abstractNum>
-  <w:abstractNum w:abstractNumId="13" w15:restartNumberingAfterBreak="0">
+  <w:abstractNum w:abstractNumId="14" w15:restartNumberingAfterBreak="0">
     <w:nsid w:val="1E7779C4"/>
     <w:multiLevelType w:val="hybridMultilevel"/>
     <w:tmpl w:val="6F5A4240"/>
@@ -14499,7 +12550,7 @@
       </w:pPr>
     </w:lvl>
   </w:abstractNum>
-  <w:abstractNum w:abstractNumId="14" w15:restartNumberingAfterBreak="0">
+  <w:abstractNum w:abstractNumId="15" w15:restartNumberingAfterBreak="0">
     <w:nsid w:val="20AE70D9"/>
     <w:multiLevelType w:val="multilevel"/>
     <w:tmpl w:val="17B6E6B8"/>
@@ -14639,7 +12690,7 @@
       </w:rPr>
     </w:lvl>
   </w:abstractNum>
-  <w:abstractNum w:abstractNumId="15" w15:restartNumberingAfterBreak="0">
+  <w:abstractNum w:abstractNumId="16" w15:restartNumberingAfterBreak="0">
     <w:nsid w:val="20DD6CA6"/>
     <w:multiLevelType w:val="hybridMultilevel"/>
     <w:tmpl w:val="E92CCC3C"/>
@@ -14725,7 +12776,7 @@
       </w:pPr>
     </w:lvl>
   </w:abstractNum>
-  <w:abstractNum w:abstractNumId="16" w15:restartNumberingAfterBreak="0">
+  <w:abstractNum w:abstractNumId="17" w15:restartNumberingAfterBreak="0">
     <w:nsid w:val="228D2141"/>
     <w:multiLevelType w:val="hybridMultilevel"/>
     <w:tmpl w:val="F66AEBAA"/>
@@ -14811,7 +12862,7 @@
       </w:pPr>
     </w:lvl>
   </w:abstractNum>
-  <w:abstractNum w:abstractNumId="17" w15:restartNumberingAfterBreak="0">
+  <w:abstractNum w:abstractNumId="18" w15:restartNumberingAfterBreak="0">
     <w:nsid w:val="23831269"/>
     <w:multiLevelType w:val="hybridMultilevel"/>
     <w:tmpl w:val="D24C40E8"/>
@@ -14897,7 +12948,7 @@
       </w:pPr>
     </w:lvl>
   </w:abstractNum>
-  <w:abstractNum w:abstractNumId="18" w15:restartNumberingAfterBreak="0">
+  <w:abstractNum w:abstractNumId="19" w15:restartNumberingAfterBreak="0">
     <w:nsid w:val="27B4661F"/>
     <w:multiLevelType w:val="hybridMultilevel"/>
     <w:tmpl w:val="4CB89B40"/>
@@ -14986,7 +13037,7 @@
       </w:pPr>
     </w:lvl>
   </w:abstractNum>
-  <w:abstractNum w:abstractNumId="19" w15:restartNumberingAfterBreak="0">
+  <w:abstractNum w:abstractNumId="20" w15:restartNumberingAfterBreak="0">
     <w:nsid w:val="28DD64D0"/>
     <w:multiLevelType w:val="multilevel"/>
     <w:tmpl w:val="B84E2224"/>
@@ -15126,7 +13177,7 @@
       </w:rPr>
     </w:lvl>
   </w:abstractNum>
-  <w:abstractNum w:abstractNumId="20" w15:restartNumberingAfterBreak="0">
+  <w:abstractNum w:abstractNumId="21" w15:restartNumberingAfterBreak="0">
     <w:nsid w:val="292C3BC6"/>
     <w:multiLevelType w:val="multilevel"/>
     <w:tmpl w:val="CA744F16"/>
@@ -15266,7 +13317,7 @@
       </w:rPr>
     </w:lvl>
   </w:abstractNum>
-  <w:abstractNum w:abstractNumId="21" w15:restartNumberingAfterBreak="0">
+  <w:abstractNum w:abstractNumId="22" w15:restartNumberingAfterBreak="0">
     <w:nsid w:val="29D04CD5"/>
     <w:multiLevelType w:val="multilevel"/>
     <w:tmpl w:val="76BC96D4"/>
@@ -15406,7 +13457,7 @@
       </w:rPr>
     </w:lvl>
   </w:abstractNum>
-  <w:abstractNum w:abstractNumId="22" w15:restartNumberingAfterBreak="0">
+  <w:abstractNum w:abstractNumId="23" w15:restartNumberingAfterBreak="0">
     <w:nsid w:val="2CC94DA2"/>
     <w:multiLevelType w:val="multilevel"/>
     <w:tmpl w:val="45E0056A"/>
@@ -15527,7 +13578,7 @@
       </w:pPr>
     </w:lvl>
   </w:abstractNum>
-  <w:abstractNum w:abstractNumId="23" w15:restartNumberingAfterBreak="0">
+  <w:abstractNum w:abstractNumId="24" w15:restartNumberingAfterBreak="0">
     <w:nsid w:val="2E774A7B"/>
     <w:multiLevelType w:val="multilevel"/>
     <w:tmpl w:val="2A44F1CE"/>
@@ -15667,7 +13718,7 @@
       </w:rPr>
     </w:lvl>
   </w:abstractNum>
-  <w:abstractNum w:abstractNumId="24" w15:restartNumberingAfterBreak="0">
+  <w:abstractNum w:abstractNumId="25" w15:restartNumberingAfterBreak="0">
     <w:nsid w:val="2EE24CB3"/>
     <w:multiLevelType w:val="hybridMultilevel"/>
     <w:tmpl w:val="A8B6CB94"/>
@@ -15781,7 +13832,7 @@
       </w:rPr>
     </w:lvl>
   </w:abstractNum>
-  <w:abstractNum w:abstractNumId="25" w15:restartNumberingAfterBreak="0">
+  <w:abstractNum w:abstractNumId="26" w15:restartNumberingAfterBreak="0">
     <w:nsid w:val="2F7A13C3"/>
     <w:multiLevelType w:val="hybridMultilevel"/>
     <w:tmpl w:val="9B96719A"/>
@@ -15867,7 +13918,7 @@
       </w:pPr>
     </w:lvl>
   </w:abstractNum>
-  <w:abstractNum w:abstractNumId="26" w15:restartNumberingAfterBreak="0">
+  <w:abstractNum w:abstractNumId="27" w15:restartNumberingAfterBreak="0">
     <w:nsid w:val="2FC838BD"/>
     <w:multiLevelType w:val="hybridMultilevel"/>
     <w:tmpl w:val="9B96719A"/>
@@ -15953,7 +14004,7 @@
       </w:pPr>
     </w:lvl>
   </w:abstractNum>
-  <w:abstractNum w:abstractNumId="27" w15:restartNumberingAfterBreak="0">
+  <w:abstractNum w:abstractNumId="28" w15:restartNumberingAfterBreak="0">
     <w:nsid w:val="301C5C6E"/>
     <w:multiLevelType w:val="hybridMultilevel"/>
     <w:tmpl w:val="3F1EB2FE"/>
@@ -16039,7 +14090,7 @@
       </w:pPr>
     </w:lvl>
   </w:abstractNum>
-  <w:abstractNum w:abstractNumId="28" w15:restartNumberingAfterBreak="0">
+  <w:abstractNum w:abstractNumId="29" w15:restartNumberingAfterBreak="0">
     <w:nsid w:val="343060AA"/>
     <w:multiLevelType w:val="hybridMultilevel"/>
     <w:tmpl w:val="309C4EEE"/>
@@ -16125,7 +14176,7 @@
       </w:pPr>
     </w:lvl>
   </w:abstractNum>
-  <w:abstractNum w:abstractNumId="29" w15:restartNumberingAfterBreak="0">
+  <w:abstractNum w:abstractNumId="30" w15:restartNumberingAfterBreak="0">
     <w:nsid w:val="3688439B"/>
     <w:multiLevelType w:val="hybridMultilevel"/>
     <w:tmpl w:val="7D2EE680"/>
@@ -16214,7 +14265,7 @@
       </w:pPr>
     </w:lvl>
   </w:abstractNum>
-  <w:abstractNum w:abstractNumId="30" w15:restartNumberingAfterBreak="0">
+  <w:abstractNum w:abstractNumId="31" w15:restartNumberingAfterBreak="0">
     <w:nsid w:val="3B94696D"/>
     <w:multiLevelType w:val="hybridMultilevel"/>
     <w:tmpl w:val="6D68C3A2"/>
@@ -16328,7 +14379,7 @@
       </w:rPr>
     </w:lvl>
   </w:abstractNum>
-  <w:abstractNum w:abstractNumId="31" w15:restartNumberingAfterBreak="0">
+  <w:abstractNum w:abstractNumId="32" w15:restartNumberingAfterBreak="0">
     <w:nsid w:val="3CF96E84"/>
     <w:multiLevelType w:val="hybridMultilevel"/>
     <w:tmpl w:val="6F5A4240"/>
@@ -16414,7 +14465,7 @@
       </w:pPr>
     </w:lvl>
   </w:abstractNum>
-  <w:abstractNum w:abstractNumId="32" w15:restartNumberingAfterBreak="0">
+  <w:abstractNum w:abstractNumId="33" w15:restartNumberingAfterBreak="0">
     <w:nsid w:val="3D522993"/>
     <w:multiLevelType w:val="multilevel"/>
     <w:tmpl w:val="587A946C"/>
@@ -16563,7 +14614,7 @@
       </w:rPr>
     </w:lvl>
   </w:abstractNum>
-  <w:abstractNum w:abstractNumId="33" w15:restartNumberingAfterBreak="0">
+  <w:abstractNum w:abstractNumId="34" w15:restartNumberingAfterBreak="0">
     <w:nsid w:val="41593F0F"/>
     <w:multiLevelType w:val="hybridMultilevel"/>
     <w:tmpl w:val="9B96719A"/>
@@ -16649,7 +14700,7 @@
       </w:pPr>
     </w:lvl>
   </w:abstractNum>
-  <w:abstractNum w:abstractNumId="34" w15:restartNumberingAfterBreak="0">
+  <w:abstractNum w:abstractNumId="35" w15:restartNumberingAfterBreak="0">
     <w:nsid w:val="42B150AE"/>
     <w:multiLevelType w:val="hybridMultilevel"/>
     <w:tmpl w:val="9B96719A"/>
@@ -16735,7 +14786,7 @@
       </w:pPr>
     </w:lvl>
   </w:abstractNum>
-  <w:abstractNum w:abstractNumId="35" w15:restartNumberingAfterBreak="0">
+  <w:abstractNum w:abstractNumId="36" w15:restartNumberingAfterBreak="0">
     <w:nsid w:val="42D52088"/>
     <w:multiLevelType w:val="hybridMultilevel"/>
     <w:tmpl w:val="778A69FE"/>
@@ -16849,7 +14900,7 @@
       </w:rPr>
     </w:lvl>
   </w:abstractNum>
-  <w:abstractNum w:abstractNumId="36" w15:restartNumberingAfterBreak="0">
+  <w:abstractNum w:abstractNumId="37" w15:restartNumberingAfterBreak="0">
     <w:nsid w:val="44216B3E"/>
     <w:multiLevelType w:val="multilevel"/>
     <w:tmpl w:val="DDA22A5E"/>
@@ -16986,7 +15037,7 @@
       </w:rPr>
     </w:lvl>
   </w:abstractNum>
-  <w:abstractNum w:abstractNumId="37" w15:restartNumberingAfterBreak="0">
+  <w:abstractNum w:abstractNumId="38" w15:restartNumberingAfterBreak="0">
     <w:nsid w:val="53702BD6"/>
     <w:multiLevelType w:val="hybridMultilevel"/>
     <w:tmpl w:val="373AFA12"/>
@@ -17075,7 +15126,7 @@
       </w:pPr>
     </w:lvl>
   </w:abstractNum>
-  <w:abstractNum w:abstractNumId="38" w15:restartNumberingAfterBreak="0">
+  <w:abstractNum w:abstractNumId="39" w15:restartNumberingAfterBreak="0">
     <w:nsid w:val="537506E6"/>
     <w:multiLevelType w:val="multilevel"/>
     <w:tmpl w:val="BCE88726"/>
@@ -17215,7 +15266,7 @@
       </w:rPr>
     </w:lvl>
   </w:abstractNum>
-  <w:abstractNum w:abstractNumId="39" w15:restartNumberingAfterBreak="0">
+  <w:abstractNum w:abstractNumId="40" w15:restartNumberingAfterBreak="0">
     <w:nsid w:val="53A3586F"/>
     <w:multiLevelType w:val="hybridMultilevel"/>
     <w:tmpl w:val="A0569A98"/>
@@ -17310,7 +15361,7 @@
       </w:pPr>
     </w:lvl>
   </w:abstractNum>
-  <w:abstractNum w:abstractNumId="40" w15:restartNumberingAfterBreak="0">
+  <w:abstractNum w:abstractNumId="41" w15:restartNumberingAfterBreak="0">
     <w:nsid w:val="54452864"/>
     <w:multiLevelType w:val="hybridMultilevel"/>
     <w:tmpl w:val="9E78C98E"/>
@@ -17423,7 +15474,7 @@
       </w:rPr>
     </w:lvl>
   </w:abstractNum>
-  <w:abstractNum w:abstractNumId="41" w15:restartNumberingAfterBreak="0">
+  <w:abstractNum w:abstractNumId="42" w15:restartNumberingAfterBreak="0">
     <w:nsid w:val="57ED5547"/>
     <w:multiLevelType w:val="multilevel"/>
     <w:tmpl w:val="B38A48C4"/>
@@ -17563,7 +15614,93 @@
       </w:rPr>
     </w:lvl>
   </w:abstractNum>
-  <w:abstractNum w:abstractNumId="42" w15:restartNumberingAfterBreak="0">
+  <w:abstractNum w:abstractNumId="43" w15:restartNumberingAfterBreak="0">
+    <w:nsid w:val="5AC32B88"/>
+    <w:multiLevelType w:val="hybridMultilevel"/>
+    <w:tmpl w:val="748C87A0"/>
+    <w:lvl w:ilvl="0" w:tplc="0809000F">
+      <w:start w:val="1"/>
+      <w:numFmt w:val="decimal"/>
+      <w:lvlText w:val="%1."/>
+      <w:lvlJc w:val="left"/>
+      <w:pPr>
+        <w:ind w:left="720" w:hanging="360"/>
+      </w:pPr>
+    </w:lvl>
+    <w:lvl w:ilvl="1" w:tplc="08090019" w:tentative="1">
+      <w:start w:val="1"/>
+      <w:numFmt w:val="lowerLetter"/>
+      <w:lvlText w:val="%2."/>
+      <w:lvlJc w:val="left"/>
+      <w:pPr>
+        <w:ind w:left="1440" w:hanging="360"/>
+      </w:pPr>
+    </w:lvl>
+    <w:lvl w:ilvl="2" w:tplc="0809001B" w:tentative="1">
+      <w:start w:val="1"/>
+      <w:numFmt w:val="lowerRoman"/>
+      <w:lvlText w:val="%3."/>
+      <w:lvlJc w:val="right"/>
+      <w:pPr>
+        <w:ind w:left="2160" w:hanging="180"/>
+      </w:pPr>
+    </w:lvl>
+    <w:lvl w:ilvl="3" w:tplc="0809000F" w:tentative="1">
+      <w:start w:val="1"/>
+      <w:numFmt w:val="decimal"/>
+      <w:lvlText w:val="%4."/>
+      <w:lvlJc w:val="left"/>
+      <w:pPr>
+        <w:ind w:left="2880" w:hanging="360"/>
+      </w:pPr>
+    </w:lvl>
+    <w:lvl w:ilvl="4" w:tplc="08090019" w:tentative="1">
+      <w:start w:val="1"/>
+      <w:numFmt w:val="lowerLetter"/>
+      <w:lvlText w:val="%5."/>
+      <w:lvlJc w:val="left"/>
+      <w:pPr>
+        <w:ind w:left="3600" w:hanging="360"/>
+      </w:pPr>
+    </w:lvl>
+    <w:lvl w:ilvl="5" w:tplc="0809001B" w:tentative="1">
+      <w:start w:val="1"/>
+      <w:numFmt w:val="lowerRoman"/>
+      <w:lvlText w:val="%6."/>
+      <w:lvlJc w:val="right"/>
+      <w:pPr>
+        <w:ind w:left="4320" w:hanging="180"/>
+      </w:pPr>
+    </w:lvl>
+    <w:lvl w:ilvl="6" w:tplc="0809000F" w:tentative="1">
+      <w:start w:val="1"/>
+      <w:numFmt w:val="decimal"/>
+      <w:lvlText w:val="%7."/>
+      <w:lvlJc w:val="left"/>
+      <w:pPr>
+        <w:ind w:left="5040" w:hanging="360"/>
+      </w:pPr>
+    </w:lvl>
+    <w:lvl w:ilvl="7" w:tplc="08090019" w:tentative="1">
+      <w:start w:val="1"/>
+      <w:numFmt w:val="lowerLetter"/>
+      <w:lvlText w:val="%8."/>
+      <w:lvlJc w:val="left"/>
+      <w:pPr>
+        <w:ind w:left="5760" w:hanging="360"/>
+      </w:pPr>
+    </w:lvl>
+    <w:lvl w:ilvl="8" w:tplc="0809001B" w:tentative="1">
+      <w:start w:val="1"/>
+      <w:numFmt w:val="lowerRoman"/>
+      <w:lvlText w:val="%9."/>
+      <w:lvlJc w:val="right"/>
+      <w:pPr>
+        <w:ind w:left="6480" w:hanging="180"/>
+      </w:pPr>
+    </w:lvl>
+  </w:abstractNum>
+  <w:abstractNum w:abstractNumId="44" w15:restartNumberingAfterBreak="0">
     <w:nsid w:val="5FE76B91"/>
     <w:multiLevelType w:val="hybridMultilevel"/>
     <w:tmpl w:val="F5869F58"/>
@@ -17653,7 +15790,7 @@
       </w:pPr>
     </w:lvl>
   </w:abstractNum>
-  <w:abstractNum w:abstractNumId="43" w15:restartNumberingAfterBreak="0">
+  <w:abstractNum w:abstractNumId="45" w15:restartNumberingAfterBreak="0">
     <w:nsid w:val="60E342C7"/>
     <w:multiLevelType w:val="multilevel"/>
     <w:tmpl w:val="1EB209EC"/>
@@ -17778,7 +15915,7 @@
       </w:pPr>
     </w:lvl>
   </w:abstractNum>
-  <w:abstractNum w:abstractNumId="44" w15:restartNumberingAfterBreak="0">
+  <w:abstractNum w:abstractNumId="46" w15:restartNumberingAfterBreak="0">
     <w:nsid w:val="67C36222"/>
     <w:multiLevelType w:val="hybridMultilevel"/>
     <w:tmpl w:val="FB3CB0AC"/>
@@ -17867,7 +16004,7 @@
       </w:pPr>
     </w:lvl>
   </w:abstractNum>
-  <w:abstractNum w:abstractNumId="45" w15:restartNumberingAfterBreak="0">
+  <w:abstractNum w:abstractNumId="47" w15:restartNumberingAfterBreak="0">
     <w:nsid w:val="68A13AFA"/>
     <w:multiLevelType w:val="multilevel"/>
     <w:tmpl w:val="9D8ED202"/>
@@ -18007,7 +16144,7 @@
       </w:rPr>
     </w:lvl>
   </w:abstractNum>
-  <w:abstractNum w:abstractNumId="46" w15:restartNumberingAfterBreak="0">
+  <w:abstractNum w:abstractNumId="48" w15:restartNumberingAfterBreak="0">
     <w:nsid w:val="6A3306C0"/>
     <w:multiLevelType w:val="hybridMultilevel"/>
     <w:tmpl w:val="2E303AD2"/>
@@ -18121,7 +16258,7 @@
       </w:rPr>
     </w:lvl>
   </w:abstractNum>
-  <w:abstractNum w:abstractNumId="47" w15:restartNumberingAfterBreak="0">
+  <w:abstractNum w:abstractNumId="49" w15:restartNumberingAfterBreak="0">
     <w:nsid w:val="6EA919B6"/>
     <w:multiLevelType w:val="multilevel"/>
     <w:tmpl w:val="FBFC98EE"/>
@@ -18261,7 +16398,7 @@
       </w:rPr>
     </w:lvl>
   </w:abstractNum>
-  <w:abstractNum w:abstractNumId="48" w15:restartNumberingAfterBreak="0">
+  <w:abstractNum w:abstractNumId="50" w15:restartNumberingAfterBreak="0">
     <w:nsid w:val="720E469D"/>
     <w:multiLevelType w:val="hybridMultilevel"/>
     <w:tmpl w:val="8A847CAE"/>
@@ -18350,7 +16487,7 @@
       </w:pPr>
     </w:lvl>
   </w:abstractNum>
-  <w:abstractNum w:abstractNumId="49" w15:restartNumberingAfterBreak="0">
+  <w:abstractNum w:abstractNumId="51" w15:restartNumberingAfterBreak="0">
     <w:nsid w:val="72282641"/>
     <w:multiLevelType w:val="hybridMultilevel"/>
     <w:tmpl w:val="7EF4B7E0"/>
@@ -18464,7 +16601,7 @@
       </w:rPr>
     </w:lvl>
   </w:abstractNum>
-  <w:abstractNum w:abstractNumId="50" w15:restartNumberingAfterBreak="0">
+  <w:abstractNum w:abstractNumId="52" w15:restartNumberingAfterBreak="0">
     <w:nsid w:val="7236607D"/>
     <w:multiLevelType w:val="multilevel"/>
     <w:tmpl w:val="33C21AF4"/>
@@ -18595,7 +16732,7 @@
       </w:rPr>
     </w:lvl>
   </w:abstractNum>
-  <w:abstractNum w:abstractNumId="51" w15:restartNumberingAfterBreak="0">
+  <w:abstractNum w:abstractNumId="53" w15:restartNumberingAfterBreak="0">
     <w:nsid w:val="77751C34"/>
     <w:multiLevelType w:val="hybridMultilevel"/>
     <w:tmpl w:val="93B03718"/>
@@ -18684,7 +16821,7 @@
       </w:pPr>
     </w:lvl>
   </w:abstractNum>
-  <w:abstractNum w:abstractNumId="52" w15:restartNumberingAfterBreak="0">
+  <w:abstractNum w:abstractNumId="54" w15:restartNumberingAfterBreak="0">
     <w:nsid w:val="77A13E6C"/>
     <w:multiLevelType w:val="hybridMultilevel"/>
     <w:tmpl w:val="E24619C8"/>
@@ -18779,7 +16916,7 @@
       </w:pPr>
     </w:lvl>
   </w:abstractNum>
-  <w:abstractNum w:abstractNumId="53" w15:restartNumberingAfterBreak="0">
+  <w:abstractNum w:abstractNumId="55" w15:restartNumberingAfterBreak="0">
     <w:nsid w:val="78A40B1D"/>
     <w:multiLevelType w:val="multilevel"/>
     <w:tmpl w:val="1AC2EB18"/>
@@ -18919,7 +17056,7 @@
       </w:rPr>
     </w:lvl>
   </w:abstractNum>
-  <w:abstractNum w:abstractNumId="54" w15:restartNumberingAfterBreak="0">
+  <w:abstractNum w:abstractNumId="56" w15:restartNumberingAfterBreak="0">
     <w:nsid w:val="79F162FB"/>
     <w:multiLevelType w:val="multilevel"/>
     <w:tmpl w:val="0C321464"/>
@@ -19059,7 +17196,7 @@
       </w:rPr>
     </w:lvl>
   </w:abstractNum>
-  <w:abstractNum w:abstractNumId="55" w15:restartNumberingAfterBreak="0">
+  <w:abstractNum w:abstractNumId="57" w15:restartNumberingAfterBreak="0">
     <w:nsid w:val="7C970EC7"/>
     <w:multiLevelType w:val="hybridMultilevel"/>
     <w:tmpl w:val="7D2EE680"/>
@@ -19148,7 +17285,7 @@
       </w:pPr>
     </w:lvl>
   </w:abstractNum>
-  <w:abstractNum w:abstractNumId="56" w15:restartNumberingAfterBreak="0">
+  <w:abstractNum w:abstractNumId="58" w15:restartNumberingAfterBreak="0">
     <w:nsid w:val="7F3605F0"/>
     <w:multiLevelType w:val="multilevel"/>
     <w:tmpl w:val="0B484776"/>
@@ -19288,7 +17425,7 @@
       </w:rPr>
     </w:lvl>
   </w:abstractNum>
-  <w:abstractNum w:abstractNumId="57" w15:restartNumberingAfterBreak="0">
+  <w:abstractNum w:abstractNumId="59" w15:restartNumberingAfterBreak="0">
     <w:nsid w:val="7FF24A2E"/>
     <w:multiLevelType w:val="hybridMultilevel"/>
     <w:tmpl w:val="AA284BB2"/>
@@ -19379,232 +17516,247 @@
     </w:lvl>
   </w:abstractNum>
   <w:num w:numId="1" w16cid:durableId="462768859">
-    <w:abstractNumId w:val="43"/>
+    <w:abstractNumId w:val="45"/>
   </w:num>
   <w:num w:numId="2" w16cid:durableId="534851259">
-    <w:abstractNumId w:val="14"/>
+    <w:abstractNumId w:val="15"/>
   </w:num>
   <w:num w:numId="3" w16cid:durableId="754977449">
+    <w:abstractNumId w:val="22"/>
+  </w:num>
+  <w:num w:numId="4" w16cid:durableId="2071151317">
+    <w:abstractNumId w:val="39"/>
+  </w:num>
+  <w:num w:numId="5" w16cid:durableId="1569268375">
+    <w:abstractNumId w:val="58"/>
+  </w:num>
+  <w:num w:numId="6" w16cid:durableId="1342007254">
+    <w:abstractNumId w:val="47"/>
+  </w:num>
+  <w:num w:numId="7" w16cid:durableId="935209781">
     <w:abstractNumId w:val="21"/>
   </w:num>
-  <w:num w:numId="4" w16cid:durableId="2071151317">
-    <w:abstractNumId w:val="38"/>
+  <w:num w:numId="8" w16cid:durableId="393507632">
+    <w:abstractNumId w:val="24"/>
   </w:num>
-  <w:num w:numId="5" w16cid:durableId="1569268375">
+  <w:num w:numId="9" w16cid:durableId="1732313751">
+    <w:abstractNumId w:val="42"/>
+  </w:num>
+  <w:num w:numId="10" w16cid:durableId="1929850215">
+    <w:abstractNumId w:val="49"/>
+  </w:num>
+  <w:num w:numId="11" w16cid:durableId="624845372">
+    <w:abstractNumId w:val="20"/>
+  </w:num>
+  <w:num w:numId="12" w16cid:durableId="407583010">
+    <w:abstractNumId w:val="55"/>
+  </w:num>
+  <w:num w:numId="13" w16cid:durableId="750663636">
     <w:abstractNumId w:val="56"/>
   </w:num>
-  <w:num w:numId="6" w16cid:durableId="1342007254">
-    <w:abstractNumId w:val="45"/>
-  </w:num>
-  <w:num w:numId="7" w16cid:durableId="935209781">
-    <w:abstractNumId w:val="20"/>
-  </w:num>
-  <w:num w:numId="8" w16cid:durableId="393507632">
-    <w:abstractNumId w:val="23"/>
-  </w:num>
-  <w:num w:numId="9" w16cid:durableId="1732313751">
-    <w:abstractNumId w:val="41"/>
-  </w:num>
-  <w:num w:numId="10" w16cid:durableId="1929850215">
-    <w:abstractNumId w:val="47"/>
-  </w:num>
-  <w:num w:numId="11" w16cid:durableId="624845372">
-    <w:abstractNumId w:val="19"/>
-  </w:num>
-  <w:num w:numId="12" w16cid:durableId="407583010">
-    <w:abstractNumId w:val="53"/>
-  </w:num>
-  <w:num w:numId="13" w16cid:durableId="750663636">
-    <w:abstractNumId w:val="54"/>
-  </w:num>
   <w:num w:numId="14" w16cid:durableId="1026060989">
-    <w:abstractNumId w:val="12"/>
+    <w:abstractNumId w:val="13"/>
   </w:num>
   <w:num w:numId="15" w16cid:durableId="670109320">
-    <w:abstractNumId w:val="24"/>
+    <w:abstractNumId w:val="25"/>
   </w:num>
   <w:num w:numId="16" w16cid:durableId="1566524494">
-    <w:abstractNumId w:val="27"/>
+    <w:abstractNumId w:val="28"/>
   </w:num>
   <w:num w:numId="17" w16cid:durableId="2041972332">
-    <w:abstractNumId w:val="13"/>
+    <w:abstractNumId w:val="14"/>
   </w:num>
   <w:num w:numId="18" w16cid:durableId="1397167982">
     <w:abstractNumId w:val="3"/>
   </w:num>
   <w:num w:numId="19" w16cid:durableId="153645313">
-    <w:abstractNumId w:val="31"/>
+    <w:abstractNumId w:val="32"/>
   </w:num>
   <w:num w:numId="20" w16cid:durableId="1506895684">
-    <w:abstractNumId w:val="37"/>
+    <w:abstractNumId w:val="38"/>
   </w:num>
   <w:num w:numId="21" w16cid:durableId="264191240">
-    <w:abstractNumId w:val="22"/>
+    <w:abstractNumId w:val="23"/>
   </w:num>
   <w:num w:numId="22" w16cid:durableId="1217857422">
     <w:abstractNumId w:val="2"/>
   </w:num>
   <w:num w:numId="23" w16cid:durableId="178354707">
-    <w:abstractNumId w:val="16"/>
+    <w:abstractNumId w:val="17"/>
     <w:lvlOverride w:ilvl="0">
       <w:startOverride w:val="1"/>
     </w:lvlOverride>
   </w:num>
   <w:num w:numId="24" w16cid:durableId="883636844">
-    <w:abstractNumId w:val="52"/>
+    <w:abstractNumId w:val="54"/>
     <w:lvlOverride w:ilvl="0">
       <w:startOverride w:val="1"/>
     </w:lvlOverride>
   </w:num>
   <w:num w:numId="25" w16cid:durableId="1517230823">
-    <w:abstractNumId w:val="29"/>
+    <w:abstractNumId w:val="30"/>
   </w:num>
   <w:num w:numId="26" w16cid:durableId="198737806">
-    <w:abstractNumId w:val="30"/>
+    <w:abstractNumId w:val="31"/>
   </w:num>
   <w:num w:numId="27" w16cid:durableId="1970436380">
-    <w:abstractNumId w:val="42"/>
+    <w:abstractNumId w:val="44"/>
   </w:num>
   <w:num w:numId="28" w16cid:durableId="1109744282">
-    <w:abstractNumId w:val="7"/>
+    <w:abstractNumId w:val="8"/>
   </w:num>
   <w:num w:numId="29" w16cid:durableId="1596595425">
+    <w:abstractNumId w:val="35"/>
+  </w:num>
+  <w:num w:numId="30" w16cid:durableId="1092163475">
+    <w:abstractNumId w:val="16"/>
+  </w:num>
+  <w:num w:numId="31" w16cid:durableId="1638341705">
+    <w:abstractNumId w:val="26"/>
+  </w:num>
+  <w:num w:numId="32" w16cid:durableId="99614821">
+    <w:abstractNumId w:val="59"/>
+  </w:num>
+  <w:num w:numId="33" w16cid:durableId="1972857697">
     <w:abstractNumId w:val="34"/>
   </w:num>
-  <w:num w:numId="30" w16cid:durableId="1092163475">
-    <w:abstractNumId w:val="15"/>
-  </w:num>
-  <w:num w:numId="31" w16cid:durableId="1638341705">
-    <w:abstractNumId w:val="25"/>
-  </w:num>
-  <w:num w:numId="32" w16cid:durableId="99614821">
-    <w:abstractNumId w:val="57"/>
-  </w:num>
-  <w:num w:numId="33" w16cid:durableId="1972857697">
-    <w:abstractNumId w:val="33"/>
-  </w:num>
   <w:num w:numId="34" w16cid:durableId="2055888871">
-    <w:abstractNumId w:val="26"/>
+    <w:abstractNumId w:val="27"/>
   </w:num>
   <w:num w:numId="35" w16cid:durableId="2124761692">
     <w:abstractNumId w:val="1"/>
   </w:num>
   <w:num w:numId="36" w16cid:durableId="921449534">
-    <w:abstractNumId w:val="36"/>
+    <w:abstractNumId w:val="37"/>
   </w:num>
   <w:num w:numId="37" w16cid:durableId="1249339732">
-    <w:abstractNumId w:val="43"/>
+    <w:abstractNumId w:val="45"/>
   </w:num>
   <w:num w:numId="38" w16cid:durableId="901332559">
-    <w:abstractNumId w:val="11"/>
+    <w:abstractNumId w:val="12"/>
   </w:num>
   <w:num w:numId="39" w16cid:durableId="226458378">
     <w:abstractNumId w:val="0"/>
   </w:num>
   <w:num w:numId="40" w16cid:durableId="1691839389">
-    <w:abstractNumId w:val="35"/>
+    <w:abstractNumId w:val="36"/>
   </w:num>
   <w:num w:numId="41" w16cid:durableId="1257639454">
-    <w:abstractNumId w:val="43"/>
+    <w:abstractNumId w:val="45"/>
   </w:num>
   <w:num w:numId="42" w16cid:durableId="196894282">
     <w:abstractNumId w:val="5"/>
   </w:num>
   <w:num w:numId="43" w16cid:durableId="680471570">
-    <w:abstractNumId w:val="55"/>
+    <w:abstractNumId w:val="57"/>
   </w:num>
   <w:num w:numId="44" w16cid:durableId="1315139082">
-    <w:abstractNumId w:val="43"/>
+    <w:abstractNumId w:val="45"/>
   </w:num>
   <w:num w:numId="45" w16cid:durableId="2113940701">
-    <w:abstractNumId w:val="43"/>
+    <w:abstractNumId w:val="45"/>
   </w:num>
   <w:num w:numId="46" w16cid:durableId="1884713029">
-    <w:abstractNumId w:val="44"/>
+    <w:abstractNumId w:val="46"/>
   </w:num>
   <w:num w:numId="47" w16cid:durableId="1079255107">
-    <w:abstractNumId w:val="48"/>
+    <w:abstractNumId w:val="50"/>
   </w:num>
   <w:num w:numId="48" w16cid:durableId="163739946">
-    <w:abstractNumId w:val="28"/>
+    <w:abstractNumId w:val="29"/>
     <w:lvlOverride w:ilvl="0">
       <w:startOverride w:val="1"/>
     </w:lvlOverride>
   </w:num>
   <w:num w:numId="49" w16cid:durableId="130177845">
-    <w:abstractNumId w:val="43"/>
+    <w:abstractNumId w:val="45"/>
   </w:num>
   <w:num w:numId="50" w16cid:durableId="1549225530">
-    <w:abstractNumId w:val="43"/>
+    <w:abstractNumId w:val="45"/>
   </w:num>
   <w:num w:numId="51" w16cid:durableId="1543207655">
-    <w:abstractNumId w:val="43"/>
+    <w:abstractNumId w:val="45"/>
   </w:num>
   <w:num w:numId="52" w16cid:durableId="2082754323">
-    <w:abstractNumId w:val="18"/>
+    <w:abstractNumId w:val="19"/>
   </w:num>
   <w:num w:numId="53" w16cid:durableId="1140000597">
-    <w:abstractNumId w:val="39"/>
+    <w:abstractNumId w:val="40"/>
     <w:lvlOverride w:ilvl="0">
       <w:startOverride w:val="1"/>
     </w:lvlOverride>
   </w:num>
   <w:num w:numId="54" w16cid:durableId="1476414865">
-    <w:abstractNumId w:val="43"/>
+    <w:abstractNumId w:val="45"/>
   </w:num>
   <w:num w:numId="55" w16cid:durableId="1747803550">
-    <w:abstractNumId w:val="51"/>
+    <w:abstractNumId w:val="53"/>
   </w:num>
   <w:num w:numId="56" w16cid:durableId="1421872203">
-    <w:abstractNumId w:val="17"/>
+    <w:abstractNumId w:val="18"/>
     <w:lvlOverride w:ilvl="0">
       <w:startOverride w:val="1"/>
     </w:lvlOverride>
   </w:num>
   <w:num w:numId="57" w16cid:durableId="1090199479">
-    <w:abstractNumId w:val="46"/>
+    <w:abstractNumId w:val="48"/>
   </w:num>
   <w:num w:numId="58" w16cid:durableId="794324903">
-    <w:abstractNumId w:val="43"/>
+    <w:abstractNumId w:val="45"/>
   </w:num>
   <w:num w:numId="59" w16cid:durableId="1306081610">
+    <w:abstractNumId w:val="11"/>
+  </w:num>
+  <w:num w:numId="60" w16cid:durableId="432749816">
     <w:abstractNumId w:val="10"/>
   </w:num>
-  <w:num w:numId="60" w16cid:durableId="432749816">
-    <w:abstractNumId w:val="9"/>
-  </w:num>
   <w:num w:numId="61" w16cid:durableId="903416085">
-    <w:abstractNumId w:val="32"/>
+    <w:abstractNumId w:val="33"/>
   </w:num>
   <w:num w:numId="62" w16cid:durableId="109403679">
-    <w:abstractNumId w:val="6"/>
+    <w:abstractNumId w:val="7"/>
   </w:num>
   <w:num w:numId="63" w16cid:durableId="1952125431">
-    <w:abstractNumId w:val="43"/>
+    <w:abstractNumId w:val="45"/>
   </w:num>
   <w:num w:numId="64" w16cid:durableId="1966891500">
     <w:abstractNumId w:val="4"/>
   </w:num>
   <w:num w:numId="65" w16cid:durableId="697698884">
+    <w:abstractNumId w:val="45"/>
+  </w:num>
+  <w:num w:numId="66" w16cid:durableId="1168981868">
+    <w:abstractNumId w:val="52"/>
+  </w:num>
+  <w:num w:numId="67" w16cid:durableId="160393705">
+    <w:abstractNumId w:val="45"/>
+  </w:num>
+  <w:num w:numId="68" w16cid:durableId="1831167593">
+    <w:abstractNumId w:val="9"/>
+  </w:num>
+  <w:num w:numId="69" w16cid:durableId="1698121427">
+    <w:abstractNumId w:val="45"/>
+  </w:num>
+  <w:num w:numId="70" w16cid:durableId="1760105121">
+    <w:abstractNumId w:val="41"/>
+  </w:num>
+  <w:num w:numId="71" w16cid:durableId="702751241">
+    <w:abstractNumId w:val="51"/>
+  </w:num>
+  <w:num w:numId="72" w16cid:durableId="408386921">
+    <w:abstractNumId w:val="45"/>
+  </w:num>
+  <w:num w:numId="73" w16cid:durableId="2030330978">
     <w:abstractNumId w:val="43"/>
   </w:num>
-  <w:num w:numId="66" w16cid:durableId="1168981868">
-    <w:abstractNumId w:val="50"/>
+  <w:num w:numId="74" w16cid:durableId="100954797">
+    <w:abstractNumId w:val="45"/>
   </w:num>
-  <w:num w:numId="67" w16cid:durableId="160393705">
-    <w:abstractNumId w:val="43"/>
+  <w:num w:numId="75" w16cid:durableId="1834107868">
+    <w:abstractNumId w:val="45"/>
   </w:num>
-  <w:num w:numId="68" w16cid:durableId="1831167593">
-    <w:abstractNumId w:val="8"/>
-  </w:num>
-  <w:num w:numId="69" w16cid:durableId="1698121427">
-    <w:abstractNumId w:val="43"/>
-  </w:num>
-  <w:num w:numId="70" w16cid:durableId="1760105121">
-    <w:abstractNumId w:val="40"/>
-  </w:num>
-  <w:num w:numId="71" w16cid:durableId="702751241">
-    <w:abstractNumId w:val="49"/>
+  <w:num w:numId="76" w16cid:durableId="1557204703">
+    <w:abstractNumId w:val="6"/>
   </w:num>
 </w:numbering>
 </file>

</xml_diff>

<commit_message>
git ignore and doc update
</commit_message>
<xml_diff>
--- a/CW_Doc.docx
+++ b/CW_Doc.docx
@@ -10765,6 +10765,47 @@
           <w:rFonts w:ascii="Aptos" w:hAnsi="Aptos" w:cs="Angsana New"/>
         </w:rPr>
       </w:pPr>
+    </w:p>
+    <w:p>
+      <w:pPr>
+        <w:suppressAutoHyphens/>
+        <w:rPr>
+          <w:rFonts w:ascii="Aptos" w:hAnsi="Aptos" w:cs="Angsana New"/>
+        </w:rPr>
+      </w:pPr>
+      <w:r>
+        <w:rPr>
+          <w:rFonts w:ascii="Aptos" w:hAnsi="Aptos" w:cs="Angsana New"/>
+        </w:rPr>
+        <w:br w:type="page"/>
+      </w:r>
+    </w:p>
+    <w:p>
+      <w:pPr>
+        <w:pStyle w:val="Heading1"/>
+        <w:rPr>
+          <w:rFonts w:ascii="Aptos" w:hAnsi="Aptos" w:cs="Angsana New"/>
+        </w:rPr>
+      </w:pPr>
+      <w:r>
+        <w:rPr>
+          <w:rFonts w:ascii="Aptos" w:hAnsi="Aptos" w:cs="Angsana New"/>
+        </w:rPr>
+        <w:lastRenderedPageBreak/>
+        <w:t xml:space="preserve">Task </w:t>
+      </w:r>
+      <w:r>
+        <w:rPr>
+          <w:rFonts w:ascii="Aptos" w:hAnsi="Aptos" w:cs="Angsana New"/>
+        </w:rPr>
+        <w:t>2</w:t>
+      </w:r>
+      <w:r>
+        <w:rPr>
+          <w:rFonts w:ascii="Aptos" w:hAnsi="Aptos" w:cs="Angsana New"/>
+        </w:rPr>
+        <w:t xml:space="preserve"> : Data source selection and Supporting Factors</w:t>
+      </w:r>
     </w:p>
     <w:p>
       <w:pPr>

</xml_diff>

<commit_message>
q3 started and doc updated
</commit_message>
<xml_diff>
--- a/CW_Doc.docx
+++ b/CW_Doc.docx
@@ -1328,13 +1328,7 @@
         <w:rPr>
           <w:rFonts w:ascii="Aptos" w:hAnsi="Aptos" w:cs="Angsana New"/>
         </w:rPr>
-        <w:t>I</w:t>
-      </w:r>
-      <w:r>
-        <w:rPr>
-          <w:rFonts w:ascii="Aptos" w:hAnsi="Aptos" w:cs="Angsana New"/>
-        </w:rPr>
-        <w:t>nternational Information and Engineering Technology Association</w:t>
+        <w:t>International Information and Engineering Technology Association</w:t>
       </w:r>
     </w:p>
     <w:p>
@@ -11002,13 +10996,7 @@
         <w:rPr>
           <w:rFonts w:ascii="Aptos" w:hAnsi="Aptos"/>
         </w:rPr>
-        <w:t>J</w:t>
-      </w:r>
-      <w:r>
-        <w:rPr>
-          <w:rFonts w:ascii="Aptos" w:hAnsi="Aptos"/>
-        </w:rPr>
-        <w:t>ournal of information science and technology, data, knowledge, and communication</w:t>
+        <w:t>Journal of information science and technology, data, knowledge, and communication</w:t>
       </w:r>
     </w:p>
     <w:p>
@@ -11050,16 +11038,7 @@
           <w:b w:val="0"/>
           <w:bCs w:val="0"/>
         </w:rPr>
-        <w:t>Evaluated tree-based ensemble methods (XGBoost) for financial assets</w:t>
-      </w:r>
-      <w:r>
-        <w:rPr>
-          <w:rStyle w:val="Strong"/>
-          <w:rFonts w:ascii="Aptos" w:hAnsi="Aptos" w:cs="Angsana New"/>
-          <w:b w:val="0"/>
-          <w:bCs w:val="0"/>
-        </w:rPr>
-        <w:t>. XGBoost is flexible and robust to outliers. Its limited in extrapolating beyond the range of prices observed during training.</w:t>
+        <w:t>Evaluated tree-based ensemble methods (XGBoost) for financial assets. XGBoost is flexible and robust to outliers. Its limited in extrapolating beyond the range of prices observed during training.</w:t>
       </w:r>
     </w:p>
     <w:p>
@@ -11081,52 +11060,30 @@
           <w:b/>
           <w:bCs/>
         </w:rPr>
-        <w:t>A hybrid volatility forecasting framework integrating GARCH, artificial neural network, technical analysis, and principal components analysis</w:t>
-      </w:r>
+        <w:t>A hybrid volatility forecasting framework integrating GARCH, artificial neural network, technical analysis, and principal components analysis [8]</w:t>
+      </w:r>
+    </w:p>
+    <w:p>
+      <w:pPr>
+        <w:spacing w:after="120"/>
+        <w:ind w:left="360" w:firstLine="349"/>
+        <w:rPr>
+          <w:rFonts w:ascii="Aptos" w:hAnsi="Aptos" w:cs="Mangal"/>
+        </w:rPr>
+      </w:pPr>
       <w:r>
         <w:rPr>
           <w:rFonts w:ascii="Aptos" w:hAnsi="Aptos" w:cs="Angsana New"/>
           <w:b/>
           <w:bCs/>
         </w:rPr>
-        <w:t xml:space="preserve"> [8]</w:t>
-      </w:r>
-    </w:p>
-    <w:p>
-      <w:pPr>
-        <w:spacing w:after="120"/>
-        <w:ind w:left="360" w:firstLine="349"/>
-        <w:rPr>
-          <w:rFonts w:ascii="Aptos" w:hAnsi="Aptos" w:cs="Mangal"/>
-        </w:rPr>
-      </w:pPr>
-      <w:r>
-        <w:rPr>
-          <w:rFonts w:ascii="Aptos" w:hAnsi="Aptos" w:cs="Angsana New"/>
-          <w:b/>
-          <w:bCs/>
-        </w:rPr>
-        <w:t>Source:</w:t>
-      </w:r>
-      <w:r>
-        <w:rPr>
-          <w:rFonts w:ascii="Aptos" w:hAnsi="Aptos" w:cs="Angsana New"/>
-          <w:b/>
-          <w:bCs/>
-        </w:rPr>
-        <w:t xml:space="preserve"> </w:t>
-      </w:r>
-      <w:r>
-        <w:rPr>
-          <w:rFonts w:ascii="Aptos" w:hAnsi="Aptos" w:cs="Angsana New"/>
-        </w:rPr>
-        <w:t>Expert Systems with Applications</w:t>
-      </w:r>
-      <w:r>
-        <w:rPr>
-          <w:rFonts w:ascii="Aptos" w:hAnsi="Aptos" w:cs="Angsana New"/>
-        </w:rPr>
-        <w:t xml:space="preserve"> Journal</w:t>
+        <w:t xml:space="preserve">Source: </w:t>
+      </w:r>
+      <w:r>
+        <w:rPr>
+          <w:rFonts w:ascii="Aptos" w:hAnsi="Aptos" w:cs="Angsana New"/>
+        </w:rPr>
+        <w:t>Expert Systems with Applications Journal</w:t>
       </w:r>
     </w:p>
     <w:p>
@@ -11162,25 +11119,7 @@
         <w:rPr>
           <w:rFonts w:ascii="Aptos" w:hAnsi="Aptos"/>
         </w:rPr>
-        <w:t>Proposed a hybrid GARCH</w:t>
-      </w:r>
-      <w:r>
-        <w:rPr>
-          <w:rFonts w:ascii="Aptos" w:hAnsi="Aptos"/>
-        </w:rPr>
-        <w:t>+</w:t>
-      </w:r>
-      <w:r>
-        <w:rPr>
-          <w:rFonts w:ascii="Aptos" w:hAnsi="Aptos"/>
-        </w:rPr>
-        <w:t>LSTM mode</w:t>
-      </w:r>
-      <w:r>
-        <w:rPr>
-          <w:rFonts w:ascii="Aptos" w:hAnsi="Aptos"/>
-        </w:rPr>
-        <w:t xml:space="preserve">l. They were used this to prove hybrid statistical and neural models outperforms standalone models. </w:t>
+        <w:t xml:space="preserve">Proposed a hybrid GARCH+LSTM model. They were used this to prove hybrid statistical and neural models outperforms standalone models. </w:t>
       </w:r>
     </w:p>
     <w:p>
@@ -12233,6 +12172,7 @@
       <w:r>
         <w:rPr>
           <w:rFonts w:ascii="Aptos" w:hAnsi="Aptos" w:cs="Angsana New"/>
+          <w:noProof/>
         </w:rPr>
         <w:drawing>
           <wp:inline distT="0" distB="0" distL="0" distR="0" wp14:anchorId="0C4F4045" wp14:editId="51BB1C4B">
@@ -12773,13 +12713,7 @@
         <w:rPr>
           <w:rFonts w:ascii="Aptos" w:hAnsi="Aptos" w:cs="Angsana New"/>
         </w:rPr>
-        <w:t xml:space="preserve"> </w:t>
-      </w:r>
-      <w:r>
-        <w:rPr>
-          <w:rFonts w:ascii="Aptos" w:hAnsi="Aptos" w:cs="Angsana New"/>
-        </w:rPr>
-        <w:t xml:space="preserve">05 </w:t>
+        <w:t xml:space="preserve"> 05 </w:t>
       </w:r>
       <w:r>
         <w:rPr>
@@ -13329,19 +13263,7 @@
         <w:rPr>
           <w:rFonts w:ascii="Aptos" w:hAnsi="Aptos"/>
         </w:rPr>
-        <w:t xml:space="preserve">Here the hyperparameters optimized with grid search to minimize RMSE(Root Mean Squared Error). And it gave optimized params as </w:t>
-      </w:r>
-      <w:r>
-        <w:rPr>
-          <w:rFonts w:ascii="Aptos" w:hAnsi="Aptos"/>
-        </w:rPr>
-        <w:t>n_estimators: 200, max_depth: 3, and learning_rate: 0.03</w:t>
-      </w:r>
-      <w:r>
-        <w:rPr>
-          <w:rFonts w:ascii="Aptos" w:hAnsi="Aptos"/>
-        </w:rPr>
-        <w:t xml:space="preserve">. Data leakages were prevented by enforcing exclusion of raw price variables(Open, High, Low, Adj Close) and target returns. This ensures model trains on structural indicators and calendar features. </w:t>
+        <w:t xml:space="preserve">Here the hyperparameters optimized with grid search to minimize RMSE(Root Mean Squared Error). And it gave optimized params as n_estimators: 200, max_depth: 3, and learning_rate: 0.03. Data leakages were prevented by enforcing exclusion of raw price variables(Open, High, Low, Adj Close) and target returns. This ensures model trains on structural indicators and calendar features. </w:t>
       </w:r>
     </w:p>
     <w:p>
@@ -13367,25 +13289,20 @@
         <w:rPr>
           <w:rFonts w:ascii="Aptos" w:hAnsi="Aptos"/>
         </w:rPr>
-        <w:t>Open, High, Low, and Close</w:t>
-      </w:r>
-      <w:r>
-        <w:rPr>
-          <w:rFonts w:ascii="Aptos" w:hAnsi="Aptos"/>
-        </w:rPr>
-        <w:t xml:space="preserve"> are highly correlated, if we included them to XGBoost it could bypass engineered feature completely. It may simply look at High or Open value to predict Close calue.</w:t>
-      </w:r>
-    </w:p>
-    <w:p>
-      <w:pPr>
-        <w:pStyle w:val="BodyText"/>
-        <w:rPr>
-          <w:rFonts w:ascii="Aptos" w:hAnsi="Aptos"/>
-        </w:rPr>
-      </w:pPr>
-      <w:r>
-        <w:rPr>
-          <w:rFonts w:ascii="Aptos" w:hAnsi="Aptos"/>
+        <w:t>Open, High, Low, and Close are highly correlated, if we included them to XGBoost it could bypass engineered feature completely. It may simply look at High or Open value to predict Close calue.</w:t>
+      </w:r>
+    </w:p>
+    <w:p>
+      <w:pPr>
+        <w:pStyle w:val="BodyText"/>
+        <w:rPr>
+          <w:rFonts w:ascii="Aptos" w:hAnsi="Aptos"/>
+        </w:rPr>
+      </w:pPr>
+      <w:r>
+        <w:rPr>
+          <w:rFonts w:ascii="Aptos" w:hAnsi="Aptos"/>
+          <w:noProof/>
         </w:rPr>
         <w:lastRenderedPageBreak/>
         <w:drawing>
@@ -13441,39 +13358,7 @@
           <w:sz w:val="20"/>
           <w:szCs w:val="20"/>
         </w:rPr>
-        <w:t>Figure 2.</w:t>
-      </w:r>
-      <w:r>
-        <w:rPr>
-          <w:rFonts w:ascii="Aptos" w:hAnsi="Aptos"/>
-          <w:sz w:val="20"/>
-          <w:szCs w:val="20"/>
-        </w:rPr>
-        <w:t>8</w:t>
-      </w:r>
-      <w:r>
-        <w:rPr>
-          <w:rFonts w:ascii="Aptos" w:hAnsi="Aptos"/>
-          <w:sz w:val="20"/>
-          <w:szCs w:val="20"/>
-        </w:rPr>
-        <w:t xml:space="preserve">: </w:t>
-      </w:r>
-      <w:r>
-        <w:rPr>
-          <w:rFonts w:ascii="Aptos" w:hAnsi="Aptos"/>
-          <w:sz w:val="20"/>
-          <w:szCs w:val="20"/>
-        </w:rPr>
-        <w:t>XGBoost</w:t>
-      </w:r>
-      <w:r>
-        <w:rPr>
-          <w:rFonts w:ascii="Aptos" w:hAnsi="Aptos"/>
-          <w:sz w:val="20"/>
-          <w:szCs w:val="20"/>
-        </w:rPr>
-        <w:t xml:space="preserve"> model implementation</w:t>
+        <w:t>Figure 2.8: XGBoost model implementation</w:t>
       </w:r>
     </w:p>
     <w:p>
@@ -13924,6 +13809,7 @@
       <w:r>
         <w:rPr>
           <w:rFonts w:ascii="Aptos" w:hAnsi="Aptos"/>
+          <w:noProof/>
         </w:rPr>
         <w:drawing>
           <wp:inline distT="0" distB="0" distL="0" distR="0" wp14:anchorId="2C184F85" wp14:editId="2447285A">
@@ -13978,15 +13864,7 @@
           <w:sz w:val="20"/>
           <w:szCs w:val="20"/>
         </w:rPr>
-        <w:t>Figure 2.</w:t>
-      </w:r>
-      <w:r>
-        <w:rPr>
-          <w:rFonts w:ascii="Aptos" w:hAnsi="Aptos"/>
-          <w:sz w:val="20"/>
-          <w:szCs w:val="20"/>
-        </w:rPr>
-        <w:t>9: Test set model forecasting plots</w:t>
+        <w:t>Figure 2.9: Test set model forecasting plots</w:t>
       </w:r>
     </w:p>
     <w:p>
@@ -14311,6 +14189,7 @@
       <w:r>
         <w:rPr>
           <w:rFonts w:ascii="Aptos" w:hAnsi="Aptos"/>
+          <w:noProof/>
         </w:rPr>
         <w:drawing>
           <wp:inline distT="0" distB="0" distL="0" distR="0" wp14:anchorId="4CA5000F" wp14:editId="2ADAB18E">
@@ -14365,7 +14244,7 @@
           <w:sz w:val="20"/>
           <w:szCs w:val="20"/>
         </w:rPr>
-        <w:t>Figure 2.</w:t>
+        <w:t xml:space="preserve">Figure 2.10: </w:t>
       </w:r>
       <w:r>
         <w:rPr>
@@ -14373,66 +14252,30 @@
           <w:sz w:val="20"/>
           <w:szCs w:val="20"/>
         </w:rPr>
-        <w:t>10</w:t>
-      </w:r>
-      <w:r>
+        <w:t>ARCH effect testing</w:t>
+      </w:r>
+    </w:p>
+    <w:p>
+      <w:pPr>
+        <w:pStyle w:val="BodyText"/>
         <w:rPr>
           <w:rFonts w:ascii="Aptos" w:hAnsi="Aptos"/>
           <w:sz w:val="20"/>
           <w:szCs w:val="20"/>
         </w:rPr>
-        <w:t>:</w:t>
-      </w:r>
-      <w:r>
-        <w:rPr>
-          <w:rFonts w:ascii="Aptos" w:hAnsi="Aptos"/>
-          <w:sz w:val="20"/>
-          <w:szCs w:val="20"/>
-        </w:rPr>
-        <w:t xml:space="preserve"> </w:t>
-      </w:r>
-      <w:r>
-        <w:rPr>
-          <w:rFonts w:ascii="Aptos" w:hAnsi="Aptos"/>
-          <w:sz w:val="20"/>
-          <w:szCs w:val="20"/>
-        </w:rPr>
-        <w:t>ARCH effect testing</w:t>
-      </w:r>
-    </w:p>
-    <w:p>
-      <w:pPr>
-        <w:pStyle w:val="BodyText"/>
-        <w:rPr>
-          <w:rFonts w:ascii="Aptos" w:hAnsi="Aptos"/>
-          <w:sz w:val="20"/>
-          <w:szCs w:val="20"/>
-        </w:rPr>
-      </w:pPr>
-    </w:p>
-    <w:p>
-      <w:pPr>
-        <w:rPr>
-          <w:rFonts w:ascii="Aptos" w:hAnsi="Aptos"/>
-        </w:rPr>
-      </w:pPr>
-      <w:r>
-        <w:rPr>
-          <w:rFonts w:ascii="Aptos" w:hAnsi="Aptos"/>
-        </w:rPr>
-        <w:t xml:space="preserve">Here we got significantly low p-value </w:t>
-      </w:r>
-      <w:r>
-        <w:rPr>
-          <w:rFonts w:ascii="Aptos" w:hAnsi="Aptos"/>
-        </w:rPr>
-        <w:t>1.981030</w:t>
-      </w:r>
-      <w:r>
-        <w:rPr>
-          <w:rFonts w:ascii="Aptos" w:hAnsi="Aptos"/>
-        </w:rPr>
-        <w:t xml:space="preserve"> x 10</w:t>
+      </w:pPr>
+    </w:p>
+    <w:p>
+      <w:pPr>
+        <w:rPr>
+          <w:rFonts w:ascii="Aptos" w:hAnsi="Aptos"/>
+        </w:rPr>
+      </w:pPr>
+      <w:r>
+        <w:rPr>
+          <w:rFonts w:ascii="Aptos" w:hAnsi="Aptos"/>
+        </w:rPr>
+        <w:t>Here we got significantly low p-value 1.981030 x 10</w:t>
       </w:r>
       <w:r>
         <w:rPr>
@@ -14582,6 +14425,7 @@
       <w:r>
         <w:rPr>
           <w:rFonts w:ascii="Aptos" w:hAnsi="Aptos"/>
+          <w:noProof/>
         </w:rPr>
         <w:lastRenderedPageBreak/>
         <w:drawing>
@@ -14787,31 +14631,7 @@
           <w:sz w:val="20"/>
           <w:szCs w:val="20"/>
         </w:rPr>
-        <w:t>Table 2.</w:t>
-      </w:r>
-      <w:r>
-        <w:rPr>
-          <w:rFonts w:ascii="Aptos" w:hAnsi="Aptos"/>
-          <w:sz w:val="20"/>
-          <w:szCs w:val="20"/>
-        </w:rPr>
-        <w:t>3</w:t>
-      </w:r>
-      <w:r>
-        <w:rPr>
-          <w:rFonts w:ascii="Aptos" w:hAnsi="Aptos"/>
-          <w:sz w:val="20"/>
-          <w:szCs w:val="20"/>
-        </w:rPr>
-        <w:t xml:space="preserve">: </w:t>
-      </w:r>
-      <w:r>
-        <w:rPr>
-          <w:rFonts w:ascii="Aptos" w:hAnsi="Aptos"/>
-          <w:sz w:val="20"/>
-          <w:szCs w:val="20"/>
-        </w:rPr>
-        <w:t>GARCH Parameters</w:t>
+        <w:t>Table 2.3: GARCH Parameters</w:t>
       </w:r>
     </w:p>
     <w:p>
@@ -15042,20 +14862,1457 @@
     </w:p>
     <w:p>
       <w:pPr>
+        <w:pStyle w:val="Title"/>
+        <w:rPr>
+          <w:rFonts w:ascii="Aptos" w:hAnsi="Aptos"/>
+        </w:rPr>
+      </w:pPr>
+      <w:r>
+        <w:rPr>
+          <w:rFonts w:ascii="Aptos" w:hAnsi="Aptos"/>
+        </w:rPr>
+        <w:lastRenderedPageBreak/>
+        <w:t xml:space="preserve">Question 3: Optimization using Genetic Algorithms </w:t>
+      </w:r>
+    </w:p>
+    <w:p>
+      <w:pPr>
+        <w:pStyle w:val="Heading1"/>
+        <w:numPr>
+          <w:ilvl w:val="0"/>
+          <w:numId w:val="92"/>
+        </w:numPr>
+        <w:rPr>
+          <w:rFonts w:ascii="Aptos" w:hAnsi="Aptos" w:cs="Angsana New"/>
+        </w:rPr>
+      </w:pPr>
+      <w:r>
+        <w:rPr>
+          <w:rFonts w:ascii="Aptos" w:hAnsi="Aptos" w:cs="Angsana New"/>
+        </w:rPr>
+        <w:t xml:space="preserve">Problem Definition and Literature Review </w:t>
+      </w:r>
+    </w:p>
+    <w:p>
+      <w:pPr>
+        <w:pStyle w:val="ListParagraph"/>
+        <w:spacing w:after="120"/>
+        <w:ind w:left="360"/>
+        <w:rPr>
+          <w:rFonts w:ascii="Aptos" w:hAnsi="Aptos"/>
+        </w:rPr>
+      </w:pPr>
+      <w:r>
+        <w:rPr>
+          <w:rFonts w:ascii="Aptos" w:hAnsi="Aptos"/>
+        </w:rPr>
+        <w:t xml:space="preserve">Project Portfolio Selection (Resource Allocation) was selected as our optimization problem. Here </w:t>
+      </w:r>
+      <w:r>
+        <w:rPr>
+          <w:rFonts w:ascii="Aptos" w:hAnsi="Aptos"/>
+        </w:rPr>
+        <w:t xml:space="preserve">need to </w:t>
+      </w:r>
+      <w:r>
+        <w:rPr>
+          <w:rFonts w:ascii="Aptos" w:hAnsi="Aptos"/>
+        </w:rPr>
+        <w:t xml:space="preserve">select optimal subset of projects from pool of avialable projects to maximize the profit with </w:t>
+      </w:r>
+      <w:r>
+        <w:rPr>
+          <w:rFonts w:ascii="Aptos" w:hAnsi="Aptos"/>
+          <w:b/>
+          <w:bCs/>
+        </w:rPr>
+        <w:t>considering capital budget constraints</w:t>
+      </w:r>
+      <w:r>
+        <w:rPr>
+          <w:rFonts w:ascii="Aptos" w:hAnsi="Aptos"/>
+          <w:b/>
+          <w:bCs/>
+        </w:rPr>
+        <w:t xml:space="preserve">, </w:t>
+      </w:r>
+      <w:r>
+        <w:rPr>
+          <w:rFonts w:ascii="Aptos" w:hAnsi="Aptos"/>
+          <w:b/>
+          <w:bCs/>
+        </w:rPr>
+        <w:t>constraints with avialable developer</w:t>
+      </w:r>
+      <w:r>
+        <w:rPr>
+          <w:rFonts w:ascii="Aptos" w:hAnsi="Aptos"/>
+          <w:b/>
+          <w:bCs/>
+        </w:rPr>
+        <w:t xml:space="preserve"> hours</w:t>
+      </w:r>
+      <w:r>
+        <w:rPr>
+          <w:rFonts w:ascii="Aptos" w:hAnsi="Aptos"/>
+          <w:b/>
+          <w:bCs/>
+        </w:rPr>
+        <w:t xml:space="preserve"> and </w:t>
+      </w:r>
+      <w:r>
+        <w:rPr>
+          <w:rFonts w:ascii="Aptos" w:hAnsi="Aptos"/>
+          <w:b/>
+          <w:bCs/>
+        </w:rPr>
+        <w:t>other logical</w:t>
+      </w:r>
+      <w:r>
+        <w:rPr>
+          <w:rFonts w:ascii="Aptos" w:hAnsi="Aptos"/>
+          <w:b/>
+          <w:bCs/>
+        </w:rPr>
+        <w:t xml:space="preserve"> constraints</w:t>
+      </w:r>
+      <w:r>
+        <w:rPr>
+          <w:rFonts w:ascii="Aptos" w:hAnsi="Aptos"/>
+        </w:rPr>
+        <w:t>.</w:t>
+      </w:r>
+    </w:p>
+    <w:p>
+      <w:pPr>
+        <w:pStyle w:val="ListParagraph"/>
+        <w:spacing w:after="120"/>
+        <w:ind w:left="360"/>
+        <w:rPr>
+          <w:rFonts w:ascii="Aptos" w:hAnsi="Aptos"/>
+        </w:rPr>
+      </w:pPr>
+    </w:p>
+    <w:p>
+      <w:pPr>
+        <w:pStyle w:val="ListParagraph"/>
+        <w:spacing w:after="120"/>
+        <w:ind w:left="360"/>
+        <w:rPr>
+          <w:rFonts w:ascii="Aptos" w:hAnsi="Aptos"/>
+        </w:rPr>
+      </w:pPr>
+      <w:r>
+        <w:rPr>
+          <w:rFonts w:ascii="Aptos" w:hAnsi="Aptos"/>
+        </w:rPr>
+        <w:t>Resource Constraints : Budget Limit and Developer Hours</w:t>
+      </w:r>
+    </w:p>
+    <w:p>
+      <w:pPr>
+        <w:pStyle w:val="ListParagraph"/>
+        <w:spacing w:after="120"/>
+        <w:ind w:left="360"/>
+        <w:rPr>
+          <w:rFonts w:ascii="Aptos" w:hAnsi="Aptos"/>
+        </w:rPr>
+      </w:pPr>
+    </w:p>
+    <w:p>
+      <w:pPr>
+        <w:pStyle w:val="ListParagraph"/>
+        <w:spacing w:after="120"/>
+        <w:ind w:left="360"/>
+        <w:rPr>
+          <w:rFonts w:ascii="Aptos" w:hAnsi="Aptos"/>
+        </w:rPr>
+      </w:pPr>
+      <w:r>
+        <w:rPr>
+          <w:rFonts w:ascii="Aptos" w:hAnsi="Aptos"/>
+        </w:rPr>
+        <w:t xml:space="preserve">Logical Constraints : </w:t>
+      </w:r>
+    </w:p>
+    <w:p>
+      <w:pPr>
+        <w:pStyle w:val="ListParagraph"/>
+        <w:numPr>
+          <w:ilvl w:val="2"/>
+          <w:numId w:val="92"/>
+        </w:numPr>
+        <w:spacing w:after="120"/>
+        <w:rPr>
+          <w:rFonts w:ascii="Aptos" w:hAnsi="Aptos"/>
+        </w:rPr>
+      </w:pPr>
+      <w:r>
+        <w:rPr>
+          <w:rFonts w:ascii="Aptos" w:hAnsi="Aptos"/>
+        </w:rPr>
+        <w:t>Mutual Exclusion : Certain projects cannot picked together</w:t>
+      </w:r>
+    </w:p>
+    <w:p>
+      <w:pPr>
+        <w:pStyle w:val="ListParagraph"/>
+        <w:numPr>
+          <w:ilvl w:val="2"/>
+          <w:numId w:val="92"/>
+        </w:numPr>
+        <w:spacing w:after="120"/>
+        <w:rPr>
+          <w:rFonts w:ascii="Aptos" w:hAnsi="Aptos"/>
+        </w:rPr>
+      </w:pPr>
+      <w:r>
+        <w:rPr>
+          <w:rFonts w:ascii="Aptos" w:hAnsi="Aptos"/>
+        </w:rPr>
+        <w:t>Dependency : Some projects depends on completion of another</w:t>
+      </w:r>
+    </w:p>
+    <w:p>
+      <w:pPr>
+        <w:pStyle w:val="ListParagraph"/>
+        <w:spacing w:after="120"/>
+        <w:ind w:left="709"/>
+        <w:rPr>
+          <w:rFonts w:ascii="Aptos" w:hAnsi="Aptos"/>
+        </w:rPr>
+      </w:pPr>
+      <w:r>
+        <w:rPr>
+          <w:rFonts w:ascii="Aptos" w:hAnsi="Aptos"/>
+        </w:rPr>
+        <w:t xml:space="preserve"> </w:t>
+      </w:r>
+    </w:p>
+    <w:p>
+      <w:pPr>
+        <w:pStyle w:val="Heading3"/>
+        <w:rPr>
+          <w:rFonts w:ascii="Aptos" w:hAnsi="Aptos" w:cs="Angsana New"/>
+        </w:rPr>
+      </w:pPr>
+      <w:r>
+        <w:rPr>
+          <w:rFonts w:ascii="Aptos" w:hAnsi="Aptos" w:cs="Angsana New"/>
+        </w:rPr>
+        <w:t>Mathematical Formulation</w:t>
+      </w:r>
+    </w:p>
+    <w:p>
+      <w:pPr>
+        <w:pStyle w:val="ListParagraph"/>
+        <w:spacing w:after="120"/>
+        <w:ind w:left="360"/>
+        <w:rPr>
+          <w:rFonts w:ascii="Aptos" w:hAnsi="Aptos"/>
+        </w:rPr>
+      </w:pPr>
+      <w:r>
+        <w:rPr>
+          <w:rFonts w:ascii="Aptos" w:hAnsi="Aptos"/>
+        </w:rPr>
+        <w:t xml:space="preserve">Here we need to Pick </w:t>
+      </w:r>
+      <w:r>
+        <w:rPr>
+          <w:rFonts w:ascii="Aptos" w:hAnsi="Aptos"/>
+          <w:b/>
+          <w:bCs/>
+        </w:rPr>
+        <w:t>N</w:t>
+      </w:r>
+      <w:r>
+        <w:rPr>
+          <w:rFonts w:ascii="Aptos" w:hAnsi="Aptos"/>
+        </w:rPr>
+        <w:t xml:space="preserve"> number of projects that maximises the profit. </w:t>
+      </w:r>
+    </w:p>
+    <w:p>
+      <w:pPr>
+        <w:pStyle w:val="Heading"/>
+        <w:rPr>
+          <w:rFonts w:ascii="Aptos" w:hAnsi="Aptos"/>
+        </w:rPr>
+      </w:pPr>
+      <w:r>
+        <w:rPr>
+          <w:rFonts w:ascii="Aptos" w:hAnsi="Aptos"/>
+        </w:rPr>
+        <w:t>Objective Function</w:t>
+      </w:r>
+    </w:p>
+    <w:p>
+      <w:pPr>
+        <w:pStyle w:val="ListParagraph"/>
+        <w:spacing w:after="120"/>
+        <w:ind w:left="360"/>
+        <w:rPr>
+          <w:rFonts w:ascii="Aptos" w:hAnsi="Aptos"/>
+          <w:sz w:val="32"/>
+          <w:szCs w:val="32"/>
+        </w:rPr>
+      </w:pPr>
+      <m:oMathPara>
+        <m:oMath>
+          <m:r>
+            <w:rPr>
+              <w:rFonts w:ascii="Cambria Math" w:hAnsi="Cambria Math"/>
+              <w:sz w:val="32"/>
+              <w:szCs w:val="32"/>
+            </w:rPr>
+            <m:t xml:space="preserve">Max </m:t>
+          </m:r>
+          <m:nary>
+            <m:naryPr>
+              <m:chr m:val="∑"/>
+              <m:limLoc m:val="undOvr"/>
+              <m:ctrlPr>
+                <w:rPr>
+                  <w:rFonts w:ascii="Cambria Math" w:hAnsi="Cambria Math"/>
+                  <w:sz w:val="32"/>
+                  <w:szCs w:val="32"/>
+                </w:rPr>
+              </m:ctrlPr>
+            </m:naryPr>
+            <m:sub>
+              <m:r>
+                <w:rPr>
+                  <w:rFonts w:ascii="Cambria Math" w:hAnsi="Cambria Math"/>
+                  <w:sz w:val="32"/>
+                  <w:szCs w:val="32"/>
+                </w:rPr>
+                <m:t>i=1</m:t>
+              </m:r>
+            </m:sub>
+            <m:sup>
+              <m:r>
+                <w:rPr>
+                  <w:rFonts w:ascii="Cambria Math" w:hAnsi="Cambria Math"/>
+                  <w:sz w:val="32"/>
+                  <w:szCs w:val="32"/>
+                </w:rPr>
+                <m:t>N</m:t>
+              </m:r>
+            </m:sup>
+            <m:e>
+              <m:sSub>
+                <m:sSubPr>
+                  <m:ctrlPr>
+                    <w:rPr>
+                      <w:rFonts w:ascii="Cambria Math" w:hAnsi="Cambria Math"/>
+                      <w:i/>
+                      <w:sz w:val="32"/>
+                      <w:szCs w:val="32"/>
+                    </w:rPr>
+                  </m:ctrlPr>
+                </m:sSubPr>
+                <m:e>
+                  <m:r>
+                    <w:rPr>
+                      <w:rFonts w:ascii="Cambria Math" w:hAnsi="Cambria Math"/>
+                      <w:sz w:val="32"/>
+                      <w:szCs w:val="32"/>
+                    </w:rPr>
+                    <m:t>Pr</m:t>
+                  </m:r>
+                </m:e>
+                <m:sub>
+                  <m:r>
+                    <w:rPr>
+                      <w:rFonts w:ascii="Cambria Math" w:hAnsi="Cambria Math"/>
+                      <w:sz w:val="32"/>
+                      <w:szCs w:val="32"/>
+                    </w:rPr>
+                    <m:t xml:space="preserve">i </m:t>
+                  </m:r>
+                </m:sub>
+              </m:sSub>
+            </m:e>
+          </m:nary>
+          <m:r>
+            <m:rPr>
+              <m:sty m:val="p"/>
+            </m:rPr>
+            <w:rPr>
+              <w:rFonts w:ascii="Cambria Math" w:hAnsi="Cambria Math"/>
+              <w:sz w:val="32"/>
+              <w:szCs w:val="32"/>
+            </w:rPr>
+            <m:t xml:space="preserve"> .  </m:t>
+          </m:r>
+          <m:sSub>
+            <m:sSubPr>
+              <m:ctrlPr>
+                <w:rPr>
+                  <w:rFonts w:ascii="Cambria Math" w:hAnsi="Cambria Math"/>
+                  <w:sz w:val="32"/>
+                  <w:szCs w:val="32"/>
+                </w:rPr>
+              </m:ctrlPr>
+            </m:sSubPr>
+            <m:e>
+              <m:r>
+                <w:rPr>
+                  <w:rFonts w:ascii="Cambria Math" w:hAnsi="Cambria Math"/>
+                  <w:sz w:val="32"/>
+                  <w:szCs w:val="32"/>
+                </w:rPr>
+                <m:t>BD</m:t>
+              </m:r>
+            </m:e>
+            <m:sub>
+              <m:r>
+                <w:rPr>
+                  <w:rFonts w:ascii="Cambria Math" w:hAnsi="Cambria Math"/>
+                  <w:sz w:val="32"/>
+                  <w:szCs w:val="32"/>
+                </w:rPr>
+                <m:t>i</m:t>
+              </m:r>
+            </m:sub>
+          </m:sSub>
+          <m:r>
+            <m:rPr>
+              <m:sty m:val="p"/>
+            </m:rPr>
+            <w:rPr>
+              <w:rFonts w:ascii="Cambria Math" w:hAnsi="Cambria Math"/>
+              <w:sz w:val="32"/>
+              <w:szCs w:val="32"/>
+            </w:rPr>
+            <m:t xml:space="preserve"> </m:t>
+          </m:r>
+        </m:oMath>
+      </m:oMathPara>
+    </w:p>
+    <w:p>
+      <w:pPr>
+        <w:pStyle w:val="ListParagraph"/>
+        <w:spacing w:after="120"/>
+        <w:ind w:left="360"/>
+        <w:rPr>
+          <w:rFonts w:ascii="Aptos" w:hAnsi="Aptos"/>
+        </w:rPr>
+      </w:pPr>
+    </w:p>
+    <w:p>
+      <w:pPr>
+        <w:pStyle w:val="ListParagraph"/>
+        <w:spacing w:after="120"/>
+        <w:ind w:left="360"/>
+        <w:rPr>
+          <w:rFonts w:ascii="Aptos" w:hAnsi="Aptos"/>
+          <w:sz w:val="32"/>
+          <w:szCs w:val="32"/>
+        </w:rPr>
+      </w:pPr>
+      <w:r>
+        <w:rPr>
+          <w:rFonts w:ascii="Aptos" w:hAnsi="Aptos"/>
+        </w:rPr>
+        <w:tab/>
+      </w:r>
+      <w:r>
+        <w:rPr>
+          <w:rFonts w:ascii="Aptos" w:hAnsi="Aptos"/>
+        </w:rPr>
+        <w:tab/>
+      </w:r>
+      <w:r>
+        <w:rPr>
+          <w:rFonts w:ascii="Aptos" w:hAnsi="Aptos"/>
+        </w:rPr>
+        <w:tab/>
+      </w:r>
+      <w:r>
+        <w:rPr>
+          <w:rFonts w:ascii="Aptos" w:hAnsi="Aptos"/>
+        </w:rPr>
+        <w:tab/>
+      </w:r>
+      <w:r>
+        <w:rPr>
+          <w:rFonts w:ascii="Aptos" w:hAnsi="Aptos"/>
+        </w:rPr>
+        <w:tab/>
+      </w:r>
+      <w:r>
+        <w:rPr>
+          <w:rFonts w:ascii="Aptos" w:hAnsi="Aptos"/>
+          <w:i/>
+          <w:sz w:val="32"/>
+          <w:szCs w:val="32"/>
+        </w:rPr>
+        <w:br/>
+      </w:r>
+      <m:oMathPara>
+        <m:oMath>
+          <m:nary>
+            <m:naryPr>
+              <m:chr m:val="∑"/>
+              <m:limLoc m:val="undOvr"/>
+              <m:ctrlPr>
+                <w:rPr>
+                  <w:rFonts w:ascii="Cambria Math" w:hAnsi="Cambria Math"/>
+                  <w:sz w:val="32"/>
+                  <w:szCs w:val="32"/>
+                </w:rPr>
+              </m:ctrlPr>
+            </m:naryPr>
+            <m:sub>
+              <m:r>
+                <w:rPr>
+                  <w:rFonts w:ascii="Cambria Math" w:hAnsi="Cambria Math"/>
+                  <w:sz w:val="32"/>
+                  <w:szCs w:val="32"/>
+                </w:rPr>
+                <m:t>i=1</m:t>
+              </m:r>
+            </m:sub>
+            <m:sup>
+              <m:r>
+                <w:rPr>
+                  <w:rFonts w:ascii="Cambria Math" w:hAnsi="Cambria Math"/>
+                  <w:sz w:val="32"/>
+                  <w:szCs w:val="32"/>
+                </w:rPr>
+                <m:t>N</m:t>
+              </m:r>
+            </m:sup>
+            <m:e>
+              <m:sSub>
+                <m:sSubPr>
+                  <m:ctrlPr>
+                    <w:rPr>
+                      <w:rFonts w:ascii="Cambria Math" w:hAnsi="Cambria Math"/>
+                      <w:i/>
+                      <w:sz w:val="32"/>
+                      <w:szCs w:val="32"/>
+                    </w:rPr>
+                  </m:ctrlPr>
+                </m:sSubPr>
+                <m:e>
+                  <m:r>
+                    <w:rPr>
+                      <w:rFonts w:ascii="Cambria Math" w:hAnsi="Cambria Math"/>
+                      <w:sz w:val="32"/>
+                      <w:szCs w:val="32"/>
+                    </w:rPr>
+                    <m:t>C</m:t>
+                  </m:r>
+                </m:e>
+                <m:sub>
+                  <m:r>
+                    <w:rPr>
+                      <w:rFonts w:ascii="Cambria Math" w:hAnsi="Cambria Math"/>
+                      <w:sz w:val="32"/>
+                      <w:szCs w:val="32"/>
+                    </w:rPr>
+                    <m:t xml:space="preserve">i </m:t>
+                  </m:r>
+                </m:sub>
+              </m:sSub>
+            </m:e>
+          </m:nary>
+          <m:r>
+            <m:rPr>
+              <m:sty m:val="p"/>
+            </m:rPr>
+            <w:rPr>
+              <w:rFonts w:ascii="Cambria Math" w:hAnsi="Cambria Math"/>
+              <w:sz w:val="32"/>
+              <w:szCs w:val="32"/>
+            </w:rPr>
+            <m:t xml:space="preserve"> .  </m:t>
+          </m:r>
+          <m:sSub>
+            <m:sSubPr>
+              <m:ctrlPr>
+                <w:rPr>
+                  <w:rFonts w:ascii="Cambria Math" w:hAnsi="Cambria Math"/>
+                  <w:sz w:val="32"/>
+                  <w:szCs w:val="32"/>
+                </w:rPr>
+              </m:ctrlPr>
+            </m:sSubPr>
+            <m:e>
+              <m:r>
+                <w:rPr>
+                  <w:rFonts w:ascii="Cambria Math" w:hAnsi="Cambria Math"/>
+                  <w:sz w:val="32"/>
+                  <w:szCs w:val="32"/>
+                </w:rPr>
+                <m:t>BD</m:t>
+              </m:r>
+            </m:e>
+            <m:sub>
+              <m:r>
+                <w:rPr>
+                  <w:rFonts w:ascii="Cambria Math" w:hAnsi="Cambria Math"/>
+                  <w:sz w:val="32"/>
+                  <w:szCs w:val="32"/>
+                </w:rPr>
+                <m:t xml:space="preserve">i </m:t>
+              </m:r>
+            </m:sub>
+          </m:sSub>
+          <m:r>
+            <m:rPr>
+              <m:sty m:val="p"/>
+            </m:rPr>
+            <w:rPr>
+              <w:rFonts w:ascii="Cambria Math" w:hAnsi="Cambria Math"/>
+              <w:sz w:val="32"/>
+              <w:szCs w:val="32"/>
+            </w:rPr>
+            <m:t>≤ TB</m:t>
+          </m:r>
+        </m:oMath>
+      </m:oMathPara>
+    </w:p>
+    <w:p>
+      <w:pPr>
+        <w:pStyle w:val="ListParagraph"/>
+        <w:spacing w:after="120"/>
+        <w:ind w:left="360"/>
+        <w:rPr>
+          <w:rFonts w:ascii="Aptos" w:hAnsi="Aptos"/>
+        </w:rPr>
+      </w:pPr>
+    </w:p>
+    <w:p>
+      <w:pPr>
+        <w:pStyle w:val="ListParagraph"/>
+        <w:spacing w:after="120"/>
+        <w:ind w:left="360"/>
+        <w:rPr>
+          <w:rFonts w:ascii="Aptos" w:hAnsi="Aptos"/>
+          <w:sz w:val="32"/>
+          <w:szCs w:val="32"/>
+        </w:rPr>
+      </w:pPr>
+      <w:r>
+        <w:rPr>
+          <w:rFonts w:ascii="Aptos" w:hAnsi="Aptos"/>
+        </w:rPr>
+        <w:tab/>
+      </w:r>
+      <w:r>
+        <w:rPr>
+          <w:rFonts w:ascii="Aptos" w:hAnsi="Aptos"/>
+        </w:rPr>
+        <w:tab/>
+      </w:r>
+      <w:r>
+        <w:rPr>
+          <w:rFonts w:ascii="Aptos" w:hAnsi="Aptos"/>
+        </w:rPr>
+        <w:tab/>
+      </w:r>
+      <w:r>
+        <w:rPr>
+          <w:rFonts w:ascii="Aptos" w:hAnsi="Aptos"/>
+        </w:rPr>
+        <w:tab/>
+      </w:r>
+      <w:r>
+        <w:rPr>
+          <w:rFonts w:ascii="Aptos" w:hAnsi="Aptos"/>
+        </w:rPr>
+        <w:tab/>
+      </w:r>
+      <w:r>
+        <w:rPr>
+          <w:rFonts w:ascii="Aptos" w:hAnsi="Aptos"/>
+          <w:sz w:val="32"/>
+          <w:szCs w:val="32"/>
+        </w:rPr>
+        <w:br/>
+      </w:r>
+      <m:oMathPara>
+        <m:oMath>
+          <m:nary>
+            <m:naryPr>
+              <m:chr m:val="∑"/>
+              <m:limLoc m:val="undOvr"/>
+              <m:ctrlPr>
+                <w:rPr>
+                  <w:rFonts w:ascii="Cambria Math" w:hAnsi="Cambria Math"/>
+                  <w:sz w:val="32"/>
+                  <w:szCs w:val="32"/>
+                </w:rPr>
+              </m:ctrlPr>
+            </m:naryPr>
+            <m:sub>
+              <m:r>
+                <w:rPr>
+                  <w:rFonts w:ascii="Cambria Math" w:hAnsi="Cambria Math"/>
+                  <w:sz w:val="32"/>
+                  <w:szCs w:val="32"/>
+                </w:rPr>
+                <m:t>i=1</m:t>
+              </m:r>
+            </m:sub>
+            <m:sup>
+              <m:r>
+                <w:rPr>
+                  <w:rFonts w:ascii="Cambria Math" w:hAnsi="Cambria Math"/>
+                  <w:sz w:val="32"/>
+                  <w:szCs w:val="32"/>
+                </w:rPr>
+                <m:t>N</m:t>
+              </m:r>
+            </m:sup>
+            <m:e>
+              <m:sSub>
+                <m:sSubPr>
+                  <m:ctrlPr>
+                    <w:rPr>
+                      <w:rFonts w:ascii="Cambria Math" w:hAnsi="Cambria Math"/>
+                      <w:i/>
+                      <w:sz w:val="32"/>
+                      <w:szCs w:val="32"/>
+                    </w:rPr>
+                  </m:ctrlPr>
+                </m:sSubPr>
+                <m:e>
+                  <m:r>
+                    <w:rPr>
+                      <w:rFonts w:ascii="Cambria Math" w:hAnsi="Cambria Math"/>
+                      <w:sz w:val="32"/>
+                      <w:szCs w:val="32"/>
+                    </w:rPr>
+                    <m:t>H</m:t>
+                  </m:r>
+                </m:e>
+                <m:sub>
+                  <m:r>
+                    <w:rPr>
+                      <w:rFonts w:ascii="Cambria Math" w:hAnsi="Cambria Math"/>
+                      <w:sz w:val="32"/>
+                      <w:szCs w:val="32"/>
+                    </w:rPr>
+                    <m:t xml:space="preserve">i </m:t>
+                  </m:r>
+                </m:sub>
+              </m:sSub>
+            </m:e>
+          </m:nary>
+          <m:r>
+            <m:rPr>
+              <m:sty m:val="p"/>
+            </m:rPr>
+            <w:rPr>
+              <w:rFonts w:ascii="Cambria Math" w:hAnsi="Cambria Math"/>
+              <w:sz w:val="32"/>
+              <w:szCs w:val="32"/>
+            </w:rPr>
+            <m:t xml:space="preserve"> .  </m:t>
+          </m:r>
+          <m:sSub>
+            <m:sSubPr>
+              <m:ctrlPr>
+                <w:rPr>
+                  <w:rFonts w:ascii="Cambria Math" w:hAnsi="Cambria Math"/>
+                  <w:sz w:val="32"/>
+                  <w:szCs w:val="32"/>
+                </w:rPr>
+              </m:ctrlPr>
+            </m:sSubPr>
+            <m:e>
+              <m:r>
+                <w:rPr>
+                  <w:rFonts w:ascii="Cambria Math" w:hAnsi="Cambria Math"/>
+                  <w:sz w:val="32"/>
+                  <w:szCs w:val="32"/>
+                </w:rPr>
+                <m:t>BD</m:t>
+              </m:r>
+            </m:e>
+            <m:sub>
+              <m:r>
+                <w:rPr>
+                  <w:rFonts w:ascii="Cambria Math" w:hAnsi="Cambria Math"/>
+                  <w:sz w:val="32"/>
+                  <w:szCs w:val="32"/>
+                </w:rPr>
+                <m:t xml:space="preserve">i </m:t>
+              </m:r>
+            </m:sub>
+          </m:sSub>
+          <m:r>
+            <m:rPr>
+              <m:sty m:val="p"/>
+            </m:rPr>
+            <w:rPr>
+              <w:rFonts w:ascii="Cambria Math" w:hAnsi="Cambria Math"/>
+              <w:sz w:val="32"/>
+              <w:szCs w:val="32"/>
+            </w:rPr>
+            <m:t>≤ TDH</m:t>
+          </m:r>
+        </m:oMath>
+      </m:oMathPara>
+    </w:p>
+    <w:p>
+      <w:pPr>
+        <w:pStyle w:val="ListParagraph"/>
+        <w:spacing w:after="120"/>
+        <w:ind w:left="360"/>
+        <w:rPr>
+          <w:rFonts w:ascii="Aptos" w:hAnsi="Aptos"/>
+        </w:rPr>
+      </w:pPr>
+    </w:p>
+    <w:p>
+      <w:pPr>
+        <w:pStyle w:val="ListParagraph"/>
+        <w:spacing w:after="120"/>
+        <w:ind w:left="360"/>
+        <w:rPr>
+          <w:rFonts w:ascii="Aptos" w:hAnsi="Aptos"/>
+        </w:rPr>
+      </w:pPr>
+      <w:r>
+        <w:rPr>
+          <w:rFonts w:ascii="Aptos" w:hAnsi="Aptos"/>
+        </w:rPr>
+        <w:tab/>
+      </w:r>
+      <w:r>
+        <w:rPr>
+          <w:rFonts w:ascii="Aptos" w:hAnsi="Aptos"/>
+        </w:rPr>
+        <w:tab/>
+      </w:r>
+      <w:r>
+        <w:rPr>
+          <w:rFonts w:ascii="Aptos" w:hAnsi="Aptos"/>
+        </w:rPr>
+        <w:tab/>
+      </w:r>
+      <w:r>
+        <w:rPr>
+          <w:rFonts w:ascii="Aptos" w:hAnsi="Aptos"/>
+        </w:rPr>
+        <w:tab/>
+      </w:r>
+      <w:r>
+        <w:rPr>
+          <w:rFonts w:ascii="Aptos" w:hAnsi="Aptos"/>
+        </w:rPr>
+        <w:tab/>
+      </w:r>
+      <w:r>
+        <w:rPr>
+          <w:rFonts w:ascii="Aptos" w:hAnsi="Aptos"/>
+        </w:rPr>
+        <w:tab/>
+      </w:r>
+    </w:p>
+    <w:p>
+      <w:pPr>
+        <w:pStyle w:val="ListParagraph"/>
+        <w:spacing w:after="120"/>
+        <w:ind w:left="360"/>
+        <w:rPr>
+          <w:rFonts w:ascii="Aptos" w:hAnsi="Aptos"/>
+        </w:rPr>
+      </w:pPr>
+    </w:p>
+    <w:p>
+      <w:pPr>
+        <w:pStyle w:val="ListParagraph"/>
+        <w:spacing w:after="120"/>
+        <w:ind w:left="360"/>
+        <w:rPr>
+          <w:rFonts w:ascii="Aptos" w:hAnsi="Aptos"/>
+        </w:rPr>
+      </w:pPr>
+    </w:p>
+    <w:p>
+      <w:pPr>
+        <w:pStyle w:val="ListParagraph"/>
+        <w:spacing w:after="120"/>
+        <w:ind w:left="360"/>
+        <w:rPr>
+          <w:rFonts w:ascii="Aptos" w:hAnsi="Aptos" w:cstheme="minorHAnsi"/>
+          <w:szCs w:val="24"/>
+        </w:rPr>
+      </w:pPr>
+      <m:oMath>
+        <m:sSub>
+          <m:sSubPr>
+            <m:ctrlPr>
+              <w:rPr>
+                <w:rFonts w:ascii="Cambria Math" w:hAnsi="Cambria Math" w:cstheme="minorHAnsi"/>
+                <w:i/>
+                <w:szCs w:val="24"/>
+              </w:rPr>
+            </m:ctrlPr>
+          </m:sSubPr>
+          <m:e>
+            <m:r>
+              <w:rPr>
+                <w:rFonts w:ascii="Cambria Math" w:hAnsi="Cambria Math" w:cstheme="minorHAnsi"/>
+                <w:szCs w:val="24"/>
+              </w:rPr>
+              <m:t>Pr</m:t>
+            </m:r>
+          </m:e>
+          <m:sub>
+            <m:r>
+              <w:rPr>
+                <w:rFonts w:ascii="Cambria Math" w:hAnsi="Cambria Math" w:cstheme="minorHAnsi"/>
+                <w:szCs w:val="24"/>
+              </w:rPr>
+              <m:t xml:space="preserve">i </m:t>
+            </m:r>
+          </m:sub>
+        </m:sSub>
+      </m:oMath>
+      <w:r>
+        <w:rPr>
+          <w:rFonts w:ascii="Aptos" w:hAnsi="Aptos" w:cstheme="minorHAnsi"/>
+          <w:szCs w:val="24"/>
+        </w:rPr>
+        <w:t>: Profit of project i</w:t>
+      </w:r>
+    </w:p>
+    <w:p>
+      <w:pPr>
+        <w:pStyle w:val="ListParagraph"/>
+        <w:spacing w:after="120"/>
+        <w:ind w:left="360"/>
+        <w:rPr>
+          <w:rFonts w:ascii="Aptos" w:hAnsi="Aptos" w:cstheme="minorHAnsi"/>
+          <w:szCs w:val="24"/>
+        </w:rPr>
+      </w:pPr>
+      <m:oMath>
+        <m:sSub>
+          <m:sSubPr>
+            <m:ctrlPr>
+              <w:rPr>
+                <w:rFonts w:ascii="Cambria Math" w:hAnsi="Cambria Math" w:cstheme="minorHAnsi"/>
+                <w:szCs w:val="24"/>
+              </w:rPr>
+            </m:ctrlPr>
+          </m:sSubPr>
+          <m:e>
+            <m:r>
+              <w:rPr>
+                <w:rFonts w:ascii="Cambria Math" w:hAnsi="Cambria Math" w:cstheme="minorHAnsi"/>
+                <w:szCs w:val="24"/>
+              </w:rPr>
+              <m:t>BD</m:t>
+            </m:r>
+          </m:e>
+          <m:sub>
+            <m:r>
+              <w:rPr>
+                <w:rFonts w:ascii="Cambria Math" w:hAnsi="Cambria Math" w:cstheme="minorHAnsi"/>
+                <w:szCs w:val="24"/>
+              </w:rPr>
+              <m:t xml:space="preserve">i </m:t>
+            </m:r>
+          </m:sub>
+        </m:sSub>
+      </m:oMath>
+      <w:r>
+        <w:rPr>
+          <w:rFonts w:ascii="Aptos" w:hAnsi="Aptos" w:cstheme="minorHAnsi"/>
+          <w:szCs w:val="24"/>
+        </w:rPr>
+        <w:t xml:space="preserve"> : Binary Decision</w:t>
+      </w:r>
+      <w:r>
+        <w:rPr>
+          <w:rFonts w:ascii="Aptos" w:hAnsi="Aptos" w:cstheme="minorHAnsi"/>
+          <w:szCs w:val="24"/>
+        </w:rPr>
+        <w:t xml:space="preserve"> Variable</w:t>
+      </w:r>
+      <w:r>
+        <w:rPr>
+          <w:rFonts w:ascii="Aptos" w:hAnsi="Aptos" w:cstheme="minorHAnsi"/>
+          <w:szCs w:val="24"/>
+        </w:rPr>
+        <w:t xml:space="preserve"> </w:t>
+      </w:r>
+      <m:oMath>
+        <m:r>
+          <w:rPr>
+            <w:rFonts w:ascii="Cambria Math" w:hAnsi="Cambria Math" w:cstheme="minorHAnsi"/>
+            <w:szCs w:val="24"/>
+          </w:rPr>
+          <m:t>∈(0, 1)</m:t>
+        </m:r>
+      </m:oMath>
+      <w:r>
+        <w:rPr>
+          <w:rFonts w:ascii="Aptos" w:hAnsi="Aptos" w:cstheme="minorHAnsi"/>
+          <w:szCs w:val="24"/>
+        </w:rPr>
+        <w:t xml:space="preserve"> of selecting the project/not</w:t>
+      </w:r>
+    </w:p>
+    <w:p>
+      <w:pPr>
+        <w:pStyle w:val="ListParagraph"/>
+        <w:spacing w:after="120"/>
+        <w:ind w:left="360"/>
+        <w:rPr>
+          <w:rFonts w:ascii="Aptos" w:hAnsi="Aptos" w:cstheme="minorHAnsi"/>
+          <w:szCs w:val="24"/>
+        </w:rPr>
+      </w:pPr>
+      <m:oMath>
+        <m:sSub>
+          <m:sSubPr>
+            <m:ctrlPr>
+              <w:rPr>
+                <w:rFonts w:ascii="Cambria Math" w:hAnsi="Cambria Math" w:cstheme="minorHAnsi"/>
+                <w:szCs w:val="24"/>
+              </w:rPr>
+            </m:ctrlPr>
+          </m:sSubPr>
+          <m:e>
+            <m:r>
+              <w:rPr>
+                <w:rFonts w:ascii="Cambria Math" w:hAnsi="Cambria Math" w:cstheme="minorHAnsi"/>
+                <w:szCs w:val="24"/>
+              </w:rPr>
+              <m:t>C</m:t>
+            </m:r>
+          </m:e>
+          <m:sub>
+            <m:r>
+              <w:rPr>
+                <w:rFonts w:ascii="Cambria Math" w:hAnsi="Cambria Math" w:cstheme="minorHAnsi"/>
+                <w:szCs w:val="24"/>
+              </w:rPr>
+              <m:t>i</m:t>
+            </m:r>
+          </m:sub>
+        </m:sSub>
+      </m:oMath>
+      <w:r>
+        <w:rPr>
+          <w:rFonts w:ascii="Aptos" w:hAnsi="Aptos" w:cstheme="minorHAnsi"/>
+          <w:szCs w:val="24"/>
+        </w:rPr>
+        <w:t xml:space="preserve"> : Cost of project i</w:t>
+      </w:r>
+    </w:p>
+    <w:p>
+      <w:pPr>
+        <w:pStyle w:val="ListParagraph"/>
+        <w:spacing w:after="120"/>
+        <w:ind w:left="360"/>
+        <w:rPr>
+          <w:rFonts w:ascii="Aptos" w:hAnsi="Aptos" w:cstheme="minorHAnsi"/>
+          <w:szCs w:val="24"/>
+        </w:rPr>
+      </w:pPr>
+      <m:oMath>
+        <m:r>
+          <m:rPr>
+            <m:sty m:val="p"/>
+          </m:rPr>
+          <w:rPr>
+            <w:rFonts w:ascii="Cambria Math" w:hAnsi="Cambria Math" w:cstheme="minorHAnsi"/>
+            <w:szCs w:val="24"/>
+          </w:rPr>
+          <m:t>TB</m:t>
+        </m:r>
+      </m:oMath>
+      <w:r>
+        <w:rPr>
+          <w:rFonts w:ascii="Aptos" w:hAnsi="Aptos" w:cstheme="minorHAnsi"/>
+          <w:szCs w:val="24"/>
+        </w:rPr>
+        <w:t xml:space="preserve"> : Total Budget Avaialable </w:t>
+      </w:r>
+    </w:p>
+    <w:p>
+      <w:pPr>
+        <w:pStyle w:val="ListParagraph"/>
+        <w:spacing w:after="120"/>
+        <w:ind w:left="360"/>
+        <w:rPr>
+          <w:rFonts w:ascii="Aptos" w:hAnsi="Aptos" w:cstheme="minorHAnsi"/>
+          <w:szCs w:val="24"/>
+        </w:rPr>
+      </w:pPr>
+      <m:oMath>
+        <m:r>
+          <m:rPr>
+            <m:sty m:val="p"/>
+          </m:rPr>
+          <w:rPr>
+            <w:rFonts w:ascii="Cambria Math" w:hAnsi="Cambria Math" w:cstheme="minorHAnsi"/>
+            <w:szCs w:val="24"/>
+          </w:rPr>
+          <m:t>TH</m:t>
+        </m:r>
+      </m:oMath>
+      <w:r>
+        <w:rPr>
+          <w:rFonts w:ascii="Aptos" w:hAnsi="Aptos" w:cstheme="minorHAnsi"/>
+          <w:szCs w:val="24"/>
+        </w:rPr>
+        <w:t xml:space="preserve"> : Total Developer Hours Avaialable </w:t>
+      </w:r>
+    </w:p>
+    <w:p>
+      <w:pPr>
+        <w:pStyle w:val="ListParagraph"/>
+        <w:spacing w:after="120"/>
+        <w:ind w:left="360"/>
+        <w:rPr>
+          <w:rFonts w:ascii="Aptos" w:hAnsi="Aptos" w:cstheme="minorHAnsi"/>
+          <w:szCs w:val="24"/>
+        </w:rPr>
+      </w:pPr>
+    </w:p>
+    <w:p>
+      <w:pPr>
+        <w:pStyle w:val="Heading3"/>
+        <w:rPr>
+          <w:rFonts w:ascii="Aptos" w:hAnsi="Aptos" w:cs="Angsana New"/>
+        </w:rPr>
+      </w:pPr>
+      <w:r>
+        <w:rPr>
+          <w:rFonts w:ascii="Aptos" w:hAnsi="Aptos" w:cs="Angsana New"/>
+        </w:rPr>
+        <w:lastRenderedPageBreak/>
+        <w:t>Literature Review</w:t>
+      </w:r>
+    </w:p>
+    <w:p>
+      <w:pPr>
+        <w:pStyle w:val="Heading3"/>
+        <w:rPr>
+          <w:rFonts w:ascii="Aptos" w:hAnsi="Aptos" w:cs="Angsana New"/>
+        </w:rPr>
+      </w:pPr>
+    </w:p>
+    <w:p>
+      <w:pPr>
+        <w:pStyle w:val="Heading3"/>
+        <w:rPr>
+          <w:rFonts w:ascii="Aptos" w:hAnsi="Aptos" w:cs="Angsana New"/>
+        </w:rPr>
+      </w:pPr>
+      <w:r>
+        <w:rPr>
+          <w:rFonts w:ascii="Aptos" w:hAnsi="Aptos" w:cs="Angsana New"/>
+        </w:rPr>
+        <w:t>Slecting GA and MIP</w:t>
+      </w:r>
+    </w:p>
+    <w:p>
+      <w:pPr>
+        <w:pStyle w:val="BodyText"/>
+      </w:pPr>
+    </w:p>
+    <w:p>
+      <w:pPr>
+        <w:pStyle w:val="Heading5"/>
+      </w:pPr>
+      <w:r>
+        <w:t xml:space="preserve">Mixed Integer Programming (MIP) </w:t>
+      </w:r>
+    </w:p>
+    <w:p>
+      <w:pPr>
+        <w:rPr>
+          <w:rFonts w:ascii="Aptos" w:hAnsi="Aptos"/>
+        </w:rPr>
+      </w:pPr>
+      <w:r>
+        <w:rPr>
+          <w:rFonts w:ascii="Aptos" w:hAnsi="Aptos"/>
+        </w:rPr>
+        <w:t xml:space="preserve">This is mathematically optimal solution to slicing the search space using branch and cut method to make the best possible decision. The “Mixed” part here meant to be handle two distinct types of variables. </w:t>
+      </w:r>
+    </w:p>
+    <w:p>
+      <w:pPr>
+        <w:pStyle w:val="ListParagraph"/>
+        <w:numPr>
+          <w:ilvl w:val="0"/>
+          <w:numId w:val="93"/>
+        </w:numPr>
+        <w:rPr>
+          <w:rFonts w:ascii="Aptos" w:hAnsi="Aptos"/>
+        </w:rPr>
+      </w:pPr>
+      <w:r>
+        <w:rPr>
+          <w:rFonts w:ascii="Aptos" w:hAnsi="Aptos"/>
+          <w:b/>
+          <w:bCs/>
+          <w:i/>
+          <w:iCs/>
+        </w:rPr>
+        <w:t>Integer</w:t>
+      </w:r>
+      <w:r>
+        <w:rPr>
+          <w:rFonts w:ascii="Aptos" w:hAnsi="Aptos"/>
+          <w:b/>
+          <w:bCs/>
+          <w:i/>
+          <w:iCs/>
+        </w:rPr>
+        <w:t>/</w:t>
+      </w:r>
+      <w:r>
+        <w:rPr>
+          <w:rFonts w:ascii="Aptos" w:hAnsi="Aptos"/>
+          <w:b/>
+          <w:bCs/>
+          <w:i/>
+          <w:iCs/>
+        </w:rPr>
+        <w:t>Binary varaibles</w:t>
+      </w:r>
+      <w:r>
+        <w:rPr>
+          <w:rFonts w:ascii="Aptos" w:hAnsi="Aptos"/>
+        </w:rPr>
+        <w:t xml:space="preserve"> : This is for problems that cannot be devided into fractions. For exaple </w:t>
+      </w:r>
+      <w:r>
+        <w:rPr>
+          <w:rFonts w:ascii="Aptos" w:hAnsi="Aptos"/>
+        </w:rPr>
+        <w:t>the projet selection above is select or not. We cannot execute the project partially</w:t>
+      </w:r>
+    </w:p>
+    <w:p>
+      <w:pPr>
+        <w:pStyle w:val="ListParagraph"/>
+        <w:numPr>
+          <w:ilvl w:val="0"/>
+          <w:numId w:val="93"/>
+        </w:numPr>
+        <w:rPr>
+          <w:rFonts w:ascii="Aptos" w:hAnsi="Aptos"/>
+        </w:rPr>
+      </w:pPr>
+      <w:r>
+        <w:rPr>
+          <w:rFonts w:ascii="Aptos" w:hAnsi="Aptos"/>
+          <w:b/>
+          <w:bCs/>
+          <w:i/>
+          <w:iCs/>
+        </w:rPr>
+        <w:t>Continous variables</w:t>
+      </w:r>
+      <w:r>
+        <w:rPr>
+          <w:rFonts w:ascii="Aptos" w:hAnsi="Aptos"/>
+        </w:rPr>
+        <w:t xml:space="preserve"> : Numbers may have fraction values. For example the problems like 1.5 devleoper hours if applciable.</w:t>
+      </w:r>
+    </w:p>
+    <w:p>
+      <w:pPr>
+        <w:rPr>
+          <w:rFonts w:ascii="Aptos" w:hAnsi="Aptos"/>
+        </w:rPr>
+      </w:pPr>
+      <w:r>
+        <w:rPr>
+          <w:rFonts w:ascii="Aptos" w:hAnsi="Aptos"/>
+        </w:rPr>
+        <w:t>And MIP can address only when relationship</w:t>
+      </w:r>
+      <w:r>
+        <w:rPr>
+          <w:rFonts w:ascii="Aptos" w:hAnsi="Aptos"/>
+        </w:rPr>
+        <w:t xml:space="preserve"> </w:t>
+      </w:r>
+      <w:r>
+        <w:rPr>
+          <w:rFonts w:ascii="Aptos" w:hAnsi="Aptos"/>
+        </w:rPr>
+        <w:t>between variables are linear.</w:t>
+      </w:r>
+    </w:p>
+    <w:p>
+      <w:pPr>
+        <w:rPr>
+          <w:rFonts w:ascii="Aptos" w:hAnsi="Aptos"/>
+        </w:rPr>
+      </w:pPr>
+    </w:p>
+    <w:p>
+      <w:pPr>
+        <w:pStyle w:val="Heading5"/>
+      </w:pPr>
+      <w:r>
+        <w:t>Genetic Algorithm (GA)</w:t>
+      </w:r>
+    </w:p>
+    <w:p>
+      <w:pPr>
+        <w:pStyle w:val="BodyText"/>
+        <w:rPr>
+          <w:lang w:val="en-US" w:eastAsia="zh-CN" w:bidi="hi-IN"/>
+        </w:rPr>
+      </w:pPr>
+      <w:r>
+        <w:rPr>
+          <w:lang w:val="en-US" w:eastAsia="zh-CN" w:bidi="hi-IN"/>
+        </w:rPr>
+        <w:t>For simple use cases MIP normally superior because, they execute fast and guarantees we found best possible combination. But when the problem shifts from simple use cases to more extreme complex use cases GA becomes the preferred choice.</w:t>
+      </w:r>
+      <w:r>
+        <w:rPr>
+          <w:lang w:val="en-US" w:eastAsia="zh-CN" w:bidi="hi-IN"/>
+        </w:rPr>
+        <w:t xml:space="preserve"> Following are some cases where GA becomes the superior choice</w:t>
+      </w:r>
+      <w:r>
+        <w:rPr>
+          <w:lang w:val="en-US" w:eastAsia="zh-CN" w:bidi="hi-IN"/>
+        </w:rPr>
+        <w:t>.</w:t>
+      </w:r>
+    </w:p>
+    <w:p>
+      <w:pPr>
         <w:pStyle w:val="BodyText"/>
         <w:numPr>
           <w:ilvl w:val="1"/>
-          <w:numId w:val="1"/>
+          <w:numId w:val="93"/>
         </w:numPr>
         <w:rPr>
-          <w:rFonts w:ascii="Aptos" w:hAnsi="Aptos" w:cs="Angsana New"/>
-        </w:rPr>
-      </w:pPr>
-      <w:r>
-        <w:rPr>
-          <w:rFonts w:ascii="Aptos" w:hAnsi="Aptos"/>
+          <w:lang w:val="en-US" w:eastAsia="zh-CN" w:bidi="hi-IN"/>
+        </w:rPr>
+      </w:pPr>
+      <w:r>
+        <w:rPr>
+          <w:lang w:val="en-US" w:eastAsia="zh-CN" w:bidi="hi-IN"/>
+        </w:rPr>
+        <w:t>Massive problem Size: Eg: 100,000 projects, number of combinations may not be possible for MIP to handle</w:t>
+      </w:r>
+    </w:p>
+    <w:p>
+      <w:pPr>
+        <w:pStyle w:val="BodyText"/>
+        <w:numPr>
+          <w:ilvl w:val="1"/>
+          <w:numId w:val="93"/>
+        </w:numPr>
+        <w:rPr>
+          <w:lang w:val="en-US" w:eastAsia="zh-CN" w:bidi="hi-IN"/>
+        </w:rPr>
+      </w:pPr>
+      <w:r>
+        <w:rPr>
+          <w:lang w:val="en-US" w:eastAsia="zh-CN" w:bidi="hi-IN"/>
+        </w:rPr>
+        <w:t>Non-Linear variables: Eg: Profile = Project 1</w:t>
+      </w:r>
+      <w:proofErr w:type="gramStart"/>
+      <w:r>
+        <w:rPr>
+          <w:lang w:val="en-US" w:eastAsia="zh-CN" w:bidi="hi-IN"/>
+        </w:rPr>
+        <w:t>^  2</w:t>
+      </w:r>
+      <w:proofErr w:type="gramEnd"/>
+      <w:r>
+        <w:rPr>
+          <w:lang w:val="en-US" w:eastAsia="zh-CN" w:bidi="hi-IN"/>
+        </w:rPr>
+        <w:t>, MIP may fail here, GA do not care linearity</w:t>
+      </w:r>
+    </w:p>
+    <w:p>
+      <w:pPr>
+        <w:pStyle w:val="BodyText"/>
+        <w:numPr>
+          <w:ilvl w:val="1"/>
+          <w:numId w:val="93"/>
+        </w:numPr>
+        <w:rPr>
+          <w:lang w:val="en-US" w:eastAsia="zh-CN" w:bidi="hi-IN"/>
+        </w:rPr>
+      </w:pPr>
+      <w:r>
+        <w:rPr>
+          <w:lang w:val="en-US" w:eastAsia="zh-CN" w:bidi="hi-IN"/>
+        </w:rPr>
+        <w:t>Complex Time-sequence dependencies: Eg: due to a holiday season in 2 months developer hours availability significantly reduce.</w:t>
+      </w:r>
+    </w:p>
+    <w:p>
+      <w:pPr>
+        <w:suppressAutoHyphens/>
+        <w:rPr>
+          <w:lang w:val="en-US" w:eastAsia="zh-CN" w:bidi="hi-IN"/>
+        </w:rPr>
+      </w:pPr>
+      <w:r>
+        <w:rPr>
+          <w:lang w:val="en-US" w:eastAsia="zh-CN" w:bidi="hi-IN"/>
+        </w:rPr>
+        <w:br w:type="page"/>
+      </w:r>
+    </w:p>
+    <w:p>
+      <w:pPr>
+        <w:pStyle w:val="BodyText"/>
+        <w:rPr>
+          <w:lang w:val="en-US" w:eastAsia="zh-CN" w:bidi="hi-IN"/>
+        </w:rPr>
+      </w:pPr>
+      <w:r>
+        <w:rPr>
+          <w:lang w:val="en-US" w:eastAsia="zh-CN" w:bidi="hi-IN"/>
         </w:rPr>
         <w:lastRenderedPageBreak/>
+        <w:t>References</w:t>
+      </w:r>
+    </w:p>
+    <w:p>
+      <w:pPr>
+        <w:suppressAutoHyphens/>
+        <w:rPr>
+          <w:rFonts w:ascii="Aptos" w:hAnsi="Aptos" w:cs="Angsana New"/>
+        </w:rPr>
+      </w:pPr>
+    </w:p>
+    <w:p>
+      <w:pPr>
+        <w:pStyle w:val="BodyText"/>
+        <w:numPr>
+          <w:ilvl w:val="1"/>
+          <w:numId w:val="94"/>
+        </w:numPr>
+        <w:rPr>
+          <w:rFonts w:ascii="Aptos" w:hAnsi="Aptos" w:cs="Angsana New"/>
+        </w:rPr>
+      </w:pPr>
+      <w:r>
+        <w:rPr>
+          <w:rFonts w:ascii="Aptos" w:hAnsi="Aptos"/>
+        </w:rPr>
         <w:t xml:space="preserve">R. Kohavi, "Scaling up the accuracy of Naive-Bayes classifiers: A decision-tree hybrid," in </w:t>
       </w:r>
       <w:r>
@@ -15078,7 +16335,7 @@
         <w:pStyle w:val="BodyText"/>
         <w:numPr>
           <w:ilvl w:val="1"/>
-          <w:numId w:val="1"/>
+          <w:numId w:val="94"/>
         </w:numPr>
         <w:rPr>
           <w:rFonts w:ascii="Aptos" w:hAnsi="Aptos" w:cs="Angsana New"/>
@@ -15110,7 +16367,7 @@
         <w:pStyle w:val="BodyText"/>
         <w:numPr>
           <w:ilvl w:val="1"/>
-          <w:numId w:val="1"/>
+          <w:numId w:val="94"/>
         </w:numPr>
         <w:rPr>
           <w:rFonts w:ascii="Aptos" w:hAnsi="Aptos" w:cs="Angsana New"/>
@@ -15142,7 +16399,7 @@
         <w:pStyle w:val="BodyText"/>
         <w:numPr>
           <w:ilvl w:val="1"/>
-          <w:numId w:val="1"/>
+          <w:numId w:val="94"/>
         </w:numPr>
         <w:rPr>
           <w:rFonts w:ascii="Aptos" w:hAnsi="Aptos" w:cs="Angsana New"/>
@@ -15174,7 +16431,7 @@
         <w:pStyle w:val="BodyText"/>
         <w:numPr>
           <w:ilvl w:val="1"/>
-          <w:numId w:val="1"/>
+          <w:numId w:val="94"/>
         </w:numPr>
         <w:rPr>
           <w:rFonts w:ascii="Aptos" w:hAnsi="Aptos" w:cs="Angsana New"/>
@@ -15206,7 +16463,7 @@
         <w:pStyle w:val="BodyText"/>
         <w:numPr>
           <w:ilvl w:val="1"/>
-          <w:numId w:val="1"/>
+          <w:numId w:val="94"/>
         </w:numPr>
         <w:rPr>
           <w:rFonts w:ascii="Aptos" w:hAnsi="Aptos" w:cs="Angsana New"/>
@@ -15238,7 +16495,7 @@
         <w:pStyle w:val="BodyText"/>
         <w:numPr>
           <w:ilvl w:val="1"/>
-          <w:numId w:val="1"/>
+          <w:numId w:val="94"/>
         </w:numPr>
         <w:rPr>
           <w:rFonts w:ascii="Aptos" w:hAnsi="Aptos" w:cs="Angsana New"/>
@@ -15270,7 +16527,7 @@
         <w:pStyle w:val="BodyText"/>
         <w:numPr>
           <w:ilvl w:val="1"/>
-          <w:numId w:val="1"/>
+          <w:numId w:val="94"/>
         </w:numPr>
         <w:rPr>
           <w:rFonts w:ascii="Aptos" w:hAnsi="Aptos" w:cs="Angsana New"/>
@@ -15860,6 +17117,119 @@
     </w:lvl>
   </w:abstractNum>
   <w:abstractNum w:abstractNumId="5" w15:restartNumberingAfterBreak="0">
+    <w:nsid w:val="06D018EA"/>
+    <w:multiLevelType w:val="multilevel"/>
+    <w:tmpl w:val="3AE6F6DE"/>
+    <w:lvl w:ilvl="0">
+      <w:start w:val="1"/>
+      <w:numFmt w:val="decimal"/>
+      <w:lvlText w:val="%1."/>
+      <w:lvlJc w:val="left"/>
+      <w:pPr>
+        <w:ind w:left="360" w:hanging="360"/>
+      </w:pPr>
+      <w:rPr>
+        <w:rFonts w:hint="default"/>
+      </w:rPr>
+    </w:lvl>
+    <w:lvl w:ilvl="1">
+      <w:start w:val="1"/>
+      <w:numFmt w:val="decimal"/>
+      <w:lvlText w:val="%2."/>
+      <w:lvlJc w:val="left"/>
+      <w:pPr>
+        <w:tabs>
+          <w:tab w:val="num" w:pos="632"/>
+        </w:tabs>
+        <w:ind w:left="632" w:hanging="283"/>
+      </w:pPr>
+    </w:lvl>
+    <w:lvl w:ilvl="2">
+      <w:start w:val="1"/>
+      <w:numFmt w:val="decimal"/>
+      <w:lvlText w:val="%3."/>
+      <w:lvlJc w:val="left"/>
+      <w:pPr>
+        <w:tabs>
+          <w:tab w:val="num" w:pos="1341"/>
+        </w:tabs>
+        <w:ind w:left="1341" w:hanging="283"/>
+      </w:pPr>
+    </w:lvl>
+    <w:lvl w:ilvl="3">
+      <w:start w:val="1"/>
+      <w:numFmt w:val="decimal"/>
+      <w:lvlText w:val="%4."/>
+      <w:lvlJc w:val="left"/>
+      <w:pPr>
+        <w:tabs>
+          <w:tab w:val="num" w:pos="2050"/>
+        </w:tabs>
+        <w:ind w:left="2050" w:hanging="283"/>
+      </w:pPr>
+    </w:lvl>
+    <w:lvl w:ilvl="4">
+      <w:start w:val="1"/>
+      <w:numFmt w:val="decimal"/>
+      <w:lvlText w:val="%5."/>
+      <w:lvlJc w:val="left"/>
+      <w:pPr>
+        <w:tabs>
+          <w:tab w:val="num" w:pos="2759"/>
+        </w:tabs>
+        <w:ind w:left="2759" w:hanging="283"/>
+      </w:pPr>
+    </w:lvl>
+    <w:lvl w:ilvl="5">
+      <w:start w:val="1"/>
+      <w:numFmt w:val="decimal"/>
+      <w:lvlText w:val="%6."/>
+      <w:lvlJc w:val="left"/>
+      <w:pPr>
+        <w:tabs>
+          <w:tab w:val="num" w:pos="3468"/>
+        </w:tabs>
+        <w:ind w:left="3468" w:hanging="283"/>
+      </w:pPr>
+    </w:lvl>
+    <w:lvl w:ilvl="6">
+      <w:start w:val="1"/>
+      <w:numFmt w:val="decimal"/>
+      <w:lvlText w:val="%7."/>
+      <w:lvlJc w:val="left"/>
+      <w:pPr>
+        <w:tabs>
+          <w:tab w:val="num" w:pos="4177"/>
+        </w:tabs>
+        <w:ind w:left="4177" w:hanging="283"/>
+      </w:pPr>
+    </w:lvl>
+    <w:lvl w:ilvl="7">
+      <w:start w:val="1"/>
+      <w:numFmt w:val="decimal"/>
+      <w:lvlText w:val="%8."/>
+      <w:lvlJc w:val="left"/>
+      <w:pPr>
+        <w:tabs>
+          <w:tab w:val="num" w:pos="4886"/>
+        </w:tabs>
+        <w:ind w:left="4886" w:hanging="283"/>
+      </w:pPr>
+    </w:lvl>
+    <w:lvl w:ilvl="8">
+      <w:start w:val="1"/>
+      <w:numFmt w:val="decimal"/>
+      <w:lvlText w:val="%9."/>
+      <w:lvlJc w:val="left"/>
+      <w:pPr>
+        <w:tabs>
+          <w:tab w:val="num" w:pos="5595"/>
+        </w:tabs>
+        <w:ind w:left="5595" w:hanging="283"/>
+      </w:pPr>
+    </w:lvl>
+  </w:abstractNum>
+  <w:abstractNum w:abstractNumId="6" w15:restartNumberingAfterBreak="0">
     <w:nsid w:val="071D2490"/>
     <w:multiLevelType w:val="hybridMultilevel"/>
     <w:tmpl w:val="CB145054"/>
@@ -15954,7 +17324,7 @@
       </w:pPr>
     </w:lvl>
   </w:abstractNum>
-  <w:abstractNum w:abstractNumId="6" w15:restartNumberingAfterBreak="0">
+  <w:abstractNum w:abstractNumId="7" w15:restartNumberingAfterBreak="0">
     <w:nsid w:val="075C018C"/>
     <w:multiLevelType w:val="hybridMultilevel"/>
     <w:tmpl w:val="7D2EE680"/>
@@ -16043,7 +17413,7 @@
       </w:pPr>
     </w:lvl>
   </w:abstractNum>
-  <w:abstractNum w:abstractNumId="7" w15:restartNumberingAfterBreak="0">
+  <w:abstractNum w:abstractNumId="8" w15:restartNumberingAfterBreak="0">
     <w:nsid w:val="084B5F6F"/>
     <w:multiLevelType w:val="hybridMultilevel"/>
     <w:tmpl w:val="CE9AA2AC"/>
@@ -16157,7 +17527,7 @@
       </w:rPr>
     </w:lvl>
   </w:abstractNum>
-  <w:abstractNum w:abstractNumId="8" w15:restartNumberingAfterBreak="0">
+  <w:abstractNum w:abstractNumId="9" w15:restartNumberingAfterBreak="0">
     <w:nsid w:val="09B6400A"/>
     <w:multiLevelType w:val="hybridMultilevel"/>
     <w:tmpl w:val="5AD4FBBA"/>
@@ -16246,7 +17616,7 @@
       </w:pPr>
     </w:lvl>
   </w:abstractNum>
-  <w:abstractNum w:abstractNumId="9" w15:restartNumberingAfterBreak="0">
+  <w:abstractNum w:abstractNumId="10" w15:restartNumberingAfterBreak="0">
     <w:nsid w:val="0BEA3F5F"/>
     <w:multiLevelType w:val="multilevel"/>
     <w:tmpl w:val="D95C38D0"/>
@@ -16359,7 +17729,7 @@
       </w:pPr>
     </w:lvl>
   </w:abstractNum>
-  <w:abstractNum w:abstractNumId="10" w15:restartNumberingAfterBreak="0">
+  <w:abstractNum w:abstractNumId="11" w15:restartNumberingAfterBreak="0">
     <w:nsid w:val="0F723653"/>
     <w:multiLevelType w:val="hybridMultilevel"/>
     <w:tmpl w:val="9B96719A"/>
@@ -16445,7 +17815,7 @@
       </w:pPr>
     </w:lvl>
   </w:abstractNum>
-  <w:abstractNum w:abstractNumId="11" w15:restartNumberingAfterBreak="0">
+  <w:abstractNum w:abstractNumId="12" w15:restartNumberingAfterBreak="0">
     <w:nsid w:val="10CB70C6"/>
     <w:multiLevelType w:val="hybridMultilevel"/>
     <w:tmpl w:val="6DD0207A"/>
@@ -16559,7 +17929,7 @@
       </w:rPr>
     </w:lvl>
   </w:abstractNum>
-  <w:abstractNum w:abstractNumId="12" w15:restartNumberingAfterBreak="0">
+  <w:abstractNum w:abstractNumId="13" w15:restartNumberingAfterBreak="0">
     <w:nsid w:val="140A0A72"/>
     <w:multiLevelType w:val="multilevel"/>
     <w:tmpl w:val="3AE6F6DE"/>
@@ -16672,7 +18042,7 @@
       </w:pPr>
     </w:lvl>
   </w:abstractNum>
-  <w:abstractNum w:abstractNumId="13" w15:restartNumberingAfterBreak="0">
+  <w:abstractNum w:abstractNumId="14" w15:restartNumberingAfterBreak="0">
     <w:nsid w:val="152C6DF0"/>
     <w:multiLevelType w:val="multilevel"/>
     <w:tmpl w:val="C6EC08BA"/>
@@ -16821,7 +18191,7 @@
       </w:rPr>
     </w:lvl>
   </w:abstractNum>
-  <w:abstractNum w:abstractNumId="14" w15:restartNumberingAfterBreak="0">
+  <w:abstractNum w:abstractNumId="15" w15:restartNumberingAfterBreak="0">
     <w:nsid w:val="165A2156"/>
     <w:multiLevelType w:val="multilevel"/>
     <w:tmpl w:val="40D0C17E"/>
@@ -16970,7 +18340,7 @@
       </w:rPr>
     </w:lvl>
   </w:abstractNum>
-  <w:abstractNum w:abstractNumId="15" w15:restartNumberingAfterBreak="0">
+  <w:abstractNum w:abstractNumId="16" w15:restartNumberingAfterBreak="0">
     <w:nsid w:val="19296353"/>
     <w:multiLevelType w:val="hybridMultilevel"/>
     <w:tmpl w:val="49ACDB06"/>
@@ -17084,7 +18454,7 @@
       </w:rPr>
     </w:lvl>
   </w:abstractNum>
-  <w:abstractNum w:abstractNumId="16" w15:restartNumberingAfterBreak="0">
+  <w:abstractNum w:abstractNumId="17" w15:restartNumberingAfterBreak="0">
     <w:nsid w:val="1AAF6121"/>
     <w:multiLevelType w:val="multilevel"/>
     <w:tmpl w:val="3AE6F6DE"/>
@@ -17197,7 +18567,7 @@
       </w:pPr>
     </w:lvl>
   </w:abstractNum>
-  <w:abstractNum w:abstractNumId="17" w15:restartNumberingAfterBreak="0">
+  <w:abstractNum w:abstractNumId="18" w15:restartNumberingAfterBreak="0">
     <w:nsid w:val="1AF0283E"/>
     <w:multiLevelType w:val="multilevel"/>
     <w:tmpl w:val="F7425054"/>
@@ -17310,7 +18680,120 @@
       </w:pPr>
     </w:lvl>
   </w:abstractNum>
-  <w:abstractNum w:abstractNumId="18" w15:restartNumberingAfterBreak="0">
+  <w:abstractNum w:abstractNumId="19" w15:restartNumberingAfterBreak="0">
+    <w:nsid w:val="1BD2073C"/>
+    <w:multiLevelType w:val="multilevel"/>
+    <w:tmpl w:val="3AE6F6DE"/>
+    <w:lvl w:ilvl="0">
+      <w:start w:val="1"/>
+      <w:numFmt w:val="decimal"/>
+      <w:lvlText w:val="%1."/>
+      <w:lvlJc w:val="left"/>
+      <w:pPr>
+        <w:ind w:left="360" w:hanging="360"/>
+      </w:pPr>
+      <w:rPr>
+        <w:rFonts w:hint="default"/>
+      </w:rPr>
+    </w:lvl>
+    <w:lvl w:ilvl="1">
+      <w:start w:val="1"/>
+      <w:numFmt w:val="decimal"/>
+      <w:lvlText w:val="%2."/>
+      <w:lvlJc w:val="left"/>
+      <w:pPr>
+        <w:tabs>
+          <w:tab w:val="num" w:pos="632"/>
+        </w:tabs>
+        <w:ind w:left="632" w:hanging="283"/>
+      </w:pPr>
+    </w:lvl>
+    <w:lvl w:ilvl="2">
+      <w:start w:val="1"/>
+      <w:numFmt w:val="decimal"/>
+      <w:lvlText w:val="%3."/>
+      <w:lvlJc w:val="left"/>
+      <w:pPr>
+        <w:tabs>
+          <w:tab w:val="num" w:pos="1341"/>
+        </w:tabs>
+        <w:ind w:left="1341" w:hanging="283"/>
+      </w:pPr>
+    </w:lvl>
+    <w:lvl w:ilvl="3">
+      <w:start w:val="1"/>
+      <w:numFmt w:val="decimal"/>
+      <w:lvlText w:val="%4."/>
+      <w:lvlJc w:val="left"/>
+      <w:pPr>
+        <w:tabs>
+          <w:tab w:val="num" w:pos="2050"/>
+        </w:tabs>
+        <w:ind w:left="2050" w:hanging="283"/>
+      </w:pPr>
+    </w:lvl>
+    <w:lvl w:ilvl="4">
+      <w:start w:val="1"/>
+      <w:numFmt w:val="decimal"/>
+      <w:lvlText w:val="%5."/>
+      <w:lvlJc w:val="left"/>
+      <w:pPr>
+        <w:tabs>
+          <w:tab w:val="num" w:pos="2759"/>
+        </w:tabs>
+        <w:ind w:left="2759" w:hanging="283"/>
+      </w:pPr>
+    </w:lvl>
+    <w:lvl w:ilvl="5">
+      <w:start w:val="1"/>
+      <w:numFmt w:val="decimal"/>
+      <w:lvlText w:val="%6."/>
+      <w:lvlJc w:val="left"/>
+      <w:pPr>
+        <w:tabs>
+          <w:tab w:val="num" w:pos="3468"/>
+        </w:tabs>
+        <w:ind w:left="3468" w:hanging="283"/>
+      </w:pPr>
+    </w:lvl>
+    <w:lvl w:ilvl="6">
+      <w:start w:val="1"/>
+      <w:numFmt w:val="decimal"/>
+      <w:lvlText w:val="%7."/>
+      <w:lvlJc w:val="left"/>
+      <w:pPr>
+        <w:tabs>
+          <w:tab w:val="num" w:pos="4177"/>
+        </w:tabs>
+        <w:ind w:left="4177" w:hanging="283"/>
+      </w:pPr>
+    </w:lvl>
+    <w:lvl w:ilvl="7">
+      <w:start w:val="1"/>
+      <w:numFmt w:val="decimal"/>
+      <w:lvlText w:val="%8."/>
+      <w:lvlJc w:val="left"/>
+      <w:pPr>
+        <w:tabs>
+          <w:tab w:val="num" w:pos="4886"/>
+        </w:tabs>
+        <w:ind w:left="4886" w:hanging="283"/>
+      </w:pPr>
+    </w:lvl>
+    <w:lvl w:ilvl="8">
+      <w:start w:val="1"/>
+      <w:numFmt w:val="decimal"/>
+      <w:lvlText w:val="%9."/>
+      <w:lvlJc w:val="left"/>
+      <w:pPr>
+        <w:tabs>
+          <w:tab w:val="num" w:pos="5595"/>
+        </w:tabs>
+        <w:ind w:left="5595" w:hanging="283"/>
+      </w:pPr>
+    </w:lvl>
+  </w:abstractNum>
+  <w:abstractNum w:abstractNumId="20" w15:restartNumberingAfterBreak="0">
     <w:nsid w:val="1E7779C4"/>
     <w:multiLevelType w:val="hybridMultilevel"/>
     <w:tmpl w:val="6F5A4240"/>
@@ -17396,7 +18879,7 @@
       </w:pPr>
     </w:lvl>
   </w:abstractNum>
-  <w:abstractNum w:abstractNumId="19" w15:restartNumberingAfterBreak="0">
+  <w:abstractNum w:abstractNumId="21" w15:restartNumberingAfterBreak="0">
     <w:nsid w:val="2082558F"/>
     <w:multiLevelType w:val="hybridMultilevel"/>
     <w:tmpl w:val="0E24C6FE"/>
@@ -17482,7 +18965,7 @@
       </w:pPr>
     </w:lvl>
   </w:abstractNum>
-  <w:abstractNum w:abstractNumId="20" w15:restartNumberingAfterBreak="0">
+  <w:abstractNum w:abstractNumId="22" w15:restartNumberingAfterBreak="0">
     <w:nsid w:val="20AE70D9"/>
     <w:multiLevelType w:val="multilevel"/>
     <w:tmpl w:val="17B6E6B8"/>
@@ -17622,7 +19105,7 @@
       </w:rPr>
     </w:lvl>
   </w:abstractNum>
-  <w:abstractNum w:abstractNumId="21" w15:restartNumberingAfterBreak="0">
+  <w:abstractNum w:abstractNumId="23" w15:restartNumberingAfterBreak="0">
     <w:nsid w:val="20DD6CA6"/>
     <w:multiLevelType w:val="hybridMultilevel"/>
     <w:tmpl w:val="E92CCC3C"/>
@@ -17708,7 +19191,7 @@
       </w:pPr>
     </w:lvl>
   </w:abstractNum>
-  <w:abstractNum w:abstractNumId="22" w15:restartNumberingAfterBreak="0">
+  <w:abstractNum w:abstractNumId="24" w15:restartNumberingAfterBreak="0">
     <w:nsid w:val="228D2141"/>
     <w:multiLevelType w:val="hybridMultilevel"/>
     <w:tmpl w:val="F66AEBAA"/>
@@ -17794,7 +19277,7 @@
       </w:pPr>
     </w:lvl>
   </w:abstractNum>
-  <w:abstractNum w:abstractNumId="23" w15:restartNumberingAfterBreak="0">
+  <w:abstractNum w:abstractNumId="25" w15:restartNumberingAfterBreak="0">
     <w:nsid w:val="23831269"/>
     <w:multiLevelType w:val="hybridMultilevel"/>
     <w:tmpl w:val="D24C40E8"/>
@@ -17880,7 +19363,7 @@
       </w:pPr>
     </w:lvl>
   </w:abstractNum>
-  <w:abstractNum w:abstractNumId="24" w15:restartNumberingAfterBreak="0">
+  <w:abstractNum w:abstractNumId="26" w15:restartNumberingAfterBreak="0">
     <w:nsid w:val="27B4661F"/>
     <w:multiLevelType w:val="hybridMultilevel"/>
     <w:tmpl w:val="4CB89B40"/>
@@ -17969,7 +19452,7 @@
       </w:pPr>
     </w:lvl>
   </w:abstractNum>
-  <w:abstractNum w:abstractNumId="25" w15:restartNumberingAfterBreak="0">
+  <w:abstractNum w:abstractNumId="27" w15:restartNumberingAfterBreak="0">
     <w:nsid w:val="28DD64D0"/>
     <w:multiLevelType w:val="multilevel"/>
     <w:tmpl w:val="B84E2224"/>
@@ -18109,7 +19592,7 @@
       </w:rPr>
     </w:lvl>
   </w:abstractNum>
-  <w:abstractNum w:abstractNumId="26" w15:restartNumberingAfterBreak="0">
+  <w:abstractNum w:abstractNumId="28" w15:restartNumberingAfterBreak="0">
     <w:nsid w:val="292C3BC6"/>
     <w:multiLevelType w:val="multilevel"/>
     <w:tmpl w:val="CA744F16"/>
@@ -18249,7 +19732,7 @@
       </w:rPr>
     </w:lvl>
   </w:abstractNum>
-  <w:abstractNum w:abstractNumId="27" w15:restartNumberingAfterBreak="0">
+  <w:abstractNum w:abstractNumId="29" w15:restartNumberingAfterBreak="0">
     <w:nsid w:val="29D04CD5"/>
     <w:multiLevelType w:val="multilevel"/>
     <w:tmpl w:val="76BC96D4"/>
@@ -18389,7 +19872,7 @@
       </w:rPr>
     </w:lvl>
   </w:abstractNum>
-  <w:abstractNum w:abstractNumId="28" w15:restartNumberingAfterBreak="0">
+  <w:abstractNum w:abstractNumId="30" w15:restartNumberingAfterBreak="0">
     <w:nsid w:val="2CC94DA2"/>
     <w:multiLevelType w:val="multilevel"/>
     <w:tmpl w:val="45E0056A"/>
@@ -18510,7 +19993,7 @@
       </w:pPr>
     </w:lvl>
   </w:abstractNum>
-  <w:abstractNum w:abstractNumId="29" w15:restartNumberingAfterBreak="0">
+  <w:abstractNum w:abstractNumId="31" w15:restartNumberingAfterBreak="0">
     <w:nsid w:val="2E774A7B"/>
     <w:multiLevelType w:val="multilevel"/>
     <w:tmpl w:val="2A44F1CE"/>
@@ -18650,7 +20133,7 @@
       </w:rPr>
     </w:lvl>
   </w:abstractNum>
-  <w:abstractNum w:abstractNumId="30" w15:restartNumberingAfterBreak="0">
+  <w:abstractNum w:abstractNumId="32" w15:restartNumberingAfterBreak="0">
     <w:nsid w:val="2EE24CB3"/>
     <w:multiLevelType w:val="hybridMultilevel"/>
     <w:tmpl w:val="A8B6CB94"/>
@@ -18764,7 +20247,7 @@
       </w:rPr>
     </w:lvl>
   </w:abstractNum>
-  <w:abstractNum w:abstractNumId="31" w15:restartNumberingAfterBreak="0">
+  <w:abstractNum w:abstractNumId="33" w15:restartNumberingAfterBreak="0">
     <w:nsid w:val="2F7A13C3"/>
     <w:multiLevelType w:val="hybridMultilevel"/>
     <w:tmpl w:val="9B96719A"/>
@@ -18850,7 +20333,7 @@
       </w:pPr>
     </w:lvl>
   </w:abstractNum>
-  <w:abstractNum w:abstractNumId="32" w15:restartNumberingAfterBreak="0">
+  <w:abstractNum w:abstractNumId="34" w15:restartNumberingAfterBreak="0">
     <w:nsid w:val="2FC838BD"/>
     <w:multiLevelType w:val="hybridMultilevel"/>
     <w:tmpl w:val="9B96719A"/>
@@ -18936,7 +20419,7 @@
       </w:pPr>
     </w:lvl>
   </w:abstractNum>
-  <w:abstractNum w:abstractNumId="33" w15:restartNumberingAfterBreak="0">
+  <w:abstractNum w:abstractNumId="35" w15:restartNumberingAfterBreak="0">
     <w:nsid w:val="2FF63291"/>
     <w:multiLevelType w:val="hybridMultilevel"/>
     <w:tmpl w:val="1CE49AF4"/>
@@ -19034,7 +20517,7 @@
       </w:pPr>
     </w:lvl>
   </w:abstractNum>
-  <w:abstractNum w:abstractNumId="34" w15:restartNumberingAfterBreak="0">
+  <w:abstractNum w:abstractNumId="36" w15:restartNumberingAfterBreak="0">
     <w:nsid w:val="301C5C6E"/>
     <w:multiLevelType w:val="hybridMultilevel"/>
     <w:tmpl w:val="3F1EB2FE"/>
@@ -19120,7 +20603,120 @@
       </w:pPr>
     </w:lvl>
   </w:abstractNum>
-  <w:abstractNum w:abstractNumId="35" w15:restartNumberingAfterBreak="0">
+  <w:abstractNum w:abstractNumId="37" w15:restartNumberingAfterBreak="0">
+    <w:nsid w:val="33A211D5"/>
+    <w:multiLevelType w:val="multilevel"/>
+    <w:tmpl w:val="3AE6F6DE"/>
+    <w:lvl w:ilvl="0">
+      <w:start w:val="1"/>
+      <w:numFmt w:val="decimal"/>
+      <w:lvlText w:val="%1."/>
+      <w:lvlJc w:val="left"/>
+      <w:pPr>
+        <w:ind w:left="360" w:hanging="360"/>
+      </w:pPr>
+      <w:rPr>
+        <w:rFonts w:hint="default"/>
+      </w:rPr>
+    </w:lvl>
+    <w:lvl w:ilvl="1">
+      <w:start w:val="1"/>
+      <w:numFmt w:val="decimal"/>
+      <w:lvlText w:val="%2."/>
+      <w:lvlJc w:val="left"/>
+      <w:pPr>
+        <w:tabs>
+          <w:tab w:val="num" w:pos="632"/>
+        </w:tabs>
+        <w:ind w:left="632" w:hanging="283"/>
+      </w:pPr>
+    </w:lvl>
+    <w:lvl w:ilvl="2">
+      <w:start w:val="1"/>
+      <w:numFmt w:val="decimal"/>
+      <w:lvlText w:val="%3."/>
+      <w:lvlJc w:val="left"/>
+      <w:pPr>
+        <w:tabs>
+          <w:tab w:val="num" w:pos="1341"/>
+        </w:tabs>
+        <w:ind w:left="1341" w:hanging="283"/>
+      </w:pPr>
+    </w:lvl>
+    <w:lvl w:ilvl="3">
+      <w:start w:val="1"/>
+      <w:numFmt w:val="decimal"/>
+      <w:lvlText w:val="%4."/>
+      <w:lvlJc w:val="left"/>
+      <w:pPr>
+        <w:tabs>
+          <w:tab w:val="num" w:pos="2050"/>
+        </w:tabs>
+        <w:ind w:left="2050" w:hanging="283"/>
+      </w:pPr>
+    </w:lvl>
+    <w:lvl w:ilvl="4">
+      <w:start w:val="1"/>
+      <w:numFmt w:val="decimal"/>
+      <w:lvlText w:val="%5."/>
+      <w:lvlJc w:val="left"/>
+      <w:pPr>
+        <w:tabs>
+          <w:tab w:val="num" w:pos="2759"/>
+        </w:tabs>
+        <w:ind w:left="2759" w:hanging="283"/>
+      </w:pPr>
+    </w:lvl>
+    <w:lvl w:ilvl="5">
+      <w:start w:val="1"/>
+      <w:numFmt w:val="decimal"/>
+      <w:lvlText w:val="%6."/>
+      <w:lvlJc w:val="left"/>
+      <w:pPr>
+        <w:tabs>
+          <w:tab w:val="num" w:pos="3468"/>
+        </w:tabs>
+        <w:ind w:left="3468" w:hanging="283"/>
+      </w:pPr>
+    </w:lvl>
+    <w:lvl w:ilvl="6">
+      <w:start w:val="1"/>
+      <w:numFmt w:val="decimal"/>
+      <w:lvlText w:val="%7."/>
+      <w:lvlJc w:val="left"/>
+      <w:pPr>
+        <w:tabs>
+          <w:tab w:val="num" w:pos="4177"/>
+        </w:tabs>
+        <w:ind w:left="4177" w:hanging="283"/>
+      </w:pPr>
+    </w:lvl>
+    <w:lvl w:ilvl="7">
+      <w:start w:val="1"/>
+      <w:numFmt w:val="decimal"/>
+      <w:lvlText w:val="%8."/>
+      <w:lvlJc w:val="left"/>
+      <w:pPr>
+        <w:tabs>
+          <w:tab w:val="num" w:pos="4886"/>
+        </w:tabs>
+        <w:ind w:left="4886" w:hanging="283"/>
+      </w:pPr>
+    </w:lvl>
+    <w:lvl w:ilvl="8">
+      <w:start w:val="1"/>
+      <w:numFmt w:val="decimal"/>
+      <w:lvlText w:val="%9."/>
+      <w:lvlJc w:val="left"/>
+      <w:pPr>
+        <w:tabs>
+          <w:tab w:val="num" w:pos="5595"/>
+        </w:tabs>
+        <w:ind w:left="5595" w:hanging="283"/>
+      </w:pPr>
+    </w:lvl>
+  </w:abstractNum>
+  <w:abstractNum w:abstractNumId="38" w15:restartNumberingAfterBreak="0">
     <w:nsid w:val="343060AA"/>
     <w:multiLevelType w:val="hybridMultilevel"/>
     <w:tmpl w:val="309C4EEE"/>
@@ -19206,7 +20802,7 @@
       </w:pPr>
     </w:lvl>
   </w:abstractNum>
-  <w:abstractNum w:abstractNumId="36" w15:restartNumberingAfterBreak="0">
+  <w:abstractNum w:abstractNumId="39" w15:restartNumberingAfterBreak="0">
     <w:nsid w:val="3688439B"/>
     <w:multiLevelType w:val="hybridMultilevel"/>
     <w:tmpl w:val="7D2EE680"/>
@@ -19295,7 +20891,7 @@
       </w:pPr>
     </w:lvl>
   </w:abstractNum>
-  <w:abstractNum w:abstractNumId="37" w15:restartNumberingAfterBreak="0">
+  <w:abstractNum w:abstractNumId="40" w15:restartNumberingAfterBreak="0">
     <w:nsid w:val="3B94696D"/>
     <w:multiLevelType w:val="hybridMultilevel"/>
     <w:tmpl w:val="6D68C3A2"/>
@@ -19409,7 +21005,7 @@
       </w:rPr>
     </w:lvl>
   </w:abstractNum>
-  <w:abstractNum w:abstractNumId="38" w15:restartNumberingAfterBreak="0">
+  <w:abstractNum w:abstractNumId="41" w15:restartNumberingAfterBreak="0">
     <w:nsid w:val="3CF96E84"/>
     <w:multiLevelType w:val="hybridMultilevel"/>
     <w:tmpl w:val="6F5A4240"/>
@@ -19495,7 +21091,7 @@
       </w:pPr>
     </w:lvl>
   </w:abstractNum>
-  <w:abstractNum w:abstractNumId="39" w15:restartNumberingAfterBreak="0">
+  <w:abstractNum w:abstractNumId="42" w15:restartNumberingAfterBreak="0">
     <w:nsid w:val="3D522993"/>
     <w:multiLevelType w:val="multilevel"/>
     <w:tmpl w:val="587A946C"/>
@@ -19644,7 +21240,7 @@
       </w:rPr>
     </w:lvl>
   </w:abstractNum>
-  <w:abstractNum w:abstractNumId="40" w15:restartNumberingAfterBreak="0">
+  <w:abstractNum w:abstractNumId="43" w15:restartNumberingAfterBreak="0">
     <w:nsid w:val="41593F0F"/>
     <w:multiLevelType w:val="hybridMultilevel"/>
     <w:tmpl w:val="9B96719A"/>
@@ -19730,7 +21326,7 @@
       </w:pPr>
     </w:lvl>
   </w:abstractNum>
-  <w:abstractNum w:abstractNumId="41" w15:restartNumberingAfterBreak="0">
+  <w:abstractNum w:abstractNumId="44" w15:restartNumberingAfterBreak="0">
     <w:nsid w:val="42B150AE"/>
     <w:multiLevelType w:val="hybridMultilevel"/>
     <w:tmpl w:val="9B96719A"/>
@@ -19816,7 +21412,7 @@
       </w:pPr>
     </w:lvl>
   </w:abstractNum>
-  <w:abstractNum w:abstractNumId="42" w15:restartNumberingAfterBreak="0">
+  <w:abstractNum w:abstractNumId="45" w15:restartNumberingAfterBreak="0">
     <w:nsid w:val="42D52088"/>
     <w:multiLevelType w:val="hybridMultilevel"/>
     <w:tmpl w:val="778A69FE"/>
@@ -19930,7 +21526,7 @@
       </w:rPr>
     </w:lvl>
   </w:abstractNum>
-  <w:abstractNum w:abstractNumId="43" w15:restartNumberingAfterBreak="0">
+  <w:abstractNum w:abstractNumId="46" w15:restartNumberingAfterBreak="0">
     <w:nsid w:val="44216B3E"/>
     <w:multiLevelType w:val="multilevel"/>
     <w:tmpl w:val="DDA22A5E"/>
@@ -20067,7 +21663,7 @@
       </w:rPr>
     </w:lvl>
   </w:abstractNum>
-  <w:abstractNum w:abstractNumId="44" w15:restartNumberingAfterBreak="0">
+  <w:abstractNum w:abstractNumId="47" w15:restartNumberingAfterBreak="0">
     <w:nsid w:val="4B2A49D7"/>
     <w:multiLevelType w:val="hybridMultilevel"/>
     <w:tmpl w:val="FF38B69E"/>
@@ -20153,7 +21749,7 @@
       </w:pPr>
     </w:lvl>
   </w:abstractNum>
-  <w:abstractNum w:abstractNumId="45" w15:restartNumberingAfterBreak="0">
+  <w:abstractNum w:abstractNumId="48" w15:restartNumberingAfterBreak="0">
     <w:nsid w:val="53702BD6"/>
     <w:multiLevelType w:val="hybridMultilevel"/>
     <w:tmpl w:val="373AFA12"/>
@@ -20242,7 +21838,7 @@
       </w:pPr>
     </w:lvl>
   </w:abstractNum>
-  <w:abstractNum w:abstractNumId="46" w15:restartNumberingAfterBreak="0">
+  <w:abstractNum w:abstractNumId="49" w15:restartNumberingAfterBreak="0">
     <w:nsid w:val="537506E6"/>
     <w:multiLevelType w:val="multilevel"/>
     <w:tmpl w:val="BCE88726"/>
@@ -20382,7 +21978,7 @@
       </w:rPr>
     </w:lvl>
   </w:abstractNum>
-  <w:abstractNum w:abstractNumId="47" w15:restartNumberingAfterBreak="0">
+  <w:abstractNum w:abstractNumId="50" w15:restartNumberingAfterBreak="0">
     <w:nsid w:val="53A3586F"/>
     <w:multiLevelType w:val="hybridMultilevel"/>
     <w:tmpl w:val="A0569A98"/>
@@ -20477,7 +22073,7 @@
       </w:pPr>
     </w:lvl>
   </w:abstractNum>
-  <w:abstractNum w:abstractNumId="48" w15:restartNumberingAfterBreak="0">
+  <w:abstractNum w:abstractNumId="51" w15:restartNumberingAfterBreak="0">
     <w:nsid w:val="54452864"/>
     <w:multiLevelType w:val="hybridMultilevel"/>
     <w:tmpl w:val="9E78C98E"/>
@@ -20590,7 +22186,7 @@
       </w:rPr>
     </w:lvl>
   </w:abstractNum>
-  <w:abstractNum w:abstractNumId="49" w15:restartNumberingAfterBreak="0">
+  <w:abstractNum w:abstractNumId="52" w15:restartNumberingAfterBreak="0">
     <w:nsid w:val="57ED5547"/>
     <w:multiLevelType w:val="multilevel"/>
     <w:tmpl w:val="B38A48C4"/>
@@ -20730,7 +22326,7 @@
       </w:rPr>
     </w:lvl>
   </w:abstractNum>
-  <w:abstractNum w:abstractNumId="50" w15:restartNumberingAfterBreak="0">
+  <w:abstractNum w:abstractNumId="53" w15:restartNumberingAfterBreak="0">
     <w:nsid w:val="5AC32B88"/>
     <w:multiLevelType w:val="hybridMultilevel"/>
     <w:tmpl w:val="748C87A0"/>
@@ -20816,7 +22412,7 @@
       </w:pPr>
     </w:lvl>
   </w:abstractNum>
-  <w:abstractNum w:abstractNumId="51" w15:restartNumberingAfterBreak="0">
+  <w:abstractNum w:abstractNumId="54" w15:restartNumberingAfterBreak="0">
     <w:nsid w:val="5C3F3720"/>
     <w:multiLevelType w:val="hybridMultilevel"/>
     <w:tmpl w:val="F2D217D0"/>
@@ -20914,7 +22510,7 @@
       </w:pPr>
     </w:lvl>
   </w:abstractNum>
-  <w:abstractNum w:abstractNumId="52" w15:restartNumberingAfterBreak="0">
+  <w:abstractNum w:abstractNumId="55" w15:restartNumberingAfterBreak="0">
     <w:nsid w:val="5FE76B91"/>
     <w:multiLevelType w:val="hybridMultilevel"/>
     <w:tmpl w:val="F5869F58"/>
@@ -21004,7 +22600,7 @@
       </w:pPr>
     </w:lvl>
   </w:abstractNum>
-  <w:abstractNum w:abstractNumId="53" w15:restartNumberingAfterBreak="0">
+  <w:abstractNum w:abstractNumId="56" w15:restartNumberingAfterBreak="0">
     <w:nsid w:val="60E342C7"/>
     <w:multiLevelType w:val="multilevel"/>
     <w:tmpl w:val="3AE6F6DE"/>
@@ -21117,7 +22713,7 @@
       </w:pPr>
     </w:lvl>
   </w:abstractNum>
-  <w:abstractNum w:abstractNumId="54" w15:restartNumberingAfterBreak="0">
+  <w:abstractNum w:abstractNumId="57" w15:restartNumberingAfterBreak="0">
     <w:nsid w:val="616370BE"/>
     <w:multiLevelType w:val="hybridMultilevel"/>
     <w:tmpl w:val="FCBAF152"/>
@@ -21231,7 +22827,7 @@
       </w:rPr>
     </w:lvl>
   </w:abstractNum>
-  <w:abstractNum w:abstractNumId="55" w15:restartNumberingAfterBreak="0">
+  <w:abstractNum w:abstractNumId="58" w15:restartNumberingAfterBreak="0">
     <w:nsid w:val="67C36222"/>
     <w:multiLevelType w:val="hybridMultilevel"/>
     <w:tmpl w:val="FB3CB0AC"/>
@@ -21320,7 +22916,7 @@
       </w:pPr>
     </w:lvl>
   </w:abstractNum>
-  <w:abstractNum w:abstractNumId="56" w15:restartNumberingAfterBreak="0">
+  <w:abstractNum w:abstractNumId="59" w15:restartNumberingAfterBreak="0">
     <w:nsid w:val="68A13AFA"/>
     <w:multiLevelType w:val="multilevel"/>
     <w:tmpl w:val="9D8ED202"/>
@@ -21460,7 +23056,7 @@
       </w:rPr>
     </w:lvl>
   </w:abstractNum>
-  <w:abstractNum w:abstractNumId="57" w15:restartNumberingAfterBreak="0">
+  <w:abstractNum w:abstractNumId="60" w15:restartNumberingAfterBreak="0">
     <w:nsid w:val="6A3306C0"/>
     <w:multiLevelType w:val="hybridMultilevel"/>
     <w:tmpl w:val="2E303AD2"/>
@@ -21574,7 +23170,7 @@
       </w:rPr>
     </w:lvl>
   </w:abstractNum>
-  <w:abstractNum w:abstractNumId="58" w15:restartNumberingAfterBreak="0">
+  <w:abstractNum w:abstractNumId="61" w15:restartNumberingAfterBreak="0">
     <w:nsid w:val="6EA919B6"/>
     <w:multiLevelType w:val="multilevel"/>
     <w:tmpl w:val="FBFC98EE"/>
@@ -21714,7 +23310,7 @@
       </w:rPr>
     </w:lvl>
   </w:abstractNum>
-  <w:abstractNum w:abstractNumId="59" w15:restartNumberingAfterBreak="0">
+  <w:abstractNum w:abstractNumId="62" w15:restartNumberingAfterBreak="0">
     <w:nsid w:val="720E469D"/>
     <w:multiLevelType w:val="hybridMultilevel"/>
     <w:tmpl w:val="8A847CAE"/>
@@ -21803,7 +23399,7 @@
       </w:pPr>
     </w:lvl>
   </w:abstractNum>
-  <w:abstractNum w:abstractNumId="60" w15:restartNumberingAfterBreak="0">
+  <w:abstractNum w:abstractNumId="63" w15:restartNumberingAfterBreak="0">
     <w:nsid w:val="72282641"/>
     <w:multiLevelType w:val="hybridMultilevel"/>
     <w:tmpl w:val="E58816D6"/>
@@ -21917,7 +23513,7 @@
       </w:rPr>
     </w:lvl>
   </w:abstractNum>
-  <w:abstractNum w:abstractNumId="61" w15:restartNumberingAfterBreak="0">
+  <w:abstractNum w:abstractNumId="64" w15:restartNumberingAfterBreak="0">
     <w:nsid w:val="7236607D"/>
     <w:multiLevelType w:val="multilevel"/>
     <w:tmpl w:val="33C21AF4"/>
@@ -22048,7 +23644,7 @@
       </w:rPr>
     </w:lvl>
   </w:abstractNum>
-  <w:abstractNum w:abstractNumId="62" w15:restartNumberingAfterBreak="0">
+  <w:abstractNum w:abstractNumId="65" w15:restartNumberingAfterBreak="0">
     <w:nsid w:val="77751C34"/>
     <w:multiLevelType w:val="hybridMultilevel"/>
     <w:tmpl w:val="93B03718"/>
@@ -22137,7 +23733,7 @@
       </w:pPr>
     </w:lvl>
   </w:abstractNum>
-  <w:abstractNum w:abstractNumId="63" w15:restartNumberingAfterBreak="0">
+  <w:abstractNum w:abstractNumId="66" w15:restartNumberingAfterBreak="0">
     <w:nsid w:val="77A13E6C"/>
     <w:multiLevelType w:val="hybridMultilevel"/>
     <w:tmpl w:val="E24619C8"/>
@@ -22232,7 +23828,7 @@
       </w:pPr>
     </w:lvl>
   </w:abstractNum>
-  <w:abstractNum w:abstractNumId="64" w15:restartNumberingAfterBreak="0">
+  <w:abstractNum w:abstractNumId="67" w15:restartNumberingAfterBreak="0">
     <w:nsid w:val="78A40B1D"/>
     <w:multiLevelType w:val="multilevel"/>
     <w:tmpl w:val="1AC2EB18"/>
@@ -22372,7 +23968,7 @@
       </w:rPr>
     </w:lvl>
   </w:abstractNum>
-  <w:abstractNum w:abstractNumId="65" w15:restartNumberingAfterBreak="0">
+  <w:abstractNum w:abstractNumId="68" w15:restartNumberingAfterBreak="0">
     <w:nsid w:val="79F162FB"/>
     <w:multiLevelType w:val="multilevel"/>
     <w:tmpl w:val="0C321464"/>
@@ -22512,7 +24108,7 @@
       </w:rPr>
     </w:lvl>
   </w:abstractNum>
-  <w:abstractNum w:abstractNumId="66" w15:restartNumberingAfterBreak="0">
+  <w:abstractNum w:abstractNumId="69" w15:restartNumberingAfterBreak="0">
     <w:nsid w:val="7C970EC7"/>
     <w:multiLevelType w:val="hybridMultilevel"/>
     <w:tmpl w:val="7D2EE680"/>
@@ -22601,7 +24197,7 @@
       </w:pPr>
     </w:lvl>
   </w:abstractNum>
-  <w:abstractNum w:abstractNumId="67" w15:restartNumberingAfterBreak="0">
+  <w:abstractNum w:abstractNumId="70" w15:restartNumberingAfterBreak="0">
     <w:nsid w:val="7F3605F0"/>
     <w:multiLevelType w:val="multilevel"/>
     <w:tmpl w:val="0B484776"/>
@@ -22741,7 +24337,7 @@
       </w:rPr>
     </w:lvl>
   </w:abstractNum>
-  <w:abstractNum w:abstractNumId="68" w15:restartNumberingAfterBreak="0">
+  <w:abstractNum w:abstractNumId="71" w15:restartNumberingAfterBreak="0">
     <w:nsid w:val="7FEE14A8"/>
     <w:multiLevelType w:val="hybridMultilevel"/>
     <w:tmpl w:val="64FC9D2C"/>
@@ -22827,7 +24423,7 @@
       </w:pPr>
     </w:lvl>
   </w:abstractNum>
-  <w:abstractNum w:abstractNumId="69" w15:restartNumberingAfterBreak="0">
+  <w:abstractNum w:abstractNumId="72" w15:restartNumberingAfterBreak="0">
     <w:nsid w:val="7FF24A2E"/>
     <w:multiLevelType w:val="hybridMultilevel"/>
     <w:tmpl w:val="AA284BB2"/>
@@ -22918,298 +24514,307 @@
     </w:lvl>
   </w:abstractNum>
   <w:num w:numId="1" w16cid:durableId="462768859">
-    <w:abstractNumId w:val="53"/>
+    <w:abstractNumId w:val="56"/>
   </w:num>
   <w:num w:numId="2" w16cid:durableId="534851259">
-    <w:abstractNumId w:val="20"/>
+    <w:abstractNumId w:val="22"/>
   </w:num>
   <w:num w:numId="3" w16cid:durableId="754977449">
+    <w:abstractNumId w:val="29"/>
+  </w:num>
+  <w:num w:numId="4" w16cid:durableId="2071151317">
+    <w:abstractNumId w:val="49"/>
+  </w:num>
+  <w:num w:numId="5" w16cid:durableId="1569268375">
+    <w:abstractNumId w:val="70"/>
+  </w:num>
+  <w:num w:numId="6" w16cid:durableId="1342007254">
+    <w:abstractNumId w:val="59"/>
+  </w:num>
+  <w:num w:numId="7" w16cid:durableId="935209781">
+    <w:abstractNumId w:val="28"/>
+  </w:num>
+  <w:num w:numId="8" w16cid:durableId="393507632">
+    <w:abstractNumId w:val="31"/>
+  </w:num>
+  <w:num w:numId="9" w16cid:durableId="1732313751">
+    <w:abstractNumId w:val="52"/>
+  </w:num>
+  <w:num w:numId="10" w16cid:durableId="1929850215">
+    <w:abstractNumId w:val="61"/>
+  </w:num>
+  <w:num w:numId="11" w16cid:durableId="624845372">
     <w:abstractNumId w:val="27"/>
   </w:num>
-  <w:num w:numId="4" w16cid:durableId="2071151317">
-    <w:abstractNumId w:val="46"/>
-  </w:num>
-  <w:num w:numId="5" w16cid:durableId="1569268375">
+  <w:num w:numId="12" w16cid:durableId="407583010">
     <w:abstractNumId w:val="67"/>
   </w:num>
-  <w:num w:numId="6" w16cid:durableId="1342007254">
-    <w:abstractNumId w:val="56"/>
-  </w:num>
-  <w:num w:numId="7" w16cid:durableId="935209781">
-    <w:abstractNumId w:val="26"/>
-  </w:num>
-  <w:num w:numId="8" w16cid:durableId="393507632">
-    <w:abstractNumId w:val="29"/>
-  </w:num>
-  <w:num w:numId="9" w16cid:durableId="1732313751">
-    <w:abstractNumId w:val="49"/>
-  </w:num>
-  <w:num w:numId="10" w16cid:durableId="1929850215">
-    <w:abstractNumId w:val="58"/>
-  </w:num>
-  <w:num w:numId="11" w16cid:durableId="624845372">
-    <w:abstractNumId w:val="25"/>
-  </w:num>
-  <w:num w:numId="12" w16cid:durableId="407583010">
-    <w:abstractNumId w:val="64"/>
-  </w:num>
   <w:num w:numId="13" w16cid:durableId="750663636">
-    <w:abstractNumId w:val="65"/>
+    <w:abstractNumId w:val="68"/>
   </w:num>
   <w:num w:numId="14" w16cid:durableId="1026060989">
-    <w:abstractNumId w:val="17"/>
+    <w:abstractNumId w:val="18"/>
   </w:num>
   <w:num w:numId="15" w16cid:durableId="670109320">
-    <w:abstractNumId w:val="30"/>
+    <w:abstractNumId w:val="32"/>
   </w:num>
   <w:num w:numId="16" w16cid:durableId="1566524494">
-    <w:abstractNumId w:val="34"/>
+    <w:abstractNumId w:val="36"/>
   </w:num>
   <w:num w:numId="17" w16cid:durableId="2041972332">
-    <w:abstractNumId w:val="18"/>
+    <w:abstractNumId w:val="20"/>
   </w:num>
   <w:num w:numId="18" w16cid:durableId="1397167982">
     <w:abstractNumId w:val="3"/>
   </w:num>
   <w:num w:numId="19" w16cid:durableId="153645313">
-    <w:abstractNumId w:val="38"/>
+    <w:abstractNumId w:val="41"/>
   </w:num>
   <w:num w:numId="20" w16cid:durableId="1506895684">
-    <w:abstractNumId w:val="45"/>
+    <w:abstractNumId w:val="48"/>
   </w:num>
   <w:num w:numId="21" w16cid:durableId="264191240">
-    <w:abstractNumId w:val="28"/>
+    <w:abstractNumId w:val="30"/>
   </w:num>
   <w:num w:numId="22" w16cid:durableId="1217857422">
     <w:abstractNumId w:val="2"/>
   </w:num>
   <w:num w:numId="23" w16cid:durableId="178354707">
-    <w:abstractNumId w:val="22"/>
+    <w:abstractNumId w:val="24"/>
     <w:lvlOverride w:ilvl="0">
       <w:startOverride w:val="1"/>
     </w:lvlOverride>
   </w:num>
   <w:num w:numId="24" w16cid:durableId="883636844">
-    <w:abstractNumId w:val="63"/>
+    <w:abstractNumId w:val="66"/>
     <w:lvlOverride w:ilvl="0">
       <w:startOverride w:val="1"/>
     </w:lvlOverride>
   </w:num>
   <w:num w:numId="25" w16cid:durableId="1517230823">
-    <w:abstractNumId w:val="36"/>
+    <w:abstractNumId w:val="39"/>
   </w:num>
   <w:num w:numId="26" w16cid:durableId="198737806">
-    <w:abstractNumId w:val="37"/>
+    <w:abstractNumId w:val="40"/>
   </w:num>
   <w:num w:numId="27" w16cid:durableId="1970436380">
-    <w:abstractNumId w:val="52"/>
+    <w:abstractNumId w:val="55"/>
   </w:num>
   <w:num w:numId="28" w16cid:durableId="1109744282">
-    <w:abstractNumId w:val="10"/>
+    <w:abstractNumId w:val="11"/>
   </w:num>
   <w:num w:numId="29" w16cid:durableId="1596595425">
-    <w:abstractNumId w:val="41"/>
+    <w:abstractNumId w:val="44"/>
   </w:num>
   <w:num w:numId="30" w16cid:durableId="1092163475">
-    <w:abstractNumId w:val="21"/>
+    <w:abstractNumId w:val="23"/>
   </w:num>
   <w:num w:numId="31" w16cid:durableId="1638341705">
-    <w:abstractNumId w:val="31"/>
+    <w:abstractNumId w:val="33"/>
   </w:num>
   <w:num w:numId="32" w16cid:durableId="99614821">
-    <w:abstractNumId w:val="69"/>
+    <w:abstractNumId w:val="72"/>
   </w:num>
   <w:num w:numId="33" w16cid:durableId="1972857697">
-    <w:abstractNumId w:val="40"/>
+    <w:abstractNumId w:val="43"/>
   </w:num>
   <w:num w:numId="34" w16cid:durableId="2055888871">
-    <w:abstractNumId w:val="32"/>
+    <w:abstractNumId w:val="34"/>
   </w:num>
   <w:num w:numId="35" w16cid:durableId="2124761692">
     <w:abstractNumId w:val="1"/>
   </w:num>
   <w:num w:numId="36" w16cid:durableId="921449534">
-    <w:abstractNumId w:val="43"/>
+    <w:abstractNumId w:val="46"/>
   </w:num>
   <w:num w:numId="37" w16cid:durableId="1249339732">
-    <w:abstractNumId w:val="53"/>
+    <w:abstractNumId w:val="56"/>
   </w:num>
   <w:num w:numId="38" w16cid:durableId="901332559">
-    <w:abstractNumId w:val="15"/>
+    <w:abstractNumId w:val="16"/>
   </w:num>
   <w:num w:numId="39" w16cid:durableId="226458378">
     <w:abstractNumId w:val="0"/>
   </w:num>
   <w:num w:numId="40" w16cid:durableId="1691839389">
-    <w:abstractNumId w:val="42"/>
+    <w:abstractNumId w:val="45"/>
   </w:num>
   <w:num w:numId="41" w16cid:durableId="1257639454">
-    <w:abstractNumId w:val="53"/>
+    <w:abstractNumId w:val="56"/>
   </w:num>
   <w:num w:numId="42" w16cid:durableId="196894282">
-    <w:abstractNumId w:val="7"/>
+    <w:abstractNumId w:val="8"/>
   </w:num>
   <w:num w:numId="43" w16cid:durableId="680471570">
-    <w:abstractNumId w:val="66"/>
+    <w:abstractNumId w:val="69"/>
   </w:num>
   <w:num w:numId="44" w16cid:durableId="1315139082">
-    <w:abstractNumId w:val="53"/>
+    <w:abstractNumId w:val="56"/>
   </w:num>
   <w:num w:numId="45" w16cid:durableId="2113940701">
-    <w:abstractNumId w:val="53"/>
+    <w:abstractNumId w:val="56"/>
   </w:num>
   <w:num w:numId="46" w16cid:durableId="1884713029">
-    <w:abstractNumId w:val="55"/>
+    <w:abstractNumId w:val="58"/>
   </w:num>
   <w:num w:numId="47" w16cid:durableId="1079255107">
-    <w:abstractNumId w:val="59"/>
+    <w:abstractNumId w:val="62"/>
   </w:num>
   <w:num w:numId="48" w16cid:durableId="163739946">
-    <w:abstractNumId w:val="35"/>
+    <w:abstractNumId w:val="38"/>
     <w:lvlOverride w:ilvl="0">
       <w:startOverride w:val="1"/>
     </w:lvlOverride>
   </w:num>
   <w:num w:numId="49" w16cid:durableId="130177845">
-    <w:abstractNumId w:val="53"/>
+    <w:abstractNumId w:val="56"/>
   </w:num>
   <w:num w:numId="50" w16cid:durableId="1549225530">
-    <w:abstractNumId w:val="53"/>
+    <w:abstractNumId w:val="56"/>
   </w:num>
   <w:num w:numId="51" w16cid:durableId="1543207655">
-    <w:abstractNumId w:val="53"/>
+    <w:abstractNumId w:val="56"/>
   </w:num>
   <w:num w:numId="52" w16cid:durableId="2082754323">
-    <w:abstractNumId w:val="24"/>
+    <w:abstractNumId w:val="26"/>
   </w:num>
   <w:num w:numId="53" w16cid:durableId="1140000597">
-    <w:abstractNumId w:val="47"/>
+    <w:abstractNumId w:val="50"/>
     <w:lvlOverride w:ilvl="0">
       <w:startOverride w:val="1"/>
     </w:lvlOverride>
   </w:num>
   <w:num w:numId="54" w16cid:durableId="1476414865">
-    <w:abstractNumId w:val="53"/>
+    <w:abstractNumId w:val="56"/>
   </w:num>
   <w:num w:numId="55" w16cid:durableId="1747803550">
-    <w:abstractNumId w:val="62"/>
+    <w:abstractNumId w:val="65"/>
   </w:num>
   <w:num w:numId="56" w16cid:durableId="1421872203">
-    <w:abstractNumId w:val="23"/>
+    <w:abstractNumId w:val="25"/>
     <w:lvlOverride w:ilvl="0">
       <w:startOverride w:val="1"/>
     </w:lvlOverride>
   </w:num>
   <w:num w:numId="57" w16cid:durableId="1090199479">
-    <w:abstractNumId w:val="57"/>
+    <w:abstractNumId w:val="60"/>
   </w:num>
   <w:num w:numId="58" w16cid:durableId="794324903">
-    <w:abstractNumId w:val="53"/>
+    <w:abstractNumId w:val="56"/>
   </w:num>
   <w:num w:numId="59" w16cid:durableId="1306081610">
+    <w:abstractNumId w:val="15"/>
+  </w:num>
+  <w:num w:numId="60" w16cid:durableId="432749816">
     <w:abstractNumId w:val="14"/>
   </w:num>
-  <w:num w:numId="60" w16cid:durableId="432749816">
-    <w:abstractNumId w:val="13"/>
-  </w:num>
   <w:num w:numId="61" w16cid:durableId="903416085">
-    <w:abstractNumId w:val="39"/>
+    <w:abstractNumId w:val="42"/>
   </w:num>
   <w:num w:numId="62" w16cid:durableId="109403679">
-    <w:abstractNumId w:val="9"/>
+    <w:abstractNumId w:val="10"/>
   </w:num>
   <w:num w:numId="63" w16cid:durableId="1952125431">
-    <w:abstractNumId w:val="53"/>
+    <w:abstractNumId w:val="56"/>
   </w:num>
   <w:num w:numId="64" w16cid:durableId="1966891500">
     <w:abstractNumId w:val="4"/>
   </w:num>
   <w:num w:numId="65" w16cid:durableId="697698884">
+    <w:abstractNumId w:val="56"/>
+  </w:num>
+  <w:num w:numId="66" w16cid:durableId="1168981868">
+    <w:abstractNumId w:val="64"/>
+  </w:num>
+  <w:num w:numId="67" w16cid:durableId="160393705">
+    <w:abstractNumId w:val="56"/>
+  </w:num>
+  <w:num w:numId="68" w16cid:durableId="1831167593">
+    <w:abstractNumId w:val="13"/>
+  </w:num>
+  <w:num w:numId="69" w16cid:durableId="1698121427">
+    <w:abstractNumId w:val="56"/>
+  </w:num>
+  <w:num w:numId="70" w16cid:durableId="1760105121">
+    <w:abstractNumId w:val="51"/>
+  </w:num>
+  <w:num w:numId="71" w16cid:durableId="702751241">
+    <w:abstractNumId w:val="63"/>
+  </w:num>
+  <w:num w:numId="72" w16cid:durableId="408386921">
+    <w:abstractNumId w:val="56"/>
+  </w:num>
+  <w:num w:numId="73" w16cid:durableId="2030330978">
     <w:abstractNumId w:val="53"/>
   </w:num>
-  <w:num w:numId="66" w16cid:durableId="1168981868">
-    <w:abstractNumId w:val="61"/>
-  </w:num>
-  <w:num w:numId="67" w16cid:durableId="160393705">
-    <w:abstractNumId w:val="53"/>
-  </w:num>
-  <w:num w:numId="68" w16cid:durableId="1831167593">
-    <w:abstractNumId w:val="12"/>
-  </w:num>
-  <w:num w:numId="69" w16cid:durableId="1698121427">
-    <w:abstractNumId w:val="53"/>
-  </w:num>
-  <w:num w:numId="70" w16cid:durableId="1760105121">
-    <w:abstractNumId w:val="48"/>
-  </w:num>
-  <w:num w:numId="71" w16cid:durableId="702751241">
-    <w:abstractNumId w:val="60"/>
-  </w:num>
-  <w:num w:numId="72" w16cid:durableId="408386921">
-    <w:abstractNumId w:val="53"/>
-  </w:num>
-  <w:num w:numId="73" w16cid:durableId="2030330978">
-    <w:abstractNumId w:val="50"/>
-  </w:num>
   <w:num w:numId="74" w16cid:durableId="100954797">
-    <w:abstractNumId w:val="53"/>
+    <w:abstractNumId w:val="56"/>
   </w:num>
   <w:num w:numId="75" w16cid:durableId="1834107868">
-    <w:abstractNumId w:val="53"/>
+    <w:abstractNumId w:val="56"/>
   </w:num>
   <w:num w:numId="76" w16cid:durableId="1557204703">
-    <w:abstractNumId w:val="8"/>
+    <w:abstractNumId w:val="9"/>
   </w:num>
   <w:num w:numId="77" w16cid:durableId="534007519">
-    <w:abstractNumId w:val="68"/>
+    <w:abstractNumId w:val="71"/>
     <w:lvlOverride w:ilvl="0">
       <w:startOverride w:val="1"/>
     </w:lvlOverride>
   </w:num>
   <w:num w:numId="78" w16cid:durableId="48388127">
-    <w:abstractNumId w:val="6"/>
+    <w:abstractNumId w:val="7"/>
   </w:num>
   <w:num w:numId="79" w16cid:durableId="163978971">
-    <w:abstractNumId w:val="16"/>
+    <w:abstractNumId w:val="17"/>
   </w:num>
   <w:num w:numId="80" w16cid:durableId="157352278">
-    <w:abstractNumId w:val="5"/>
+    <w:abstractNumId w:val="6"/>
     <w:lvlOverride w:ilvl="0">
       <w:startOverride w:val="1"/>
     </w:lvlOverride>
   </w:num>
   <w:num w:numId="81" w16cid:durableId="1371109530">
-    <w:abstractNumId w:val="53"/>
+    <w:abstractNumId w:val="56"/>
   </w:num>
   <w:num w:numId="82" w16cid:durableId="56056520">
-    <w:abstractNumId w:val="53"/>
+    <w:abstractNumId w:val="56"/>
   </w:num>
   <w:num w:numId="83" w16cid:durableId="903219920">
-    <w:abstractNumId w:val="53"/>
+    <w:abstractNumId w:val="56"/>
   </w:num>
   <w:num w:numId="84" w16cid:durableId="1131555045">
-    <w:abstractNumId w:val="53"/>
+    <w:abstractNumId w:val="56"/>
   </w:num>
   <w:num w:numId="85" w16cid:durableId="501623252">
+    <w:abstractNumId w:val="57"/>
+  </w:num>
+  <w:num w:numId="86" w16cid:durableId="1804806667">
+    <w:abstractNumId w:val="12"/>
+  </w:num>
+  <w:num w:numId="87" w16cid:durableId="948468945">
+    <w:abstractNumId w:val="21"/>
+  </w:num>
+  <w:num w:numId="88" w16cid:durableId="248933344">
+    <w:abstractNumId w:val="47"/>
+  </w:num>
+  <w:num w:numId="89" w16cid:durableId="144778899">
+    <w:abstractNumId w:val="6"/>
+  </w:num>
+  <w:num w:numId="90" w16cid:durableId="296032824">
+    <w:abstractNumId w:val="35"/>
+  </w:num>
+  <w:num w:numId="91" w16cid:durableId="316420869">
     <w:abstractNumId w:val="54"/>
   </w:num>
-  <w:num w:numId="86" w16cid:durableId="1804806667">
-    <w:abstractNumId w:val="11"/>
+  <w:num w:numId="92" w16cid:durableId="1106775173">
+    <w:abstractNumId w:val="37"/>
   </w:num>
-  <w:num w:numId="87" w16cid:durableId="948468945">
+  <w:num w:numId="93" w16cid:durableId="1720977892">
     <w:abstractNumId w:val="19"/>
   </w:num>
-  <w:num w:numId="88" w16cid:durableId="248933344">
-    <w:abstractNumId w:val="44"/>
-  </w:num>
-  <w:num w:numId="89" w16cid:durableId="144778899">
+  <w:num w:numId="94" w16cid:durableId="1904827934">
     <w:abstractNumId w:val="5"/>
-  </w:num>
-  <w:num w:numId="90" w16cid:durableId="296032824">
-    <w:abstractNumId w:val="33"/>
-  </w:num>
-  <w:num w:numId="91" w16cid:durableId="316420869">
-    <w:abstractNumId w:val="51"/>
   </w:num>
 </w:numbering>
 </file>
@@ -23783,6 +25388,7 @@
   <w:style w:type="paragraph" w:styleId="BodyText">
     <w:name w:val="Body Text"/>
     <w:basedOn w:val="Normal"/>
+    <w:link w:val="BodyTextChar"/>
     <w:pPr>
       <w:spacing w:after="140" w:line="276" w:lineRule="auto"/>
     </w:pPr>
@@ -24295,6 +25901,16 @@
       <w:szCs w:val="18"/>
     </w:rPr>
   </w:style>
+  <w:style w:type="character" w:customStyle="1" w:styleId="BodyTextChar">
+    <w:name w:val="Body Text Char"/>
+    <w:basedOn w:val="DefaultParagraphFont"/>
+    <w:link w:val="BodyText"/>
+    <w:rsid w:val="00DB10BC"/>
+    <w:rPr>
+      <w:rFonts w:ascii="Times New Roman" w:eastAsia="Times New Roman" w:hAnsi="Times New Roman" w:cs="Times New Roman"/>
+      <w:lang w:val="en-LK" w:eastAsia="en-GB" w:bidi="ar-SA"/>
+    </w:rPr>
+  </w:style>
 </w:styles>
 </file>
 

</xml_diff>

<commit_message>
doc, dependcy container and ga updates
</commit_message>
<xml_diff>
--- a/CW_Doc.docx
+++ b/CW_Doc.docx
@@ -17917,14 +17917,6 @@
     </w:p>
     <w:p>
       <w:pPr>
-        <w:spacing w:before="240" w:after="160"/>
-        <w:rPr>
-          <w:rFonts w:ascii="Aptos" w:hAnsi="Aptos"/>
-        </w:rPr>
-      </w:pPr>
-    </w:p>
-    <w:p>
-      <w:pPr>
         <w:pStyle w:val="Heading1"/>
         <w:numPr>
           <w:ilvl w:val="0"/>
@@ -17943,14 +17935,323 @@
     </w:p>
     <w:p>
       <w:pPr>
+        <w:pStyle w:val="Heading3"/>
+        <w:rPr>
+          <w:color w:val="000000"/>
+          <w:sz w:val="18"/>
+          <w:szCs w:val="18"/>
+        </w:rPr>
+      </w:pPr>
+      <w:r>
+        <w:rPr>
+          <w:rFonts w:ascii="Aptos" w:hAnsi="Aptos" w:cs="Angsana New"/>
+        </w:rPr>
+        <w:t>Chromosome representation</w:t>
+      </w:r>
+      <w:r>
+        <w:rPr>
+          <w:rFonts w:ascii="Aptos" w:hAnsi="Aptos" w:cs="Angsana New"/>
+        </w:rPr>
+        <w:t xml:space="preserve"> and Popualtion Initalization Strategy</w:t>
+      </w:r>
+    </w:p>
+    <w:p>
+      <w:pPr>
+        <w:rPr>
+          <w:rFonts w:ascii="Aptos" w:hAnsi="Aptos"/>
+          <w:color w:val="000000"/>
+        </w:rPr>
+      </w:pPr>
+      <w:r>
+        <w:rPr>
+          <w:rFonts w:ascii="Aptos" w:hAnsi="Aptos"/>
+          <w:color w:val="000000"/>
+        </w:rPr>
+        <w:t>Becase</w:t>
+      </w:r>
+      <w:r>
+        <w:rPr>
+          <w:rFonts w:ascii="Aptos" w:hAnsi="Aptos"/>
+          <w:color w:val="000000"/>
+        </w:rPr>
+        <w:t xml:space="preserve"> we have 30 projects we </w:t>
+      </w:r>
+      <w:r>
+        <w:rPr>
+          <w:rFonts w:ascii="Aptos" w:hAnsi="Aptos"/>
+          <w:color w:val="000000"/>
+        </w:rPr>
+        <w:t>need to</w:t>
+      </w:r>
+      <w:r>
+        <w:rPr>
+          <w:rFonts w:ascii="Aptos" w:hAnsi="Aptos"/>
+          <w:color w:val="000000"/>
+        </w:rPr>
+        <w:t xml:space="preserve"> created a binary array of size 30 as the </w:t>
+      </w:r>
+      <w:r>
+        <w:rPr>
+          <w:rFonts w:ascii="Aptos" w:hAnsi="Aptos"/>
+          <w:color w:val="000000"/>
+        </w:rPr>
+        <w:t xml:space="preserve">representaion of a </w:t>
+      </w:r>
+      <w:r>
+        <w:rPr>
+          <w:rFonts w:ascii="Aptos" w:hAnsi="Aptos"/>
+          <w:color w:val="000000"/>
+        </w:rPr>
+        <w:t xml:space="preserve">chromasome. </w:t>
+      </w:r>
+      <w:r>
+        <w:rPr>
+          <w:rFonts w:ascii="Aptos" w:hAnsi="Aptos"/>
+          <w:color w:val="000000"/>
+        </w:rPr>
+        <w:t xml:space="preserve">This is </w:t>
+      </w:r>
+      <w:r>
+        <w:rPr>
+          <w:rFonts w:ascii="Aptos" w:hAnsi="Aptos"/>
+          <w:color w:val="000000"/>
+        </w:rPr>
+        <w:t xml:space="preserve">same as </w:t>
+      </w:r>
+      <w:r>
+        <w:rPr>
+          <w:rFonts w:ascii="Aptos" w:hAnsi="Aptos"/>
+          <w:color w:val="000000"/>
+        </w:rPr>
+        <w:t xml:space="preserve">the feature select/not usecase </w:t>
+      </w:r>
+      <w:r>
+        <w:rPr>
+          <w:rFonts w:ascii="Aptos" w:hAnsi="Aptos"/>
+          <w:color w:val="000000"/>
+        </w:rPr>
+        <w:t>we use binary represenation to keep feature or drop</w:t>
+      </w:r>
+      <w:r>
+        <w:rPr>
+          <w:rFonts w:ascii="Aptos" w:hAnsi="Aptos"/>
+          <w:color w:val="000000"/>
+        </w:rPr>
+        <w:t xml:space="preserve"> as the chromasome</w:t>
+      </w:r>
+      <w:r>
+        <w:rPr>
+          <w:rFonts w:ascii="Aptos" w:hAnsi="Aptos"/>
+          <w:color w:val="000000"/>
+        </w:rPr>
+        <w:t xml:space="preserve">. As the same in </w:t>
+      </w:r>
+      <w:r>
+        <w:rPr>
+          <w:rFonts w:ascii="Aptos" w:hAnsi="Aptos"/>
+          <w:color w:val="000000"/>
+        </w:rPr>
+        <w:t xml:space="preserve">the </w:t>
+      </w:r>
+      <w:r>
+        <w:rPr>
+          <w:rFonts w:ascii="Aptos" w:hAnsi="Aptos"/>
+          <w:color w:val="000000"/>
+        </w:rPr>
+        <w:t>projet</w:t>
+      </w:r>
+      <w:r>
+        <w:rPr>
+          <w:rFonts w:ascii="Aptos" w:hAnsi="Aptos"/>
+          <w:color w:val="000000"/>
+        </w:rPr>
+        <w:t xml:space="preserve"> selectrion usecase of ours </w:t>
+      </w:r>
+      <w:r>
+        <w:rPr>
+          <w:rFonts w:ascii="Aptos" w:hAnsi="Aptos"/>
+          <w:color w:val="000000"/>
+        </w:rPr>
+        <w:t xml:space="preserve">we need to decide keep the project or not. </w:t>
+      </w:r>
+    </w:p>
+    <w:p>
+      <w:pPr>
+        <w:rPr>
+          <w:rFonts w:ascii="Aptos" w:hAnsi="Aptos"/>
+          <w:color w:val="000000"/>
+        </w:rPr>
+      </w:pPr>
+    </w:p>
+    <w:p>
+      <w:pPr>
+        <w:rPr>
+          <w:rFonts w:ascii="Aptos" w:hAnsi="Aptos"/>
+          <w:color w:val="000000"/>
+        </w:rPr>
+      </w:pPr>
+      <m:oMathPara>
+        <m:oMath>
+          <m:r>
+            <w:rPr>
+              <w:rFonts w:ascii="Cambria Math" w:hAnsi="Cambria Math"/>
+              <w:color w:val="000000"/>
+            </w:rPr>
+            <m:t>Chromasome= [1=keep the project, 0=not, …]</m:t>
+          </m:r>
+        </m:oMath>
+      </m:oMathPara>
+    </w:p>
+    <w:p>
+      <w:pPr>
+        <w:pStyle w:val="Heading3"/>
+        <w:rPr>
+          <w:rFonts w:ascii="Aptos" w:hAnsi="Aptos" w:cs="Angsana New"/>
+        </w:rPr>
+      </w:pPr>
+    </w:p>
+    <w:p>
+      <w:pPr>
+        <w:pStyle w:val="Heading3"/>
+        <w:rPr>
+          <w:rFonts w:ascii="Aptos" w:hAnsi="Aptos"/>
+          <w:b w:val="0"/>
+          <w:bCs w:val="0"/>
+          <w:sz w:val="24"/>
+          <w:szCs w:val="24"/>
+        </w:rPr>
+      </w:pPr>
+      <w:r>
+        <w:rPr>
+          <w:rFonts w:ascii="Aptos" w:hAnsi="Aptos"/>
+          <w:b w:val="0"/>
+          <w:bCs w:val="0"/>
+          <w:sz w:val="24"/>
+          <w:szCs w:val="24"/>
+        </w:rPr>
+        <w:t>The population size and generation count are dynamically configurable to support hyperparameter tuning</w:t>
+      </w:r>
+      <w:r>
+        <w:rPr>
+          <w:rFonts w:ascii="Aptos" w:hAnsi="Aptos"/>
+          <w:b w:val="0"/>
+          <w:bCs w:val="0"/>
+          <w:sz w:val="24"/>
+          <w:szCs w:val="24"/>
+        </w:rPr>
+        <w:t xml:space="preserve"> as </w:t>
+      </w:r>
+      <w:r>
+        <w:rPr>
+          <w:rFonts w:ascii="Aptos" w:hAnsi="Aptos"/>
+          <w:b w:val="0"/>
+          <w:bCs w:val="0"/>
+          <w:sz w:val="24"/>
+          <w:szCs w:val="24"/>
+        </w:rPr>
+        <w:t>depicted</w:t>
+      </w:r>
+      <w:r>
+        <w:rPr>
+          <w:rFonts w:ascii="Aptos" w:hAnsi="Aptos"/>
+          <w:b w:val="0"/>
+          <w:bCs w:val="0"/>
+          <w:sz w:val="24"/>
+          <w:szCs w:val="24"/>
+        </w:rPr>
+        <w:t xml:space="preserve"> in figure 3.</w:t>
+      </w:r>
+      <w:r>
+        <w:rPr>
+          <w:rFonts w:ascii="Aptos" w:hAnsi="Aptos"/>
+          <w:b w:val="0"/>
+          <w:bCs w:val="0"/>
+          <w:sz w:val="24"/>
+          <w:szCs w:val="24"/>
+        </w:rPr>
+        <w:t>4</w:t>
+      </w:r>
+    </w:p>
+    <w:p>
+      <w:pPr>
         <w:pStyle w:val="BodyText"/>
-        <w:rPr>
-          <w:rFonts w:ascii="Aptos" w:hAnsi="Aptos"/>
-        </w:rPr>
-      </w:pPr>
-      <w:r>
-        <w:rPr>
-          <w:rFonts w:ascii="Aptos" w:hAnsi="Aptos"/>
+        <w:jc w:val="center"/>
+      </w:pPr>
+      <w:r>
+        <w:drawing>
+          <wp:inline distT="0" distB="0" distL="0" distR="0" wp14:anchorId="26868C9A" wp14:editId="53BB723E">
+            <wp:extent cx="6120130" cy="2512060"/>
+            <wp:effectExtent l="0" t="0" r="1270" b="2540"/>
+            <wp:docPr id="1826793616" name="Picture 1" descr="A screen shot of a computer&#10;&#10;AI-generated content may be incorrect."/>
+            <wp:cNvGraphicFramePr>
+              <a:graphicFrameLocks xmlns:a="http://schemas.openxmlformats.org/drawingml/2006/main" noChangeAspect="1"/>
+            </wp:cNvGraphicFramePr>
+            <a:graphic xmlns:a="http://schemas.openxmlformats.org/drawingml/2006/main">
+              <a:graphicData uri="http://schemas.openxmlformats.org/drawingml/2006/picture">
+                <pic:pic xmlns:pic="http://schemas.openxmlformats.org/drawingml/2006/picture">
+                  <pic:nvPicPr>
+                    <pic:cNvPr id="1826793616" name="Picture 1" descr="A screen shot of a computer&#10;&#10;AI-generated content may be incorrect."/>
+                    <pic:cNvPicPr/>
+                  </pic:nvPicPr>
+                  <pic:blipFill>
+                    <a:blip r:embed="rId43"/>
+                    <a:stretch>
+                      <a:fillRect/>
+                    </a:stretch>
+                  </pic:blipFill>
+                  <pic:spPr>
+                    <a:xfrm>
+                      <a:off x="0" y="0"/>
+                      <a:ext cx="6120130" cy="2512060"/>
+                    </a:xfrm>
+                    <a:prstGeom prst="rect">
+                      <a:avLst/>
+                    </a:prstGeom>
+                  </pic:spPr>
+                </pic:pic>
+              </a:graphicData>
+            </a:graphic>
+          </wp:inline>
+        </w:drawing>
+      </w:r>
+    </w:p>
+    <w:p>
+      <w:pPr>
+        <w:pStyle w:val="BodyText"/>
+        <w:jc w:val="center"/>
+        <w:rPr>
+          <w:rFonts w:ascii="Aptos" w:hAnsi="Aptos"/>
+          <w:sz w:val="20"/>
+          <w:szCs w:val="20"/>
+        </w:rPr>
+      </w:pPr>
+      <w:r>
+        <w:rPr>
+          <w:rFonts w:ascii="Aptos" w:hAnsi="Aptos"/>
+          <w:sz w:val="20"/>
+          <w:szCs w:val="20"/>
+        </w:rPr>
+        <w:t xml:space="preserve">Figure 3.4 : </w:t>
+      </w:r>
+      <w:r>
+        <w:rPr>
+          <w:rFonts w:ascii="Aptos" w:hAnsi="Aptos"/>
+          <w:sz w:val="20"/>
+          <w:szCs w:val="20"/>
+        </w:rPr>
+        <w:t>Population creation</w:t>
+      </w:r>
+    </w:p>
+    <w:p>
+      <w:pPr>
+        <w:pStyle w:val="Heading3"/>
+        <w:rPr>
+          <w:rFonts w:ascii="Aptos" w:hAnsi="Aptos" w:cs="Angsana New"/>
+        </w:rPr>
+      </w:pPr>
+      <w:r>
+        <w:rPr>
+          <w:rFonts w:ascii="Aptos" w:hAnsi="Aptos" w:cs="Angsana New"/>
         </w:rPr>
         <w:t>Fitness Function</w:t>
       </w:r>
@@ -17972,74 +18273,120 @@
     <w:p>
       <w:pPr>
         <w:pStyle w:val="BodyText"/>
+        <w:rPr>
+          <w:rFonts w:ascii="Aptos" w:hAnsi="Aptos"/>
+        </w:rPr>
+      </w:pPr>
+      <w:r>
         <w:rPr>
           <w:rFonts w:ascii="Aptos" w:hAnsi="Aptos"/>
           <w:b/>
           <w:bCs/>
         </w:rPr>
-      </w:pPr>
+        <w:t>Low Penalties</w:t>
+      </w:r>
       <w:r>
         <w:rPr>
           <w:rFonts w:ascii="Aptos" w:hAnsi="Aptos"/>
           <w:b/>
           <w:bCs/>
         </w:rPr>
-        <w:t>Low Penalties</w:t>
+        <w:t xml:space="preserve"> : </w:t>
+      </w:r>
+      <w:r>
+        <w:rPr>
+          <w:rFonts w:ascii="Aptos" w:hAnsi="Aptos"/>
+        </w:rPr>
+        <w:t>Vialations of Budget and Labour constraints assign low penalties</w:t>
+      </w:r>
+      <w:r>
+        <w:rPr>
+          <w:rFonts w:ascii="Aptos" w:hAnsi="Aptos"/>
+        </w:rPr>
+        <w:t>.</w:t>
       </w:r>
     </w:p>
     <w:p>
       <w:pPr>
         <w:pStyle w:val="BodyText"/>
-        <w:ind w:firstLine="709"/>
-        <w:rPr>
-          <w:rFonts w:ascii="Aptos" w:hAnsi="Aptos"/>
-        </w:rPr>
-      </w:pPr>
-      <w:r>
-        <w:rPr>
-          <w:rFonts w:ascii="Aptos" w:hAnsi="Aptos"/>
-        </w:rPr>
-        <w:t>Vialations of Budget and Labour constraints assign low penalties</w:t>
-      </w:r>
-    </w:p>
-    <w:p>
-      <w:pPr>
-        <w:pStyle w:val="BodyText"/>
+        <w:rPr>
+          <w:rFonts w:ascii="Aptos" w:hAnsi="Aptos"/>
+        </w:rPr>
+      </w:pPr>
+      <w:r>
         <w:rPr>
           <w:rFonts w:ascii="Aptos" w:hAnsi="Aptos"/>
           <w:b/>
           <w:bCs/>
         </w:rPr>
-      </w:pPr>
+        <w:t>High Penalties</w:t>
+      </w:r>
       <w:r>
         <w:rPr>
           <w:rFonts w:ascii="Aptos" w:hAnsi="Aptos"/>
           <w:b/>
           <w:bCs/>
         </w:rPr>
-        <w:t>High Penalties</w:t>
+        <w:t xml:space="preserve"> : </w:t>
+      </w:r>
+      <w:r>
+        <w:rPr>
+          <w:rFonts w:ascii="Aptos" w:hAnsi="Aptos"/>
+        </w:rPr>
+        <w:t xml:space="preserve">Logical constraint vialation like mutual exclusion and </w:t>
+      </w:r>
+      <w:r>
+        <w:rPr>
+          <w:rFonts w:ascii="Aptos" w:hAnsi="Aptos"/>
+        </w:rPr>
+        <w:t>dependency we assign high penalty which brings negative scores. Here we have picked 500 which exceed maximum profit from the 30 pool projects.</w:t>
       </w:r>
     </w:p>
     <w:p>
       <w:pPr>
         <w:pStyle w:val="BodyText"/>
-        <w:ind w:left="709"/>
-        <w:rPr>
-          <w:rFonts w:ascii="Aptos" w:hAnsi="Aptos"/>
-        </w:rPr>
-      </w:pPr>
-      <w:r>
-        <w:rPr>
-          <w:rFonts w:ascii="Aptos" w:hAnsi="Aptos"/>
-        </w:rPr>
-        <w:t xml:space="preserve">Logical constraint vialation like mutual exclusion and </w:t>
-      </w:r>
-      <w:r>
-        <w:rPr>
-          <w:rFonts w:ascii="Aptos" w:hAnsi="Aptos"/>
-        </w:rPr>
-        <w:t>dependency we assign high penalty which brings negative scores. Here we have picked 500 which exceed maximum profit from the 30 pool projects.</w:t>
-      </w:r>
+        <w:rPr>
+          <w:rFonts w:ascii="Aptos" w:hAnsi="Aptos"/>
+        </w:rPr>
+      </w:pPr>
+      <w:r>
+        <w:rPr>
+          <w:rFonts w:ascii="Aptos" w:hAnsi="Aptos"/>
+        </w:rPr>
+        <w:t>Finally fitness value calculated as below function</w:t>
+      </w:r>
+      <w:r>
+        <w:rPr>
+          <w:rFonts w:ascii="Aptos" w:hAnsi="Aptos"/>
+        </w:rPr>
+        <w:t xml:space="preserve"> and logics depicted in figure 3.5 below.</w:t>
+      </w:r>
+    </w:p>
+    <w:p>
+      <w:pPr>
+        <w:pStyle w:val="BodyText"/>
+        <w:rPr>
+          <w:rFonts w:ascii="Aptos" w:hAnsi="Aptos"/>
+        </w:rPr>
+      </w:pPr>
+      <m:oMathPara>
+        <m:oMath>
+          <m:r>
+            <w:rPr>
+              <w:rFonts w:ascii="Cambria Math" w:hAnsi="Cambria Math"/>
+            </w:rPr>
+            <m:t xml:space="preserve">Fitness Value=Total Profit-Penalty </m:t>
+          </m:r>
+        </m:oMath>
+      </m:oMathPara>
+    </w:p>
+    <w:p>
+      <w:pPr>
+        <w:pStyle w:val="BodyText"/>
+        <w:rPr>
+          <w:rFonts w:ascii="Aptos" w:hAnsi="Aptos"/>
+        </w:rPr>
+      </w:pPr>
     </w:p>
     <w:p>
       <w:pPr>
@@ -18053,10 +18400,11 @@
         <w:rPr>
           <w:rFonts w:ascii="Aptos" w:hAnsi="Aptos"/>
         </w:rPr>
+        <w:lastRenderedPageBreak/>
         <w:drawing>
-          <wp:inline distT="0" distB="0" distL="0" distR="0" wp14:anchorId="3919608A" wp14:editId="5C7C901B">
-            <wp:extent cx="6120130" cy="4437380"/>
-            <wp:effectExtent l="0" t="0" r="1270" b="0"/>
+          <wp:inline distT="0" distB="0" distL="0" distR="0" wp14:anchorId="3919608A" wp14:editId="5937EFBC">
+            <wp:extent cx="5768437" cy="4182386"/>
+            <wp:effectExtent l="0" t="0" r="0" b="0"/>
             <wp:docPr id="1419475280" name="Picture 1" descr="A screen shot of a computer program&#10;&#10;AI-generated content may be incorrect."/>
             <wp:cNvGraphicFramePr>
               <a:graphicFrameLocks xmlns:a="http://schemas.openxmlformats.org/drawingml/2006/main" noChangeAspect="1"/>
@@ -18069,7 +18417,7 @@
                     <pic:cNvPicPr/>
                   </pic:nvPicPr>
                   <pic:blipFill>
-                    <a:blip r:embed="rId43"/>
+                    <a:blip r:embed="rId44"/>
                     <a:stretch>
                       <a:fillRect/>
                     </a:stretch>
@@ -18077,7 +18425,7 @@
                   <pic:spPr>
                     <a:xfrm>
                       <a:off x="0" y="0"/>
-                      <a:ext cx="6120130" cy="4437380"/>
+                      <a:ext cx="5795738" cy="4202180"/>
                     </a:xfrm>
                     <a:prstGeom prst="rect">
                       <a:avLst/>
@@ -18106,7 +18454,23 @@
           <w:sz w:val="20"/>
           <w:szCs w:val="20"/>
         </w:rPr>
-        <w:t>Figure : Fitness function for GA</w:t>
+        <w:t xml:space="preserve">Figure </w:t>
+      </w:r>
+      <w:r>
+        <w:rPr>
+          <w:rFonts w:ascii="Aptos" w:hAnsi="Aptos"/>
+          <w:sz w:val="20"/>
+          <w:szCs w:val="20"/>
+        </w:rPr>
+        <w:t>3.5</w:t>
+      </w:r>
+      <w:r>
+        <w:rPr>
+          <w:rFonts w:ascii="Aptos" w:hAnsi="Aptos"/>
+          <w:sz w:val="20"/>
+          <w:szCs w:val="20"/>
+        </w:rPr>
+        <w:t>: Fitness function for GA</w:t>
       </w:r>
     </w:p>
     <w:p>
@@ -18120,7 +18484,6 @@
         <w:rPr>
           <w:rFonts w:ascii="Aptos" w:hAnsi="Aptos" w:cs="Angsana New"/>
         </w:rPr>
-        <w:lastRenderedPageBreak/>
         <w:t xml:space="preserve">Selection Method </w:t>
       </w:r>
       <w:r>
@@ -18183,7 +18546,19 @@
         <w:rPr>
           <w:rFonts w:ascii="Aptos" w:hAnsi="Aptos" w:cs="Arial"/>
         </w:rPr>
-        <w:t>s for next generation as depciuted in figure below.</w:t>
+        <w:t>s for next generation as depciuted in figure</w:t>
+      </w:r>
+      <w:r>
+        <w:rPr>
+          <w:rFonts w:ascii="Aptos" w:hAnsi="Aptos" w:cs="Arial"/>
+        </w:rPr>
+        <w:t xml:space="preserve"> 3.6</w:t>
+      </w:r>
+      <w:r>
+        <w:rPr>
+          <w:rFonts w:ascii="Aptos" w:hAnsi="Aptos" w:cs="Arial"/>
+        </w:rPr>
+        <w:t xml:space="preserve"> below.</w:t>
       </w:r>
     </w:p>
     <w:p>
@@ -18218,7 +18593,7 @@
                     <pic:cNvPicPr/>
                   </pic:nvPicPr>
                   <pic:blipFill>
-                    <a:blip r:embed="rId44"/>
+                    <a:blip r:embed="rId45"/>
                     <a:stretch>
                       <a:fillRect/>
                     </a:stretch>
@@ -18255,104 +18630,581 @@
           <w:sz w:val="20"/>
           <w:szCs w:val="20"/>
         </w:rPr>
-        <w:t>Figure : Tounament selection implementation</w:t>
-      </w:r>
-    </w:p>
-    <w:p>
-      <w:pPr>
-        <w:pStyle w:val="BodyText"/>
-        <w:jc w:val="center"/>
+        <w:t xml:space="preserve">Figure </w:t>
+      </w:r>
+      <w:r>
         <w:rPr>
           <w:rFonts w:ascii="Aptos" w:hAnsi="Aptos"/>
           <w:sz w:val="20"/>
           <w:szCs w:val="20"/>
         </w:rPr>
-      </w:pPr>
+        <w:t>3.6</w:t>
+      </w:r>
+      <w:r>
+        <w:rPr>
+          <w:rFonts w:ascii="Aptos" w:hAnsi="Aptos"/>
+          <w:sz w:val="20"/>
+          <w:szCs w:val="20"/>
+        </w:rPr>
+        <w:t>: Tounament selection implementation</w:t>
+      </w:r>
     </w:p>
     <w:p>
       <w:pPr>
         <w:pStyle w:val="Heading3"/>
         <w:rPr>
-          <w:rFonts w:ascii="Aptos" w:hAnsi="Aptos"/>
-        </w:rPr>
-      </w:pPr>
-      <w:r>
-        <w:rPr>
-          <w:rFonts w:ascii="Aptos" w:hAnsi="Aptos" w:cs="Angsana New"/>
-        </w:rPr>
-        <w:t>Elitism</w:t>
-      </w:r>
-      <w:r>
-        <w:rPr>
-          <w:rFonts w:ascii="Aptos" w:hAnsi="Aptos"/>
-        </w:rPr>
+          <w:rFonts w:ascii="Aptos" w:hAnsi="Aptos" w:cs="Angsana New"/>
+        </w:rPr>
+      </w:pPr>
+    </w:p>
+    <w:p>
+      <w:pPr>
+        <w:pStyle w:val="Heading3"/>
+        <w:rPr>
+          <w:rFonts w:ascii="Aptos" w:hAnsi="Aptos" w:cs="Angsana New"/>
+        </w:rPr>
+      </w:pPr>
+      <w:r>
+        <w:rPr>
+          <w:rFonts w:ascii="Aptos" w:hAnsi="Aptos" w:cs="Angsana New"/>
+        </w:rPr>
+        <w:t>Crossover Operators</w:t>
+      </w:r>
+    </w:p>
+    <w:p>
+      <w:pPr>
+        <w:pStyle w:val="BodyText"/>
+      </w:pPr>
+      <w:r>
+        <w:t xml:space="preserve">This is combining two parent chromasomes to create a child. The idea behind is child inherits the best traits. Here we apply uniform cross over mechanism. Its like coin is tossed and </w:t>
+      </w:r>
+      <w:r>
+        <w:t>determines</w:t>
+      </w:r>
+      <w:r>
+        <w:t xml:space="preserve"> whether the parent 1 and parent 2 </w:t>
+      </w:r>
+      <w:r>
+        <w:t>properties are swapped and create and update child 1 and child 2 properties which is the cross over. The logic is depicted in figure 3.7 below.</w:t>
+      </w:r>
+    </w:p>
+    <w:p>
+      <w:pPr>
+        <w:pStyle w:val="BodyText"/>
+      </w:pPr>
+      <w:r>
+        <w:t xml:space="preserve">Additionally we do not cross over 100% instead we keep a cross over rate to 80% which make sure there is a 20% chance </w:t>
+      </w:r>
+      <w:r>
+        <w:t xml:space="preserve">that parent pass traits starigh to the next generation without being traits swapped. This make sure good solutions from </w:t>
+      </w:r>
+      <w:r>
+        <w:t>tournament</w:t>
+      </w:r>
+      <w:r>
         <w:t xml:space="preserve"> </w:t>
       </w:r>
+      <w:r>
+        <w:t>selection</w:t>
+      </w:r>
+      <w:r>
+        <w:t xml:space="preserve"> survives intact into the next </w:t>
+      </w:r>
+      <w:r>
+        <w:lastRenderedPageBreak/>
+        <w:t>generation witohut breakdown in every generation. If 100% crossover we cannot make sure this would preserve.</w:t>
+      </w:r>
+    </w:p>
+    <w:p>
+      <w:pPr>
+        <w:pStyle w:val="BodyText"/>
+      </w:pPr>
+      <w:r>
+        <w:drawing>
+          <wp:inline distT="0" distB="0" distL="0" distR="0" wp14:anchorId="31F3CBCB" wp14:editId="63CF2B88">
+            <wp:extent cx="6120130" cy="1560195"/>
+            <wp:effectExtent l="0" t="0" r="1270" b="1905"/>
+            <wp:docPr id="1247804154" name="Picture 1" descr="A computer screen with text on it&#10;&#10;AI-generated content may be incorrect."/>
+            <wp:cNvGraphicFramePr>
+              <a:graphicFrameLocks xmlns:a="http://schemas.openxmlformats.org/drawingml/2006/main" noChangeAspect="1"/>
+            </wp:cNvGraphicFramePr>
+            <a:graphic xmlns:a="http://schemas.openxmlformats.org/drawingml/2006/main">
+              <a:graphicData uri="http://schemas.openxmlformats.org/drawingml/2006/picture">
+                <pic:pic xmlns:pic="http://schemas.openxmlformats.org/drawingml/2006/picture">
+                  <pic:nvPicPr>
+                    <pic:cNvPr id="1247804154" name="Picture 1" descr="A computer screen with text on it&#10;&#10;AI-generated content may be incorrect."/>
+                    <pic:cNvPicPr/>
+                  </pic:nvPicPr>
+                  <pic:blipFill>
+                    <a:blip r:embed="rId46"/>
+                    <a:stretch>
+                      <a:fillRect/>
+                    </a:stretch>
+                  </pic:blipFill>
+                  <pic:spPr>
+                    <a:xfrm>
+                      <a:off x="0" y="0"/>
+                      <a:ext cx="6120130" cy="1560195"/>
+                    </a:xfrm>
+                    <a:prstGeom prst="rect">
+                      <a:avLst/>
+                    </a:prstGeom>
+                  </pic:spPr>
+                </pic:pic>
+              </a:graphicData>
+            </a:graphic>
+          </wp:inline>
+        </w:drawing>
+      </w:r>
     </w:p>
     <w:p>
       <w:pPr>
         <w:pStyle w:val="Heading3"/>
-        <w:rPr>
-          <w:rFonts w:ascii="Aptos" w:hAnsi="Aptos"/>
+        <w:jc w:val="center"/>
+        <w:rPr>
+          <w:rFonts w:ascii="Aptos" w:hAnsi="Aptos" w:cs="Angsana New"/>
           <w:b w:val="0"/>
           <w:bCs w:val="0"/>
-        </w:rPr>
-      </w:pPr>
-      <w:r>
-        <w:rPr>
-          <w:rFonts w:ascii="Aptos" w:hAnsi="Aptos"/>
+          <w:sz w:val="20"/>
+          <w:szCs w:val="20"/>
+        </w:rPr>
+      </w:pPr>
+      <w:r>
+        <w:rPr>
+          <w:rFonts w:ascii="Aptos" w:hAnsi="Aptos" w:cs="Angsana New"/>
           <w:b w:val="0"/>
           <w:bCs w:val="0"/>
-        </w:rPr>
-        <w:t xml:space="preserve">This is a process of </w:t>
-      </w:r>
-      <w:r>
-        <w:rPr>
-          <w:rFonts w:ascii="Aptos" w:hAnsi="Aptos"/>
+          <w:sz w:val="20"/>
+          <w:szCs w:val="20"/>
+        </w:rPr>
+        <w:t xml:space="preserve">Figure 3.7 : </w:t>
+      </w:r>
+      <w:r>
+        <w:rPr>
+          <w:rFonts w:ascii="Aptos" w:hAnsi="Aptos" w:cs="Angsana New"/>
           <w:b w:val="0"/>
           <w:bCs w:val="0"/>
-        </w:rPr>
-        <w:t>automatically copying the best chromosomes directly into the next generation without crossover or mutation.</w:t>
-      </w:r>
-      <w:r>
-        <w:rPr>
-          <w:rFonts w:ascii="Aptos" w:hAnsi="Aptos"/>
+          <w:sz w:val="20"/>
+          <w:szCs w:val="20"/>
+        </w:rPr>
+        <w:t>Unform Crossover</w:t>
+      </w:r>
+    </w:p>
+    <w:p>
+      <w:pPr>
+        <w:pStyle w:val="BodyText"/>
+      </w:pPr>
+    </w:p>
+    <w:p>
+      <w:pPr>
+        <w:pStyle w:val="Heading3"/>
+        <w:rPr>
+          <w:rFonts w:ascii="Aptos" w:hAnsi="Aptos" w:cs="Angsana New"/>
+        </w:rPr>
+      </w:pPr>
+      <w:r>
+        <w:rPr>
+          <w:rFonts w:ascii="Aptos" w:hAnsi="Aptos" w:cs="Angsana New"/>
+        </w:rPr>
+        <w:t xml:space="preserve">Mutation Operation </w:t>
+      </w:r>
+    </w:p>
+    <w:p>
+      <w:pPr>
+        <w:pStyle w:val="BodyText"/>
+        <w:rPr>
+          <w:rFonts w:ascii="Aptos" w:hAnsi="Aptos"/>
+        </w:rPr>
+      </w:pPr>
+      <w:r>
+        <w:rPr>
+          <w:rFonts w:ascii="Aptos" w:hAnsi="Aptos"/>
+        </w:rPr>
+        <w:t xml:space="preserve">Random Small changes introduced to prevent algorithm stuck in a local trap. </w:t>
+      </w:r>
+      <w:r>
+        <w:rPr>
+          <w:rFonts w:ascii="Aptos" w:hAnsi="Aptos"/>
+        </w:rPr>
+        <w:t xml:space="preserve"> Logic is depicted in figure 3.</w:t>
+      </w:r>
+      <w:r>
+        <w:rPr>
+          <w:rFonts w:ascii="Aptos" w:hAnsi="Aptos"/>
+        </w:rPr>
+        <w:t xml:space="preserve">8 </w:t>
+      </w:r>
+      <w:r>
+        <w:rPr>
+          <w:rFonts w:ascii="Aptos" w:hAnsi="Aptos"/>
+        </w:rPr>
+        <w:t>below.</w:t>
+      </w:r>
+    </w:p>
+    <w:p>
+      <w:pPr>
+        <w:pStyle w:val="BodyText"/>
+        <w:rPr>
+          <w:rFonts w:ascii="Aptos" w:hAnsi="Aptos"/>
+        </w:rPr>
+      </w:pPr>
+      <m:oMathPara>
+        <m:oMath>
+          <m:r>
+            <w:rPr>
+              <w:rFonts w:ascii="Cambria Math" w:hAnsi="Cambria Math"/>
+            </w:rPr>
+            <m:t>Before=</m:t>
+          </m:r>
+          <m:d>
+            <m:dPr>
+              <m:begChr m:val="["/>
+              <m:endChr m:val="]"/>
+              <m:ctrlPr>
+                <w:rPr>
+                  <w:rFonts w:ascii="Cambria Math" w:hAnsi="Cambria Math"/>
+                  <w:i/>
+                </w:rPr>
+              </m:ctrlPr>
+            </m:dPr>
+            <m:e>
+              <m:r>
+                <w:rPr>
+                  <w:rFonts w:ascii="Cambria Math" w:hAnsi="Cambria Math"/>
+                </w:rPr>
+                <m:t>0, 1, 0…</m:t>
+              </m:r>
+            </m:e>
+          </m:d>
+        </m:oMath>
+      </m:oMathPara>
+    </w:p>
+    <w:p>
+      <w:pPr>
+        <w:pStyle w:val="BodyText"/>
+        <w:rPr>
+          <w:rFonts w:ascii="Aptos" w:hAnsi="Aptos"/>
+        </w:rPr>
+      </w:pPr>
+      <m:oMathPara>
+        <m:oMath>
+          <m:r>
+            <w:rPr>
+              <w:rFonts w:ascii="Cambria Math" w:hAnsi="Cambria Math"/>
+            </w:rPr>
+            <m:t>After=[0, 0, 1… ]</m:t>
+          </m:r>
+        </m:oMath>
+      </m:oMathPara>
+    </w:p>
+    <w:p>
+      <w:pPr>
+        <w:pStyle w:val="BodyText"/>
+        <w:rPr>
+          <w:rFonts w:ascii="Aptos" w:hAnsi="Aptos"/>
+        </w:rPr>
+      </w:pPr>
+      <w:r>
+        <w:rPr>
+          <w:rFonts w:ascii="Aptos" w:hAnsi="Aptos"/>
+        </w:rPr>
+        <w:drawing>
+          <wp:inline distT="0" distB="0" distL="0" distR="0" wp14:anchorId="4C964BF4" wp14:editId="00A0C6EB">
+            <wp:extent cx="6120130" cy="1863090"/>
+            <wp:effectExtent l="0" t="0" r="1270" b="3810"/>
+            <wp:docPr id="292384438" name="Picture 1" descr="A screen shot of a computer code&#10;&#10;AI-generated content may be incorrect."/>
+            <wp:cNvGraphicFramePr>
+              <a:graphicFrameLocks xmlns:a="http://schemas.openxmlformats.org/drawingml/2006/main" noChangeAspect="1"/>
+            </wp:cNvGraphicFramePr>
+            <a:graphic xmlns:a="http://schemas.openxmlformats.org/drawingml/2006/main">
+              <a:graphicData uri="http://schemas.openxmlformats.org/drawingml/2006/picture">
+                <pic:pic xmlns:pic="http://schemas.openxmlformats.org/drawingml/2006/picture">
+                  <pic:nvPicPr>
+                    <pic:cNvPr id="292384438" name="Picture 1" descr="A screen shot of a computer code&#10;&#10;AI-generated content may be incorrect."/>
+                    <pic:cNvPicPr/>
+                  </pic:nvPicPr>
+                  <pic:blipFill>
+                    <a:blip r:embed="rId47"/>
+                    <a:stretch>
+                      <a:fillRect/>
+                    </a:stretch>
+                  </pic:blipFill>
+                  <pic:spPr>
+                    <a:xfrm>
+                      <a:off x="0" y="0"/>
+                      <a:ext cx="6120130" cy="1863090"/>
+                    </a:xfrm>
+                    <a:prstGeom prst="rect">
+                      <a:avLst/>
+                    </a:prstGeom>
+                  </pic:spPr>
+                </pic:pic>
+              </a:graphicData>
+            </a:graphic>
+          </wp:inline>
+        </w:drawing>
+      </w:r>
+    </w:p>
+    <w:p>
+      <w:pPr>
+        <w:pStyle w:val="Heading3"/>
+        <w:jc w:val="center"/>
+        <w:rPr>
+          <w:rFonts w:ascii="Aptos" w:hAnsi="Aptos" w:cs="Angsana New"/>
           <w:b w:val="0"/>
           <w:bCs w:val="0"/>
-        </w:rPr>
-        <w:t xml:space="preserve"> Without Elitism we would notice a oscilation</w:t>
-      </w:r>
-      <w:r>
-        <w:rPr>
-          <w:rFonts w:ascii="Aptos" w:hAnsi="Aptos"/>
+          <w:sz w:val="20"/>
+          <w:szCs w:val="20"/>
+        </w:rPr>
+      </w:pPr>
+      <w:r>
+        <w:rPr>
+          <w:rFonts w:ascii="Aptos" w:hAnsi="Aptos" w:cs="Angsana New"/>
           <w:b w:val="0"/>
           <w:bCs w:val="0"/>
-        </w:rPr>
-        <w:t xml:space="preserve"> as depicted in figure </w:t>
-      </w:r>
-      <w:r>
-        <w:rPr>
-          <w:rFonts w:ascii="Aptos" w:hAnsi="Aptos"/>
+          <w:sz w:val="20"/>
+          <w:szCs w:val="20"/>
+        </w:rPr>
+        <w:t>Figure 3.</w:t>
+      </w:r>
+      <w:r>
+        <w:rPr>
+          <w:rFonts w:ascii="Aptos" w:hAnsi="Aptos" w:cs="Angsana New"/>
           <w:b w:val="0"/>
           <w:bCs w:val="0"/>
-        </w:rPr>
-        <w:t xml:space="preserve">. </w:t>
-      </w:r>
-      <w:r>
-        <w:rPr>
-          <w:rFonts w:ascii="Aptos" w:hAnsi="Aptos"/>
+          <w:sz w:val="20"/>
+          <w:szCs w:val="20"/>
+        </w:rPr>
+        <w:t>8</w:t>
+      </w:r>
+      <w:r>
+        <w:rPr>
+          <w:rFonts w:ascii="Aptos" w:hAnsi="Aptos" w:cs="Angsana New"/>
           <w:b w:val="0"/>
           <w:bCs w:val="0"/>
-        </w:rPr>
-        <w:t xml:space="preserve">With addressing elitism of selecting the best score for next generation its continously improved curve as depicted in figure below.  </w:t>
-      </w:r>
-      <w:r>
-        <w:rPr>
-          <w:rFonts w:ascii="Aptos" w:hAnsi="Aptos"/>
+          <w:sz w:val="20"/>
+          <w:szCs w:val="20"/>
+        </w:rPr>
+        <w:t>: Rando</w:t>
+      </w:r>
+      <w:r>
+        <w:rPr>
+          <w:rFonts w:ascii="Aptos" w:hAnsi="Aptos" w:cs="Angsana New"/>
           <w:b w:val="0"/>
           <w:bCs w:val="0"/>
-        </w:rPr>
-        <w:t>Figure depicts elitism implementation.</w:t>
+          <w:sz w:val="20"/>
+          <w:szCs w:val="20"/>
+        </w:rPr>
+        <w:t>m</w:t>
+      </w:r>
+      <w:r>
+        <w:rPr>
+          <w:rFonts w:ascii="Aptos" w:hAnsi="Aptos" w:cs="Angsana New"/>
+          <w:b w:val="0"/>
+          <w:bCs w:val="0"/>
+          <w:sz w:val="20"/>
+          <w:szCs w:val="20"/>
+        </w:rPr>
+        <w:t xml:space="preserve"> mutation with bit flipping</w:t>
+      </w:r>
+    </w:p>
+    <w:p>
+      <w:pPr>
+        <w:pStyle w:val="Heading3"/>
+        <w:rPr>
+          <w:rFonts w:ascii="Aptos" w:hAnsi="Aptos" w:cs="Angsana New"/>
+        </w:rPr>
+      </w:pPr>
+    </w:p>
+    <w:p>
+      <w:pPr>
+        <w:pStyle w:val="Heading3"/>
+        <w:rPr>
+          <w:rFonts w:ascii="Aptos" w:hAnsi="Aptos"/>
+        </w:rPr>
+      </w:pPr>
+      <w:r>
+        <w:rPr>
+          <w:rFonts w:ascii="Aptos" w:hAnsi="Aptos" w:cs="Angsana New"/>
+        </w:rPr>
+        <w:t>Elitism</w:t>
+      </w:r>
+      <w:r>
+        <w:rPr>
+          <w:rFonts w:ascii="Aptos" w:hAnsi="Aptos"/>
+        </w:rPr>
+        <w:t xml:space="preserve"> </w:t>
+      </w:r>
+    </w:p>
+    <w:p>
+      <w:pPr>
+        <w:pStyle w:val="Heading3"/>
+        <w:rPr>
+          <w:rFonts w:ascii="Aptos" w:hAnsi="Aptos"/>
+          <w:b w:val="0"/>
+          <w:bCs w:val="0"/>
+        </w:rPr>
+      </w:pPr>
+      <w:r>
+        <w:rPr>
+          <w:rFonts w:ascii="Aptos" w:hAnsi="Aptos"/>
+          <w:b w:val="0"/>
+          <w:bCs w:val="0"/>
+        </w:rPr>
+        <w:t xml:space="preserve">This is a process of </w:t>
+      </w:r>
+      <w:r>
+        <w:rPr>
+          <w:rFonts w:ascii="Aptos" w:hAnsi="Aptos"/>
+          <w:b w:val="0"/>
+          <w:bCs w:val="0"/>
+        </w:rPr>
+        <w:t>automatically copying the best chromosomes directly into the next generation without crossover or mutation.</w:t>
+      </w:r>
+      <w:r>
+        <w:rPr>
+          <w:rFonts w:ascii="Aptos" w:hAnsi="Aptos"/>
+          <w:b w:val="0"/>
+          <w:bCs w:val="0"/>
+        </w:rPr>
+        <w:t xml:space="preserve"> Without Elitism we would notice a oscilation</w:t>
+      </w:r>
+      <w:r>
+        <w:rPr>
+          <w:rFonts w:ascii="Aptos" w:hAnsi="Aptos"/>
+          <w:b w:val="0"/>
+          <w:bCs w:val="0"/>
+        </w:rPr>
+        <w:t xml:space="preserve"> as depicted in figure </w:t>
+      </w:r>
+      <w:r>
+        <w:rPr>
+          <w:rFonts w:ascii="Aptos" w:hAnsi="Aptos"/>
+          <w:b w:val="0"/>
+          <w:bCs w:val="0"/>
+        </w:rPr>
+        <w:t>3.</w:t>
+      </w:r>
+      <w:r>
+        <w:rPr>
+          <w:rFonts w:ascii="Aptos" w:hAnsi="Aptos"/>
+          <w:b w:val="0"/>
+          <w:bCs w:val="0"/>
+        </w:rPr>
+        <w:t>9</w:t>
+      </w:r>
+      <w:r>
+        <w:rPr>
+          <w:rFonts w:ascii="Aptos" w:hAnsi="Aptos"/>
+          <w:b w:val="0"/>
+          <w:bCs w:val="0"/>
+        </w:rPr>
+        <w:t xml:space="preserve">. </w:t>
+      </w:r>
+      <w:r>
+        <w:rPr>
+          <w:rFonts w:ascii="Aptos" w:hAnsi="Aptos"/>
+          <w:b w:val="0"/>
+          <w:bCs w:val="0"/>
+        </w:rPr>
+        <w:t xml:space="preserve">With addressing elitism of selecting the best score for next generation its continously improved </w:t>
+      </w:r>
+      <w:r>
+        <w:rPr>
+          <w:rFonts w:ascii="Aptos" w:hAnsi="Aptos"/>
+          <w:b w:val="0"/>
+          <w:bCs w:val="0"/>
+        </w:rPr>
+        <w:t xml:space="preserve">and stabalize </w:t>
+      </w:r>
+      <w:r>
+        <w:rPr>
+          <w:rFonts w:ascii="Aptos" w:hAnsi="Aptos"/>
+          <w:b w:val="0"/>
+          <w:bCs w:val="0"/>
+        </w:rPr>
+        <w:t xml:space="preserve">as </w:t>
+      </w:r>
+      <w:r>
+        <w:rPr>
+          <w:rFonts w:ascii="Aptos" w:hAnsi="Aptos"/>
+          <w:b w:val="0"/>
+          <w:bCs w:val="0"/>
+        </w:rPr>
+        <w:lastRenderedPageBreak/>
+        <w:t xml:space="preserve">depicted in figure </w:t>
+      </w:r>
+      <w:r>
+        <w:rPr>
+          <w:rFonts w:ascii="Aptos" w:hAnsi="Aptos"/>
+          <w:b w:val="0"/>
+          <w:bCs w:val="0"/>
+        </w:rPr>
+        <w:t>3.</w:t>
+      </w:r>
+      <w:r>
+        <w:rPr>
+          <w:rFonts w:ascii="Aptos" w:hAnsi="Aptos"/>
+          <w:b w:val="0"/>
+          <w:bCs w:val="0"/>
+        </w:rPr>
+        <w:t>10</w:t>
+      </w:r>
+      <w:r>
+        <w:rPr>
+          <w:rFonts w:ascii="Aptos" w:hAnsi="Aptos"/>
+          <w:b w:val="0"/>
+          <w:bCs w:val="0"/>
+        </w:rPr>
+        <w:t xml:space="preserve"> </w:t>
+      </w:r>
+      <w:r>
+        <w:rPr>
+          <w:rFonts w:ascii="Aptos" w:hAnsi="Aptos"/>
+          <w:b w:val="0"/>
+          <w:bCs w:val="0"/>
+        </w:rPr>
+        <w:t xml:space="preserve">below.  </w:t>
+      </w:r>
+      <w:r>
+        <w:rPr>
+          <w:rFonts w:ascii="Aptos" w:hAnsi="Aptos"/>
+          <w:b w:val="0"/>
+          <w:bCs w:val="0"/>
+        </w:rPr>
+        <w:t xml:space="preserve">Figure </w:t>
+      </w:r>
+      <w:r>
+        <w:rPr>
+          <w:rFonts w:ascii="Aptos" w:hAnsi="Aptos"/>
+          <w:b w:val="0"/>
+          <w:bCs w:val="0"/>
+        </w:rPr>
+        <w:t>3.</w:t>
+      </w:r>
+      <w:r>
+        <w:rPr>
+          <w:rFonts w:ascii="Aptos" w:hAnsi="Aptos"/>
+          <w:b w:val="0"/>
+          <w:bCs w:val="0"/>
+        </w:rPr>
+        <w:t>11</w:t>
+      </w:r>
+      <w:r>
+        <w:rPr>
+          <w:rFonts w:ascii="Aptos" w:hAnsi="Aptos"/>
+          <w:b w:val="0"/>
+          <w:bCs w:val="0"/>
+        </w:rPr>
+        <w:t xml:space="preserve"> below </w:t>
+      </w:r>
+      <w:r>
+        <w:rPr>
+          <w:rFonts w:ascii="Aptos" w:hAnsi="Aptos"/>
+          <w:b w:val="0"/>
+          <w:bCs w:val="0"/>
+        </w:rPr>
+        <w:t>depicts elitism implementation.</w:t>
       </w:r>
     </w:p>
     <w:p>
@@ -18383,7 +19235,7 @@
                     <pic:cNvPicPr/>
                   </pic:nvPicPr>
                   <pic:blipFill>
-                    <a:blip r:embed="rId45"/>
+                    <a:blip r:embed="rId48"/>
                     <a:stretch>
                       <a:fillRect/>
                     </a:stretch>
@@ -18420,7 +19272,39 @@
           <w:sz w:val="20"/>
           <w:szCs w:val="20"/>
         </w:rPr>
-        <w:t>Figure : GA Best Score Curve without Elitism</w:t>
+        <w:t xml:space="preserve">Figure </w:t>
+      </w:r>
+      <w:r>
+        <w:rPr>
+          <w:rFonts w:ascii="Aptos" w:hAnsi="Aptos"/>
+          <w:sz w:val="20"/>
+          <w:szCs w:val="20"/>
+        </w:rPr>
+        <w:t>3.</w:t>
+      </w:r>
+      <w:r>
+        <w:rPr>
+          <w:rFonts w:ascii="Aptos" w:hAnsi="Aptos"/>
+          <w:sz w:val="20"/>
+          <w:szCs w:val="20"/>
+        </w:rPr>
+        <w:t>9</w:t>
+      </w:r>
+      <w:r>
+        <w:rPr>
+          <w:rFonts w:ascii="Aptos" w:hAnsi="Aptos"/>
+          <w:sz w:val="20"/>
+          <w:szCs w:val="20"/>
+        </w:rPr>
+        <w:t>: GA Best Score Curve without Elitism</w:t>
+      </w:r>
+      <w:r>
+        <w:rPr>
+          <w:rFonts w:ascii="Aptos" w:hAnsi="Aptos"/>
+          <w:sz w:val="20"/>
+          <w:szCs w:val="20"/>
+        </w:rPr>
+        <w:t xml:space="preserve"> (Up and Down)</w:t>
       </w:r>
     </w:p>
     <w:p>
@@ -18443,7 +19327,6 @@
         <w:rPr>
           <w:rFonts w:ascii="Aptos" w:hAnsi="Aptos"/>
         </w:rPr>
-        <w:lastRenderedPageBreak/>
         <w:drawing>
           <wp:inline distT="0" distB="0" distL="0" distR="0" wp14:anchorId="761D6F24" wp14:editId="2CCC6606">
             <wp:extent cx="5375083" cy="2687541"/>
@@ -18460,7 +19343,7 @@
                     <pic:cNvPicPr/>
                   </pic:nvPicPr>
                   <pic:blipFill>
-                    <a:blip r:embed="rId46"/>
+                    <a:blip r:embed="rId49"/>
                     <a:stretch>
                       <a:fillRect/>
                     </a:stretch>
@@ -18497,29 +19380,31 @@
           <w:sz w:val="20"/>
           <w:szCs w:val="20"/>
         </w:rPr>
-        <w:t>Figure : GA Best Score Curve with Elitism</w:t>
-      </w:r>
-    </w:p>
-    <w:p>
-      <w:pPr>
-        <w:pStyle w:val="BodyText"/>
-        <w:rPr>
-          <w:rFonts w:ascii="Aptos" w:hAnsi="Aptos"/>
-        </w:rPr>
-      </w:pPr>
-    </w:p>
-    <w:p>
-      <w:pPr>
-        <w:pStyle w:val="BodyText"/>
-        <w:rPr>
-          <w:rFonts w:ascii="Aptos" w:hAnsi="Aptos"/>
-        </w:rPr>
-      </w:pPr>
-      <w:r>
-        <w:rPr>
-          <w:rFonts w:ascii="Aptos" w:hAnsi="Aptos"/>
-        </w:rPr>
-        <w:t>Figure below depicts elitism implementation.</w:t>
+        <w:t xml:space="preserve">Figure </w:t>
+      </w:r>
+      <w:r>
+        <w:rPr>
+          <w:rFonts w:ascii="Aptos" w:hAnsi="Aptos"/>
+          <w:sz w:val="20"/>
+          <w:szCs w:val="20"/>
+        </w:rPr>
+        <w:t>3.</w:t>
+      </w:r>
+      <w:r>
+        <w:rPr>
+          <w:rFonts w:ascii="Aptos" w:hAnsi="Aptos"/>
+          <w:sz w:val="20"/>
+          <w:szCs w:val="20"/>
+        </w:rPr>
+        <w:t>10</w:t>
+      </w:r>
+      <w:r>
+        <w:rPr>
+          <w:rFonts w:ascii="Aptos" w:hAnsi="Aptos"/>
+          <w:sz w:val="20"/>
+          <w:szCs w:val="20"/>
+        </w:rPr>
+        <w:t>: GA Best Score Curve with Elitism</w:t>
       </w:r>
     </w:p>
     <w:p>
@@ -18549,7 +19434,7 @@
                     <pic:cNvPicPr/>
                   </pic:nvPicPr>
                   <pic:blipFill>
-                    <a:blip r:embed="rId47"/>
+                    <a:blip r:embed="rId50"/>
                     <a:stretch>
                       <a:fillRect/>
                     </a:stretch>
@@ -18586,7 +19471,7 @@
           <w:sz w:val="20"/>
           <w:szCs w:val="20"/>
         </w:rPr>
-        <w:t xml:space="preserve">Figure : </w:t>
+        <w:t xml:space="preserve">Figure </w:t>
       </w:r>
       <w:r>
         <w:rPr>
@@ -18594,6 +19479,38 @@
           <w:sz w:val="20"/>
           <w:szCs w:val="20"/>
         </w:rPr>
+        <w:t>3.</w:t>
+      </w:r>
+      <w:r>
+        <w:rPr>
+          <w:rFonts w:ascii="Aptos" w:hAnsi="Aptos"/>
+          <w:sz w:val="20"/>
+          <w:szCs w:val="20"/>
+        </w:rPr>
+        <w:t>11</w:t>
+      </w:r>
+      <w:r>
+        <w:rPr>
+          <w:rFonts w:ascii="Aptos" w:hAnsi="Aptos"/>
+          <w:sz w:val="20"/>
+          <w:szCs w:val="20"/>
+        </w:rPr>
+        <w:t xml:space="preserve"> </w:t>
+      </w:r>
+      <w:r>
+        <w:rPr>
+          <w:rFonts w:ascii="Aptos" w:hAnsi="Aptos"/>
+          <w:sz w:val="20"/>
+          <w:szCs w:val="20"/>
+        </w:rPr>
+        <w:t xml:space="preserve">: </w:t>
+      </w:r>
+      <w:r>
+        <w:rPr>
+          <w:rFonts w:ascii="Aptos" w:hAnsi="Aptos"/>
+          <w:sz w:val="20"/>
+          <w:szCs w:val="20"/>
+        </w:rPr>
         <w:t>Elitism implementation</w:t>
       </w:r>
     </w:p>
@@ -18618,6 +19535,7 @@
           <w:rFonts w:ascii="Aptos" w:hAnsi="Aptos"/>
           <w:lang w:val="en-US" w:eastAsia="zh-CN" w:bidi="hi-IN"/>
         </w:rPr>
+        <w:lastRenderedPageBreak/>
         <w:t>References</w:t>
       </w:r>
     </w:p>
@@ -18772,7 +19690,6 @@
         <w:rPr>
           <w:rFonts w:ascii="Aptos" w:hAnsi="Aptos"/>
         </w:rPr>
-        <w:lastRenderedPageBreak/>
         <w:t xml:space="preserve">C. Dewi, R. A. Andika, E. Haryani, D. Riantama, A. Sajid, M. M. Alam, and M. M. Su'ud, "Feature selection for financial data classification using Random Forest, Boruta, and Recursive Feature Elimination," </w:t>
       </w:r>
       <w:r>

</xml_diff>

<commit_message>
doc and notebook updated
</commit_message>
<xml_diff>
--- a/CW_Doc.docx
+++ b/CW_Doc.docx
@@ -16730,21 +16730,7 @@
           <w:rFonts w:ascii="Aptos" w:hAnsi="Aptos"/>
           <w:lang w:val="en-US" w:eastAsia="zh-CN" w:bidi="hi-IN"/>
         </w:rPr>
-        <w:t>P3 (Enterprise Automation)</w:t>
-      </w:r>
-      <w:r>
-        <w:rPr>
-          <w:rFonts w:ascii="Aptos" w:hAnsi="Aptos"/>
-          <w:lang w:val="en-US" w:eastAsia="zh-CN" w:bidi="hi-IN"/>
-        </w:rPr>
-        <w:t xml:space="preserve">, </w:t>
-      </w:r>
-      <w:r>
-        <w:rPr>
-          <w:rFonts w:ascii="Aptos" w:hAnsi="Aptos"/>
-          <w:lang w:val="en-US" w:eastAsia="zh-CN" w:bidi="hi-IN"/>
-        </w:rPr>
-        <w:t>P7 (Enterprise Pipeline)</w:t>
+        <w:t>P3 (Enterprise Automation), P7 (Enterprise Pipeline)</w:t>
       </w:r>
     </w:p>
     <w:p>
@@ -16784,19 +16770,7 @@
         <w:rPr>
           <w:rFonts w:ascii="Aptos" w:hAnsi="Aptos"/>
         </w:rPr>
-        <w:t>)</w:t>
-      </w:r>
-      <w:r>
-        <w:rPr>
-          <w:rFonts w:ascii="Aptos" w:hAnsi="Aptos"/>
-        </w:rPr>
-        <w:t>,</w:t>
-      </w:r>
-      <w:r>
-        <w:rPr>
-          <w:rFonts w:ascii="Aptos" w:hAnsi="Aptos"/>
-        </w:rPr>
-        <w:t xml:space="preserve"> </w:t>
+        <w:t xml:space="preserve">), </w:t>
       </w:r>
       <w:r>
         <w:rPr>
@@ -16862,13 +16836,7 @@
         <w:rPr>
           <w:rFonts w:ascii="Aptos" w:hAnsi="Aptos"/>
         </w:rPr>
-        <w:t>)</w:t>
-      </w:r>
-      <w:r>
-        <w:rPr>
-          <w:rFonts w:ascii="Aptos" w:hAnsi="Aptos"/>
-        </w:rPr>
-        <w:t xml:space="preserve">, </w:t>
+        <w:t xml:space="preserve">), </w:t>
       </w:r>
       <w:r>
         <w:rPr>
@@ -17201,6 +17169,7 @@
       <w:r>
         <w:rPr>
           <w:rFonts w:ascii="Aptos" w:hAnsi="Aptos"/>
+          <w:noProof/>
           <w:lang w:val="en-US" w:eastAsia="zh-CN" w:bidi="hi-IN"/>
         </w:rPr>
         <w:drawing>
@@ -17268,98 +17237,81 @@
           <w:szCs w:val="20"/>
           <w:lang w:val="en-US" w:eastAsia="zh-CN" w:bidi="hi-IN"/>
         </w:rPr>
+        <w:t>Figure 3.2 Data Preparation implementation</w:t>
+      </w:r>
+    </w:p>
+    <w:p>
+      <w:pPr>
+        <w:suppressAutoHyphens/>
+        <w:rPr>
+          <w:rFonts w:ascii="Aptos" w:hAnsi="Aptos"/>
+          <w:lang w:val="en-US" w:eastAsia="zh-CN" w:bidi="hi-IN"/>
+        </w:rPr>
+      </w:pPr>
+    </w:p>
+    <w:p>
+      <w:pPr>
+        <w:suppressAutoHyphens/>
+        <w:rPr>
+          <w:rFonts w:ascii="Aptos" w:hAnsi="Aptos"/>
+          <w:lang w:val="en-US" w:eastAsia="zh-CN" w:bidi="hi-IN"/>
+        </w:rPr>
+      </w:pPr>
+    </w:p>
+    <w:p>
+      <w:pPr>
+        <w:suppressAutoHyphens/>
+        <w:rPr>
+          <w:rFonts w:ascii="Aptos" w:hAnsi="Aptos"/>
+          <w:lang w:val="en-US" w:eastAsia="zh-CN" w:bidi="hi-IN"/>
+        </w:rPr>
+      </w:pPr>
+      <w:r>
+        <w:rPr>
+          <w:rFonts w:ascii="Aptos" w:hAnsi="Aptos"/>
+          <w:lang w:val="en-US" w:eastAsia="zh-CN" w:bidi="hi-IN"/>
+        </w:rPr>
         <w:t>Figure 3.</w:t>
       </w:r>
       <w:r>
+        <w:rPr>
+          <w:rFonts w:ascii="Aptos" w:hAnsi="Aptos"/>
+          <w:lang w:val="en-US" w:eastAsia="zh-CN" w:bidi="hi-IN"/>
+        </w:rPr>
+        <w:t>3</w:t>
+      </w:r>
+      <w:r>
+        <w:rPr>
+          <w:rFonts w:ascii="Aptos" w:hAnsi="Aptos"/>
+          <w:lang w:val="en-US" w:eastAsia="zh-CN" w:bidi="hi-IN"/>
+        </w:rPr>
+        <w:t xml:space="preserve"> illustrates project distribution plots which visualize the cost vs profit tradeoff. The size of the points represents the required developer dev hours.</w:t>
+      </w:r>
+    </w:p>
+    <w:p>
+      <w:pPr>
+        <w:suppressAutoHyphens/>
+        <w:rPr>
+          <w:rFonts w:ascii="Aptos" w:hAnsi="Aptos"/>
+          <w:lang w:val="en-US" w:eastAsia="zh-CN" w:bidi="hi-IN"/>
+        </w:rPr>
+      </w:pPr>
+    </w:p>
+    <w:p>
+      <w:pPr>
+        <w:suppressAutoHyphens/>
+        <w:jc w:val="center"/>
         <w:rPr>
           <w:rFonts w:ascii="Aptos" w:hAnsi="Aptos"/>
           <w:sz w:val="20"/>
           <w:szCs w:val="20"/>
           <w:lang w:val="en-US" w:eastAsia="zh-CN" w:bidi="hi-IN"/>
         </w:rPr>
-        <w:t>2</w:t>
-      </w:r>
-      <w:r>
-        <w:rPr>
-          <w:rFonts w:ascii="Aptos" w:hAnsi="Aptos"/>
-          <w:sz w:val="20"/>
-          <w:szCs w:val="20"/>
-          <w:lang w:val="en-US" w:eastAsia="zh-CN" w:bidi="hi-IN"/>
-        </w:rPr>
-        <w:t xml:space="preserve"> Data Preparation implementation</w:t>
-      </w:r>
-    </w:p>
-    <w:p>
-      <w:pPr>
-        <w:suppressAutoHyphens/>
-        <w:rPr>
-          <w:rFonts w:ascii="Aptos" w:hAnsi="Aptos"/>
-          <w:lang w:val="en-US" w:eastAsia="zh-CN" w:bidi="hi-IN"/>
-        </w:rPr>
-      </w:pPr>
-    </w:p>
-    <w:p>
-      <w:pPr>
-        <w:suppressAutoHyphens/>
-        <w:rPr>
-          <w:rFonts w:ascii="Aptos" w:hAnsi="Aptos"/>
-          <w:lang w:val="en-US" w:eastAsia="zh-CN" w:bidi="hi-IN"/>
-        </w:rPr>
-      </w:pPr>
-    </w:p>
-    <w:p>
-      <w:pPr>
-        <w:suppressAutoHyphens/>
-        <w:rPr>
-          <w:rFonts w:ascii="Aptos" w:hAnsi="Aptos"/>
-          <w:lang w:val="en-US" w:eastAsia="zh-CN" w:bidi="hi-IN"/>
-        </w:rPr>
-      </w:pPr>
-      <w:r>
-        <w:rPr>
-          <w:rFonts w:ascii="Aptos" w:hAnsi="Aptos"/>
-          <w:lang w:val="en-US" w:eastAsia="zh-CN" w:bidi="hi-IN"/>
-        </w:rPr>
-        <w:t>Figure 3.</w:t>
-      </w:r>
-      <w:r>
-        <w:rPr>
-          <w:rFonts w:ascii="Aptos" w:hAnsi="Aptos"/>
-          <w:lang w:val="en-US" w:eastAsia="zh-CN" w:bidi="hi-IN"/>
-        </w:rPr>
-        <w:t>3</w:t>
-      </w:r>
-      <w:r>
-        <w:rPr>
-          <w:rFonts w:ascii="Aptos" w:hAnsi="Aptos"/>
-          <w:lang w:val="en-US" w:eastAsia="zh-CN" w:bidi="hi-IN"/>
-        </w:rPr>
-        <w:t xml:space="preserve"> illustrates project distribution plots which visualize the cost vs profit tradeoff. The size of the points represents the required developer dev hours.</w:t>
-      </w:r>
-    </w:p>
-    <w:p>
-      <w:pPr>
-        <w:suppressAutoHyphens/>
-        <w:rPr>
-          <w:rFonts w:ascii="Aptos" w:hAnsi="Aptos"/>
-          <w:lang w:val="en-US" w:eastAsia="zh-CN" w:bidi="hi-IN"/>
-        </w:rPr>
-      </w:pPr>
-    </w:p>
-    <w:p>
-      <w:pPr>
-        <w:suppressAutoHyphens/>
-        <w:jc w:val="center"/>
-        <w:rPr>
-          <w:rFonts w:ascii="Aptos" w:hAnsi="Aptos"/>
-          <w:sz w:val="20"/>
-          <w:szCs w:val="20"/>
-          <w:lang w:val="en-US" w:eastAsia="zh-CN" w:bidi="hi-IN"/>
-        </w:rPr>
-      </w:pPr>
-      <w:r>
-        <w:rPr>
-          <w:rFonts w:ascii="Aptos" w:hAnsi="Aptos"/>
+      </w:pPr>
+      <w:r>
+        <w:rPr>
+          <w:rFonts w:ascii="Aptos" w:hAnsi="Aptos"/>
+          <w:noProof/>
           <w:sz w:val="20"/>
           <w:szCs w:val="20"/>
           <w:lang w:val="en-US" w:eastAsia="zh-CN" w:bidi="hi-IN"/>
@@ -17876,43 +17828,7 @@
         <w:rPr>
           <w:rFonts w:ascii="Aptos" w:hAnsi="Aptos"/>
         </w:rPr>
-        <w:t>Brute</w:t>
-      </w:r>
-      <w:r>
-        <w:rPr>
-          <w:rFonts w:ascii="Aptos" w:hAnsi="Aptos"/>
-        </w:rPr>
-        <w:t xml:space="preserve"> </w:t>
-      </w:r>
-      <w:r>
-        <w:rPr>
-          <w:rFonts w:ascii="Aptos" w:hAnsi="Aptos"/>
-        </w:rPr>
-        <w:t xml:space="preserve">force evaluation of over 1 billion combinations is computationally </w:t>
-      </w:r>
-      <w:r>
-        <w:rPr>
-          <w:rFonts w:ascii="Aptos" w:hAnsi="Aptos"/>
-        </w:rPr>
-        <w:t xml:space="preserve">very expensive </w:t>
-      </w:r>
-      <w:r>
-        <w:rPr>
-          <w:rFonts w:ascii="Aptos" w:hAnsi="Aptos"/>
-        </w:rPr>
-        <w:t xml:space="preserve">which </w:t>
-      </w:r>
-      <w:r>
-        <w:rPr>
-          <w:rFonts w:ascii="Aptos" w:hAnsi="Aptos"/>
-        </w:rPr>
-        <w:t>requires better solutions like</w:t>
-      </w:r>
-      <w:r>
-        <w:rPr>
-          <w:rFonts w:ascii="Aptos" w:hAnsi="Aptos"/>
-        </w:rPr>
-        <w:t xml:space="preserve"> GA and MIP.</w:t>
+        <w:t>Brute force evaluation of over 1 billion combinations is computationally very expensive which requires better solutions like GA and MIP.</w:t>
       </w:r>
     </w:p>
     <w:p>
@@ -17946,13 +17862,7 @@
         <w:rPr>
           <w:rFonts w:ascii="Aptos" w:hAnsi="Aptos" w:cs="Angsana New"/>
         </w:rPr>
-        <w:t>Chromosome representation</w:t>
-      </w:r>
-      <w:r>
-        <w:rPr>
-          <w:rFonts w:ascii="Aptos" w:hAnsi="Aptos" w:cs="Angsana New"/>
-        </w:rPr>
-        <w:t xml:space="preserve"> and Popualtion Initalization Strategy</w:t>
+        <w:t>Chromosome representation and Popualtion Initalization Strategy</w:t>
       </w:r>
     </w:p>
     <w:p>
@@ -18179,10 +18089,10 @@
       </w:pPr>
       <w:r>
         <w:drawing>
-          <wp:inline distT="0" distB="0" distL="0" distR="0" wp14:anchorId="26868C9A" wp14:editId="53BB723E">
-            <wp:extent cx="6120130" cy="2512060"/>
-            <wp:effectExtent l="0" t="0" r="1270" b="2540"/>
-            <wp:docPr id="1826793616" name="Picture 1" descr="A screen shot of a computer&#10;&#10;AI-generated content may be incorrect."/>
+          <wp:inline distT="0" distB="0" distL="0" distR="0" wp14:anchorId="02C48D43" wp14:editId="485E3913">
+            <wp:extent cx="6120130" cy="1653540"/>
+            <wp:effectExtent l="0" t="0" r="1270" b="0"/>
+            <wp:docPr id="1576581003" name="Picture 1" descr="A screen shot of a computer code&#10;&#10;AI-generated content may be incorrect."/>
             <wp:cNvGraphicFramePr>
               <a:graphicFrameLocks xmlns:a="http://schemas.openxmlformats.org/drawingml/2006/main" noChangeAspect="1"/>
             </wp:cNvGraphicFramePr>
@@ -18190,7 +18100,7 @@
               <a:graphicData uri="http://schemas.openxmlformats.org/drawingml/2006/picture">
                 <pic:pic xmlns:pic="http://schemas.openxmlformats.org/drawingml/2006/picture">
                   <pic:nvPicPr>
-                    <pic:cNvPr id="1826793616" name="Picture 1" descr="A screen shot of a computer&#10;&#10;AI-generated content may be incorrect."/>
+                    <pic:cNvPr id="1576581003" name="Picture 1" descr="A screen shot of a computer code&#10;&#10;AI-generated content may be incorrect."/>
                     <pic:cNvPicPr/>
                   </pic:nvPicPr>
                   <pic:blipFill>
@@ -18202,7 +18112,7 @@
                   <pic:spPr>
                     <a:xfrm>
                       <a:off x="0" y="0"/>
-                      <a:ext cx="6120130" cy="2512060"/>
+                      <a:ext cx="6120130" cy="1653540"/>
                     </a:xfrm>
                     <a:prstGeom prst="rect">
                       <a:avLst/>
@@ -18399,6 +18309,7 @@
       <w:r>
         <w:rPr>
           <w:rFonts w:ascii="Aptos" w:hAnsi="Aptos"/>
+          <w:noProof/>
         </w:rPr>
         <w:lastRenderedPageBreak/>
         <w:drawing>
@@ -18516,19 +18427,7 @@
         <w:rPr>
           <w:rFonts w:ascii="Aptos" w:hAnsi="Aptos" w:cs="Arial"/>
         </w:rPr>
-        <w:t xml:space="preserve">This is </w:t>
-      </w:r>
-      <w:r>
-        <w:rPr>
-          <w:rFonts w:ascii="Aptos" w:hAnsi="Aptos" w:cs="Arial"/>
-        </w:rPr>
-        <w:t xml:space="preserve">used to select </w:t>
-      </w:r>
-      <w:r>
-        <w:rPr>
-          <w:rFonts w:ascii="Aptos" w:hAnsi="Aptos" w:cs="Arial"/>
-        </w:rPr>
-        <w:t xml:space="preserve">the fittest candidate </w:t>
+        <w:t xml:space="preserve">This is used to select the fittest candidate </w:t>
       </w:r>
       <w:r>
         <w:rPr>
@@ -18574,6 +18473,7 @@
       <w:r>
         <w:rPr>
           <w:rFonts w:ascii="Aptos" w:hAnsi="Aptos"/>
+          <w:noProof/>
           <w:sz w:val="20"/>
           <w:szCs w:val="20"/>
         </w:rPr>
@@ -18720,6 +18620,9 @@
         <w:pStyle w:val="BodyText"/>
       </w:pPr>
       <w:r>
+        <w:rPr>
+          <w:noProof/>
+        </w:rPr>
         <w:drawing>
           <wp:inline distT="0" distB="0" distL="0" distR="0" wp14:anchorId="31F3CBCB" wp14:editId="63CF2B88">
             <wp:extent cx="6120130" cy="1560195"/>
@@ -18907,6 +18810,7 @@
       <w:r>
         <w:rPr>
           <w:rFonts w:ascii="Aptos" w:hAnsi="Aptos"/>
+          <w:noProof/>
         </w:rPr>
         <w:drawing>
           <wp:inline distT="0" distB="0" distL="0" distR="0" wp14:anchorId="4C964BF4" wp14:editId="00A0C6EB">
@@ -19050,159 +18954,179 @@
           <w:rFonts w:ascii="Aptos" w:hAnsi="Aptos"/>
           <w:b w:val="0"/>
           <w:bCs w:val="0"/>
-        </w:rPr>
-        <w:t xml:space="preserve">This is a process of </w:t>
+          <w:sz w:val="24"/>
+          <w:szCs w:val="24"/>
+        </w:rPr>
+        <w:t>This is a process of automatically copying the best chromosomes directly into the next generation without crossover or mutation. Without Elitism we would notice a oscilation</w:t>
       </w:r>
       <w:r>
         <w:rPr>
           <w:rFonts w:ascii="Aptos" w:hAnsi="Aptos"/>
           <w:b w:val="0"/>
           <w:bCs w:val="0"/>
-        </w:rPr>
-        <w:t>automatically copying the best chromosomes directly into the next generation without crossover or mutation.</w:t>
+          <w:sz w:val="24"/>
+          <w:szCs w:val="24"/>
+        </w:rPr>
+        <w:t xml:space="preserve"> as depicted in figure </w:t>
       </w:r>
       <w:r>
         <w:rPr>
           <w:rFonts w:ascii="Aptos" w:hAnsi="Aptos"/>
           <w:b w:val="0"/>
           <w:bCs w:val="0"/>
-        </w:rPr>
-        <w:t xml:space="preserve"> Without Elitism we would notice a oscilation</w:t>
+          <w:sz w:val="24"/>
+          <w:szCs w:val="24"/>
+        </w:rPr>
+        <w:t>3.</w:t>
       </w:r>
       <w:r>
         <w:rPr>
           <w:rFonts w:ascii="Aptos" w:hAnsi="Aptos"/>
           <w:b w:val="0"/>
           <w:bCs w:val="0"/>
-        </w:rPr>
-        <w:t xml:space="preserve"> as depicted in figure </w:t>
+          <w:sz w:val="24"/>
+          <w:szCs w:val="24"/>
+        </w:rPr>
+        <w:t>9</w:t>
       </w:r>
       <w:r>
         <w:rPr>
           <w:rFonts w:ascii="Aptos" w:hAnsi="Aptos"/>
           <w:b w:val="0"/>
           <w:bCs w:val="0"/>
-        </w:rPr>
-        <w:t>3.</w:t>
+          <w:sz w:val="24"/>
+          <w:szCs w:val="24"/>
+        </w:rPr>
+        <w:t xml:space="preserve">. </w:t>
       </w:r>
       <w:r>
         <w:rPr>
           <w:rFonts w:ascii="Aptos" w:hAnsi="Aptos"/>
           <w:b w:val="0"/>
           <w:bCs w:val="0"/>
-        </w:rPr>
-        <w:t>9</w:t>
+          <w:sz w:val="24"/>
+          <w:szCs w:val="24"/>
+        </w:rPr>
+        <w:t xml:space="preserve">With addressing elitism of selecting the best score for next generation </w:t>
       </w:r>
       <w:r>
         <w:rPr>
           <w:rFonts w:ascii="Aptos" w:hAnsi="Aptos"/>
           <w:b w:val="0"/>
           <w:bCs w:val="0"/>
-        </w:rPr>
-        <w:t xml:space="preserve">. </w:t>
+          <w:sz w:val="24"/>
+          <w:szCs w:val="24"/>
+        </w:rPr>
+        <w:lastRenderedPageBreak/>
+        <w:t xml:space="preserve">its continously improved </w:t>
       </w:r>
       <w:r>
         <w:rPr>
           <w:rFonts w:ascii="Aptos" w:hAnsi="Aptos"/>
           <w:b w:val="0"/>
           <w:bCs w:val="0"/>
-        </w:rPr>
-        <w:t xml:space="preserve">With addressing elitism of selecting the best score for next generation its continously improved </w:t>
+          <w:sz w:val="24"/>
+          <w:szCs w:val="24"/>
+        </w:rPr>
+        <w:t xml:space="preserve">and stabalize </w:t>
       </w:r>
       <w:r>
         <w:rPr>
           <w:rFonts w:ascii="Aptos" w:hAnsi="Aptos"/>
           <w:b w:val="0"/>
           <w:bCs w:val="0"/>
-        </w:rPr>
-        <w:t xml:space="preserve">and stabalize </w:t>
+          <w:sz w:val="24"/>
+          <w:szCs w:val="24"/>
+        </w:rPr>
+        <w:t xml:space="preserve">as depicted in figure </w:t>
       </w:r>
       <w:r>
         <w:rPr>
           <w:rFonts w:ascii="Aptos" w:hAnsi="Aptos"/>
           <w:b w:val="0"/>
           <w:bCs w:val="0"/>
-        </w:rPr>
-        <w:t xml:space="preserve">as </w:t>
+          <w:sz w:val="24"/>
+          <w:szCs w:val="24"/>
+        </w:rPr>
+        <w:t>3.</w:t>
       </w:r>
       <w:r>
         <w:rPr>
           <w:rFonts w:ascii="Aptos" w:hAnsi="Aptos"/>
           <w:b w:val="0"/>
           <w:bCs w:val="0"/>
-        </w:rPr>
-        <w:lastRenderedPageBreak/>
-        <w:t xml:space="preserve">depicted in figure </w:t>
+          <w:sz w:val="24"/>
+          <w:szCs w:val="24"/>
+        </w:rPr>
+        <w:t>10</w:t>
       </w:r>
       <w:r>
         <w:rPr>
           <w:rFonts w:ascii="Aptos" w:hAnsi="Aptos"/>
           <w:b w:val="0"/>
           <w:bCs w:val="0"/>
-        </w:rPr>
-        <w:t>3.</w:t>
+          <w:sz w:val="24"/>
+          <w:szCs w:val="24"/>
+        </w:rPr>
+        <w:t xml:space="preserve"> </w:t>
       </w:r>
       <w:r>
         <w:rPr>
           <w:rFonts w:ascii="Aptos" w:hAnsi="Aptos"/>
           <w:b w:val="0"/>
           <w:bCs w:val="0"/>
-        </w:rPr>
-        <w:t>10</w:t>
+          <w:sz w:val="24"/>
+          <w:szCs w:val="24"/>
+        </w:rPr>
+        <w:t xml:space="preserve">below.  </w:t>
       </w:r>
       <w:r>
         <w:rPr>
           <w:rFonts w:ascii="Aptos" w:hAnsi="Aptos"/>
           <w:b w:val="0"/>
           <w:bCs w:val="0"/>
-        </w:rPr>
-        <w:t xml:space="preserve"> </w:t>
+          <w:sz w:val="24"/>
+          <w:szCs w:val="24"/>
+        </w:rPr>
+        <w:t xml:space="preserve">Figure </w:t>
       </w:r>
       <w:r>
         <w:rPr>
           <w:rFonts w:ascii="Aptos" w:hAnsi="Aptos"/>
           <w:b w:val="0"/>
           <w:bCs w:val="0"/>
-        </w:rPr>
-        <w:t xml:space="preserve">below.  </w:t>
+          <w:sz w:val="24"/>
+          <w:szCs w:val="24"/>
+        </w:rPr>
+        <w:t>3.</w:t>
       </w:r>
       <w:r>
         <w:rPr>
           <w:rFonts w:ascii="Aptos" w:hAnsi="Aptos"/>
           <w:b w:val="0"/>
           <w:bCs w:val="0"/>
-        </w:rPr>
-        <w:t xml:space="preserve">Figure </w:t>
+          <w:sz w:val="24"/>
+          <w:szCs w:val="24"/>
+        </w:rPr>
+        <w:t>11</w:t>
       </w:r>
       <w:r>
         <w:rPr>
           <w:rFonts w:ascii="Aptos" w:hAnsi="Aptos"/>
           <w:b w:val="0"/>
           <w:bCs w:val="0"/>
-        </w:rPr>
-        <w:t>3.</w:t>
+          <w:sz w:val="24"/>
+          <w:szCs w:val="24"/>
+        </w:rPr>
+        <w:t xml:space="preserve"> below </w:t>
       </w:r>
       <w:r>
         <w:rPr>
           <w:rFonts w:ascii="Aptos" w:hAnsi="Aptos"/>
           <w:b w:val="0"/>
           <w:bCs w:val="0"/>
-        </w:rPr>
-        <w:t>11</w:t>
-      </w:r>
-      <w:r>
-        <w:rPr>
-          <w:rFonts w:ascii="Aptos" w:hAnsi="Aptos"/>
-          <w:b w:val="0"/>
-          <w:bCs w:val="0"/>
-        </w:rPr>
-        <w:t xml:space="preserve"> below </w:t>
-      </w:r>
-      <w:r>
-        <w:rPr>
-          <w:rFonts w:ascii="Aptos" w:hAnsi="Aptos"/>
-          <w:b w:val="0"/>
-          <w:bCs w:val="0"/>
+          <w:sz w:val="24"/>
+          <w:szCs w:val="24"/>
         </w:rPr>
         <w:t>depicts elitism implementation.</w:t>
       </w:r>
@@ -19218,6 +19142,7 @@
       <w:r>
         <w:rPr>
           <w:rFonts w:ascii="Aptos" w:hAnsi="Aptos"/>
+          <w:noProof/>
         </w:rPr>
         <w:drawing>
           <wp:inline distT="0" distB="0" distL="0" distR="0" wp14:anchorId="16EC44D3" wp14:editId="62A48C33">
@@ -19328,10 +19253,10 @@
           <w:rFonts w:ascii="Aptos" w:hAnsi="Aptos"/>
         </w:rPr>
         <w:drawing>
-          <wp:inline distT="0" distB="0" distL="0" distR="0" wp14:anchorId="761D6F24" wp14:editId="2CCC6606">
-            <wp:extent cx="5375083" cy="2687541"/>
-            <wp:effectExtent l="0" t="0" r="0" b="5080"/>
-            <wp:docPr id="1166627407" name="Picture 1" descr="A green line graph with numbers and a white background&#10;&#10;AI-generated content may be incorrect."/>
+          <wp:inline distT="0" distB="0" distL="0" distR="0" wp14:anchorId="70B4656F" wp14:editId="7EE1F726">
+            <wp:extent cx="5404238" cy="2702119"/>
+            <wp:effectExtent l="0" t="0" r="6350" b="3175"/>
+            <wp:docPr id="663200314" name="Picture 1" descr="A graph with green line&#10;&#10;AI-generated content may be incorrect."/>
             <wp:cNvGraphicFramePr>
               <a:graphicFrameLocks xmlns:a="http://schemas.openxmlformats.org/drawingml/2006/main" noChangeAspect="1"/>
             </wp:cNvGraphicFramePr>
@@ -19339,7 +19264,7 @@
               <a:graphicData uri="http://schemas.openxmlformats.org/drawingml/2006/picture">
                 <pic:pic xmlns:pic="http://schemas.openxmlformats.org/drawingml/2006/picture">
                   <pic:nvPicPr>
-                    <pic:cNvPr id="1166627407" name="Picture 1" descr="A green line graph with numbers and a white background&#10;&#10;AI-generated content may be incorrect."/>
+                    <pic:cNvPr id="663200314" name="Picture 1" descr="A graph with green line&#10;&#10;AI-generated content may be incorrect."/>
                     <pic:cNvPicPr/>
                   </pic:nvPicPr>
                   <pic:blipFill>
@@ -19351,7 +19276,7 @@
                   <pic:spPr>
                     <a:xfrm>
                       <a:off x="0" y="0"/>
-                      <a:ext cx="5408497" cy="2704248"/>
+                      <a:ext cx="5497747" cy="2748873"/>
                     </a:xfrm>
                     <a:prstGeom prst="rect">
                       <a:avLst/>
@@ -19417,6 +19342,7 @@
       <w:r>
         <w:rPr>
           <w:rFonts w:ascii="Aptos" w:hAnsi="Aptos"/>
+          <w:noProof/>
         </w:rPr>
         <w:drawing>
           <wp:inline distT="0" distB="0" distL="0" distR="0" wp14:anchorId="19EEF5A3" wp14:editId="6EB79D01">
@@ -19516,26 +19442,913 @@
     </w:p>
     <w:p>
       <w:pPr>
+        <w:pStyle w:val="Heading3"/>
+        <w:rPr>
+          <w:color w:val="000000"/>
+          <w:sz w:val="18"/>
+          <w:szCs w:val="18"/>
+        </w:rPr>
+      </w:pPr>
+      <w:r>
+        <w:rPr>
+          <w:rFonts w:ascii="Aptos" w:hAnsi="Aptos" w:cs="Angsana New"/>
+        </w:rPr>
+        <w:lastRenderedPageBreak/>
+        <w:t>Hyperparameter tuning</w:t>
+      </w:r>
+    </w:p>
+    <w:p>
+      <w:pPr>
         <w:rPr>
           <w:rFonts w:ascii="Aptos" w:hAnsi="Aptos"/>
           <w:lang w:val="en-US" w:eastAsia="zh-CN" w:bidi="hi-IN"/>
         </w:rPr>
       </w:pPr>
+      <w:r>
+        <w:rPr>
+          <w:rFonts w:ascii="Aptos" w:hAnsi="Aptos"/>
+          <w:lang w:val="en-US" w:eastAsia="zh-CN" w:bidi="hi-IN"/>
+        </w:rPr>
+        <w:t xml:space="preserve">The main parameters we use for GA here are population size and generations size. To identify the best parameters for 30 project </w:t>
+      </w:r>
+      <w:r>
+        <w:rPr>
+          <w:rFonts w:ascii="Aptos" w:hAnsi="Aptos"/>
+          <w:lang w:val="en-US" w:eastAsia="zh-CN" w:bidi="hi-IN"/>
+        </w:rPr>
+        <w:t>portfolios</w:t>
+      </w:r>
+      <w:r>
+        <w:rPr>
+          <w:rFonts w:ascii="Aptos" w:hAnsi="Aptos"/>
+          <w:lang w:val="en-US" w:eastAsia="zh-CN" w:bidi="hi-IN"/>
+        </w:rPr>
+        <w:t>,</w:t>
+      </w:r>
+      <w:r>
+        <w:rPr>
+          <w:rFonts w:ascii="Aptos" w:hAnsi="Aptos"/>
+          <w:lang w:val="en-US" w:eastAsia="zh-CN" w:bidi="hi-IN"/>
+        </w:rPr>
+        <w:t xml:space="preserve"> we used the param value combination as </w:t>
+      </w:r>
+    </w:p>
+    <w:p>
+      <w:pPr>
+        <w:rPr>
+          <w:rFonts w:ascii="Aptos" w:hAnsi="Aptos"/>
+          <w:lang w:val="en-US" w:eastAsia="zh-CN" w:bidi="hi-IN"/>
+        </w:rPr>
+      </w:pPr>
+    </w:p>
+    <w:p>
+      <w:pPr>
+        <w:rPr>
+          <w:rFonts w:ascii="Aptos" w:hAnsi="Aptos"/>
+          <w:lang w:val="en-US" w:eastAsia="zh-CN" w:bidi="hi-IN"/>
+        </w:rPr>
+      </w:pPr>
+      <w:r>
+        <w:rPr>
+          <w:rFonts w:ascii="Aptos" w:hAnsi="Aptos"/>
+          <w:lang w:val="en-US" w:eastAsia="zh-CN" w:bidi="hi-IN"/>
+        </w:rPr>
+        <w:t xml:space="preserve">Population Size </w:t>
+      </w:r>
+      <m:oMath>
+        <m:r>
+          <w:rPr>
+            <w:rFonts w:ascii="Cambria Math" w:hAnsi="Cambria Math"/>
+            <w:lang w:val="en-US" w:eastAsia="zh-CN" w:bidi="hi-IN"/>
+          </w:rPr>
+          <m:t>∈{</m:t>
+        </m:r>
+        <m:r>
+          <m:rPr>
+            <m:sty m:val="p"/>
+          </m:rPr>
+          <w:rPr>
+            <w:rStyle w:val="math-inline"/>
+            <w:rFonts w:ascii="Cambria Math" w:eastAsia="OpenSymbol" w:hAnsi="Cambria Math" w:cs="Arial"/>
+          </w:rPr>
+          <m:t>50, 100, 200, 300</m:t>
+        </m:r>
+        <m:r>
+          <w:rPr>
+            <w:rFonts w:ascii="Cambria Math" w:hAnsi="Cambria Math"/>
+            <w:lang w:val="en-US" w:eastAsia="zh-CN" w:bidi="hi-IN"/>
+          </w:rPr>
+          <m:t xml:space="preserve">} </m:t>
+        </m:r>
+      </m:oMath>
     </w:p>
     <w:p>
       <w:pPr>
         <w:pStyle w:val="Heading1"/>
         <w:rPr>
           <w:rFonts w:ascii="Aptos" w:hAnsi="Aptos"/>
+          <w:b w:val="0"/>
+          <w:bCs w:val="0"/>
+          <w:sz w:val="24"/>
+          <w:szCs w:val="24"/>
           <w:lang w:val="en-US" w:eastAsia="zh-CN" w:bidi="hi-IN"/>
         </w:rPr>
       </w:pPr>
       <w:r>
         <w:rPr>
           <w:rFonts w:ascii="Aptos" w:hAnsi="Aptos"/>
+          <w:b w:val="0"/>
+          <w:bCs w:val="0"/>
+          <w:sz w:val="24"/>
+          <w:szCs w:val="24"/>
           <w:lang w:val="en-US" w:eastAsia="zh-CN" w:bidi="hi-IN"/>
         </w:rPr>
-        <w:lastRenderedPageBreak/>
+        <w:t>Ge</w:t>
+      </w:r>
+      <w:r>
+        <w:rPr>
+          <w:rFonts w:ascii="Aptos" w:hAnsi="Aptos"/>
+          <w:b w:val="0"/>
+          <w:bCs w:val="0"/>
+          <w:sz w:val="24"/>
+          <w:szCs w:val="24"/>
+          <w:lang w:val="en-US" w:eastAsia="zh-CN" w:bidi="hi-IN"/>
+        </w:rPr>
+        <w:t>n</w:t>
+      </w:r>
+      <w:r>
+        <w:rPr>
+          <w:rFonts w:ascii="Aptos" w:hAnsi="Aptos"/>
+          <w:b w:val="0"/>
+          <w:bCs w:val="0"/>
+          <w:sz w:val="24"/>
+          <w:szCs w:val="24"/>
+          <w:lang w:val="en-US" w:eastAsia="zh-CN" w:bidi="hi-IN"/>
+        </w:rPr>
+        <w:t xml:space="preserve">erations </w:t>
+      </w:r>
+      <m:oMath>
+        <m:r>
+          <w:rPr>
+            <w:rFonts w:ascii="Cambria Math" w:hAnsi="Cambria Math"/>
+            <w:sz w:val="24"/>
+            <w:szCs w:val="24"/>
+            <w:lang w:val="en-US" w:eastAsia="zh-CN" w:bidi="hi-IN"/>
+          </w:rPr>
+          <m:t>∈{50, 100, 150, 200}</m:t>
+        </m:r>
+      </m:oMath>
+    </w:p>
+    <w:p>
+      <w:pPr>
+        <w:pStyle w:val="BodyText"/>
+        <w:rPr>
+          <w:lang w:val="en-US" w:eastAsia="zh-CN" w:bidi="hi-IN"/>
+        </w:rPr>
+      </w:pPr>
+      <w:r>
+        <w:rPr>
+          <w:lang w:val="en-US" w:eastAsia="zh-CN" w:bidi="hi-IN"/>
+        </w:rPr>
+        <w:t xml:space="preserve">After searching over </w:t>
+      </w:r>
+      <w:r>
+        <w:rPr>
+          <w:lang w:val="en-US" w:eastAsia="zh-CN" w:bidi="hi-IN"/>
+        </w:rPr>
+        <w:t xml:space="preserve">the </w:t>
+      </w:r>
+      <w:r>
+        <w:rPr>
+          <w:lang w:val="en-US" w:eastAsia="zh-CN" w:bidi="hi-IN"/>
+        </w:rPr>
+        <w:t xml:space="preserve">grid space </w:t>
+      </w:r>
+      <w:r>
+        <w:rPr>
+          <w:lang w:val="en-US" w:eastAsia="zh-CN" w:bidi="hi-IN"/>
+        </w:rPr>
+        <w:t xml:space="preserve">depicted in table 3.1 below, </w:t>
+      </w:r>
+      <w:r>
+        <w:rPr>
+          <w:lang w:val="en-US" w:eastAsia="zh-CN" w:bidi="hi-IN"/>
+        </w:rPr>
+        <w:t xml:space="preserve">the </w:t>
+      </w:r>
+      <w:r>
+        <w:rPr>
+          <w:b/>
+          <w:bCs/>
+          <w:lang w:val="en-US" w:eastAsia="zh-CN" w:bidi="hi-IN"/>
+        </w:rPr>
+        <w:t>best parameters</w:t>
+      </w:r>
+      <w:r>
+        <w:rPr>
+          <w:lang w:val="en-US" w:eastAsia="zh-CN" w:bidi="hi-IN"/>
+        </w:rPr>
+        <w:t xml:space="preserve"> found that maximize the profit </w:t>
+      </w:r>
+      <w:r>
+        <w:rPr>
+          <w:lang w:val="en-US" w:eastAsia="zh-CN" w:bidi="hi-IN"/>
+        </w:rPr>
+        <w:t>is</w:t>
+      </w:r>
+      <w:r>
+        <w:rPr>
+          <w:lang w:val="en-US" w:eastAsia="zh-CN" w:bidi="hi-IN"/>
+        </w:rPr>
+        <w:t xml:space="preserve"> </w:t>
+      </w:r>
+    </w:p>
+    <w:p>
+      <w:pPr>
+        <w:pStyle w:val="BodyText"/>
+        <w:rPr>
+          <w:b/>
+          <w:bCs/>
+          <w:lang w:val="en-US" w:eastAsia="zh-CN" w:bidi="hi-IN"/>
+        </w:rPr>
+      </w:pPr>
+      <w:r>
+        <w:rPr>
+          <w:b/>
+          <w:bCs/>
+          <w:lang w:val="en-US" w:eastAsia="zh-CN" w:bidi="hi-IN"/>
+        </w:rPr>
+        <w:t>Population Size:  100</w:t>
+      </w:r>
+      <w:r>
+        <w:rPr>
+          <w:b/>
+          <w:bCs/>
+          <w:lang w:val="en-US" w:eastAsia="zh-CN" w:bidi="hi-IN"/>
+        </w:rPr>
+        <w:br/>
+        <w:t>Generations: 150</w:t>
+      </w:r>
+    </w:p>
+    <w:tbl>
+      <w:tblPr>
+        <w:tblStyle w:val="TableGrid"/>
+        <w:tblW w:w="0" w:type="auto"/>
+        <w:tblLook w:val="04A0" w:firstRow="1" w:lastRow="0" w:firstColumn="1" w:lastColumn="0" w:noHBand="0" w:noVBand="1"/>
+      </w:tblPr>
+      <w:tblGrid>
+        <w:gridCol w:w="1925"/>
+        <w:gridCol w:w="1925"/>
+        <w:gridCol w:w="1926"/>
+        <w:gridCol w:w="1926"/>
+        <w:gridCol w:w="1926"/>
+      </w:tblGrid>
+      <w:tr>
+        <w:tc>
+          <w:tcPr>
+            <w:tcW w:w="1925" w:type="dxa"/>
+          </w:tcPr>
+          <w:p>
+            <w:pPr>
+              <w:pStyle w:val="BodyText"/>
+              <w:rPr>
+                <w:b/>
+                <w:bCs/>
+                <w:lang w:val="en-US" w:eastAsia="zh-CN" w:bidi="hi-IN"/>
+              </w:rPr>
+            </w:pPr>
+          </w:p>
+        </w:tc>
+        <w:tc>
+          <w:tcPr>
+            <w:tcW w:w="1925" w:type="dxa"/>
+          </w:tcPr>
+          <w:p>
+            <w:pPr>
+              <w:pStyle w:val="BodyText"/>
+              <w:rPr>
+                <w:b/>
+                <w:bCs/>
+                <w:lang w:val="en-US" w:eastAsia="zh-CN" w:bidi="hi-IN"/>
+              </w:rPr>
+            </w:pPr>
+            <w:r>
+              <w:rPr>
+                <w:b/>
+                <w:bCs/>
+                <w:lang w:val="en-US" w:eastAsia="zh-CN" w:bidi="hi-IN"/>
+              </w:rPr>
+              <w:t>Generation 50</w:t>
+            </w:r>
+          </w:p>
+        </w:tc>
+        <w:tc>
+          <w:tcPr>
+            <w:tcW w:w="1926" w:type="dxa"/>
+          </w:tcPr>
+          <w:p>
+            <w:pPr>
+              <w:pStyle w:val="BodyText"/>
+              <w:rPr>
+                <w:b/>
+                <w:bCs/>
+                <w:lang w:val="en-US" w:eastAsia="zh-CN" w:bidi="hi-IN"/>
+              </w:rPr>
+            </w:pPr>
+            <w:r>
+              <w:rPr>
+                <w:b/>
+                <w:bCs/>
+                <w:lang w:val="en-US" w:eastAsia="zh-CN" w:bidi="hi-IN"/>
+              </w:rPr>
+              <w:t xml:space="preserve">Generation </w:t>
+            </w:r>
+            <w:r>
+              <w:rPr>
+                <w:b/>
+                <w:bCs/>
+                <w:lang w:val="en-US" w:eastAsia="zh-CN" w:bidi="hi-IN"/>
+              </w:rPr>
+              <w:t>100</w:t>
+            </w:r>
+          </w:p>
+        </w:tc>
+        <w:tc>
+          <w:tcPr>
+            <w:tcW w:w="1926" w:type="dxa"/>
+          </w:tcPr>
+          <w:p>
+            <w:pPr>
+              <w:pStyle w:val="BodyText"/>
+              <w:rPr>
+                <w:b/>
+                <w:bCs/>
+                <w:lang w:val="en-US" w:eastAsia="zh-CN" w:bidi="hi-IN"/>
+              </w:rPr>
+            </w:pPr>
+            <w:r>
+              <w:rPr>
+                <w:b/>
+                <w:bCs/>
+                <w:lang w:val="en-US" w:eastAsia="zh-CN" w:bidi="hi-IN"/>
+              </w:rPr>
+              <w:t xml:space="preserve">Generation </w:t>
+            </w:r>
+            <w:r>
+              <w:rPr>
+                <w:b/>
+                <w:bCs/>
+                <w:lang w:val="en-US" w:eastAsia="zh-CN" w:bidi="hi-IN"/>
+              </w:rPr>
+              <w:t>150</w:t>
+            </w:r>
+          </w:p>
+        </w:tc>
+        <w:tc>
+          <w:tcPr>
+            <w:tcW w:w="1926" w:type="dxa"/>
+          </w:tcPr>
+          <w:p>
+            <w:pPr>
+              <w:pStyle w:val="BodyText"/>
+              <w:rPr>
+                <w:b/>
+                <w:bCs/>
+                <w:lang w:val="en-US" w:eastAsia="zh-CN" w:bidi="hi-IN"/>
+              </w:rPr>
+            </w:pPr>
+            <w:r>
+              <w:rPr>
+                <w:b/>
+                <w:bCs/>
+                <w:lang w:val="en-US" w:eastAsia="zh-CN" w:bidi="hi-IN"/>
+              </w:rPr>
+              <w:t xml:space="preserve">Generation </w:t>
+            </w:r>
+            <w:r>
+              <w:rPr>
+                <w:b/>
+                <w:bCs/>
+                <w:lang w:val="en-US" w:eastAsia="zh-CN" w:bidi="hi-IN"/>
+              </w:rPr>
+              <w:t>200</w:t>
+            </w:r>
+          </w:p>
+        </w:tc>
+      </w:tr>
+      <w:tr>
+        <w:tc>
+          <w:tcPr>
+            <w:tcW w:w="1925" w:type="dxa"/>
+          </w:tcPr>
+          <w:p>
+            <w:pPr>
+              <w:pStyle w:val="BodyText"/>
+              <w:rPr>
+                <w:b/>
+                <w:bCs/>
+                <w:lang w:val="en-US" w:eastAsia="zh-CN" w:bidi="hi-IN"/>
+              </w:rPr>
+            </w:pPr>
+            <w:r>
+              <w:rPr>
+                <w:b/>
+                <w:bCs/>
+                <w:lang w:val="en-US" w:eastAsia="zh-CN" w:bidi="hi-IN"/>
+              </w:rPr>
+              <w:t>Population 50</w:t>
+            </w:r>
+          </w:p>
+        </w:tc>
+        <w:tc>
+          <w:tcPr>
+            <w:tcW w:w="1925" w:type="dxa"/>
+          </w:tcPr>
+          <w:p>
+            <w:pPr>
+              <w:pStyle w:val="BodyText"/>
+              <w:rPr>
+                <w:lang w:val="en-US" w:eastAsia="zh-CN" w:bidi="hi-IN"/>
+              </w:rPr>
+            </w:pPr>
+            <w:r>
+              <w:rPr>
+                <w:lang w:val="en-US" w:eastAsia="zh-CN" w:bidi="hi-IN"/>
+              </w:rPr>
+              <w:t>(50, 50)</w:t>
+            </w:r>
+          </w:p>
+        </w:tc>
+        <w:tc>
+          <w:tcPr>
+            <w:tcW w:w="1926" w:type="dxa"/>
+          </w:tcPr>
+          <w:p>
+            <w:pPr>
+              <w:pStyle w:val="BodyText"/>
+              <w:rPr>
+                <w:lang w:val="en-US" w:eastAsia="zh-CN" w:bidi="hi-IN"/>
+              </w:rPr>
+            </w:pPr>
+            <w:r>
+              <w:rPr>
+                <w:lang w:val="en-US" w:eastAsia="zh-CN" w:bidi="hi-IN"/>
+              </w:rPr>
+              <w:t>(50, 100)</w:t>
+            </w:r>
+          </w:p>
+        </w:tc>
+        <w:tc>
+          <w:tcPr>
+            <w:tcW w:w="1926" w:type="dxa"/>
+          </w:tcPr>
+          <w:p>
+            <w:pPr>
+              <w:pStyle w:val="BodyText"/>
+              <w:rPr>
+                <w:lang w:val="en-US" w:eastAsia="zh-CN" w:bidi="hi-IN"/>
+              </w:rPr>
+            </w:pPr>
+            <w:r>
+              <w:rPr>
+                <w:lang w:val="en-US" w:eastAsia="zh-CN" w:bidi="hi-IN"/>
+              </w:rPr>
+              <w:t>(50, 150)</w:t>
+            </w:r>
+          </w:p>
+        </w:tc>
+        <w:tc>
+          <w:tcPr>
+            <w:tcW w:w="1926" w:type="dxa"/>
+          </w:tcPr>
+          <w:p>
+            <w:pPr>
+              <w:pStyle w:val="BodyText"/>
+              <w:rPr>
+                <w:lang w:val="en-US" w:eastAsia="zh-CN" w:bidi="hi-IN"/>
+              </w:rPr>
+            </w:pPr>
+            <w:r>
+              <w:rPr>
+                <w:lang w:val="en-US" w:eastAsia="zh-CN" w:bidi="hi-IN"/>
+              </w:rPr>
+              <w:t>(50, 200)</w:t>
+            </w:r>
+          </w:p>
+        </w:tc>
+      </w:tr>
+      <w:tr>
+        <w:tc>
+          <w:tcPr>
+            <w:tcW w:w="1925" w:type="dxa"/>
+          </w:tcPr>
+          <w:p>
+            <w:pPr>
+              <w:pStyle w:val="BodyText"/>
+              <w:rPr>
+                <w:b/>
+                <w:bCs/>
+                <w:lang w:val="en-US" w:eastAsia="zh-CN" w:bidi="hi-IN"/>
+              </w:rPr>
+            </w:pPr>
+            <w:r>
+              <w:rPr>
+                <w:b/>
+                <w:bCs/>
+                <w:lang w:val="en-US" w:eastAsia="zh-CN" w:bidi="hi-IN"/>
+              </w:rPr>
+              <w:t xml:space="preserve">Population </w:t>
+            </w:r>
+            <w:r>
+              <w:rPr>
+                <w:b/>
+                <w:bCs/>
+                <w:lang w:val="en-US" w:eastAsia="zh-CN" w:bidi="hi-IN"/>
+              </w:rPr>
+              <w:t>100</w:t>
+            </w:r>
+          </w:p>
+        </w:tc>
+        <w:tc>
+          <w:tcPr>
+            <w:tcW w:w="1925" w:type="dxa"/>
+          </w:tcPr>
+          <w:p>
+            <w:pPr>
+              <w:pStyle w:val="BodyText"/>
+              <w:rPr>
+                <w:lang w:val="en-US" w:eastAsia="zh-CN" w:bidi="hi-IN"/>
+              </w:rPr>
+            </w:pPr>
+            <w:r>
+              <w:rPr>
+                <w:lang w:val="en-US" w:eastAsia="zh-CN" w:bidi="hi-IN"/>
+              </w:rPr>
+              <w:t>(</w:t>
+            </w:r>
+            <w:r>
+              <w:rPr>
+                <w:lang w:val="en-US" w:eastAsia="zh-CN" w:bidi="hi-IN"/>
+              </w:rPr>
+              <w:t>100</w:t>
+            </w:r>
+            <w:r>
+              <w:rPr>
+                <w:lang w:val="en-US" w:eastAsia="zh-CN" w:bidi="hi-IN"/>
+              </w:rPr>
+              <w:t>, 50)</w:t>
+            </w:r>
+          </w:p>
+        </w:tc>
+        <w:tc>
+          <w:tcPr>
+            <w:tcW w:w="1926" w:type="dxa"/>
+          </w:tcPr>
+          <w:p>
+            <w:pPr>
+              <w:pStyle w:val="BodyText"/>
+              <w:rPr>
+                <w:lang w:val="en-US" w:eastAsia="zh-CN" w:bidi="hi-IN"/>
+              </w:rPr>
+            </w:pPr>
+            <w:r>
+              <w:rPr>
+                <w:lang w:val="en-US" w:eastAsia="zh-CN" w:bidi="hi-IN"/>
+              </w:rPr>
+              <w:t>(100, 100)</w:t>
+            </w:r>
+          </w:p>
+        </w:tc>
+        <w:tc>
+          <w:tcPr>
+            <w:tcW w:w="1926" w:type="dxa"/>
+          </w:tcPr>
+          <w:p>
+            <w:pPr>
+              <w:pStyle w:val="BodyText"/>
+              <w:rPr>
+                <w:lang w:val="en-US" w:eastAsia="zh-CN" w:bidi="hi-IN"/>
+              </w:rPr>
+            </w:pPr>
+            <w:r>
+              <w:rPr>
+                <w:lang w:val="en-US" w:eastAsia="zh-CN" w:bidi="hi-IN"/>
+              </w:rPr>
+              <w:t>(100, 150)</w:t>
+            </w:r>
+          </w:p>
+        </w:tc>
+        <w:tc>
+          <w:tcPr>
+            <w:tcW w:w="1926" w:type="dxa"/>
+          </w:tcPr>
+          <w:p>
+            <w:pPr>
+              <w:pStyle w:val="BodyText"/>
+              <w:rPr>
+                <w:lang w:val="en-US" w:eastAsia="zh-CN" w:bidi="hi-IN"/>
+              </w:rPr>
+            </w:pPr>
+            <w:r>
+              <w:rPr>
+                <w:lang w:val="en-US" w:eastAsia="zh-CN" w:bidi="hi-IN"/>
+              </w:rPr>
+              <w:t>(100, 200)</w:t>
+            </w:r>
+          </w:p>
+        </w:tc>
+      </w:tr>
+      <w:tr>
+        <w:tc>
+          <w:tcPr>
+            <w:tcW w:w="1925" w:type="dxa"/>
+          </w:tcPr>
+          <w:p>
+            <w:pPr>
+              <w:pStyle w:val="BodyText"/>
+              <w:rPr>
+                <w:b/>
+                <w:bCs/>
+                <w:lang w:val="en-US" w:eastAsia="zh-CN" w:bidi="hi-IN"/>
+              </w:rPr>
+            </w:pPr>
+            <w:r>
+              <w:rPr>
+                <w:b/>
+                <w:bCs/>
+                <w:lang w:val="en-US" w:eastAsia="zh-CN" w:bidi="hi-IN"/>
+              </w:rPr>
+              <w:t xml:space="preserve">Population </w:t>
+            </w:r>
+            <w:r>
+              <w:rPr>
+                <w:b/>
+                <w:bCs/>
+                <w:lang w:val="en-US" w:eastAsia="zh-CN" w:bidi="hi-IN"/>
+              </w:rPr>
+              <w:t>1</w:t>
+            </w:r>
+            <w:r>
+              <w:rPr>
+                <w:b/>
+                <w:bCs/>
+                <w:lang w:val="en-US" w:eastAsia="zh-CN" w:bidi="hi-IN"/>
+              </w:rPr>
+              <w:t>50</w:t>
+            </w:r>
+          </w:p>
+        </w:tc>
+        <w:tc>
+          <w:tcPr>
+            <w:tcW w:w="1925" w:type="dxa"/>
+          </w:tcPr>
+          <w:p>
+            <w:pPr>
+              <w:pStyle w:val="BodyText"/>
+              <w:rPr>
+                <w:lang w:val="en-US" w:eastAsia="zh-CN" w:bidi="hi-IN"/>
+              </w:rPr>
+            </w:pPr>
+            <w:r>
+              <w:rPr>
+                <w:lang w:val="en-US" w:eastAsia="zh-CN" w:bidi="hi-IN"/>
+              </w:rPr>
+              <w:t>(150, 50)</w:t>
+            </w:r>
+          </w:p>
+        </w:tc>
+        <w:tc>
+          <w:tcPr>
+            <w:tcW w:w="1926" w:type="dxa"/>
+          </w:tcPr>
+          <w:p>
+            <w:pPr>
+              <w:pStyle w:val="BodyText"/>
+              <w:rPr>
+                <w:lang w:val="en-US" w:eastAsia="zh-CN" w:bidi="hi-IN"/>
+              </w:rPr>
+            </w:pPr>
+            <w:r>
+              <w:rPr>
+                <w:lang w:val="en-US" w:eastAsia="zh-CN" w:bidi="hi-IN"/>
+              </w:rPr>
+              <w:t>(150, 100)</w:t>
+            </w:r>
+          </w:p>
+        </w:tc>
+        <w:tc>
+          <w:tcPr>
+            <w:tcW w:w="1926" w:type="dxa"/>
+          </w:tcPr>
+          <w:p>
+            <w:pPr>
+              <w:pStyle w:val="BodyText"/>
+              <w:rPr>
+                <w:lang w:val="en-US" w:eastAsia="zh-CN" w:bidi="hi-IN"/>
+              </w:rPr>
+            </w:pPr>
+            <w:r>
+              <w:rPr>
+                <w:lang w:val="en-US" w:eastAsia="zh-CN" w:bidi="hi-IN"/>
+              </w:rPr>
+              <w:t>(150, 150)</w:t>
+            </w:r>
+          </w:p>
+        </w:tc>
+        <w:tc>
+          <w:tcPr>
+            <w:tcW w:w="1926" w:type="dxa"/>
+          </w:tcPr>
+          <w:p>
+            <w:pPr>
+              <w:pStyle w:val="BodyText"/>
+              <w:rPr>
+                <w:lang w:val="en-US" w:eastAsia="zh-CN" w:bidi="hi-IN"/>
+              </w:rPr>
+            </w:pPr>
+            <w:r>
+              <w:rPr>
+                <w:lang w:val="en-US" w:eastAsia="zh-CN" w:bidi="hi-IN"/>
+              </w:rPr>
+              <w:t>(150, 200)</w:t>
+            </w:r>
+          </w:p>
+        </w:tc>
+      </w:tr>
+      <w:tr>
+        <w:tc>
+          <w:tcPr>
+            <w:tcW w:w="1925" w:type="dxa"/>
+          </w:tcPr>
+          <w:p>
+            <w:pPr>
+              <w:pStyle w:val="BodyText"/>
+              <w:rPr>
+                <w:b/>
+                <w:bCs/>
+                <w:lang w:val="en-US" w:eastAsia="zh-CN" w:bidi="hi-IN"/>
+              </w:rPr>
+            </w:pPr>
+            <w:r>
+              <w:rPr>
+                <w:b/>
+                <w:bCs/>
+                <w:lang w:val="en-US" w:eastAsia="zh-CN" w:bidi="hi-IN"/>
+              </w:rPr>
+              <w:t xml:space="preserve">Population </w:t>
+            </w:r>
+            <w:r>
+              <w:rPr>
+                <w:b/>
+                <w:bCs/>
+                <w:lang w:val="en-US" w:eastAsia="zh-CN" w:bidi="hi-IN"/>
+              </w:rPr>
+              <w:t>200</w:t>
+            </w:r>
+          </w:p>
+        </w:tc>
+        <w:tc>
+          <w:tcPr>
+            <w:tcW w:w="1925" w:type="dxa"/>
+          </w:tcPr>
+          <w:p>
+            <w:pPr>
+              <w:pStyle w:val="BodyText"/>
+              <w:rPr>
+                <w:lang w:val="en-US" w:eastAsia="zh-CN" w:bidi="hi-IN"/>
+              </w:rPr>
+            </w:pPr>
+            <w:r>
+              <w:rPr>
+                <w:lang w:val="en-US" w:eastAsia="zh-CN" w:bidi="hi-IN"/>
+              </w:rPr>
+              <w:t>(200, 50)</w:t>
+            </w:r>
+          </w:p>
+        </w:tc>
+        <w:tc>
+          <w:tcPr>
+            <w:tcW w:w="1926" w:type="dxa"/>
+          </w:tcPr>
+          <w:p>
+            <w:pPr>
+              <w:pStyle w:val="BodyText"/>
+              <w:rPr>
+                <w:lang w:val="en-US" w:eastAsia="zh-CN" w:bidi="hi-IN"/>
+              </w:rPr>
+            </w:pPr>
+            <w:r>
+              <w:rPr>
+                <w:lang w:val="en-US" w:eastAsia="zh-CN" w:bidi="hi-IN"/>
+              </w:rPr>
+              <w:t>(200, 100)</w:t>
+            </w:r>
+          </w:p>
+        </w:tc>
+        <w:tc>
+          <w:tcPr>
+            <w:tcW w:w="1926" w:type="dxa"/>
+          </w:tcPr>
+          <w:p>
+            <w:pPr>
+              <w:pStyle w:val="BodyText"/>
+              <w:rPr>
+                <w:lang w:val="en-US" w:eastAsia="zh-CN" w:bidi="hi-IN"/>
+              </w:rPr>
+            </w:pPr>
+            <w:r>
+              <w:rPr>
+                <w:lang w:val="en-US" w:eastAsia="zh-CN" w:bidi="hi-IN"/>
+              </w:rPr>
+              <w:t>(200, 150)</w:t>
+            </w:r>
+          </w:p>
+        </w:tc>
+        <w:tc>
+          <w:tcPr>
+            <w:tcW w:w="1926" w:type="dxa"/>
+          </w:tcPr>
+          <w:p>
+            <w:pPr>
+              <w:pStyle w:val="BodyText"/>
+              <w:rPr>
+                <w:lang w:val="en-US" w:eastAsia="zh-CN" w:bidi="hi-IN"/>
+              </w:rPr>
+            </w:pPr>
+            <w:r>
+              <w:rPr>
+                <w:lang w:val="en-US" w:eastAsia="zh-CN" w:bidi="hi-IN"/>
+              </w:rPr>
+              <w:t>(200, 200)</w:t>
+            </w:r>
+          </w:p>
+        </w:tc>
+      </w:tr>
+    </w:tbl>
+    <w:p>
+      <w:pPr>
+        <w:pStyle w:val="BodyText"/>
+        <w:jc w:val="center"/>
+        <w:rPr>
+          <w:lang w:val="en-US" w:eastAsia="zh-CN" w:bidi="hi-IN"/>
+        </w:rPr>
+      </w:pPr>
+      <w:r>
+        <w:rPr>
+          <w:lang w:val="en-US" w:eastAsia="zh-CN" w:bidi="hi-IN"/>
+        </w:rPr>
+        <w:t>Table 3.1: Grid Space for population and Generation</w:t>
+      </w:r>
+    </w:p>
+    <w:p>
+      <w:pPr>
+        <w:pStyle w:val="BodyText"/>
+        <w:rPr>
+          <w:lang w:val="en-US" w:eastAsia="zh-CN" w:bidi="hi-IN"/>
+        </w:rPr>
+      </w:pPr>
+      <w:r>
+        <w:rPr>
+          <w:lang w:val="en-US" w:eastAsia="zh-CN" w:bidi="hi-IN"/>
+        </w:rPr>
+        <w:t xml:space="preserve">Population size of 300 and generation sizer 200 reached the same maximum profit but they were needed higher search space and eventually higher processing power. </w:t>
+      </w:r>
+      <w:proofErr w:type="gramStart"/>
+      <w:r>
+        <w:rPr>
+          <w:lang w:val="en-US" w:eastAsia="zh-CN" w:bidi="hi-IN"/>
+        </w:rPr>
+        <w:t>Therefore</w:t>
+      </w:r>
+      <w:proofErr w:type="gramEnd"/>
+      <w:r>
+        <w:rPr>
+          <w:lang w:val="en-US" w:eastAsia="zh-CN" w:bidi="hi-IN"/>
+        </w:rPr>
+        <w:t xml:space="preserve"> we can conclude that population size 100 and generation size 150 ideally fit on search space and computationally efficient.</w:t>
+      </w:r>
+    </w:p>
+    <w:p>
+      <w:pPr>
+        <w:pStyle w:val="BodyText"/>
+        <w:rPr>
+          <w:lang w:val="en-US" w:eastAsia="zh-CN" w:bidi="hi-IN"/>
+        </w:rPr>
+      </w:pPr>
+    </w:p>
+    <w:p>
+      <w:pPr>
+        <w:pStyle w:val="Heading1"/>
+        <w:rPr>
+          <w:rFonts w:ascii="Aptos" w:hAnsi="Aptos"/>
+          <w:lang w:val="en-US" w:eastAsia="zh-CN" w:bidi="hi-IN"/>
+        </w:rPr>
+      </w:pPr>
+      <w:r>
+        <w:rPr>
+          <w:rFonts w:ascii="Aptos" w:hAnsi="Aptos"/>
+          <w:lang w:val="en-US" w:eastAsia="zh-CN" w:bidi="hi-IN"/>
+        </w:rPr>
         <w:t>References</w:t>
       </w:r>
     </w:p>
@@ -19690,6 +20503,7 @@
         <w:rPr>
           <w:rFonts w:ascii="Aptos" w:hAnsi="Aptos"/>
         </w:rPr>
+        <w:lastRenderedPageBreak/>
         <w:t xml:space="preserve">C. Dewi, R. A. Andika, E. Haryani, D. Riantama, A. Sajid, M. M. Alam, and M. M. Su'ud, "Feature selection for financial data classification using Random Forest, Boruta, and Recursive Feature Elimination," </w:t>
       </w:r>
       <w:r>

</xml_diff>

<commit_message>
doc and minor updates
</commit_message>
<xml_diff>
--- a/CW_Doc.docx
+++ b/CW_Doc.docx
@@ -15956,28 +15956,7 @@
           <w:rFonts w:ascii="Aptos" w:hAnsi="Aptos" w:cstheme="minorHAnsi"/>
           <w:szCs w:val="24"/>
         </w:rPr>
-        <w:t xml:space="preserve"> : </w:t>
-      </w:r>
-      <w:r>
-        <w:rPr>
-          <w:rFonts w:ascii="Aptos" w:hAnsi="Aptos" w:cstheme="minorHAnsi"/>
-          <w:szCs w:val="24"/>
-        </w:rPr>
-        <w:t>Hours</w:t>
-      </w:r>
-      <w:r>
-        <w:rPr>
-          <w:rFonts w:ascii="Aptos" w:hAnsi="Aptos" w:cstheme="minorHAnsi"/>
-          <w:szCs w:val="24"/>
-        </w:rPr>
-        <w:t xml:space="preserve"> of project </w:t>
-      </w:r>
-      <w:r>
-        <w:rPr>
-          <w:rFonts w:ascii="Aptos" w:hAnsi="Aptos" w:cstheme="minorHAnsi"/>
-          <w:szCs w:val="24"/>
-        </w:rPr>
-        <w:t>I required</w:t>
+        <w:t xml:space="preserve"> : Hours of project I required</w:t>
       </w:r>
     </w:p>
     <w:p>
@@ -19268,13 +19247,12 @@
       <w:r>
         <w:rPr>
           <w:rFonts w:ascii="Aptos" w:hAnsi="Aptos"/>
-          <w:noProof/>
         </w:rPr>
         <w:drawing>
-          <wp:inline distT="0" distB="0" distL="0" distR="0" wp14:anchorId="353002D4" wp14:editId="44D7A6AB">
+          <wp:inline distT="0" distB="0" distL="0" distR="0" wp14:anchorId="1436369E" wp14:editId="37BF0749">
             <wp:extent cx="6120130" cy="3060065"/>
             <wp:effectExtent l="0" t="0" r="1270" b="635"/>
-            <wp:docPr id="1111327093" name="Picture 1" descr="A graph with green line&#10;&#10;AI-generated content may be incorrect."/>
+            <wp:docPr id="1308405898" name="Picture 1" descr="A graph with a line going up&#10;&#10;AI-generated content may be incorrect."/>
             <wp:cNvGraphicFramePr>
               <a:graphicFrameLocks xmlns:a="http://schemas.openxmlformats.org/drawingml/2006/main" noChangeAspect="1"/>
             </wp:cNvGraphicFramePr>
@@ -19282,7 +19260,7 @@
               <a:graphicData uri="http://schemas.openxmlformats.org/drawingml/2006/picture">
                 <pic:pic xmlns:pic="http://schemas.openxmlformats.org/drawingml/2006/picture">
                   <pic:nvPicPr>
-                    <pic:cNvPr id="1111327093" name="Picture 1" descr="A graph with green line&#10;&#10;AI-generated content may be incorrect."/>
+                    <pic:cNvPr id="1308405898" name="Picture 1" descr="A graph with a line going up&#10;&#10;AI-generated content may be incorrect."/>
                     <pic:cNvPicPr/>
                   </pic:nvPicPr>
                   <pic:blipFill>
@@ -19587,7 +19565,28 @@
             <w:szCs w:val="24"/>
             <w:lang w:val="en-US" w:eastAsia="zh-CN" w:bidi="hi-IN"/>
           </w:rPr>
-          <m:t>∈{50, 100, 150, 200}</m:t>
+          <m:t>∈{</m:t>
+        </m:r>
+        <m:r>
+          <w:rPr>
+            <w:rFonts w:ascii="Cambria Math" w:hAnsi="Cambria Math"/>
+            <w:sz w:val="24"/>
+            <w:szCs w:val="24"/>
+            <w:lang w:val="en-US" w:eastAsia="zh-CN" w:bidi="hi-IN"/>
+          </w:rPr>
+          <m:t>50, 100, 150, 200</m:t>
+        </m:r>
+        <m:r>
+          <m:rPr>
+            <m:sty m:val="bi"/>
+          </m:rPr>
+          <w:rPr>
+            <w:rFonts w:ascii="Cambria Math" w:hAnsi="Cambria Math"/>
+            <w:sz w:val="24"/>
+            <w:szCs w:val="24"/>
+            <w:lang w:val="en-US" w:eastAsia="zh-CN" w:bidi="hi-IN"/>
+          </w:rPr>
+          <m:t>}</m:t>
         </m:r>
       </m:oMath>
     </w:p>
@@ -19648,7 +19647,21 @@
           <w:rFonts w:ascii="Aptos" w:hAnsi="Aptos"/>
           <w:lang w:val="en-US" w:eastAsia="zh-CN" w:bidi="hi-IN"/>
         </w:rPr>
-        <w:t xml:space="preserve"> found that maximize the profit </w:t>
+        <w:t xml:space="preserve"> found that maximize</w:t>
+      </w:r>
+      <w:r>
+        <w:rPr>
+          <w:rFonts w:ascii="Aptos" w:hAnsi="Aptos"/>
+          <w:lang w:val="en-US" w:eastAsia="zh-CN" w:bidi="hi-IN"/>
+        </w:rPr>
+        <w:t>d</w:t>
+      </w:r>
+      <w:r>
+        <w:rPr>
+          <w:rFonts w:ascii="Aptos" w:hAnsi="Aptos"/>
+          <w:lang w:val="en-US" w:eastAsia="zh-CN" w:bidi="hi-IN"/>
+        </w:rPr>
+        <w:t xml:space="preserve"> the profit </w:t>
       </w:r>
       <w:r>
         <w:rPr>
@@ -19692,7 +19705,26 @@
           <w:lang w:val="en-US" w:eastAsia="zh-CN" w:bidi="hi-IN"/>
         </w:rPr>
         <w:br/>
-        <w:t>Generations: 150</w:t>
+        <w:t xml:space="preserve">Generations: </w:t>
+      </w:r>
+      <w:r>
+        <w:rPr>
+          <w:rFonts w:ascii="Aptos" w:hAnsi="Aptos"/>
+          <w:b/>
+          <w:bCs/>
+          <w:lang w:val="en-US" w:eastAsia="zh-CN" w:bidi="hi-IN"/>
+        </w:rPr>
+        <w:t>50</w:t>
+      </w:r>
+      <w:r>
+        <w:rPr>
+          <w:rFonts w:ascii="Aptos" w:hAnsi="Aptos"/>
+          <w:b/>
+          <w:bCs/>
+          <w:lang w:val="en-US" w:eastAsia="zh-CN" w:bidi="hi-IN"/>
+        </w:rPr>
+        <w:br/>
+        <w:t>Profit : $2511K</w:t>
       </w:r>
     </w:p>
     <w:tbl>
@@ -20691,14 +20723,7 @@
                 <w:rFonts w:ascii="Cambria Math" w:hAnsi="Cambria Math"/>
                 <w:lang w:val="en-US" w:eastAsia="zh-CN" w:bidi="hi-IN"/>
               </w:rPr>
-              <m:t>P</m:t>
-            </m:r>
-            <m:r>
-              <w:rPr>
-                <w:rFonts w:ascii="Cambria Math" w:hAnsi="Cambria Math"/>
-                <w:lang w:val="en-US" w:eastAsia="zh-CN" w:bidi="hi-IN"/>
-              </w:rPr>
-              <m:t>r</m:t>
+              <m:t>Pr</m:t>
             </m:r>
           </m:e>
           <m:sub>
@@ -20845,42 +20870,7 @@
           <w:rFonts w:ascii="Aptos" w:hAnsi="Aptos"/>
           <w:lang w:val="en-US" w:eastAsia="zh-CN" w:bidi="hi-IN"/>
         </w:rPr>
-        <w:t xml:space="preserve">Total required </w:t>
-      </w:r>
-      <w:r>
-        <w:rPr>
-          <w:rFonts w:ascii="Aptos" w:hAnsi="Aptos"/>
-          <w:lang w:val="en-US" w:eastAsia="zh-CN" w:bidi="hi-IN"/>
-        </w:rPr>
-        <w:t>cost</w:t>
-      </w:r>
-      <w:r>
-        <w:rPr>
-          <w:rFonts w:ascii="Aptos" w:hAnsi="Aptos"/>
-          <w:lang w:val="en-US" w:eastAsia="zh-CN" w:bidi="hi-IN"/>
-        </w:rPr>
-        <w:t xml:space="preserve"> for all selected projects</w:t>
-      </w:r>
-      <w:r>
-        <w:rPr>
-          <w:rFonts w:ascii="Aptos" w:hAnsi="Aptos"/>
-          <w:lang w:val="en-US" w:eastAsia="zh-CN" w:bidi="hi-IN"/>
-        </w:rPr>
-        <w:t xml:space="preserve"> </w:t>
-      </w:r>
-      <w:r>
-        <w:rPr>
-          <w:rFonts w:ascii="Aptos" w:hAnsi="Aptos"/>
-          <w:lang w:val="en-US" w:eastAsia="zh-CN" w:bidi="hi-IN"/>
-        </w:rPr>
-        <w:t xml:space="preserve">should be less than or equal to Total </w:t>
-      </w:r>
-      <w:r>
-        <w:rPr>
-          <w:rFonts w:ascii="Aptos" w:hAnsi="Aptos"/>
-          <w:lang w:val="en-US" w:eastAsia="zh-CN" w:bidi="hi-IN"/>
-        </w:rPr>
-        <w:t>Budget willing to spent</w:t>
+        <w:t>Total required cost for all selected projects should be less than or equal to Total Budget willing to spent</w:t>
       </w:r>
     </w:p>
     <w:p>
@@ -21024,6 +21014,7 @@
       <w:r>
         <w:rPr>
           <w:rFonts w:ascii="Aptos" w:hAnsi="Aptos"/>
+          <w:noProof/>
           <w:lang w:val="en-US" w:eastAsia="zh-CN" w:bidi="hi-IN"/>
         </w:rPr>
         <w:drawing>
@@ -21377,6 +21368,7 @@
       <w:r>
         <w:rPr>
           <w:rFonts w:ascii="Aptos" w:hAnsi="Aptos"/>
+          <w:noProof/>
           <w:lang w:val="en-US" w:eastAsia="zh-CN" w:bidi="hi-IN"/>
         </w:rPr>
         <w:drawing>
@@ -21434,16 +21426,7 @@
           <w:szCs w:val="20"/>
           <w:lang w:val="en-US" w:eastAsia="zh-CN" w:bidi="hi-IN"/>
         </w:rPr>
-        <w:t>Figure 3.12</w:t>
-      </w:r>
-      <w:r>
-        <w:rPr>
-          <w:rFonts w:ascii="Aptos" w:hAnsi="Aptos"/>
-          <w:sz w:val="20"/>
-          <w:szCs w:val="20"/>
-          <w:lang w:val="en-US" w:eastAsia="zh-CN" w:bidi="hi-IN"/>
-        </w:rPr>
-        <w:t>: BILP results of portfolio selection (Green – selected, Red, Rejected)</w:t>
+        <w:t>Figure 3.12: BILP results of portfolio selection (Green – selected, Red, Rejected)</w:t>
       </w:r>
     </w:p>
     <w:p>

</xml_diff>

<commit_message>
Report and notbook updates
</commit_message>
<xml_diff>
--- a/CW_Doc.docx
+++ b/CW_Doc.docx
@@ -16021,28 +16021,442 @@
     </w:p>
     <w:p>
       <w:pPr>
+        <w:pStyle w:val="Heading3"/>
+        <w:rPr>
+          <w:rFonts w:ascii="Aptos" w:hAnsi="Aptos" w:cs="Angsana New"/>
+        </w:rPr>
+      </w:pPr>
+      <w:r>
+        <w:rPr>
+          <w:rFonts w:ascii="Aptos" w:hAnsi="Aptos" w:cs="Angsana New"/>
+        </w:rPr>
+        <w:lastRenderedPageBreak/>
+        <w:t xml:space="preserve">Literature Review </w:t>
+      </w:r>
+    </w:p>
+    <w:p>
+      <w:pPr>
+        <w:pStyle w:val="Subtitle"/>
+        <w:numPr>
+          <w:ilvl w:val="0"/>
+          <w:numId w:val="102"/>
+        </w:numPr>
+        <w:rPr>
+          <w:rFonts w:ascii="Aptos" w:hAnsi="Aptos" w:cs="Angsana New"/>
+          <w:b/>
+          <w:bCs/>
+        </w:rPr>
+      </w:pPr>
+      <w:r>
+        <w:rPr>
+          <w:rFonts w:ascii="Aptos" w:hAnsi="Aptos" w:cs="Angsana New"/>
+          <w:b/>
+          <w:bCs/>
+        </w:rPr>
+        <w:t>Revisiting the Evolution of Genetic Algorithms in Scheduling</w:t>
+      </w:r>
+      <w:r>
+        <w:rPr>
+          <w:rFonts w:ascii="Aptos" w:hAnsi="Aptos" w:cs="Angsana New"/>
+          <w:b/>
+          <w:bCs/>
+        </w:rPr>
+        <w:t xml:space="preserve"> </w:t>
+      </w:r>
+      <w:r>
+        <w:rPr>
+          <w:rFonts w:ascii="Aptos" w:hAnsi="Aptos" w:cs="Angsana New"/>
+          <w:b/>
+          <w:bCs/>
+        </w:rPr>
+        <w:t>[</w:t>
+      </w:r>
+      <w:r>
+        <w:rPr>
+          <w:rFonts w:ascii="Aptos" w:hAnsi="Aptos" w:cs="Angsana New"/>
+          <w:b/>
+          <w:bCs/>
+        </w:rPr>
+        <w:t>9</w:t>
+      </w:r>
+      <w:r>
+        <w:rPr>
+          <w:rFonts w:ascii="Aptos" w:hAnsi="Aptos" w:cs="Angsana New"/>
+          <w:b/>
+          <w:bCs/>
+        </w:rPr>
+        <w:t>]</w:t>
+      </w:r>
+    </w:p>
+    <w:p>
+      <w:pPr>
         <w:pStyle w:val="ListParagraph"/>
+        <w:spacing w:after="100"/>
+        <w:ind w:left="780"/>
+        <w:rPr>
+          <w:rFonts w:ascii="Aptos" w:hAnsi="Aptos" w:cs="Angsana New"/>
+        </w:rPr>
+      </w:pPr>
+      <w:r>
+        <w:rPr>
+          <w:rFonts w:ascii="Aptos" w:hAnsi="Aptos" w:cs="Angsana New"/>
+          <w:b/>
+          <w:bCs/>
+        </w:rPr>
+        <w:t>Source:</w:t>
+      </w:r>
+      <w:r>
+        <w:rPr>
+          <w:rFonts w:ascii="Aptos" w:hAnsi="Aptos" w:cs="Angsana New"/>
+        </w:rPr>
+        <w:t xml:space="preserve"> Applied Soft Computing, Elsevier</w:t>
+      </w:r>
+    </w:p>
+    <w:p>
+      <w:pPr>
+        <w:pStyle w:val="Caption"/>
+        <w:ind w:left="709"/>
+        <w:rPr>
+          <w:rStyle w:val="Strong"/>
+          <w:rFonts w:ascii="Aptos" w:hAnsi="Aptos" w:cs="Angsana New"/>
+          <w:b w:val="0"/>
+          <w:bCs w:val="0"/>
+        </w:rPr>
+      </w:pPr>
+      <w:r>
+        <w:rPr>
+          <w:rStyle w:val="Strong"/>
+          <w:rFonts w:ascii="Aptos" w:hAnsi="Aptos" w:cs="Angsana New"/>
+          <w:b w:val="0"/>
+          <w:bCs w:val="0"/>
+        </w:rPr>
+        <w:t>Summary</w:t>
+      </w:r>
+    </w:p>
+    <w:p>
+      <w:pPr>
         <w:spacing w:after="120"/>
-        <w:ind w:left="360"/>
-        <w:rPr>
-          <w:rFonts w:ascii="Aptos" w:hAnsi="Aptos" w:cstheme="minorHAnsi"/>
-          <w:szCs w:val="24"/>
-        </w:rPr>
-      </w:pPr>
-    </w:p>
-    <w:p>
-      <w:pPr>
-        <w:pStyle w:val="Heading3"/>
-        <w:rPr>
-          <w:rFonts w:ascii="Aptos" w:hAnsi="Aptos" w:cs="Angsana New"/>
-        </w:rPr>
-      </w:pPr>
-      <w:r>
-        <w:rPr>
-          <w:rFonts w:ascii="Aptos" w:hAnsi="Aptos" w:cs="Angsana New"/>
-        </w:rPr>
-        <w:t>Literature Review</w:t>
-      </w:r>
+        <w:ind w:left="709"/>
+        <w:rPr>
+          <w:rFonts w:ascii="Aptos" w:hAnsi="Aptos"/>
+        </w:rPr>
+      </w:pPr>
+      <w:r>
+        <w:rPr>
+          <w:rFonts w:ascii="Aptos" w:hAnsi="Aptos"/>
+        </w:rPr>
+        <w:t xml:space="preserve">Conducted a review of nearly 1500 publications on Genetic Algorithms in scheduling. The study showed that GA remains one of the most widely </w:t>
+      </w:r>
+      <w:r>
+        <w:rPr>
+          <w:rFonts w:ascii="Aptos" w:hAnsi="Aptos"/>
+        </w:rPr>
+        <w:t>used</w:t>
+      </w:r>
+      <w:r>
+        <w:rPr>
+          <w:rFonts w:ascii="Aptos" w:hAnsi="Aptos"/>
+        </w:rPr>
+        <w:t xml:space="preserve"> optimization techniques due to its flexibility and effectiveness.</w:t>
+      </w:r>
+    </w:p>
+    <w:p>
+      <w:pPr>
+        <w:pStyle w:val="Subtitle"/>
+        <w:numPr>
+          <w:ilvl w:val="0"/>
+          <w:numId w:val="102"/>
+        </w:numPr>
+        <w:rPr>
+          <w:rFonts w:ascii="Aptos" w:hAnsi="Aptos" w:cs="Angsana New"/>
+          <w:b/>
+          <w:bCs/>
+        </w:rPr>
+      </w:pPr>
+      <w:r>
+        <w:rPr>
+          <w:rFonts w:ascii="Aptos" w:hAnsi="Aptos" w:cs="Angsana New"/>
+          <w:b/>
+          <w:bCs/>
+        </w:rPr>
+        <w:t>Matheuristics: Survey and Synthesis</w:t>
+      </w:r>
+      <w:r>
+        <w:rPr>
+          <w:rFonts w:ascii="Aptos" w:hAnsi="Aptos" w:cs="Angsana New"/>
+          <w:b/>
+          <w:bCs/>
+        </w:rPr>
+        <w:t xml:space="preserve"> </w:t>
+      </w:r>
+      <w:r>
+        <w:rPr>
+          <w:rFonts w:ascii="Aptos" w:hAnsi="Aptos" w:cs="Angsana New"/>
+          <w:b/>
+          <w:bCs/>
+        </w:rPr>
+        <w:t>[</w:t>
+      </w:r>
+      <w:r>
+        <w:rPr>
+          <w:rFonts w:ascii="Aptos" w:hAnsi="Aptos" w:cs="Angsana New"/>
+          <w:b/>
+          <w:bCs/>
+        </w:rPr>
+        <w:t>10</w:t>
+      </w:r>
+      <w:r>
+        <w:rPr>
+          <w:rFonts w:ascii="Aptos" w:hAnsi="Aptos" w:cs="Angsana New"/>
+          <w:b/>
+          <w:bCs/>
+        </w:rPr>
+        <w:t>]</w:t>
+      </w:r>
+    </w:p>
+    <w:p>
+      <w:pPr>
+        <w:pStyle w:val="ListParagraph"/>
+        <w:spacing w:after="100"/>
+        <w:ind w:left="780"/>
+        <w:rPr>
+          <w:rFonts w:ascii="Aptos" w:hAnsi="Aptos" w:cs="Angsana New"/>
+        </w:rPr>
+      </w:pPr>
+      <w:r>
+        <w:rPr>
+          <w:rFonts w:ascii="Aptos" w:hAnsi="Aptos" w:cs="Angsana New"/>
+          <w:b/>
+          <w:bCs/>
+        </w:rPr>
+        <w:t>Source:</w:t>
+      </w:r>
+      <w:r>
+        <w:rPr>
+          <w:rFonts w:ascii="Aptos" w:hAnsi="Aptos" w:cs="Angsana New"/>
+        </w:rPr>
+        <w:t xml:space="preserve"> International Transactions in Operational Research</w:t>
+      </w:r>
+    </w:p>
+    <w:p>
+      <w:pPr>
+        <w:pStyle w:val="Caption"/>
+        <w:ind w:left="709"/>
+        <w:rPr>
+          <w:rStyle w:val="Strong"/>
+          <w:rFonts w:ascii="Aptos" w:hAnsi="Aptos" w:cs="Angsana New"/>
+          <w:b w:val="0"/>
+          <w:bCs w:val="0"/>
+        </w:rPr>
+      </w:pPr>
+      <w:r>
+        <w:rPr>
+          <w:rStyle w:val="Strong"/>
+          <w:rFonts w:ascii="Aptos" w:hAnsi="Aptos" w:cs="Angsana New"/>
+          <w:b w:val="0"/>
+          <w:bCs w:val="0"/>
+        </w:rPr>
+        <w:t>Summary</w:t>
+      </w:r>
+    </w:p>
+    <w:p>
+      <w:pPr>
+        <w:spacing w:after="120"/>
+        <w:ind w:left="709"/>
+        <w:rPr>
+          <w:rFonts w:ascii="Aptos" w:hAnsi="Aptos"/>
+        </w:rPr>
+      </w:pPr>
+      <w:r>
+        <w:rPr>
+          <w:rFonts w:ascii="Aptos" w:hAnsi="Aptos"/>
+        </w:rPr>
+        <w:t xml:space="preserve">Heuristic search and metaheuristics are optimization approaches and </w:t>
+      </w:r>
+      <w:r>
+        <w:rPr>
+          <w:rFonts w:ascii="Aptos" w:hAnsi="Aptos"/>
+        </w:rPr>
+        <w:t xml:space="preserve">here they conducted a study of using </w:t>
+      </w:r>
+      <w:r>
+        <w:rPr>
+          <w:rFonts w:ascii="Aptos" w:hAnsi="Aptos"/>
+        </w:rPr>
+        <w:t xml:space="preserve">Mixed Integer Programming (MIP) with </w:t>
+      </w:r>
+      <w:r>
+        <w:rPr>
+          <w:rFonts w:ascii="Aptos" w:hAnsi="Aptos"/>
+        </w:rPr>
+        <w:t xml:space="preserve">hose techniques. </w:t>
+      </w:r>
+      <w:r>
+        <w:rPr>
+          <w:rFonts w:ascii="Aptos" w:hAnsi="Aptos"/>
+        </w:rPr>
+        <w:t xml:space="preserve">They found that </w:t>
+      </w:r>
+      <w:r>
+        <w:rPr>
+          <w:rFonts w:ascii="Aptos" w:hAnsi="Aptos"/>
+        </w:rPr>
+        <w:t xml:space="preserve">mathematical optimization with heuristic search </w:t>
+      </w:r>
+      <w:r>
+        <w:rPr>
+          <w:rFonts w:ascii="Aptos" w:hAnsi="Aptos"/>
+        </w:rPr>
+        <w:t xml:space="preserve">increase </w:t>
+      </w:r>
+      <w:r>
+        <w:rPr>
+          <w:rFonts w:ascii="Aptos" w:hAnsi="Aptos"/>
+        </w:rPr>
+        <w:t>computational efficiency</w:t>
+      </w:r>
+      <w:r>
+        <w:rPr>
+          <w:rFonts w:ascii="Aptos" w:hAnsi="Aptos"/>
+        </w:rPr>
+        <w:t xml:space="preserve"> of the solution.</w:t>
+      </w:r>
+    </w:p>
+    <w:p>
+      <w:pPr>
+        <w:pStyle w:val="Subtitle"/>
+        <w:numPr>
+          <w:ilvl w:val="0"/>
+          <w:numId w:val="102"/>
+        </w:numPr>
+        <w:rPr>
+          <w:rFonts w:ascii="Aptos" w:hAnsi="Aptos" w:cs="Angsana New"/>
+          <w:b/>
+          <w:bCs/>
+        </w:rPr>
+      </w:pPr>
+      <w:r>
+        <w:rPr>
+          <w:rFonts w:ascii="Aptos" w:hAnsi="Aptos" w:cs="Angsana New"/>
+          <w:b/>
+          <w:bCs/>
+        </w:rPr>
+        <w:t>A Didactic Review on Genetic Algorithms for Industrial Planning and Scheduling Problems [</w:t>
+      </w:r>
+      <w:r>
+        <w:rPr>
+          <w:rFonts w:ascii="Aptos" w:hAnsi="Aptos" w:cs="Angsana New"/>
+          <w:b/>
+          <w:bCs/>
+        </w:rPr>
+        <w:t>11</w:t>
+      </w:r>
+      <w:r>
+        <w:rPr>
+          <w:rFonts w:ascii="Aptos" w:hAnsi="Aptos" w:cs="Angsana New"/>
+          <w:b/>
+          <w:bCs/>
+        </w:rPr>
+        <w:t>]</w:t>
+      </w:r>
+    </w:p>
+    <w:p>
+      <w:pPr>
+        <w:pStyle w:val="ListParagraph"/>
+        <w:spacing w:after="100"/>
+        <w:ind w:left="780"/>
+        <w:rPr>
+          <w:rFonts w:ascii="Aptos" w:hAnsi="Aptos" w:cs="Angsana New"/>
+        </w:rPr>
+      </w:pPr>
+      <w:r>
+        <w:rPr>
+          <w:rFonts w:ascii="Aptos" w:hAnsi="Aptos" w:cs="Angsana New"/>
+          <w:b/>
+          <w:bCs/>
+        </w:rPr>
+        <w:t>Source:</w:t>
+      </w:r>
+      <w:r>
+        <w:rPr>
+          <w:rFonts w:ascii="Aptos" w:hAnsi="Aptos" w:cs="Angsana New"/>
+        </w:rPr>
+        <w:t xml:space="preserve"> IFAC-PapersOnLine, Elsevier</w:t>
+      </w:r>
+    </w:p>
+    <w:p>
+      <w:pPr>
+        <w:pStyle w:val="Caption"/>
+        <w:ind w:left="709"/>
+        <w:rPr>
+          <w:rStyle w:val="Strong"/>
+          <w:rFonts w:ascii="Aptos" w:hAnsi="Aptos" w:cs="Angsana New"/>
+          <w:b w:val="0"/>
+          <w:bCs w:val="0"/>
+        </w:rPr>
+      </w:pPr>
+      <w:r>
+        <w:rPr>
+          <w:rStyle w:val="Strong"/>
+          <w:rFonts w:ascii="Aptos" w:hAnsi="Aptos" w:cs="Angsana New"/>
+          <w:b w:val="0"/>
+          <w:bCs w:val="0"/>
+        </w:rPr>
+        <w:t>Summary</w:t>
+      </w:r>
+    </w:p>
+    <w:p>
+      <w:pPr>
+        <w:spacing w:after="120"/>
+        <w:ind w:left="709"/>
+        <w:rPr>
+          <w:rFonts w:ascii="Aptos" w:hAnsi="Aptos"/>
+        </w:rPr>
+      </w:pPr>
+      <w:r>
+        <w:rPr>
+          <w:rFonts w:ascii="Aptos" w:hAnsi="Aptos"/>
+        </w:rPr>
+        <w:t xml:space="preserve">Study of using GA for solving industrial and shedulting problems. They found that </w:t>
+      </w:r>
+      <w:r>
+        <w:rPr>
+          <w:rFonts w:ascii="Aptos" w:hAnsi="Aptos"/>
+        </w:rPr>
+        <w:t xml:space="preserve">GA provides </w:t>
+      </w:r>
+      <w:r>
+        <w:rPr>
+          <w:rFonts w:ascii="Aptos" w:hAnsi="Aptos"/>
+        </w:rPr>
+        <w:t xml:space="preserve">high </w:t>
+      </w:r>
+      <w:r>
+        <w:rPr>
+          <w:rFonts w:ascii="Aptos" w:hAnsi="Aptos"/>
+        </w:rPr>
+        <w:t>quality near</w:t>
+      </w:r>
+      <w:r>
+        <w:rPr>
+          <w:rFonts w:ascii="Aptos" w:hAnsi="Aptos"/>
+        </w:rPr>
+        <w:t xml:space="preserve"> </w:t>
+      </w:r>
+      <w:r>
+        <w:rPr>
+          <w:rFonts w:ascii="Aptos" w:hAnsi="Aptos"/>
+        </w:rPr>
+        <w:t>optimal solutions for hard optimization problems while maintaining reasonable computational time.</w:t>
+      </w:r>
+    </w:p>
+    <w:p>
+      <w:pPr>
+        <w:spacing w:after="120"/>
+        <w:rPr>
+          <w:rFonts w:ascii="Aptos" w:hAnsi="Aptos"/>
+        </w:rPr>
+      </w:pPr>
     </w:p>
     <w:p>
       <w:pPr>
@@ -16285,7 +16699,15 @@
           <w:rFonts w:ascii="Aptos" w:hAnsi="Aptos"/>
           <w:lang w:val="en-US" w:eastAsia="zh-CN" w:bidi="hi-IN"/>
         </w:rPr>
-        <w:t>For simple use cases MIP normally superior because, they execute fast and guarantees we found best possible combination. But when the problem shifts from simple use cases to more extreme complex use cases GA becomes the preferred choice.</w:t>
+        <w:t xml:space="preserve">For simple use cases MIP normally superior because, they execute fast and guarantees we found best possible combination. But when the problem shifts from simple use cases to </w:t>
+      </w:r>
+      <w:r>
+        <w:rPr>
+          <w:rFonts w:ascii="Aptos" w:hAnsi="Aptos"/>
+          <w:lang w:val="en-US" w:eastAsia="zh-CN" w:bidi="hi-IN"/>
+        </w:rPr>
+        <w:lastRenderedPageBreak/>
+        <w:t>more extreme complex use cases GA becomes the preferred choice.</w:t>
       </w:r>
       <w:r>
         <w:rPr>
@@ -16341,15 +16763,13 @@
         </w:rPr>
         <w:t>Non-Linear variables: Eg: Profile = Project 1</w:t>
       </w:r>
-      <w:proofErr w:type="gramStart"/>
       <w:r>
         <w:rPr>
           <w:rFonts w:ascii="Aptos" w:hAnsi="Aptos"/>
           <w:lang w:val="en-US" w:eastAsia="zh-CN" w:bidi="hi-IN"/>
         </w:rPr>
-        <w:t>^  2</w:t>
-      </w:r>
-      <w:proofErr w:type="gramEnd"/>
+        <w:t>^ 2</w:t>
+      </w:r>
       <w:r>
         <w:rPr>
           <w:rFonts w:ascii="Aptos" w:hAnsi="Aptos"/>
@@ -16464,7 +16884,6 @@
           <w:noProof/>
           <w:lang w:val="en-US" w:eastAsia="zh-CN" w:bidi="hi-IN"/>
         </w:rPr>
-        <w:lastRenderedPageBreak/>
         <w:drawing>
           <wp:inline distT="0" distB="0" distL="0" distR="0" wp14:anchorId="5FA77311" wp14:editId="41C413C6">
             <wp:extent cx="4153563" cy="2373465"/>
@@ -16522,7 +16941,6 @@
         </w:rPr>
         <w:t xml:space="preserve">Figure </w:t>
       </w:r>
-      <w:proofErr w:type="gramStart"/>
       <w:r>
         <w:rPr>
           <w:rFonts w:ascii="Aptos" w:hAnsi="Aptos"/>
@@ -16530,9 +16948,8 @@
           <w:szCs w:val="20"/>
           <w:lang w:val="en-US" w:eastAsia="zh-CN" w:bidi="hi-IN"/>
         </w:rPr>
-        <w:t>3.1 :</w:t>
-      </w:r>
-      <w:proofErr w:type="gramEnd"/>
+        <w:t>3.1:</w:t>
+      </w:r>
       <w:r>
         <w:rPr>
           <w:rFonts w:ascii="Aptos" w:hAnsi="Aptos"/>
@@ -16586,15 +17003,13 @@
         </w:rPr>
         <w:t xml:space="preserve"> for 30 </w:t>
       </w:r>
-      <w:proofErr w:type="gramStart"/>
       <w:r>
         <w:rPr>
           <w:rFonts w:ascii="Aptos" w:hAnsi="Aptos"/>
           <w:lang w:val="en-US" w:eastAsia="zh-CN" w:bidi="hi-IN"/>
         </w:rPr>
-        <w:t>projects :</w:t>
-      </w:r>
-      <w:proofErr w:type="gramEnd"/>
+        <w:t>projects:</w:t>
+      </w:r>
       <w:r>
         <w:rPr>
           <w:rFonts w:ascii="Aptos" w:hAnsi="Aptos"/>
@@ -16625,15 +17040,13 @@
         </w:rPr>
         <w:t xml:space="preserve"> </w:t>
       </w:r>
-      <w:proofErr w:type="gramStart"/>
       <w:r>
         <w:rPr>
           <w:rFonts w:ascii="Aptos" w:hAnsi="Aptos"/>
           <w:lang w:val="en-US" w:eastAsia="zh-CN" w:bidi="hi-IN"/>
         </w:rPr>
-        <w:t>Required :</w:t>
-      </w:r>
-      <w:proofErr w:type="gramEnd"/>
+        <w:t>Required:</w:t>
+      </w:r>
       <w:r>
         <w:rPr>
           <w:rFonts w:ascii="Aptos" w:hAnsi="Aptos"/>
@@ -16691,7 +17104,6 @@
         </w:rPr>
         <w:t xml:space="preserve">Total </w:t>
       </w:r>
-      <w:proofErr w:type="gramStart"/>
       <w:r>
         <w:rPr>
           <w:rFonts w:ascii="Aptos" w:hAnsi="Aptos"/>
@@ -16706,9 +17118,8 @@
           <w:rFonts w:ascii="Aptos" w:hAnsi="Aptos"/>
           <w:lang w:val="en-US" w:eastAsia="zh-CN" w:bidi="hi-IN"/>
         </w:rPr>
-        <w:t xml:space="preserve"> :</w:t>
-      </w:r>
-      <w:proofErr w:type="gramEnd"/>
+        <w:t>:</w:t>
+      </w:r>
       <w:r>
         <w:rPr>
           <w:rFonts w:ascii="Aptos" w:hAnsi="Aptos"/>
@@ -16734,7 +17145,6 @@
         </w:rPr>
         <w:t xml:space="preserve">Total Developer Hours </w:t>
       </w:r>
-      <w:proofErr w:type="gramStart"/>
       <w:r>
         <w:rPr>
           <w:rFonts w:ascii="Aptos" w:hAnsi="Aptos"/>
@@ -16749,9 +17159,8 @@
           <w:rFonts w:ascii="Aptos" w:hAnsi="Aptos"/>
           <w:lang w:val="en-US" w:eastAsia="zh-CN" w:bidi="hi-IN"/>
         </w:rPr>
-        <w:t xml:space="preserve"> :</w:t>
-      </w:r>
-      <w:proofErr w:type="gramEnd"/>
+        <w:t>:</w:t>
+      </w:r>
       <w:r>
         <w:rPr>
           <w:rFonts w:ascii="Aptos" w:hAnsi="Aptos"/>
@@ -17221,7 +17630,6 @@
         </w:rPr>
         <w:t>Figure 3.2 illustrates the data preparation step implementation in python code from use case “</w:t>
       </w:r>
-      <w:proofErr w:type="spellStart"/>
       <w:r>
         <w:rPr>
           <w:rFonts w:ascii="Aptos" w:hAnsi="Aptos"/>
@@ -17231,7 +17639,6 @@
         </w:rPr>
         <w:t>DataPreparationUseCase</w:t>
       </w:r>
-      <w:proofErr w:type="spellEnd"/>
       <w:r>
         <w:rPr>
           <w:rFonts w:ascii="Aptos" w:hAnsi="Aptos"/>
@@ -17465,7 +17872,6 @@
         </w:rPr>
         <w:t xml:space="preserve">Figure </w:t>
       </w:r>
-      <w:proofErr w:type="gramStart"/>
       <w:r>
         <w:rPr>
           <w:rFonts w:ascii="Aptos" w:hAnsi="Aptos"/>
@@ -17473,27 +17879,8 @@
           <w:szCs w:val="20"/>
           <w:lang w:val="en-US" w:eastAsia="zh-CN" w:bidi="hi-IN"/>
         </w:rPr>
-        <w:t>3.</w:t>
-      </w:r>
-      <w:r>
-        <w:rPr>
-          <w:rFonts w:ascii="Aptos" w:hAnsi="Aptos"/>
-          <w:sz w:val="20"/>
-          <w:szCs w:val="20"/>
-          <w:lang w:val="en-US" w:eastAsia="zh-CN" w:bidi="hi-IN"/>
-        </w:rPr>
-        <w:t>3</w:t>
-      </w:r>
-      <w:r>
-        <w:rPr>
-          <w:rFonts w:ascii="Aptos" w:hAnsi="Aptos"/>
-          <w:sz w:val="20"/>
-          <w:szCs w:val="20"/>
-          <w:lang w:val="en-US" w:eastAsia="zh-CN" w:bidi="hi-IN"/>
-        </w:rPr>
-        <w:t xml:space="preserve"> :</w:t>
-      </w:r>
-      <w:proofErr w:type="gramEnd"/>
+        <w:t>3.3:</w:t>
+      </w:r>
       <w:r>
         <w:rPr>
           <w:rFonts w:ascii="Aptos" w:hAnsi="Aptos"/>
@@ -17636,15 +18023,13 @@
         </w:rPr>
         <w:t>P</w:t>
       </w:r>
-      <w:proofErr w:type="gramStart"/>
       <w:r>
         <w:rPr>
           <w:rFonts w:ascii="Aptos" w:hAnsi="Aptos"/>
           <w:lang w:val="en-US" w:eastAsia="zh-CN" w:bidi="hi-IN"/>
         </w:rPr>
-        <w:t>6 :</w:t>
-      </w:r>
-      <w:proofErr w:type="gramEnd"/>
+        <w:t>6:</w:t>
+      </w:r>
       <w:r>
         <w:rPr>
           <w:rFonts w:ascii="Aptos" w:hAnsi="Aptos"/>
@@ -17703,15 +18088,13 @@
         </w:rPr>
         <w:t>P7, P11, P</w:t>
       </w:r>
-      <w:proofErr w:type="gramStart"/>
       <w:r>
         <w:rPr>
           <w:rFonts w:ascii="Aptos" w:hAnsi="Aptos"/>
           <w:lang w:val="en-US" w:eastAsia="zh-CN" w:bidi="hi-IN"/>
         </w:rPr>
-        <w:t>1 :</w:t>
-      </w:r>
-      <w:proofErr w:type="gramEnd"/>
+        <w:t>1:</w:t>
+      </w:r>
       <w:r>
         <w:rPr>
           <w:rFonts w:ascii="Aptos" w:hAnsi="Aptos"/>
@@ -19247,12 +19630,13 @@
       <w:r>
         <w:rPr>
           <w:rFonts w:ascii="Aptos" w:hAnsi="Aptos"/>
+          <w:noProof/>
         </w:rPr>
         <w:drawing>
-          <wp:inline distT="0" distB="0" distL="0" distR="0" wp14:anchorId="1436369E" wp14:editId="37BF0749">
+          <wp:inline distT="0" distB="0" distL="0" distR="0" wp14:anchorId="50BC9679" wp14:editId="5FBCF0EE">
             <wp:extent cx="6120130" cy="3060065"/>
             <wp:effectExtent l="0" t="0" r="1270" b="635"/>
-            <wp:docPr id="1308405898" name="Picture 1" descr="A graph with a line going up&#10;&#10;AI-generated content may be incorrect."/>
+            <wp:docPr id="1381259960" name="Picture 1" descr="A graph with green line&#10;&#10;AI-generated content may be incorrect."/>
             <wp:cNvGraphicFramePr>
               <a:graphicFrameLocks xmlns:a="http://schemas.openxmlformats.org/drawingml/2006/main" noChangeAspect="1"/>
             </wp:cNvGraphicFramePr>
@@ -19260,7 +19644,7 @@
               <a:graphicData uri="http://schemas.openxmlformats.org/drawingml/2006/picture">
                 <pic:pic xmlns:pic="http://schemas.openxmlformats.org/drawingml/2006/picture">
                   <pic:nvPicPr>
-                    <pic:cNvPr id="1308405898" name="Picture 1" descr="A graph with a line going up&#10;&#10;AI-generated content may be incorrect."/>
+                    <pic:cNvPr id="1381259960" name="Picture 1" descr="A graph with green line&#10;&#10;AI-generated content may be incorrect."/>
                     <pic:cNvPicPr/>
                   </pic:nvPicPr>
                   <pic:blipFill>
@@ -19565,28 +19949,7 @@
             <w:szCs w:val="24"/>
             <w:lang w:val="en-US" w:eastAsia="zh-CN" w:bidi="hi-IN"/>
           </w:rPr>
-          <m:t>∈{</m:t>
-        </m:r>
-        <m:r>
-          <w:rPr>
-            <w:rFonts w:ascii="Cambria Math" w:hAnsi="Cambria Math"/>
-            <w:sz w:val="24"/>
-            <w:szCs w:val="24"/>
-            <w:lang w:val="en-US" w:eastAsia="zh-CN" w:bidi="hi-IN"/>
-          </w:rPr>
-          <m:t>50, 100, 150, 200</m:t>
-        </m:r>
-        <m:r>
-          <m:rPr>
-            <m:sty m:val="bi"/>
-          </m:rPr>
-          <w:rPr>
-            <w:rFonts w:ascii="Cambria Math" w:hAnsi="Cambria Math"/>
-            <w:sz w:val="24"/>
-            <w:szCs w:val="24"/>
-            <w:lang w:val="en-US" w:eastAsia="zh-CN" w:bidi="hi-IN"/>
-          </w:rPr>
-          <m:t>}</m:t>
+          <m:t>∈{50, 100, 150, 200}</m:t>
         </m:r>
       </m:oMath>
     </w:p>
@@ -19695,7 +20058,7 @@
           <w:bCs/>
           <w:lang w:val="en-US" w:eastAsia="zh-CN" w:bidi="hi-IN"/>
         </w:rPr>
-        <w:t>Population Size:  100</w:t>
+        <w:t xml:space="preserve">Population Size:  </w:t>
       </w:r>
       <w:r>
         <w:rPr>
@@ -19704,8 +20067,7 @@
           <w:bCs/>
           <w:lang w:val="en-US" w:eastAsia="zh-CN" w:bidi="hi-IN"/>
         </w:rPr>
-        <w:br/>
-        <w:t xml:space="preserve">Generations: </w:t>
+        <w:t>200</w:t>
       </w:r>
       <w:r>
         <w:rPr>
@@ -19714,7 +20076,8 @@
           <w:bCs/>
           <w:lang w:val="en-US" w:eastAsia="zh-CN" w:bidi="hi-IN"/>
         </w:rPr>
-        <w:t>50</w:t>
+        <w:br/>
+        <w:t xml:space="preserve">Generations: </w:t>
       </w:r>
       <w:r>
         <w:rPr>
@@ -19723,8 +20086,43 @@
           <w:bCs/>
           <w:lang w:val="en-US" w:eastAsia="zh-CN" w:bidi="hi-IN"/>
         </w:rPr>
+        <w:t>200</w:t>
+      </w:r>
+      <w:r>
+        <w:rPr>
+          <w:rFonts w:ascii="Aptos" w:hAnsi="Aptos"/>
+          <w:b/>
+          <w:bCs/>
+          <w:lang w:val="en-US" w:eastAsia="zh-CN" w:bidi="hi-IN"/>
+        </w:rPr>
         <w:br/>
-        <w:t>Profit : $2511K</w:t>
+      </w:r>
+      <w:r>
+        <w:rPr>
+          <w:rFonts w:ascii="Aptos" w:hAnsi="Aptos"/>
+          <w:b/>
+          <w:bCs/>
+          <w:lang w:val="en-US" w:eastAsia="zh-CN" w:bidi="hi-IN"/>
+        </w:rPr>
+        <w:t>Profit:</w:t>
+      </w:r>
+      <w:r>
+        <w:rPr>
+          <w:rFonts w:ascii="Aptos" w:hAnsi="Aptos"/>
+          <w:b/>
+          <w:bCs/>
+          <w:lang w:val="en-US" w:eastAsia="zh-CN" w:bidi="hi-IN"/>
+        </w:rPr>
+        <w:t xml:space="preserve"> $</w:t>
+      </w:r>
+      <w:r>
+        <w:rPr>
+          <w:rFonts w:ascii="Aptos" w:hAnsi="Aptos"/>
+          <w:b/>
+          <w:bCs/>
+          <w:lang w:val="en-US" w:eastAsia="zh-CN" w:bidi="hi-IN"/>
+        </w:rPr>
+        <w:t>2507K</w:t>
       </w:r>
     </w:p>
     <w:tbl>
@@ -20309,12 +20707,16 @@
         <w:jc w:val="center"/>
         <w:rPr>
           <w:rFonts w:ascii="Aptos" w:hAnsi="Aptos"/>
+          <w:sz w:val="20"/>
+          <w:szCs w:val="20"/>
           <w:lang w:val="en-US" w:eastAsia="zh-CN" w:bidi="hi-IN"/>
         </w:rPr>
       </w:pPr>
       <w:r>
         <w:rPr>
           <w:rFonts w:ascii="Aptos" w:hAnsi="Aptos"/>
+          <w:sz w:val="20"/>
+          <w:szCs w:val="20"/>
           <w:lang w:val="en-US" w:eastAsia="zh-CN" w:bidi="hi-IN"/>
         </w:rPr>
         <w:t>Table 3.1: Grid Space for population and Generation</w:t>
@@ -20322,6 +20724,22 @@
     </w:p>
     <w:p>
       <w:pPr>
+        <w:pStyle w:val="Heading"/>
+        <w:rPr>
+          <w:rFonts w:ascii="Aptos" w:hAnsi="Aptos"/>
+          <w:lang w:val="en-US" w:eastAsia="zh-CN" w:bidi="hi-IN"/>
+        </w:rPr>
+      </w:pPr>
+      <w:r>
+        <w:rPr>
+          <w:rFonts w:ascii="Aptos" w:hAnsi="Aptos"/>
+          <w:lang w:val="en-US" w:eastAsia="zh-CN" w:bidi="hi-IN"/>
+        </w:rPr>
+        <w:t xml:space="preserve">Results </w:t>
+      </w:r>
+    </w:p>
+    <w:p>
+      <w:pPr>
         <w:pStyle w:val="BodyText"/>
         <w:rPr>
           <w:rFonts w:ascii="Aptos" w:hAnsi="Aptos"/>
@@ -20333,24 +20751,365 @@
           <w:rFonts w:ascii="Aptos" w:hAnsi="Aptos"/>
           <w:lang w:val="en-US" w:eastAsia="zh-CN" w:bidi="hi-IN"/>
         </w:rPr>
-        <w:t xml:space="preserve">Population size of 300 and generation sizer 200 reached the same maximum profit but they were needed higher search space and eventually higher processing power. </w:t>
-      </w:r>
-      <w:proofErr w:type="gramStart"/>
-      <w:r>
-        <w:rPr>
-          <w:rFonts w:ascii="Aptos" w:hAnsi="Aptos"/>
+        <w:t>From the 30 projects portfolio we were able to pick the optimum portfolio as illustrated in figure 3.12. The result is 16 projects have been selected and 14 got rejected with maximum profit gain with maximum resource allocation as depicted in table 3.2 below.</w:t>
+      </w:r>
+    </w:p>
+    <w:tbl>
+      <w:tblPr>
+        <w:tblStyle w:val="TableGrid"/>
+        <w:tblW w:w="0" w:type="auto"/>
+        <w:tblLook w:val="04A0" w:firstRow="1" w:lastRow="0" w:firstColumn="1" w:lastColumn="0" w:noHBand="0" w:noVBand="1"/>
+      </w:tblPr>
+      <w:tblGrid>
+        <w:gridCol w:w="2972"/>
+        <w:gridCol w:w="6656"/>
+      </w:tblGrid>
+      <w:tr>
+        <w:tc>
+          <w:tcPr>
+            <w:tcW w:w="2972" w:type="dxa"/>
+          </w:tcPr>
+          <w:p>
+            <w:pPr>
+              <w:pStyle w:val="BodyText"/>
+              <w:rPr>
+                <w:rFonts w:ascii="Aptos" w:hAnsi="Aptos"/>
+                <w:lang w:val="en-US" w:eastAsia="zh-CN" w:bidi="hi-IN"/>
+              </w:rPr>
+            </w:pPr>
+            <w:r>
+              <w:rPr>
+                <w:rFonts w:ascii="Aptos" w:hAnsi="Aptos"/>
+                <w:lang w:val="en-US" w:eastAsia="zh-CN" w:bidi="hi-IN"/>
+              </w:rPr>
+              <w:t>Maximum Profit</w:t>
+            </w:r>
+          </w:p>
+        </w:tc>
+        <w:tc>
+          <w:tcPr>
+            <w:tcW w:w="6656" w:type="dxa"/>
+          </w:tcPr>
+          <w:p>
+            <w:pPr>
+              <w:pStyle w:val="BodyText"/>
+              <w:rPr>
+                <w:rFonts w:ascii="Aptos" w:hAnsi="Aptos"/>
+                <w:lang w:val="en-US" w:eastAsia="zh-CN" w:bidi="hi-IN"/>
+              </w:rPr>
+            </w:pPr>
+            <w:r>
+              <w:rPr>
+                <w:rFonts w:ascii="Aptos" w:hAnsi="Aptos"/>
+                <w:lang w:val="en-US" w:eastAsia="zh-CN" w:bidi="hi-IN"/>
+              </w:rPr>
+              <w:t>$</w:t>
+            </w:r>
+            <w:r>
+              <w:rPr>
+                <w:rFonts w:ascii="Aptos" w:hAnsi="Aptos"/>
+                <w:lang w:val="en-US" w:eastAsia="zh-CN" w:bidi="hi-IN"/>
+              </w:rPr>
+              <w:t>2507.2</w:t>
+            </w:r>
+          </w:p>
+        </w:tc>
+      </w:tr>
+      <w:tr>
+        <w:tc>
+          <w:tcPr>
+            <w:tcW w:w="2972" w:type="dxa"/>
+          </w:tcPr>
+          <w:p>
+            <w:pPr>
+              <w:pStyle w:val="BodyText"/>
+              <w:rPr>
+                <w:rFonts w:ascii="Aptos" w:hAnsi="Aptos"/>
+                <w:lang w:val="en-US" w:eastAsia="zh-CN" w:bidi="hi-IN"/>
+              </w:rPr>
+            </w:pPr>
+            <w:r>
+              <w:rPr>
+                <w:rFonts w:ascii="Aptos" w:hAnsi="Aptos"/>
+                <w:lang w:val="en-US" w:eastAsia="zh-CN" w:bidi="hi-IN"/>
+              </w:rPr>
+              <w:t xml:space="preserve">Cost </w:t>
+            </w:r>
+          </w:p>
+        </w:tc>
+        <w:tc>
+          <w:tcPr>
+            <w:tcW w:w="6656" w:type="dxa"/>
+          </w:tcPr>
+          <w:p>
+            <w:pPr>
+              <w:pStyle w:val="BodyText"/>
+              <w:rPr>
+                <w:rFonts w:ascii="Aptos" w:hAnsi="Aptos"/>
+                <w:lang w:val="en-US" w:eastAsia="zh-CN" w:bidi="hi-IN"/>
+              </w:rPr>
+            </w:pPr>
+            <w:r>
+              <w:rPr>
+                <w:rFonts w:ascii="Aptos" w:hAnsi="Aptos"/>
+                <w:lang w:val="en-US" w:eastAsia="zh-CN" w:bidi="hi-IN"/>
+              </w:rPr>
+              <w:t>Spent $</w:t>
+            </w:r>
+            <w:r>
+              <w:rPr>
+                <w:rFonts w:ascii="Aptos" w:hAnsi="Aptos"/>
+                <w:lang w:val="en-US" w:eastAsia="zh-CN" w:bidi="hi-IN"/>
+              </w:rPr>
+              <w:t>1098</w:t>
+            </w:r>
+            <w:r>
+              <w:rPr>
+                <w:rFonts w:ascii="Aptos" w:hAnsi="Aptos"/>
+                <w:lang w:val="en-US" w:eastAsia="zh-CN" w:bidi="hi-IN"/>
+              </w:rPr>
+              <w:t>K from Budget $1113.2K</w:t>
+            </w:r>
+          </w:p>
+        </w:tc>
+      </w:tr>
+      <w:tr>
+        <w:tc>
+          <w:tcPr>
+            <w:tcW w:w="2972" w:type="dxa"/>
+          </w:tcPr>
+          <w:p>
+            <w:pPr>
+              <w:pStyle w:val="BodyText"/>
+              <w:rPr>
+                <w:rFonts w:ascii="Aptos" w:hAnsi="Aptos"/>
+                <w:lang w:val="en-US" w:eastAsia="zh-CN" w:bidi="hi-IN"/>
+              </w:rPr>
+            </w:pPr>
+            <w:r>
+              <w:rPr>
+                <w:rFonts w:ascii="Aptos" w:hAnsi="Aptos"/>
+                <w:lang w:val="en-US" w:eastAsia="zh-CN" w:bidi="hi-IN"/>
+              </w:rPr>
+              <w:t>Dev Hours</w:t>
+            </w:r>
+          </w:p>
+        </w:tc>
+        <w:tc>
+          <w:tcPr>
+            <w:tcW w:w="6656" w:type="dxa"/>
+          </w:tcPr>
+          <w:p>
+            <w:pPr>
+              <w:pStyle w:val="BodyText"/>
+              <w:rPr>
+                <w:rFonts w:ascii="Aptos" w:hAnsi="Aptos"/>
+                <w:lang w:val="en-US" w:eastAsia="zh-CN" w:bidi="hi-IN"/>
+              </w:rPr>
+            </w:pPr>
+            <w:r>
+              <w:rPr>
+                <w:rFonts w:ascii="Aptos" w:hAnsi="Aptos"/>
+                <w:lang w:val="en-US" w:eastAsia="zh-CN" w:bidi="hi-IN"/>
+              </w:rPr>
+              <w:t xml:space="preserve">Used </w:t>
+            </w:r>
+            <w:r>
+              <w:rPr>
+                <w:rFonts w:ascii="Aptos" w:hAnsi="Aptos"/>
+                <w:lang w:val="en-US" w:eastAsia="zh-CN" w:bidi="hi-IN"/>
+              </w:rPr>
+              <w:t>1263</w:t>
+            </w:r>
+            <w:r>
+              <w:rPr>
+                <w:rFonts w:ascii="Aptos" w:hAnsi="Aptos"/>
+                <w:lang w:val="en-US" w:eastAsia="zh-CN" w:bidi="hi-IN"/>
+              </w:rPr>
+              <w:t xml:space="preserve">h from 1283.3h </w:t>
+            </w:r>
+            <w:r>
+              <w:rPr>
+                <w:rFonts w:ascii="Aptos" w:hAnsi="Aptos"/>
+                <w:lang w:val="en-US" w:eastAsia="zh-CN" w:bidi="hi-IN"/>
+              </w:rPr>
+              <w:t>available</w:t>
+            </w:r>
+          </w:p>
+        </w:tc>
+      </w:tr>
+    </w:tbl>
+    <w:p>
+      <w:pPr>
+        <w:pStyle w:val="BodyText"/>
+        <w:jc w:val="center"/>
+        <w:rPr>
+          <w:rFonts w:ascii="Aptos" w:hAnsi="Aptos"/>
+          <w:sz w:val="20"/>
+          <w:szCs w:val="20"/>
           <w:lang w:val="en-US" w:eastAsia="zh-CN" w:bidi="hi-IN"/>
         </w:rPr>
-        <w:t>Therefore</w:t>
-      </w:r>
-      <w:proofErr w:type="gramEnd"/>
-      <w:r>
-        <w:rPr>
-          <w:rFonts w:ascii="Aptos" w:hAnsi="Aptos"/>
+      </w:pPr>
+      <w:r>
+        <w:rPr>
+          <w:rFonts w:ascii="Aptos" w:hAnsi="Aptos"/>
+          <w:sz w:val="20"/>
+          <w:szCs w:val="20"/>
           <w:lang w:val="en-US" w:eastAsia="zh-CN" w:bidi="hi-IN"/>
         </w:rPr>
-        <w:t xml:space="preserve"> we can conclude that population size 100 and generation size 150 ideally fit on search space and computationally efficient.</w:t>
-      </w:r>
+        <w:t xml:space="preserve">Table </w:t>
+      </w:r>
+      <w:r>
+        <w:rPr>
+          <w:rFonts w:ascii="Aptos" w:hAnsi="Aptos"/>
+          <w:sz w:val="20"/>
+          <w:szCs w:val="20"/>
+          <w:lang w:val="en-US" w:eastAsia="zh-CN" w:bidi="hi-IN"/>
+        </w:rPr>
+        <w:t>3.2:</w:t>
+      </w:r>
+      <w:r>
+        <w:rPr>
+          <w:rFonts w:ascii="Aptos" w:hAnsi="Aptos"/>
+          <w:sz w:val="20"/>
+          <w:szCs w:val="20"/>
+          <w:lang w:val="en-US" w:eastAsia="zh-CN" w:bidi="hi-IN"/>
+        </w:rPr>
+        <w:t xml:space="preserve"> BILP execution result for project 30</w:t>
+      </w:r>
+    </w:p>
+    <w:p>
+      <w:pPr>
+        <w:pStyle w:val="BodyText"/>
+        <w:rPr>
+          <w:rFonts w:ascii="Aptos" w:hAnsi="Aptos"/>
+          <w:lang w:val="en-US" w:eastAsia="zh-CN" w:bidi="hi-IN"/>
+        </w:rPr>
+      </w:pPr>
+    </w:p>
+    <w:p>
+      <w:pPr>
+        <w:pStyle w:val="BodyText"/>
+        <w:rPr>
+          <w:rFonts w:ascii="Aptos" w:hAnsi="Aptos"/>
+          <w:lang w:val="en-US" w:eastAsia="zh-CN" w:bidi="hi-IN"/>
+        </w:rPr>
+      </w:pPr>
+      <w:r>
+        <w:rPr>
+          <w:rFonts w:ascii="Aptos" w:hAnsi="Aptos"/>
+          <w:lang w:val="en-US" w:eastAsia="zh-CN" w:bidi="hi-IN"/>
+        </w:rPr>
+        <w:t xml:space="preserve">Figure 3.12 </w:t>
+      </w:r>
+      <w:r>
+        <w:rPr>
+          <w:rFonts w:ascii="Aptos" w:hAnsi="Aptos"/>
+          <w:lang w:val="en-US" w:eastAsia="zh-CN" w:bidi="hi-IN"/>
+        </w:rPr>
+        <w:t xml:space="preserve">below </w:t>
+      </w:r>
+      <w:r>
+        <w:rPr>
+          <w:rFonts w:ascii="Aptos" w:hAnsi="Aptos"/>
+          <w:lang w:val="en-US" w:eastAsia="zh-CN" w:bidi="hi-IN"/>
+        </w:rPr>
+        <w:t xml:space="preserve">depicts the optimum solution picked by GA. For 30 projects portfolio it has picked </w:t>
+      </w:r>
+      <w:r>
+        <w:rPr>
+          <w:rFonts w:ascii="Aptos" w:hAnsi="Aptos"/>
+          <w:lang w:val="en-US" w:eastAsia="zh-CN" w:bidi="hi-IN"/>
+        </w:rPr>
+        <w:t>16</w:t>
+      </w:r>
+      <w:r>
+        <w:rPr>
+          <w:rFonts w:ascii="Aptos" w:hAnsi="Aptos"/>
+          <w:lang w:val="en-US" w:eastAsia="zh-CN" w:bidi="hi-IN"/>
+        </w:rPr>
+        <w:t>.</w:t>
+      </w:r>
+    </w:p>
+    <w:p>
+      <w:pPr>
+        <w:pStyle w:val="BodyText"/>
+        <w:jc w:val="center"/>
+        <w:rPr>
+          <w:rFonts w:ascii="Aptos" w:hAnsi="Aptos"/>
+          <w:sz w:val="20"/>
+          <w:szCs w:val="20"/>
+          <w:lang w:val="en-US" w:eastAsia="zh-CN" w:bidi="hi-IN"/>
+        </w:rPr>
+      </w:pPr>
+      <w:r>
+        <w:rPr>
+          <w:rFonts w:ascii="Aptos" w:hAnsi="Aptos"/>
+          <w:noProof/>
+          <w:lang w:val="en-US" w:eastAsia="zh-CN" w:bidi="hi-IN"/>
+        </w:rPr>
+        <w:lastRenderedPageBreak/>
+        <w:drawing>
+          <wp:inline distT="0" distB="0" distL="0" distR="0" wp14:anchorId="10D57949" wp14:editId="522F47DC">
+            <wp:extent cx="6120130" cy="3060065"/>
+            <wp:effectExtent l="0" t="0" r="1270" b="635"/>
+            <wp:docPr id="2044403791" name="Picture 1" descr="A graph of green and red bars&#10;&#10;AI-generated content may be incorrect."/>
+            <wp:cNvGraphicFramePr>
+              <a:graphicFrameLocks xmlns:a="http://schemas.openxmlformats.org/drawingml/2006/main" noChangeAspect="1"/>
+            </wp:cNvGraphicFramePr>
+            <a:graphic xmlns:a="http://schemas.openxmlformats.org/drawingml/2006/main">
+              <a:graphicData uri="http://schemas.openxmlformats.org/drawingml/2006/picture">
+                <pic:pic xmlns:pic="http://schemas.openxmlformats.org/drawingml/2006/picture">
+                  <pic:nvPicPr>
+                    <pic:cNvPr id="2044403791" name="Picture 1" descr="A graph of green and red bars&#10;&#10;AI-generated content may be incorrect."/>
+                    <pic:cNvPicPr/>
+                  </pic:nvPicPr>
+                  <pic:blipFill>
+                    <a:blip r:embed="rId51"/>
+                    <a:stretch>
+                      <a:fillRect/>
+                    </a:stretch>
+                  </pic:blipFill>
+                  <pic:spPr>
+                    <a:xfrm>
+                      <a:off x="0" y="0"/>
+                      <a:ext cx="6120130" cy="3060065"/>
+                    </a:xfrm>
+                    <a:prstGeom prst="rect">
+                      <a:avLst/>
+                    </a:prstGeom>
+                  </pic:spPr>
+                </pic:pic>
+              </a:graphicData>
+            </a:graphic>
+          </wp:inline>
+        </w:drawing>
+      </w:r>
+      <w:r>
+        <w:rPr>
+          <w:rFonts w:ascii="Aptos" w:hAnsi="Aptos"/>
+          <w:lang w:val="en-US" w:eastAsia="zh-CN" w:bidi="hi-IN"/>
+        </w:rPr>
+        <w:br/>
+      </w:r>
+      <w:r>
+        <w:rPr>
+          <w:rFonts w:ascii="Aptos" w:hAnsi="Aptos"/>
+          <w:sz w:val="20"/>
+          <w:szCs w:val="20"/>
+          <w:lang w:val="en-US" w:eastAsia="zh-CN" w:bidi="hi-IN"/>
+        </w:rPr>
+        <w:t>Figure 3.12: GA results of portfolio selection (Green – selected, Red, Rejected)</w:t>
+      </w:r>
+    </w:p>
+    <w:p>
+      <w:pPr>
+        <w:pStyle w:val="BodyText"/>
+        <w:rPr>
+          <w:rFonts w:ascii="Aptos" w:hAnsi="Aptos"/>
+          <w:lang w:val="en-US" w:eastAsia="zh-CN" w:bidi="hi-IN"/>
+        </w:rPr>
+      </w:pPr>
     </w:p>
     <w:p>
       <w:pPr>
@@ -20497,15 +21256,13 @@
           <w:lang w:val="en-US" w:eastAsia="zh-CN" w:bidi="hi-IN"/>
         </w:rPr>
       </w:pPr>
-      <w:proofErr w:type="gramStart"/>
       <w:r>
         <w:rPr>
           <w:rFonts w:ascii="Aptos" w:hAnsi="Aptos"/>
           <w:lang w:val="en-US" w:eastAsia="zh-CN" w:bidi="hi-IN"/>
         </w:rPr>
-        <w:t>1 :</w:t>
-      </w:r>
-      <w:proofErr w:type="gramEnd"/>
+        <w:t>1:</w:t>
+      </w:r>
       <w:r>
         <w:rPr>
           <w:rFonts w:ascii="Aptos" w:hAnsi="Aptos"/>
@@ -20520,15 +21277,13 @@
         </w:rPr>
         <w:br/>
       </w:r>
-      <w:proofErr w:type="gramStart"/>
       <w:r>
         <w:rPr>
           <w:rFonts w:ascii="Aptos" w:hAnsi="Aptos"/>
           <w:lang w:val="en-US" w:eastAsia="zh-CN" w:bidi="hi-IN"/>
         </w:rPr>
-        <w:t>0 :</w:t>
-      </w:r>
-      <w:proofErr w:type="gramEnd"/>
+        <w:t>0:</w:t>
+      </w:r>
       <w:r>
         <w:rPr>
           <w:rFonts w:ascii="Aptos" w:hAnsi="Aptos"/>
@@ -20536,15 +21291,13 @@
         </w:rPr>
         <w:t xml:space="preserve"> Project I </w:t>
       </w:r>
-      <w:proofErr w:type="gramStart"/>
       <w:r>
         <w:rPr>
           <w:rFonts w:ascii="Aptos" w:hAnsi="Aptos"/>
           <w:lang w:val="en-US" w:eastAsia="zh-CN" w:bidi="hi-IN"/>
         </w:rPr>
-        <w:t>not selected</w:t>
-      </w:r>
-      <w:proofErr w:type="gramEnd"/>
+        <w:t>did not select</w:t>
+      </w:r>
     </w:p>
     <w:p>
       <w:pPr>
@@ -20752,31 +21505,41 @@
         <w:br/>
         <w:t xml:space="preserve">BD: Binary decision of project </w:t>
       </w:r>
-      <w:proofErr w:type="spellStart"/>
       <w:r>
         <w:rPr>
           <w:rFonts w:ascii="Aptos" w:hAnsi="Aptos"/>
           <w:lang w:val="en-US" w:eastAsia="zh-CN" w:bidi="hi-IN"/>
         </w:rPr>
+        <w:t>(</w:t>
+      </w:r>
+      <w:r>
+        <w:rPr>
+          <w:rFonts w:ascii="Aptos" w:hAnsi="Aptos"/>
+          <w:lang w:val="en-US" w:eastAsia="zh-CN" w:bidi="hi-IN"/>
+        </w:rPr>
         <w:t>i</w:t>
       </w:r>
-      <w:proofErr w:type="spellEnd"/>
       <w:r>
         <w:rPr>
           <w:rFonts w:ascii="Aptos" w:hAnsi="Aptos"/>
           <w:lang w:val="en-US" w:eastAsia="zh-CN" w:bidi="hi-IN"/>
         </w:rPr>
+        <w:t>)</w:t>
+      </w:r>
+      <w:r>
+        <w:rPr>
+          <w:rFonts w:ascii="Aptos" w:hAnsi="Aptos"/>
+          <w:lang w:val="en-US" w:eastAsia="zh-CN" w:bidi="hi-IN"/>
+        </w:rPr>
         <w:t xml:space="preserve"> </w:t>
       </w:r>
-      <w:proofErr w:type="gramStart"/>
       <w:r>
         <w:rPr>
           <w:rFonts w:ascii="Aptos" w:hAnsi="Aptos"/>
           <w:lang w:val="en-US" w:eastAsia="zh-CN" w:bidi="hi-IN"/>
         </w:rPr>
-        <w:t>( 1</w:t>
-      </w:r>
-      <w:proofErr w:type="gramEnd"/>
+        <w:t>(1</w:t>
+      </w:r>
       <w:r>
         <w:rPr>
           <w:rFonts w:ascii="Aptos" w:hAnsi="Aptos"/>
@@ -20850,6 +21613,7 @@
           <w:rFonts w:ascii="Aptos" w:hAnsi="Aptos"/>
           <w:lang w:val="en-US" w:eastAsia="zh-CN" w:bidi="hi-IN"/>
         </w:rPr>
+        <w:lastRenderedPageBreak/>
         <w:t>Total required hours for all selected projects should be less than or equal to Total Developer Hours available</w:t>
       </w:r>
     </w:p>
@@ -20956,30 +21720,28 @@
           <w:rFonts w:ascii="Aptos" w:hAnsi="Aptos"/>
           <w:lang w:val="en-US" w:eastAsia="zh-CN" w:bidi="hi-IN"/>
         </w:rPr>
-        <w:t>Figure 3.12 illustrates our implementation of BILP</w:t>
+        <w:t>Figure 3.1</w:t>
       </w:r>
       <w:r>
         <w:rPr>
           <w:rFonts w:ascii="Aptos" w:hAnsi="Aptos"/>
           <w:lang w:val="en-US" w:eastAsia="zh-CN" w:bidi="hi-IN"/>
         </w:rPr>
-        <w:t xml:space="preserve"> using </w:t>
-      </w:r>
-      <w:proofErr w:type="spellStart"/>
+        <w:t>3 below</w:t>
+      </w:r>
       <w:r>
         <w:rPr>
           <w:rFonts w:ascii="Aptos" w:hAnsi="Aptos"/>
           <w:lang w:val="en-US" w:eastAsia="zh-CN" w:bidi="hi-IN"/>
         </w:rPr>
-        <w:t>PuLP</w:t>
-      </w:r>
-      <w:proofErr w:type="spellEnd"/>
+        <w:t xml:space="preserve"> illustrates our implementation of BILP</w:t>
+      </w:r>
       <w:r>
         <w:rPr>
           <w:rFonts w:ascii="Aptos" w:hAnsi="Aptos"/>
           <w:lang w:val="en-US" w:eastAsia="zh-CN" w:bidi="hi-IN"/>
         </w:rPr>
-        <w:t xml:space="preserve"> python lib</w:t>
+        <w:t xml:space="preserve"> using PuLP python lib</w:t>
       </w:r>
       <w:r>
         <w:rPr>
@@ -21033,7 +21795,7 @@
                     <pic:cNvPicPr/>
                   </pic:nvPicPr>
                   <pic:blipFill>
-                    <a:blip r:embed="rId51"/>
+                    <a:blip r:embed="rId52"/>
                     <a:stretch>
                       <a:fillRect/>
                     </a:stretch>
@@ -21072,18 +21834,38 @@
           <w:szCs w:val="20"/>
           <w:lang w:val="en-US" w:eastAsia="zh-CN" w:bidi="hi-IN"/>
         </w:rPr>
-        <w:t>Figure 3.12: BILP implementation</w:t>
+        <w:t>Figure 3.1</w:t>
+      </w:r>
+      <w:r>
+        <w:rPr>
+          <w:rFonts w:ascii="Aptos" w:hAnsi="Aptos"/>
+          <w:sz w:val="20"/>
+          <w:szCs w:val="20"/>
+          <w:lang w:val="en-US" w:eastAsia="zh-CN" w:bidi="hi-IN"/>
+        </w:rPr>
+        <w:t>3</w:t>
+      </w:r>
+      <w:r>
+        <w:rPr>
+          <w:rFonts w:ascii="Aptos" w:hAnsi="Aptos"/>
+          <w:sz w:val="20"/>
+          <w:szCs w:val="20"/>
+          <w:lang w:val="en-US" w:eastAsia="zh-CN" w:bidi="hi-IN"/>
+        </w:rPr>
+        <w:t>: BILP implementation</w:t>
       </w:r>
     </w:p>
     <w:p>
       <w:pPr>
         <w:pStyle w:val="Heading"/>
         <w:rPr>
+          <w:rFonts w:ascii="Aptos" w:hAnsi="Aptos"/>
           <w:lang w:val="en-US" w:eastAsia="zh-CN" w:bidi="hi-IN"/>
         </w:rPr>
       </w:pPr>
       <w:r>
         <w:rPr>
+          <w:rFonts w:ascii="Aptos" w:hAnsi="Aptos"/>
           <w:lang w:val="en-US" w:eastAsia="zh-CN" w:bidi="hi-IN"/>
         </w:rPr>
         <w:t xml:space="preserve">Results </w:t>
@@ -21116,7 +21898,28 @@
           <w:rFonts w:ascii="Aptos" w:hAnsi="Aptos"/>
           <w:lang w:val="en-US" w:eastAsia="zh-CN" w:bidi="hi-IN"/>
         </w:rPr>
-        <w:t>. The result is 16 projects have been selected and 14 got rejected with maximum profit gain with maximum resource allocation as depicted in table 3.2 below.</w:t>
+        <w:t xml:space="preserve"> 3.14 below</w:t>
+      </w:r>
+      <w:r>
+        <w:rPr>
+          <w:rFonts w:ascii="Aptos" w:hAnsi="Aptos"/>
+          <w:lang w:val="en-US" w:eastAsia="zh-CN" w:bidi="hi-IN"/>
+        </w:rPr>
+        <w:t>. The result is 16 projects have been selected and 14 got rejected with maximum profit gain with maximum resource allocation as depicted in table 3.</w:t>
+      </w:r>
+      <w:r>
+        <w:rPr>
+          <w:rFonts w:ascii="Aptos" w:hAnsi="Aptos"/>
+          <w:lang w:val="en-US" w:eastAsia="zh-CN" w:bidi="hi-IN"/>
+        </w:rPr>
+        <w:t>3</w:t>
+      </w:r>
+      <w:r>
+        <w:rPr>
+          <w:rFonts w:ascii="Aptos" w:hAnsi="Aptos"/>
+          <w:lang w:val="en-US" w:eastAsia="zh-CN" w:bidi="hi-IN"/>
+        </w:rPr>
+        <w:t xml:space="preserve"> below.</w:t>
       </w:r>
     </w:p>
     <w:tbl>
@@ -21147,7 +21950,6 @@
                 <w:rFonts w:ascii="Aptos" w:hAnsi="Aptos"/>
                 <w:lang w:val="en-US" w:eastAsia="zh-CN" w:bidi="hi-IN"/>
               </w:rPr>
-              <w:lastRenderedPageBreak/>
               <w:t>Maximum Profit</w:t>
             </w:r>
           </w:p>
@@ -21259,15 +22061,13 @@
               </w:rPr>
               <w:t xml:space="preserve">Used 1281.4h from 1283.3h </w:t>
             </w:r>
-            <w:proofErr w:type="spellStart"/>
             <w:r>
               <w:rPr>
                 <w:rFonts w:ascii="Aptos" w:hAnsi="Aptos"/>
                 <w:lang w:val="en-US" w:eastAsia="zh-CN" w:bidi="hi-IN"/>
               </w:rPr>
-              <w:t>avaialable</w:t>
+              <w:t>available</w:t>
             </w:r>
-            <w:proofErr w:type="spellEnd"/>
           </w:p>
         </w:tc>
       </w:tr>
@@ -21336,7 +22136,6 @@
         </w:rPr>
         <w:t xml:space="preserve">Table </w:t>
       </w:r>
-      <w:proofErr w:type="gramStart"/>
       <w:r>
         <w:rPr>
           <w:rFonts w:ascii="Aptos" w:hAnsi="Aptos"/>
@@ -21344,9 +22143,8 @@
           <w:szCs w:val="20"/>
           <w:lang w:val="en-US" w:eastAsia="zh-CN" w:bidi="hi-IN"/>
         </w:rPr>
-        <w:t>3.2 :</w:t>
-      </w:r>
-      <w:proofErr w:type="gramEnd"/>
+        <w:t>3.3:</w:t>
+      </w:r>
       <w:r>
         <w:rPr>
           <w:rFonts w:ascii="Aptos" w:hAnsi="Aptos"/>
@@ -21371,6 +22169,7 @@
           <w:noProof/>
           <w:lang w:val="en-US" w:eastAsia="zh-CN" w:bidi="hi-IN"/>
         </w:rPr>
+        <w:lastRenderedPageBreak/>
         <w:drawing>
           <wp:inline distT="0" distB="0" distL="0" distR="0" wp14:anchorId="59B4DE0A" wp14:editId="5CB7B0A3">
             <wp:extent cx="6120130" cy="3060065"/>
@@ -21387,7 +22186,7 @@
                     <pic:cNvPicPr/>
                   </pic:nvPicPr>
                   <pic:blipFill>
-                    <a:blip r:embed="rId52"/>
+                    <a:blip r:embed="rId53"/>
                     <a:stretch>
                       <a:fillRect/>
                     </a:stretch>
@@ -21426,7 +22225,52 @@
           <w:szCs w:val="20"/>
           <w:lang w:val="en-US" w:eastAsia="zh-CN" w:bidi="hi-IN"/>
         </w:rPr>
-        <w:t>Figure 3.12: BILP results of portfolio selection (Green – selected, Red, Rejected)</w:t>
+        <w:t>Figure 3.</w:t>
+      </w:r>
+      <w:r>
+        <w:rPr>
+          <w:rFonts w:ascii="Aptos" w:hAnsi="Aptos"/>
+          <w:sz w:val="20"/>
+          <w:szCs w:val="20"/>
+          <w:lang w:val="en-US" w:eastAsia="zh-CN" w:bidi="hi-IN"/>
+        </w:rPr>
+        <w:t>1</w:t>
+      </w:r>
+      <w:r>
+        <w:rPr>
+          <w:rFonts w:ascii="Aptos" w:hAnsi="Aptos"/>
+          <w:sz w:val="20"/>
+          <w:szCs w:val="20"/>
+          <w:lang w:val="en-US" w:eastAsia="zh-CN" w:bidi="hi-IN"/>
+        </w:rPr>
+        <w:t>4</w:t>
+      </w:r>
+      <w:r>
+        <w:rPr>
+          <w:rFonts w:ascii="Aptos" w:hAnsi="Aptos"/>
+          <w:sz w:val="20"/>
+          <w:szCs w:val="20"/>
+          <w:lang w:val="en-US" w:eastAsia="zh-CN" w:bidi="hi-IN"/>
+        </w:rPr>
+        <w:t xml:space="preserve"> BILP</w:t>
+      </w:r>
+      <w:r>
+        <w:rPr>
+          <w:rFonts w:ascii="Aptos" w:hAnsi="Aptos"/>
+          <w:sz w:val="20"/>
+          <w:szCs w:val="20"/>
+          <w:lang w:val="en-US" w:eastAsia="zh-CN" w:bidi="hi-IN"/>
+        </w:rPr>
+        <w:t>(MIP)</w:t>
+      </w:r>
+      <w:r>
+        <w:rPr>
+          <w:rFonts w:ascii="Aptos" w:hAnsi="Aptos"/>
+          <w:sz w:val="20"/>
+          <w:szCs w:val="20"/>
+          <w:lang w:val="en-US" w:eastAsia="zh-CN" w:bidi="hi-IN"/>
+        </w:rPr>
+        <w:t xml:space="preserve"> results of portfolio selection (Green – selected, Red, Rejected)</w:t>
       </w:r>
     </w:p>
     <w:p>
@@ -21437,11 +22281,788 @@
           <w:lang w:val="en-US" w:eastAsia="zh-CN" w:bidi="hi-IN"/>
         </w:rPr>
       </w:pPr>
-      <w:r>
+    </w:p>
+    <w:p>
+      <w:pPr>
+        <w:pStyle w:val="Heading1"/>
+        <w:numPr>
+          <w:ilvl w:val="0"/>
+          <w:numId w:val="92"/>
+        </w:numPr>
+        <w:rPr>
+          <w:rFonts w:ascii="Aptos" w:hAnsi="Aptos" w:cs="Angsana New"/>
+        </w:rPr>
+      </w:pPr>
+      <w:r>
+        <w:rPr>
+          <w:rFonts w:ascii="Aptos" w:hAnsi="Aptos" w:cs="Angsana New"/>
+        </w:rPr>
+        <w:t>Comparative Analysis and Critical Reflection</w:t>
+      </w:r>
+    </w:p>
+    <w:p>
+      <w:pPr>
         <w:rPr>
           <w:rFonts w:ascii="Aptos" w:hAnsi="Aptos"/>
           <w:lang w:val="en-US" w:eastAsia="zh-CN" w:bidi="hi-IN"/>
         </w:rPr>
+      </w:pPr>
+      <w:r>
+        <w:rPr>
+          <w:rFonts w:ascii="Aptos" w:hAnsi="Aptos"/>
+          <w:lang w:val="en-US" w:eastAsia="zh-CN" w:bidi="hi-IN"/>
+        </w:rPr>
+        <w:t>We used project size range as [</w:t>
+      </w:r>
+      <w:r>
+        <w:rPr>
+          <w:rFonts w:ascii="Aptos" w:hAnsi="Aptos"/>
+        </w:rPr>
+        <w:t>10</w:t>
+      </w:r>
+      <w:r>
+        <w:rPr>
+          <w:rFonts w:ascii="Aptos" w:hAnsi="Aptos"/>
+          <w:color w:val="CCCCCC"/>
+        </w:rPr>
+        <w:t xml:space="preserve">, </w:t>
+      </w:r>
+      <w:r>
+        <w:rPr>
+          <w:rFonts w:ascii="Aptos" w:hAnsi="Aptos"/>
+        </w:rPr>
+        <w:t>20</w:t>
+      </w:r>
+      <w:r>
+        <w:rPr>
+          <w:rFonts w:ascii="Aptos" w:hAnsi="Aptos"/>
+          <w:color w:val="CCCCCC"/>
+        </w:rPr>
+        <w:t xml:space="preserve">, </w:t>
+      </w:r>
+      <w:r>
+        <w:rPr>
+          <w:rFonts w:ascii="Aptos" w:hAnsi="Aptos"/>
+        </w:rPr>
+        <w:t>50</w:t>
+      </w:r>
+      <w:r>
+        <w:rPr>
+          <w:rFonts w:ascii="Aptos" w:hAnsi="Aptos"/>
+          <w:color w:val="CCCCCC"/>
+        </w:rPr>
+        <w:t xml:space="preserve">, </w:t>
+      </w:r>
+      <w:r>
+        <w:rPr>
+          <w:rFonts w:ascii="Aptos" w:hAnsi="Aptos"/>
+        </w:rPr>
+        <w:t>100</w:t>
+      </w:r>
+      <w:r>
+        <w:rPr>
+          <w:rFonts w:ascii="Aptos" w:hAnsi="Aptos"/>
+          <w:color w:val="CCCCCC"/>
+        </w:rPr>
+        <w:t xml:space="preserve">, </w:t>
+      </w:r>
+      <w:r>
+        <w:rPr>
+          <w:rFonts w:ascii="Aptos" w:hAnsi="Aptos"/>
+        </w:rPr>
+        <w:t>150</w:t>
+      </w:r>
+      <w:r>
+        <w:rPr>
+          <w:rFonts w:ascii="Aptos" w:hAnsi="Aptos"/>
+          <w:color w:val="CCCCCC"/>
+        </w:rPr>
+        <w:t xml:space="preserve">, </w:t>
+      </w:r>
+      <w:r>
+        <w:rPr>
+          <w:rFonts w:ascii="Aptos" w:hAnsi="Aptos"/>
+        </w:rPr>
+        <w:t>300</w:t>
+      </w:r>
+      <w:r>
+        <w:rPr>
+          <w:rFonts w:ascii="Aptos" w:hAnsi="Aptos"/>
+          <w:color w:val="CCCCCC"/>
+        </w:rPr>
+        <w:t xml:space="preserve">, </w:t>
+      </w:r>
+      <w:r>
+        <w:rPr>
+          <w:rFonts w:ascii="Aptos" w:hAnsi="Aptos"/>
+        </w:rPr>
+        <w:t>500</w:t>
+      </w:r>
+      <w:r>
+        <w:rPr>
+          <w:rFonts w:ascii="Aptos" w:hAnsi="Aptos"/>
+          <w:color w:val="CCCCCC"/>
+        </w:rPr>
+        <w:t xml:space="preserve">, </w:t>
+      </w:r>
+      <w:r>
+        <w:rPr>
+          <w:rFonts w:ascii="Aptos" w:hAnsi="Aptos"/>
+        </w:rPr>
+        <w:t>600</w:t>
+      </w:r>
+      <w:r>
+        <w:rPr>
+          <w:rFonts w:ascii="Aptos" w:hAnsi="Aptos"/>
+          <w:color w:val="CCCCCC"/>
+        </w:rPr>
+        <w:t xml:space="preserve">, </w:t>
+      </w:r>
+      <w:r>
+        <w:rPr>
+          <w:rFonts w:ascii="Aptos" w:hAnsi="Aptos"/>
+        </w:rPr>
+        <w:t>700</w:t>
+      </w:r>
+      <w:r>
+        <w:rPr>
+          <w:rFonts w:ascii="Aptos" w:hAnsi="Aptos"/>
+          <w:color w:val="CCCCCC"/>
+        </w:rPr>
+        <w:t xml:space="preserve">, </w:t>
+      </w:r>
+      <w:r>
+        <w:rPr>
+          <w:rFonts w:ascii="Aptos" w:hAnsi="Aptos"/>
+        </w:rPr>
+        <w:t>800</w:t>
+      </w:r>
+      <w:r>
+        <w:rPr>
+          <w:rFonts w:ascii="Aptos" w:hAnsi="Aptos"/>
+          <w:color w:val="CCCCCC"/>
+        </w:rPr>
+        <w:t xml:space="preserve">, </w:t>
+      </w:r>
+      <w:r>
+        <w:rPr>
+          <w:rFonts w:ascii="Aptos" w:hAnsi="Aptos"/>
+        </w:rPr>
+        <w:t>900</w:t>
+      </w:r>
+      <w:r>
+        <w:rPr>
+          <w:rFonts w:ascii="Aptos" w:hAnsi="Aptos"/>
+          <w:color w:val="CCCCCC"/>
+        </w:rPr>
+        <w:t xml:space="preserve">, </w:t>
+      </w:r>
+      <w:r>
+        <w:rPr>
+          <w:rFonts w:ascii="Aptos" w:hAnsi="Aptos"/>
+        </w:rPr>
+        <w:t>1000</w:t>
+      </w:r>
+      <w:r>
+        <w:rPr>
+          <w:rFonts w:ascii="Aptos" w:hAnsi="Aptos"/>
+          <w:color w:val="CCCCCC"/>
+        </w:rPr>
+        <w:t>]</w:t>
+      </w:r>
+      <w:r>
+        <w:rPr>
+          <w:rFonts w:ascii="Aptos" w:hAnsi="Aptos"/>
+          <w:lang w:val="en-US" w:eastAsia="zh-CN" w:bidi="hi-IN"/>
+        </w:rPr>
+        <w:t>] for comparing GA and MIP. We have 30 projects data in our original data set and for additional project we create the data with random values and use the same resource and logical constraints above.</w:t>
+      </w:r>
+    </w:p>
+    <w:p>
+      <w:pPr>
+        <w:rPr>
+          <w:rFonts w:ascii="Aptos" w:hAnsi="Aptos"/>
+          <w:lang w:val="en-US" w:eastAsia="zh-CN" w:bidi="hi-IN"/>
+        </w:rPr>
+      </w:pPr>
+    </w:p>
+    <w:p>
+      <w:pPr>
+        <w:rPr>
+          <w:rFonts w:ascii="Aptos" w:hAnsi="Aptos"/>
+          <w:lang w:val="en-US" w:eastAsia="zh-CN" w:bidi="hi-IN"/>
+        </w:rPr>
+      </w:pPr>
+      <w:r>
+        <w:rPr>
+          <w:rFonts w:ascii="Aptos" w:hAnsi="Aptos"/>
+          <w:lang w:val="en-US" w:eastAsia="zh-CN" w:bidi="hi-IN"/>
+        </w:rPr>
+        <w:t>Finally,</w:t>
+      </w:r>
+      <w:r>
+        <w:rPr>
+          <w:rFonts w:ascii="Aptos" w:hAnsi="Aptos"/>
+          <w:lang w:val="en-US" w:eastAsia="zh-CN" w:bidi="hi-IN"/>
+        </w:rPr>
+        <w:t xml:space="preserve"> we plot the execution time against the project size as the figure 3.1</w:t>
+      </w:r>
+      <w:r>
+        <w:rPr>
+          <w:rFonts w:ascii="Aptos" w:hAnsi="Aptos"/>
+          <w:lang w:val="en-US" w:eastAsia="zh-CN" w:bidi="hi-IN"/>
+        </w:rPr>
+        <w:t>5</w:t>
+      </w:r>
+      <w:r>
+        <w:rPr>
+          <w:rFonts w:ascii="Aptos" w:hAnsi="Aptos"/>
+          <w:lang w:val="en-US" w:eastAsia="zh-CN" w:bidi="hi-IN"/>
+        </w:rPr>
+        <w:t xml:space="preserve"> below.</w:t>
+      </w:r>
+    </w:p>
+    <w:p>
+      <w:pPr>
+        <w:rPr>
+          <w:rFonts w:ascii="Aptos" w:hAnsi="Aptos"/>
+          <w:lang w:val="en-US" w:eastAsia="zh-CN" w:bidi="hi-IN"/>
+        </w:rPr>
+      </w:pPr>
+    </w:p>
+    <w:p>
+      <w:pPr>
+        <w:rPr>
+          <w:rFonts w:ascii="Aptos" w:hAnsi="Aptos"/>
+          <w:lang w:val="en-US" w:eastAsia="zh-CN" w:bidi="hi-IN"/>
+        </w:rPr>
+      </w:pPr>
+    </w:p>
+    <w:p>
+      <w:pPr>
+        <w:jc w:val="center"/>
+        <w:rPr>
+          <w:rFonts w:ascii="Aptos" w:hAnsi="Aptos"/>
+          <w:lang w:val="en-US" w:eastAsia="zh-CN" w:bidi="hi-IN"/>
+        </w:rPr>
+      </w:pPr>
+      <w:r>
+        <w:rPr>
+          <w:rFonts w:ascii="Aptos" w:hAnsi="Aptos"/>
+          <w:noProof/>
+          <w:lang w:val="en-US" w:eastAsia="zh-CN" w:bidi="hi-IN"/>
+        </w:rPr>
+        <w:drawing>
+          <wp:inline distT="0" distB="0" distL="0" distR="0" wp14:anchorId="2C30E12D" wp14:editId="527A8B0C">
+            <wp:extent cx="4800214" cy="3000258"/>
+            <wp:effectExtent l="0" t="0" r="635" b="0"/>
+            <wp:docPr id="1340127996" name="Picture 1" descr="A graph with a line and a red line&#10;&#10;AI-generated content may be incorrect."/>
+            <wp:cNvGraphicFramePr>
+              <a:graphicFrameLocks xmlns:a="http://schemas.openxmlformats.org/drawingml/2006/main" noChangeAspect="1"/>
+            </wp:cNvGraphicFramePr>
+            <a:graphic xmlns:a="http://schemas.openxmlformats.org/drawingml/2006/main">
+              <a:graphicData uri="http://schemas.openxmlformats.org/drawingml/2006/picture">
+                <pic:pic xmlns:pic="http://schemas.openxmlformats.org/drawingml/2006/picture">
+                  <pic:nvPicPr>
+                    <pic:cNvPr id="1340127996" name="Picture 1" descr="A graph with a line and a red line&#10;&#10;AI-generated content may be incorrect."/>
+                    <pic:cNvPicPr/>
+                  </pic:nvPicPr>
+                  <pic:blipFill>
+                    <a:blip r:embed="rId54"/>
+                    <a:stretch>
+                      <a:fillRect/>
+                    </a:stretch>
+                  </pic:blipFill>
+                  <pic:spPr>
+                    <a:xfrm>
+                      <a:off x="0" y="0"/>
+                      <a:ext cx="4849936" cy="3031335"/>
+                    </a:xfrm>
+                    <a:prstGeom prst="rect">
+                      <a:avLst/>
+                    </a:prstGeom>
+                  </pic:spPr>
+                </pic:pic>
+              </a:graphicData>
+            </a:graphic>
+          </wp:inline>
+        </w:drawing>
+      </w:r>
+    </w:p>
+    <w:p>
+      <w:pPr>
+        <w:jc w:val="center"/>
+        <w:rPr>
+          <w:rFonts w:ascii="Aptos" w:hAnsi="Aptos"/>
+          <w:lang w:val="en-US" w:eastAsia="zh-CN" w:bidi="hi-IN"/>
+        </w:rPr>
+      </w:pPr>
+      <w:r>
+        <w:rPr>
+          <w:rFonts w:ascii="Aptos" w:hAnsi="Aptos"/>
+          <w:lang w:val="en-US" w:eastAsia="zh-CN" w:bidi="hi-IN"/>
+        </w:rPr>
+        <w:t>Figure 3.1</w:t>
+      </w:r>
+      <w:r>
+        <w:rPr>
+          <w:rFonts w:ascii="Aptos" w:hAnsi="Aptos"/>
+          <w:lang w:val="en-US" w:eastAsia="zh-CN" w:bidi="hi-IN"/>
+        </w:rPr>
+        <w:t>5</w:t>
+      </w:r>
+      <w:r>
+        <w:rPr>
+          <w:rFonts w:ascii="Aptos" w:hAnsi="Aptos"/>
+          <w:lang w:val="en-US" w:eastAsia="zh-CN" w:bidi="hi-IN"/>
+        </w:rPr>
+        <w:t xml:space="preserve">: GA vs </w:t>
+      </w:r>
+      <w:r>
+        <w:rPr>
+          <w:rFonts w:ascii="Aptos" w:hAnsi="Aptos"/>
+          <w:lang w:val="en-US" w:eastAsia="zh-CN" w:bidi="hi-IN"/>
+        </w:rPr>
+        <w:t>BILP/MIP</w:t>
+      </w:r>
+      <w:r>
+        <w:rPr>
+          <w:rFonts w:ascii="Aptos" w:hAnsi="Aptos"/>
+          <w:lang w:val="en-US" w:eastAsia="zh-CN" w:bidi="hi-IN"/>
+        </w:rPr>
+        <w:t xml:space="preserve"> (Execution time against Project </w:t>
+      </w:r>
+      <w:r>
+        <w:rPr>
+          <w:rFonts w:ascii="Aptos" w:hAnsi="Aptos"/>
+          <w:lang w:val="en-US" w:eastAsia="zh-CN" w:bidi="hi-IN"/>
+        </w:rPr>
+        <w:t>size)</w:t>
+      </w:r>
+    </w:p>
+    <w:p>
+      <w:pPr>
+        <w:rPr>
+          <w:rFonts w:ascii="Aptos" w:hAnsi="Aptos"/>
+          <w:color w:val="CCCCCC"/>
+        </w:rPr>
+      </w:pPr>
+    </w:p>
+    <w:p>
+      <w:pPr>
+        <w:pStyle w:val="Heading"/>
+        <w:rPr>
+          <w:rFonts w:ascii="Aptos" w:hAnsi="Aptos"/>
+        </w:rPr>
+      </w:pPr>
+      <w:r>
+        <w:rPr>
+          <w:rFonts w:ascii="Aptos" w:hAnsi="Aptos"/>
+        </w:rPr>
+        <w:lastRenderedPageBreak/>
+        <w:t>Comparison</w:t>
+      </w:r>
+    </w:p>
+    <w:p>
+      <w:pPr>
+        <w:rPr>
+          <w:rFonts w:ascii="Aptos" w:hAnsi="Aptos"/>
+          <w:color w:val="CCCCCC"/>
+        </w:rPr>
+      </w:pPr>
+    </w:p>
+    <w:p>
+      <w:pPr>
+        <w:rPr>
+          <w:rFonts w:ascii="Aptos" w:hAnsi="Aptos"/>
+          <w:b/>
+          <w:bCs/>
+        </w:rPr>
+      </w:pPr>
+      <w:r>
+        <w:rPr>
+          <w:rFonts w:ascii="Aptos" w:hAnsi="Aptos"/>
+          <w:b/>
+          <w:bCs/>
+        </w:rPr>
+        <w:t>Optimul Solution</w:t>
+      </w:r>
+    </w:p>
+    <w:p>
+      <w:pPr>
+        <w:rPr>
+          <w:rFonts w:ascii="Aptos" w:hAnsi="Aptos"/>
+        </w:rPr>
+      </w:pPr>
+    </w:p>
+    <w:tbl>
+      <w:tblPr>
+        <w:tblStyle w:val="TableGrid"/>
+        <w:tblW w:w="0" w:type="auto"/>
+        <w:tblLook w:val="04A0" w:firstRow="1" w:lastRow="0" w:firstColumn="1" w:lastColumn="0" w:noHBand="0" w:noVBand="1"/>
+      </w:tblPr>
+      <w:tblGrid>
+        <w:gridCol w:w="2315"/>
+        <w:gridCol w:w="2478"/>
+        <w:gridCol w:w="2518"/>
+        <w:gridCol w:w="2317"/>
+      </w:tblGrid>
+      <w:tr>
+        <w:tc>
+          <w:tcPr>
+            <w:tcW w:w="2315" w:type="dxa"/>
+          </w:tcPr>
+          <w:p>
+            <w:pPr>
+              <w:rPr>
+                <w:rFonts w:ascii="Aptos" w:hAnsi="Aptos"/>
+              </w:rPr>
+            </w:pPr>
+          </w:p>
+        </w:tc>
+        <w:tc>
+          <w:tcPr>
+            <w:tcW w:w="2478" w:type="dxa"/>
+          </w:tcPr>
+          <w:p>
+            <w:pPr>
+              <w:rPr>
+                <w:rFonts w:ascii="Aptos" w:hAnsi="Aptos"/>
+              </w:rPr>
+            </w:pPr>
+            <w:r>
+              <w:rPr>
+                <w:rFonts w:ascii="Aptos" w:hAnsi="Aptos"/>
+              </w:rPr>
+              <w:t>Profit ($K)</w:t>
+            </w:r>
+          </w:p>
+        </w:tc>
+        <w:tc>
+          <w:tcPr>
+            <w:tcW w:w="2518" w:type="dxa"/>
+          </w:tcPr>
+          <w:p>
+            <w:pPr>
+              <w:rPr>
+                <w:rFonts w:ascii="Aptos" w:hAnsi="Aptos"/>
+              </w:rPr>
+            </w:pPr>
+            <w:r>
+              <w:rPr>
+                <w:rFonts w:ascii="Aptos" w:hAnsi="Aptos"/>
+              </w:rPr>
+              <w:t>Cost ($K)</w:t>
+            </w:r>
+          </w:p>
+        </w:tc>
+        <w:tc>
+          <w:tcPr>
+            <w:tcW w:w="2317" w:type="dxa"/>
+          </w:tcPr>
+          <w:p>
+            <w:pPr>
+              <w:rPr>
+                <w:rFonts w:ascii="Aptos" w:hAnsi="Aptos"/>
+              </w:rPr>
+            </w:pPr>
+            <w:r>
+              <w:rPr>
+                <w:rFonts w:ascii="Aptos" w:hAnsi="Aptos"/>
+              </w:rPr>
+              <w:t>Dev Hours</w:t>
+            </w:r>
+          </w:p>
+        </w:tc>
+      </w:tr>
+      <w:tr>
+        <w:tc>
+          <w:tcPr>
+            <w:tcW w:w="2315" w:type="dxa"/>
+          </w:tcPr>
+          <w:p>
+            <w:pPr>
+              <w:rPr>
+                <w:rFonts w:ascii="Aptos" w:hAnsi="Aptos"/>
+                <w:b/>
+                <w:bCs/>
+              </w:rPr>
+            </w:pPr>
+            <w:r>
+              <w:rPr>
+                <w:rFonts w:ascii="Aptos" w:hAnsi="Aptos"/>
+                <w:b/>
+                <w:bCs/>
+              </w:rPr>
+              <w:t>GA</w:t>
+            </w:r>
+          </w:p>
+        </w:tc>
+        <w:tc>
+          <w:tcPr>
+            <w:tcW w:w="2478" w:type="dxa"/>
+          </w:tcPr>
+          <w:p>
+            <w:pPr>
+              <w:rPr>
+                <w:rFonts w:ascii="Aptos" w:hAnsi="Aptos"/>
+              </w:rPr>
+            </w:pPr>
+            <w:r>
+              <w:rPr>
+                <w:rFonts w:ascii="Aptos" w:hAnsi="Aptos"/>
+              </w:rPr>
+              <w:t>2507</w:t>
+            </w:r>
+          </w:p>
+        </w:tc>
+        <w:tc>
+          <w:tcPr>
+            <w:tcW w:w="2518" w:type="dxa"/>
+          </w:tcPr>
+          <w:p>
+            <w:pPr>
+              <w:rPr>
+                <w:rFonts w:ascii="Aptos" w:hAnsi="Aptos"/>
+              </w:rPr>
+            </w:pPr>
+            <w:r>
+              <w:rPr>
+                <w:rFonts w:ascii="Aptos" w:hAnsi="Aptos"/>
+              </w:rPr>
+              <w:t>1098</w:t>
+            </w:r>
+          </w:p>
+        </w:tc>
+        <w:tc>
+          <w:tcPr>
+            <w:tcW w:w="2317" w:type="dxa"/>
+          </w:tcPr>
+          <w:p>
+            <w:pPr>
+              <w:rPr>
+                <w:rFonts w:ascii="Aptos" w:hAnsi="Aptos"/>
+              </w:rPr>
+            </w:pPr>
+            <w:r>
+              <w:rPr>
+                <w:rFonts w:ascii="Aptos" w:hAnsi="Aptos"/>
+              </w:rPr>
+              <w:t>1263</w:t>
+            </w:r>
+          </w:p>
+        </w:tc>
+      </w:tr>
+      <w:tr>
+        <w:tc>
+          <w:tcPr>
+            <w:tcW w:w="2315" w:type="dxa"/>
+          </w:tcPr>
+          <w:p>
+            <w:pPr>
+              <w:rPr>
+                <w:rFonts w:ascii="Aptos" w:hAnsi="Aptos"/>
+                <w:b/>
+                <w:bCs/>
+              </w:rPr>
+            </w:pPr>
+            <w:r>
+              <w:rPr>
+                <w:rFonts w:ascii="Aptos" w:hAnsi="Aptos"/>
+                <w:b/>
+                <w:bCs/>
+              </w:rPr>
+              <w:t>BILP (MIP)</w:t>
+            </w:r>
+          </w:p>
+        </w:tc>
+        <w:tc>
+          <w:tcPr>
+            <w:tcW w:w="2478" w:type="dxa"/>
+          </w:tcPr>
+          <w:p>
+            <w:pPr>
+              <w:rPr>
+                <w:rFonts w:ascii="Aptos" w:hAnsi="Aptos"/>
+              </w:rPr>
+            </w:pPr>
+            <w:r>
+              <w:rPr>
+                <w:rFonts w:ascii="Aptos" w:hAnsi="Aptos"/>
+              </w:rPr>
+              <w:t>2511</w:t>
+            </w:r>
+          </w:p>
+        </w:tc>
+        <w:tc>
+          <w:tcPr>
+            <w:tcW w:w="2518" w:type="dxa"/>
+          </w:tcPr>
+          <w:p>
+            <w:pPr>
+              <w:rPr>
+                <w:rFonts w:ascii="Aptos" w:hAnsi="Aptos"/>
+              </w:rPr>
+            </w:pPr>
+            <w:r>
+              <w:rPr>
+                <w:rFonts w:ascii="Aptos" w:hAnsi="Aptos"/>
+              </w:rPr>
+              <w:t>1109</w:t>
+            </w:r>
+          </w:p>
+        </w:tc>
+        <w:tc>
+          <w:tcPr>
+            <w:tcW w:w="2317" w:type="dxa"/>
+          </w:tcPr>
+          <w:p>
+            <w:pPr>
+              <w:rPr>
+                <w:rFonts w:ascii="Aptos" w:hAnsi="Aptos"/>
+              </w:rPr>
+            </w:pPr>
+            <w:r>
+              <w:rPr>
+                <w:rFonts w:ascii="Aptos" w:hAnsi="Aptos"/>
+              </w:rPr>
+              <w:t>1281</w:t>
+            </w:r>
+          </w:p>
+        </w:tc>
+      </w:tr>
+    </w:tbl>
+    <w:p>
+      <w:pPr>
+        <w:rPr>
+          <w:rFonts w:ascii="Aptos" w:hAnsi="Aptos"/>
+        </w:rPr>
+      </w:pPr>
+    </w:p>
+    <w:p>
+      <w:pPr>
+        <w:jc w:val="center"/>
+        <w:rPr>
+          <w:rFonts w:ascii="Aptos" w:hAnsi="Aptos"/>
+          <w:sz w:val="20"/>
+          <w:szCs w:val="20"/>
+        </w:rPr>
+      </w:pPr>
+      <w:r>
+        <w:rPr>
+          <w:rFonts w:ascii="Aptos" w:hAnsi="Aptos"/>
+          <w:sz w:val="20"/>
+          <w:szCs w:val="20"/>
+        </w:rPr>
+        <w:t xml:space="preserve">Table 3.4: </w:t>
+      </w:r>
+      <w:r>
+        <w:rPr>
+          <w:rFonts w:ascii="Aptos" w:hAnsi="Aptos"/>
+          <w:sz w:val="20"/>
+          <w:szCs w:val="20"/>
+        </w:rPr>
+        <w:t>BA vs BILP optimul solution</w:t>
+      </w:r>
+    </w:p>
+    <w:p>
+      <w:pPr>
+        <w:rPr>
+          <w:rFonts w:ascii="Aptos" w:hAnsi="Aptos"/>
+        </w:rPr>
+      </w:pPr>
+    </w:p>
+    <w:p>
+      <w:pPr>
+        <w:rPr>
+          <w:rFonts w:ascii="Aptos" w:hAnsi="Aptos"/>
+        </w:rPr>
+      </w:pPr>
+      <w:r>
+        <w:rPr>
+          <w:rFonts w:ascii="Aptos" w:hAnsi="Aptos"/>
+        </w:rPr>
+        <w:t xml:space="preserve">MIP algorithm gurantees the absolute optimum but GA finds a near optimual solution. But profit is 99.8%. </w:t>
+      </w:r>
+    </w:p>
+    <w:p>
+      <w:pPr>
+        <w:rPr>
+          <w:rFonts w:ascii="Aptos" w:hAnsi="Aptos"/>
+        </w:rPr>
+      </w:pPr>
+    </w:p>
+    <w:p>
+      <w:pPr>
+        <w:rPr>
+          <w:rFonts w:ascii="Aptos" w:hAnsi="Aptos"/>
+          <w:b/>
+          <w:bCs/>
+        </w:rPr>
+      </w:pPr>
+      <w:r>
+        <w:rPr>
+          <w:rFonts w:ascii="Aptos" w:hAnsi="Aptos"/>
+          <w:b/>
+          <w:bCs/>
+        </w:rPr>
+        <w:t>Computation Time</w:t>
+      </w:r>
+    </w:p>
+    <w:p>
+      <w:pPr>
+        <w:rPr>
+          <w:rFonts w:ascii="Aptos" w:hAnsi="Aptos"/>
+        </w:rPr>
+      </w:pPr>
+      <w:r>
+        <w:rPr>
+          <w:rFonts w:ascii="Aptos" w:hAnsi="Aptos"/>
+        </w:rPr>
+        <w:t>As depicted in figure 3.15 above for small project sizes (&lt;500) BILP/MIP is faster. For larger problems MIP becomes slower due to greater level of branch nodes and GA time scales linearly. MIP time is highly volatile but GA time is prdictable due to linear scaling.</w:t>
+      </w:r>
+    </w:p>
+    <w:p>
+      <w:pPr>
+        <w:rPr>
+          <w:rFonts w:ascii="Aptos" w:hAnsi="Aptos"/>
+        </w:rPr>
+      </w:pPr>
+    </w:p>
+    <w:p>
+      <w:pPr>
+        <w:suppressAutoHyphens/>
+        <w:rPr>
+          <w:rFonts w:ascii="Aptos" w:hAnsi="Aptos"/>
+          <w:b/>
+          <w:bCs/>
+          <w:sz w:val="36"/>
+          <w:szCs w:val="36"/>
+          <w:lang w:val="en-US" w:eastAsia="zh-CN" w:bidi="hi-IN"/>
+        </w:rPr>
+      </w:pPr>
+      <w:r>
+        <w:rPr>
+          <w:rFonts w:ascii="Aptos" w:hAnsi="Aptos"/>
+          <w:lang w:val="en-US" w:eastAsia="zh-CN" w:bidi="hi-IN"/>
+        </w:rPr>
+        <w:br w:type="page"/>
+      </w:r>
+    </w:p>
+    <w:p>
+      <w:pPr>
+        <w:pStyle w:val="Heading1"/>
+        <w:rPr>
+          <w:rFonts w:ascii="Aptos" w:hAnsi="Aptos"/>
+          <w:lang w:val="en-US" w:eastAsia="zh-CN" w:bidi="hi-IN"/>
+        </w:rPr>
+      </w:pPr>
+      <w:r>
+        <w:rPr>
+          <w:rFonts w:ascii="Aptos" w:hAnsi="Aptos"/>
+          <w:lang w:val="en-US" w:eastAsia="zh-CN" w:bidi="hi-IN"/>
+        </w:rPr>
+        <w:lastRenderedPageBreak/>
         <w:t>References</w:t>
       </w:r>
     </w:p>
@@ -21596,14 +23217,7 @@
         <w:rPr>
           <w:rFonts w:ascii="Aptos" w:hAnsi="Aptos"/>
         </w:rPr>
-        <w:t xml:space="preserve">C. Dewi, R. A. Andika, E. Haryani, D. Riantama, A. Sajid, M. M. Alam, and M. M. Su'ud, "Feature selection for financial data classification using Random Forest, Boruta, and </w:t>
-      </w:r>
-      <w:r>
-        <w:rPr>
-          <w:rFonts w:ascii="Aptos" w:hAnsi="Aptos"/>
-        </w:rPr>
-        <w:lastRenderedPageBreak/>
-        <w:t xml:space="preserve">Recursive Feature Elimination," </w:t>
+        <w:t xml:space="preserve">C. Dewi, R. A. Andika, E. Haryani, D. Riantama, A. Sajid, M. M. Alam, and M. M. Su'ud, "Feature selection for financial data classification using Random Forest, Boruta, and Recursive Feature Elimination," </w:t>
       </w:r>
       <w:r>
         <w:rPr>
@@ -21714,6 +23328,79 @@
           <w:rFonts w:ascii="Aptos" w:hAnsi="Aptos"/>
         </w:rPr>
         <w:t>, vol. 109, pp. 1–11, Nov. 2018. doi: 10.1016/j.eswa.2018.05.011.</w:t>
+      </w:r>
+    </w:p>
+    <w:p>
+      <w:pPr>
+        <w:pStyle w:val="BodyText"/>
+        <w:numPr>
+          <w:ilvl w:val="1"/>
+          <w:numId w:val="94"/>
+        </w:numPr>
+        <w:rPr>
+          <w:rFonts w:ascii="Aptos" w:hAnsi="Aptos" w:cs="Angsana New"/>
+        </w:rPr>
+      </w:pPr>
+      <w:r>
+        <w:rPr>
+          <w:rFonts w:ascii="Aptos" w:hAnsi="Aptos" w:cs="Angsana New"/>
+        </w:rPr>
+        <w:t>K.-C. Ying, P. Pourhejazy, and K.-Y. Chen, "Revisiting the evolution of genetic algorithms in scheduling," Applied Soft Computing, vol. 201, Art. no. 115602, Jun. 2026, doi: 10.1016/j.asoc.2026.115602</w:t>
+      </w:r>
+      <w:r>
+        <w:rPr>
+          <w:rFonts w:ascii="Aptos" w:hAnsi="Aptos" w:cs="Angsana New"/>
+        </w:rPr>
+        <w:t>.</w:t>
+      </w:r>
+    </w:p>
+    <w:p>
+      <w:pPr>
+        <w:pStyle w:val="BodyText"/>
+        <w:numPr>
+          <w:ilvl w:val="1"/>
+          <w:numId w:val="94"/>
+        </w:numPr>
+        <w:rPr>
+          <w:rFonts w:ascii="Aptos" w:hAnsi="Aptos" w:cs="Angsana New"/>
+        </w:rPr>
+      </w:pPr>
+      <w:r>
+        <w:rPr>
+          <w:rFonts w:ascii="Aptos" w:hAnsi="Aptos"/>
+        </w:rPr>
+        <w:t xml:space="preserve">M. A. Boschetti, A. N. Letchford, and V. Maniezzo, "Matheuristics: Survey and synthesis," </w:t>
+      </w:r>
+      <w:r>
+        <w:rPr>
+          <w:rStyle w:val="Emphasis"/>
+          <w:rFonts w:ascii="Aptos" w:hAnsi="Aptos"/>
+        </w:rPr>
+        <w:t>International Transactions in Operational Research</w:t>
+      </w:r>
+      <w:r>
+        <w:rPr>
+          <w:rFonts w:ascii="Aptos" w:hAnsi="Aptos"/>
+        </w:rPr>
+        <w:t>, vol. 30, no. 6, pp. 2840–2866, Nov. 2023, doi: 10.1111/itor.13301.</w:t>
+      </w:r>
+    </w:p>
+    <w:p>
+      <w:pPr>
+        <w:pStyle w:val="BodyText"/>
+        <w:numPr>
+          <w:ilvl w:val="1"/>
+          <w:numId w:val="94"/>
+        </w:numPr>
+        <w:rPr>
+          <w:rFonts w:ascii="Aptos" w:hAnsi="Aptos" w:cs="Angsana New"/>
+        </w:rPr>
+      </w:pPr>
+      <w:r>
+        <w:rPr>
+          <w:rFonts w:ascii="Aptos" w:hAnsi="Aptos" w:cs="Angsana New"/>
+        </w:rPr>
+        <w:t>A. Neumann, A. Hajji, M. Rekik, and R. Pellerin, "A didactic review on genetic algorithms for industrial planning and scheduling problems," IFAC-PapersOnLine, vol. 55, no. 10, pp. 2593–2598, 2022, doi: 10.1016/j.ifacol.2022.10.100.</w:t>
       </w:r>
     </w:p>
     <w:sectPr>
@@ -27977,6 +29664,95 @@
     </w:lvl>
   </w:abstractNum>
   <w:abstractNum w:abstractNumId="58" w15:restartNumberingAfterBreak="0">
+    <w:nsid w:val="543F40A5"/>
+    <w:multiLevelType w:val="hybridMultilevel"/>
+    <w:tmpl w:val="7D2EE680"/>
+    <w:lvl w:ilvl="0" w:tplc="FFFFFFFF">
+      <w:start w:val="1"/>
+      <w:numFmt w:val="decimal"/>
+      <w:lvlText w:val="%1."/>
+      <w:lvlJc w:val="left"/>
+      <w:pPr>
+        <w:ind w:left="720" w:hanging="360"/>
+      </w:pPr>
+      <w:rPr>
+        <w:rFonts w:hint="default"/>
+      </w:rPr>
+    </w:lvl>
+    <w:lvl w:ilvl="1" w:tplc="FFFFFFFF" w:tentative="1">
+      <w:start w:val="1"/>
+      <w:numFmt w:val="lowerLetter"/>
+      <w:lvlText w:val="%2."/>
+      <w:lvlJc w:val="left"/>
+      <w:pPr>
+        <w:ind w:left="1440" w:hanging="360"/>
+      </w:pPr>
+    </w:lvl>
+    <w:lvl w:ilvl="2" w:tplc="FFFFFFFF" w:tentative="1">
+      <w:start w:val="1"/>
+      <w:numFmt w:val="lowerRoman"/>
+      <w:lvlText w:val="%3."/>
+      <w:lvlJc w:val="right"/>
+      <w:pPr>
+        <w:ind w:left="2160" w:hanging="180"/>
+      </w:pPr>
+    </w:lvl>
+    <w:lvl w:ilvl="3" w:tplc="FFFFFFFF" w:tentative="1">
+      <w:start w:val="1"/>
+      <w:numFmt w:val="decimal"/>
+      <w:lvlText w:val="%4."/>
+      <w:lvlJc w:val="left"/>
+      <w:pPr>
+        <w:ind w:left="2880" w:hanging="360"/>
+      </w:pPr>
+    </w:lvl>
+    <w:lvl w:ilvl="4" w:tplc="FFFFFFFF" w:tentative="1">
+      <w:start w:val="1"/>
+      <w:numFmt w:val="lowerLetter"/>
+      <w:lvlText w:val="%5."/>
+      <w:lvlJc w:val="left"/>
+      <w:pPr>
+        <w:ind w:left="3600" w:hanging="360"/>
+      </w:pPr>
+    </w:lvl>
+    <w:lvl w:ilvl="5" w:tplc="FFFFFFFF" w:tentative="1">
+      <w:start w:val="1"/>
+      <w:numFmt w:val="lowerRoman"/>
+      <w:lvlText w:val="%6."/>
+      <w:lvlJc w:val="right"/>
+      <w:pPr>
+        <w:ind w:left="4320" w:hanging="180"/>
+      </w:pPr>
+    </w:lvl>
+    <w:lvl w:ilvl="6" w:tplc="FFFFFFFF" w:tentative="1">
+      <w:start w:val="1"/>
+      <w:numFmt w:val="decimal"/>
+      <w:lvlText w:val="%7."/>
+      <w:lvlJc w:val="left"/>
+      <w:pPr>
+        <w:ind w:left="5040" w:hanging="360"/>
+      </w:pPr>
+    </w:lvl>
+    <w:lvl w:ilvl="7" w:tplc="FFFFFFFF" w:tentative="1">
+      <w:start w:val="1"/>
+      <w:numFmt w:val="lowerLetter"/>
+      <w:lvlText w:val="%8."/>
+      <w:lvlJc w:val="left"/>
+      <w:pPr>
+        <w:ind w:left="5760" w:hanging="360"/>
+      </w:pPr>
+    </w:lvl>
+    <w:lvl w:ilvl="8" w:tplc="FFFFFFFF" w:tentative="1">
+      <w:start w:val="1"/>
+      <w:numFmt w:val="lowerRoman"/>
+      <w:lvlText w:val="%9."/>
+      <w:lvlJc w:val="right"/>
+      <w:pPr>
+        <w:ind w:left="6480" w:hanging="180"/>
+      </w:pPr>
+    </w:lvl>
+  </w:abstractNum>
+  <w:abstractNum w:abstractNumId="59" w15:restartNumberingAfterBreak="0">
     <w:nsid w:val="54452864"/>
     <w:multiLevelType w:val="hybridMultilevel"/>
     <w:tmpl w:val="9E78C98E"/>
@@ -28089,7 +29865,7 @@
       </w:rPr>
     </w:lvl>
   </w:abstractNum>
-  <w:abstractNum w:abstractNumId="59" w15:restartNumberingAfterBreak="0">
+  <w:abstractNum w:abstractNumId="60" w15:restartNumberingAfterBreak="0">
     <w:nsid w:val="57ED5547"/>
     <w:multiLevelType w:val="multilevel"/>
     <w:tmpl w:val="B38A48C4"/>
@@ -28229,7 +30005,7 @@
       </w:rPr>
     </w:lvl>
   </w:abstractNum>
-  <w:abstractNum w:abstractNumId="60" w15:restartNumberingAfterBreak="0">
+  <w:abstractNum w:abstractNumId="61" w15:restartNumberingAfterBreak="0">
     <w:nsid w:val="5AC32B88"/>
     <w:multiLevelType w:val="hybridMultilevel"/>
     <w:tmpl w:val="748C87A0"/>
@@ -28315,7 +30091,7 @@
       </w:pPr>
     </w:lvl>
   </w:abstractNum>
-  <w:abstractNum w:abstractNumId="61" w15:restartNumberingAfterBreak="0">
+  <w:abstractNum w:abstractNumId="62" w15:restartNumberingAfterBreak="0">
     <w:nsid w:val="5C3F3720"/>
     <w:multiLevelType w:val="hybridMultilevel"/>
     <w:tmpl w:val="F2D217D0"/>
@@ -28413,7 +30189,7 @@
       </w:pPr>
     </w:lvl>
   </w:abstractNum>
-  <w:abstractNum w:abstractNumId="62" w15:restartNumberingAfterBreak="0">
+  <w:abstractNum w:abstractNumId="63" w15:restartNumberingAfterBreak="0">
     <w:nsid w:val="5FE76B91"/>
     <w:multiLevelType w:val="hybridMultilevel"/>
     <w:tmpl w:val="F5869F58"/>
@@ -28503,7 +30279,7 @@
       </w:pPr>
     </w:lvl>
   </w:abstractNum>
-  <w:abstractNum w:abstractNumId="63" w15:restartNumberingAfterBreak="0">
+  <w:abstractNum w:abstractNumId="64" w15:restartNumberingAfterBreak="0">
     <w:nsid w:val="60E342C7"/>
     <w:multiLevelType w:val="multilevel"/>
     <w:tmpl w:val="3AE6F6DE"/>
@@ -28616,7 +30392,7 @@
       </w:pPr>
     </w:lvl>
   </w:abstractNum>
-  <w:abstractNum w:abstractNumId="64" w15:restartNumberingAfterBreak="0">
+  <w:abstractNum w:abstractNumId="65" w15:restartNumberingAfterBreak="0">
     <w:nsid w:val="616370BE"/>
     <w:multiLevelType w:val="hybridMultilevel"/>
     <w:tmpl w:val="FCBAF152"/>
@@ -28730,7 +30506,7 @@
       </w:rPr>
     </w:lvl>
   </w:abstractNum>
-  <w:abstractNum w:abstractNumId="65" w15:restartNumberingAfterBreak="0">
+  <w:abstractNum w:abstractNumId="66" w15:restartNumberingAfterBreak="0">
     <w:nsid w:val="67C36222"/>
     <w:multiLevelType w:val="hybridMultilevel"/>
     <w:tmpl w:val="FB3CB0AC"/>
@@ -28819,7 +30595,7 @@
       </w:pPr>
     </w:lvl>
   </w:abstractNum>
-  <w:abstractNum w:abstractNumId="66" w15:restartNumberingAfterBreak="0">
+  <w:abstractNum w:abstractNumId="67" w15:restartNumberingAfterBreak="0">
     <w:nsid w:val="68A13AFA"/>
     <w:multiLevelType w:val="multilevel"/>
     <w:tmpl w:val="9D8ED202"/>
@@ -28959,7 +30735,7 @@
       </w:rPr>
     </w:lvl>
   </w:abstractNum>
-  <w:abstractNum w:abstractNumId="67" w15:restartNumberingAfterBreak="0">
+  <w:abstractNum w:abstractNumId="68" w15:restartNumberingAfterBreak="0">
     <w:nsid w:val="6A3306C0"/>
     <w:multiLevelType w:val="hybridMultilevel"/>
     <w:tmpl w:val="2E303AD2"/>
@@ -29073,7 +30849,7 @@
       </w:rPr>
     </w:lvl>
   </w:abstractNum>
-  <w:abstractNum w:abstractNumId="68" w15:restartNumberingAfterBreak="0">
+  <w:abstractNum w:abstractNumId="69" w15:restartNumberingAfterBreak="0">
     <w:nsid w:val="6EA919B6"/>
     <w:multiLevelType w:val="multilevel"/>
     <w:tmpl w:val="FBFC98EE"/>
@@ -29213,7 +30989,7 @@
       </w:rPr>
     </w:lvl>
   </w:abstractNum>
-  <w:abstractNum w:abstractNumId="69" w15:restartNumberingAfterBreak="0">
+  <w:abstractNum w:abstractNumId="70" w15:restartNumberingAfterBreak="0">
     <w:nsid w:val="720E469D"/>
     <w:multiLevelType w:val="hybridMultilevel"/>
     <w:tmpl w:val="8A847CAE"/>
@@ -29302,7 +31078,7 @@
       </w:pPr>
     </w:lvl>
   </w:abstractNum>
-  <w:abstractNum w:abstractNumId="70" w15:restartNumberingAfterBreak="0">
+  <w:abstractNum w:abstractNumId="71" w15:restartNumberingAfterBreak="0">
     <w:nsid w:val="72282641"/>
     <w:multiLevelType w:val="hybridMultilevel"/>
     <w:tmpl w:val="E58816D6"/>
@@ -29416,7 +31192,7 @@
       </w:rPr>
     </w:lvl>
   </w:abstractNum>
-  <w:abstractNum w:abstractNumId="71" w15:restartNumberingAfterBreak="0">
+  <w:abstractNum w:abstractNumId="72" w15:restartNumberingAfterBreak="0">
     <w:nsid w:val="7236607D"/>
     <w:multiLevelType w:val="multilevel"/>
     <w:tmpl w:val="33C21AF4"/>
@@ -29547,7 +31323,7 @@
       </w:rPr>
     </w:lvl>
   </w:abstractNum>
-  <w:abstractNum w:abstractNumId="72" w15:restartNumberingAfterBreak="0">
+  <w:abstractNum w:abstractNumId="73" w15:restartNumberingAfterBreak="0">
     <w:nsid w:val="77751C34"/>
     <w:multiLevelType w:val="hybridMultilevel"/>
     <w:tmpl w:val="93B03718"/>
@@ -29636,7 +31412,7 @@
       </w:pPr>
     </w:lvl>
   </w:abstractNum>
-  <w:abstractNum w:abstractNumId="73" w15:restartNumberingAfterBreak="0">
+  <w:abstractNum w:abstractNumId="74" w15:restartNumberingAfterBreak="0">
     <w:nsid w:val="77A13E6C"/>
     <w:multiLevelType w:val="hybridMultilevel"/>
     <w:tmpl w:val="E24619C8"/>
@@ -29731,7 +31507,7 @@
       </w:pPr>
     </w:lvl>
   </w:abstractNum>
-  <w:abstractNum w:abstractNumId="74" w15:restartNumberingAfterBreak="0">
+  <w:abstractNum w:abstractNumId="75" w15:restartNumberingAfterBreak="0">
     <w:nsid w:val="78A40B1D"/>
     <w:multiLevelType w:val="multilevel"/>
     <w:tmpl w:val="1AC2EB18"/>
@@ -29871,7 +31647,7 @@
       </w:rPr>
     </w:lvl>
   </w:abstractNum>
-  <w:abstractNum w:abstractNumId="75" w15:restartNumberingAfterBreak="0">
+  <w:abstractNum w:abstractNumId="76" w15:restartNumberingAfterBreak="0">
     <w:nsid w:val="79F162FB"/>
     <w:multiLevelType w:val="multilevel"/>
     <w:tmpl w:val="0C321464"/>
@@ -30011,7 +31787,7 @@
       </w:rPr>
     </w:lvl>
   </w:abstractNum>
-  <w:abstractNum w:abstractNumId="76" w15:restartNumberingAfterBreak="0">
+  <w:abstractNum w:abstractNumId="77" w15:restartNumberingAfterBreak="0">
     <w:nsid w:val="7C970EC7"/>
     <w:multiLevelType w:val="hybridMultilevel"/>
     <w:tmpl w:val="7D2EE680"/>
@@ -30100,7 +31876,7 @@
       </w:pPr>
     </w:lvl>
   </w:abstractNum>
-  <w:abstractNum w:abstractNumId="77" w15:restartNumberingAfterBreak="0">
+  <w:abstractNum w:abstractNumId="78" w15:restartNumberingAfterBreak="0">
     <w:nsid w:val="7F3605F0"/>
     <w:multiLevelType w:val="multilevel"/>
     <w:tmpl w:val="0B484776"/>
@@ -30240,7 +32016,7 @@
       </w:rPr>
     </w:lvl>
   </w:abstractNum>
-  <w:abstractNum w:abstractNumId="78" w15:restartNumberingAfterBreak="0">
+  <w:abstractNum w:abstractNumId="79" w15:restartNumberingAfterBreak="0">
     <w:nsid w:val="7FEE14A8"/>
     <w:multiLevelType w:val="hybridMultilevel"/>
     <w:tmpl w:val="64FC9D2C"/>
@@ -30326,7 +32102,7 @@
       </w:pPr>
     </w:lvl>
   </w:abstractNum>
-  <w:abstractNum w:abstractNumId="79" w15:restartNumberingAfterBreak="0">
+  <w:abstractNum w:abstractNumId="80" w15:restartNumberingAfterBreak="0">
     <w:nsid w:val="7FF24A2E"/>
     <w:multiLevelType w:val="hybridMultilevel"/>
     <w:tmpl w:val="AA284BB2"/>
@@ -30417,7 +32193,7 @@
     </w:lvl>
   </w:abstractNum>
   <w:num w:numId="1" w16cid:durableId="462768859">
-    <w:abstractNumId w:val="63"/>
+    <w:abstractNumId w:val="64"/>
   </w:num>
   <w:num w:numId="2" w16cid:durableId="534851259">
     <w:abstractNumId w:val="24"/>
@@ -30429,10 +32205,10 @@
     <w:abstractNumId w:val="56"/>
   </w:num>
   <w:num w:numId="5" w16cid:durableId="1569268375">
-    <w:abstractNumId w:val="77"/>
+    <w:abstractNumId w:val="78"/>
   </w:num>
   <w:num w:numId="6" w16cid:durableId="1342007254">
-    <w:abstractNumId w:val="66"/>
+    <w:abstractNumId w:val="67"/>
   </w:num>
   <w:num w:numId="7" w16cid:durableId="935209781">
     <w:abstractNumId w:val="32"/>
@@ -30441,19 +32217,19 @@
     <w:abstractNumId w:val="35"/>
   </w:num>
   <w:num w:numId="9" w16cid:durableId="1732313751">
-    <w:abstractNumId w:val="59"/>
+    <w:abstractNumId w:val="60"/>
   </w:num>
   <w:num w:numId="10" w16cid:durableId="1929850215">
-    <w:abstractNumId w:val="68"/>
+    <w:abstractNumId w:val="69"/>
   </w:num>
   <w:num w:numId="11" w16cid:durableId="624845372">
     <w:abstractNumId w:val="31"/>
   </w:num>
   <w:num w:numId="12" w16cid:durableId="407583010">
-    <w:abstractNumId w:val="74"/>
+    <w:abstractNumId w:val="75"/>
   </w:num>
   <w:num w:numId="13" w16cid:durableId="750663636">
-    <w:abstractNumId w:val="75"/>
+    <w:abstractNumId w:val="76"/>
   </w:num>
   <w:num w:numId="14" w16cid:durableId="1026060989">
     <w:abstractNumId w:val="20"/>
@@ -30489,7 +32265,7 @@
     </w:lvlOverride>
   </w:num>
   <w:num w:numId="24" w16cid:durableId="883636844">
-    <w:abstractNumId w:val="73"/>
+    <w:abstractNumId w:val="74"/>
     <w:lvlOverride w:ilvl="0">
       <w:startOverride w:val="1"/>
     </w:lvlOverride>
@@ -30501,7 +32277,7 @@
     <w:abstractNumId w:val="45"/>
   </w:num>
   <w:num w:numId="27" w16cid:durableId="1970436380">
-    <w:abstractNumId w:val="62"/>
+    <w:abstractNumId w:val="63"/>
   </w:num>
   <w:num w:numId="28" w16cid:durableId="1109744282">
     <w:abstractNumId w:val="12"/>
@@ -30516,7 +32292,7 @@
     <w:abstractNumId w:val="37"/>
   </w:num>
   <w:num w:numId="32" w16cid:durableId="99614821">
-    <w:abstractNumId w:val="79"/>
+    <w:abstractNumId w:val="80"/>
   </w:num>
   <w:num w:numId="33" w16cid:durableId="1972857697">
     <w:abstractNumId w:val="49"/>
@@ -30531,7 +32307,7 @@
     <w:abstractNumId w:val="52"/>
   </w:num>
   <w:num w:numId="37" w16cid:durableId="1249339732">
-    <w:abstractNumId w:val="63"/>
+    <w:abstractNumId w:val="64"/>
   </w:num>
   <w:num w:numId="38" w16cid:durableId="901332559">
     <w:abstractNumId w:val="18"/>
@@ -30543,25 +32319,25 @@
     <w:abstractNumId w:val="51"/>
   </w:num>
   <w:num w:numId="41" w16cid:durableId="1257639454">
-    <w:abstractNumId w:val="63"/>
+    <w:abstractNumId w:val="64"/>
   </w:num>
   <w:num w:numId="42" w16cid:durableId="196894282">
     <w:abstractNumId w:val="8"/>
   </w:num>
   <w:num w:numId="43" w16cid:durableId="680471570">
-    <w:abstractNumId w:val="76"/>
+    <w:abstractNumId w:val="77"/>
   </w:num>
   <w:num w:numId="44" w16cid:durableId="1315139082">
-    <w:abstractNumId w:val="63"/>
+    <w:abstractNumId w:val="64"/>
   </w:num>
   <w:num w:numId="45" w16cid:durableId="2113940701">
-    <w:abstractNumId w:val="63"/>
+    <w:abstractNumId w:val="64"/>
   </w:num>
   <w:num w:numId="46" w16cid:durableId="1884713029">
-    <w:abstractNumId w:val="65"/>
+    <w:abstractNumId w:val="66"/>
   </w:num>
   <w:num w:numId="47" w16cid:durableId="1079255107">
-    <w:abstractNumId w:val="69"/>
+    <w:abstractNumId w:val="70"/>
   </w:num>
   <w:num w:numId="48" w16cid:durableId="163739946">
     <w:abstractNumId w:val="42"/>
@@ -30570,13 +32346,13 @@
     </w:lvlOverride>
   </w:num>
   <w:num w:numId="49" w16cid:durableId="130177845">
-    <w:abstractNumId w:val="63"/>
+    <w:abstractNumId w:val="64"/>
   </w:num>
   <w:num w:numId="50" w16cid:durableId="1549225530">
-    <w:abstractNumId w:val="63"/>
+    <w:abstractNumId w:val="64"/>
   </w:num>
   <w:num w:numId="51" w16cid:durableId="1543207655">
-    <w:abstractNumId w:val="63"/>
+    <w:abstractNumId w:val="64"/>
   </w:num>
   <w:num w:numId="52" w16cid:durableId="2082754323">
     <w:abstractNumId w:val="30"/>
@@ -30588,10 +32364,10 @@
     </w:lvlOverride>
   </w:num>
   <w:num w:numId="54" w16cid:durableId="1476414865">
-    <w:abstractNumId w:val="63"/>
+    <w:abstractNumId w:val="64"/>
   </w:num>
   <w:num w:numId="55" w16cid:durableId="1747803550">
-    <w:abstractNumId w:val="72"/>
+    <w:abstractNumId w:val="73"/>
   </w:num>
   <w:num w:numId="56" w16cid:durableId="1421872203">
     <w:abstractNumId w:val="28"/>
@@ -30600,10 +32376,10 @@
     </w:lvlOverride>
   </w:num>
   <w:num w:numId="57" w16cid:durableId="1090199479">
-    <w:abstractNumId w:val="67"/>
+    <w:abstractNumId w:val="68"/>
   </w:num>
   <w:num w:numId="58" w16cid:durableId="794324903">
-    <w:abstractNumId w:val="63"/>
+    <w:abstractNumId w:val="64"/>
   </w:num>
   <w:num w:numId="59" w16cid:durableId="1306081610">
     <w:abstractNumId w:val="17"/>
@@ -30618,49 +32394,49 @@
     <w:abstractNumId w:val="11"/>
   </w:num>
   <w:num w:numId="63" w16cid:durableId="1952125431">
-    <w:abstractNumId w:val="63"/>
+    <w:abstractNumId w:val="64"/>
   </w:num>
   <w:num w:numId="64" w16cid:durableId="1966891500">
     <w:abstractNumId w:val="4"/>
   </w:num>
   <w:num w:numId="65" w16cid:durableId="697698884">
-    <w:abstractNumId w:val="63"/>
+    <w:abstractNumId w:val="64"/>
   </w:num>
   <w:num w:numId="66" w16cid:durableId="1168981868">
-    <w:abstractNumId w:val="71"/>
+    <w:abstractNumId w:val="72"/>
   </w:num>
   <w:num w:numId="67" w16cid:durableId="160393705">
-    <w:abstractNumId w:val="63"/>
+    <w:abstractNumId w:val="64"/>
   </w:num>
   <w:num w:numId="68" w16cid:durableId="1831167593">
     <w:abstractNumId w:val="15"/>
   </w:num>
   <w:num w:numId="69" w16cid:durableId="1698121427">
-    <w:abstractNumId w:val="63"/>
+    <w:abstractNumId w:val="64"/>
   </w:num>
   <w:num w:numId="70" w16cid:durableId="1760105121">
-    <w:abstractNumId w:val="58"/>
+    <w:abstractNumId w:val="59"/>
   </w:num>
   <w:num w:numId="71" w16cid:durableId="702751241">
-    <w:abstractNumId w:val="70"/>
+    <w:abstractNumId w:val="71"/>
   </w:num>
   <w:num w:numId="72" w16cid:durableId="408386921">
-    <w:abstractNumId w:val="63"/>
+    <w:abstractNumId w:val="64"/>
   </w:num>
   <w:num w:numId="73" w16cid:durableId="2030330978">
-    <w:abstractNumId w:val="60"/>
+    <w:abstractNumId w:val="61"/>
   </w:num>
   <w:num w:numId="74" w16cid:durableId="100954797">
-    <w:abstractNumId w:val="63"/>
+    <w:abstractNumId w:val="64"/>
   </w:num>
   <w:num w:numId="75" w16cid:durableId="1834107868">
-    <w:abstractNumId w:val="63"/>
+    <w:abstractNumId w:val="64"/>
   </w:num>
   <w:num w:numId="76" w16cid:durableId="1557204703">
     <w:abstractNumId w:val="9"/>
   </w:num>
   <w:num w:numId="77" w16cid:durableId="534007519">
-    <w:abstractNumId w:val="78"/>
+    <w:abstractNumId w:val="79"/>
     <w:lvlOverride w:ilvl="0">
       <w:startOverride w:val="1"/>
     </w:lvlOverride>
@@ -30678,19 +32454,19 @@
     </w:lvlOverride>
   </w:num>
   <w:num w:numId="81" w16cid:durableId="1371109530">
-    <w:abstractNumId w:val="63"/>
+    <w:abstractNumId w:val="64"/>
   </w:num>
   <w:num w:numId="82" w16cid:durableId="56056520">
-    <w:abstractNumId w:val="63"/>
+    <w:abstractNumId w:val="64"/>
   </w:num>
   <w:num w:numId="83" w16cid:durableId="903219920">
-    <w:abstractNumId w:val="63"/>
+    <w:abstractNumId w:val="64"/>
   </w:num>
   <w:num w:numId="84" w16cid:durableId="1131555045">
-    <w:abstractNumId w:val="63"/>
+    <w:abstractNumId w:val="64"/>
   </w:num>
   <w:num w:numId="85" w16cid:durableId="501623252">
-    <w:abstractNumId w:val="64"/>
+    <w:abstractNumId w:val="65"/>
   </w:num>
   <w:num w:numId="86" w16cid:durableId="1804806667">
     <w:abstractNumId w:val="13"/>
@@ -30708,7 +32484,7 @@
     <w:abstractNumId w:val="39"/>
   </w:num>
   <w:num w:numId="91" w16cid:durableId="316420869">
-    <w:abstractNumId w:val="61"/>
+    <w:abstractNumId w:val="62"/>
   </w:num>
   <w:num w:numId="92" w16cid:durableId="1106775173">
     <w:abstractNumId w:val="41"/>
@@ -30739,6 +32515,9 @@
   </w:num>
   <w:num w:numId="101" w16cid:durableId="806822130">
     <w:abstractNumId w:val="26"/>
+  </w:num>
+  <w:num w:numId="102" w16cid:durableId="1221549851">
+    <w:abstractNumId w:val="58"/>
   </w:num>
 </w:numbering>
 </file>
@@ -31840,6 +33619,17 @@
     <w:basedOn w:val="DefaultParagraphFont"/>
     <w:rsid w:val="00B025F5"/>
   </w:style>
+  <w:style w:type="character" w:styleId="Emphasis">
+    <w:name w:val="Emphasis"/>
+    <w:basedOn w:val="DefaultParagraphFont"/>
+    <w:uiPriority w:val="20"/>
+    <w:qFormat/>
+    <w:rsid w:val="001C17F3"/>
+    <w:rPr>
+      <w:i/>
+      <w:iCs/>
+    </w:rPr>
+  </w:style>
 </w:styles>
 </file>
 

</xml_diff>

<commit_message>
seed for consistency and doc/notebook update
</commit_message>
<xml_diff>
--- a/CW_Doc.docx
+++ b/CW_Doc.docx
@@ -16053,39 +16053,7 @@
           <w:b/>
           <w:bCs/>
         </w:rPr>
-        <w:t>Revisiting the Evolution of Genetic Algorithms in Scheduling</w:t>
-      </w:r>
-      <w:r>
-        <w:rPr>
-          <w:rFonts w:ascii="Aptos" w:hAnsi="Aptos" w:cs="Angsana New"/>
-          <w:b/>
-          <w:bCs/>
-        </w:rPr>
-        <w:t xml:space="preserve"> </w:t>
-      </w:r>
-      <w:r>
-        <w:rPr>
-          <w:rFonts w:ascii="Aptos" w:hAnsi="Aptos" w:cs="Angsana New"/>
-          <w:b/>
-          <w:bCs/>
-        </w:rPr>
-        <w:t>[</w:t>
-      </w:r>
-      <w:r>
-        <w:rPr>
-          <w:rFonts w:ascii="Aptos" w:hAnsi="Aptos" w:cs="Angsana New"/>
-          <w:b/>
-          <w:bCs/>
-        </w:rPr>
-        <w:t>9</w:t>
-      </w:r>
-      <w:r>
-        <w:rPr>
-          <w:rFonts w:ascii="Aptos" w:hAnsi="Aptos" w:cs="Angsana New"/>
-          <w:b/>
-          <w:bCs/>
-        </w:rPr>
-        <w:t>]</w:t>
+        <w:t>Revisiting the Evolution of Genetic Algorithms in Scheduling [9]</w:t>
       </w:r>
     </w:p>
     <w:p>
@@ -16145,19 +16113,7 @@
         <w:rPr>
           <w:rFonts w:ascii="Aptos" w:hAnsi="Aptos"/>
         </w:rPr>
-        <w:t xml:space="preserve">Conducted a review of nearly 1500 publications on Genetic Algorithms in scheduling. The study showed that GA remains one of the most widely </w:t>
-      </w:r>
-      <w:r>
-        <w:rPr>
-          <w:rFonts w:ascii="Aptos" w:hAnsi="Aptos"/>
-        </w:rPr>
-        <w:t>used</w:t>
-      </w:r>
-      <w:r>
-        <w:rPr>
-          <w:rFonts w:ascii="Aptos" w:hAnsi="Aptos"/>
-        </w:rPr>
-        <w:t xml:space="preserve"> optimization techniques due to its flexibility and effectiveness.</w:t>
+        <w:t>Conducted a review of nearly 1500 publications on Genetic Algorithms in scheduling. The study showed that GA remains one of the most widely used optimization techniques due to its flexibility and effectiveness.</w:t>
       </w:r>
     </w:p>
     <w:p>
@@ -16179,39 +16135,7 @@
           <w:b/>
           <w:bCs/>
         </w:rPr>
-        <w:t>Matheuristics: Survey and Synthesis</w:t>
-      </w:r>
-      <w:r>
-        <w:rPr>
-          <w:rFonts w:ascii="Aptos" w:hAnsi="Aptos" w:cs="Angsana New"/>
-          <w:b/>
-          <w:bCs/>
-        </w:rPr>
-        <w:t xml:space="preserve"> </w:t>
-      </w:r>
-      <w:r>
-        <w:rPr>
-          <w:rFonts w:ascii="Aptos" w:hAnsi="Aptos" w:cs="Angsana New"/>
-          <w:b/>
-          <w:bCs/>
-        </w:rPr>
-        <w:t>[</w:t>
-      </w:r>
-      <w:r>
-        <w:rPr>
-          <w:rFonts w:ascii="Aptos" w:hAnsi="Aptos" w:cs="Angsana New"/>
-          <w:b/>
-          <w:bCs/>
-        </w:rPr>
-        <w:t>10</w:t>
-      </w:r>
-      <w:r>
-        <w:rPr>
-          <w:rFonts w:ascii="Aptos" w:hAnsi="Aptos" w:cs="Angsana New"/>
-          <w:b/>
-          <w:bCs/>
-        </w:rPr>
-        <w:t>]</w:t>
+        <w:t>Matheuristics: Survey and Synthesis [10]</w:t>
       </w:r>
     </w:p>
     <w:p>
@@ -16271,55 +16195,13 @@
         <w:rPr>
           <w:rFonts w:ascii="Aptos" w:hAnsi="Aptos"/>
         </w:rPr>
-        <w:t xml:space="preserve">Heuristic search and metaheuristics are optimization approaches and </w:t>
-      </w:r>
-      <w:r>
-        <w:rPr>
-          <w:rFonts w:ascii="Aptos" w:hAnsi="Aptos"/>
-        </w:rPr>
-        <w:t xml:space="preserve">here they conducted a study of using </w:t>
-      </w:r>
-      <w:r>
-        <w:rPr>
-          <w:rFonts w:ascii="Aptos" w:hAnsi="Aptos"/>
-        </w:rPr>
-        <w:t xml:space="preserve">Mixed Integer Programming (MIP) with </w:t>
-      </w:r>
-      <w:r>
-        <w:rPr>
-          <w:rFonts w:ascii="Aptos" w:hAnsi="Aptos"/>
-        </w:rPr>
-        <w:t xml:space="preserve">hose techniques. </w:t>
-      </w:r>
-      <w:r>
-        <w:rPr>
-          <w:rFonts w:ascii="Aptos" w:hAnsi="Aptos"/>
-        </w:rPr>
-        <w:t xml:space="preserve">They found that </w:t>
-      </w:r>
-      <w:r>
-        <w:rPr>
-          <w:rFonts w:ascii="Aptos" w:hAnsi="Aptos"/>
-        </w:rPr>
-        <w:t xml:space="preserve">mathematical optimization with heuristic search </w:t>
-      </w:r>
-      <w:r>
-        <w:rPr>
-          <w:rFonts w:ascii="Aptos" w:hAnsi="Aptos"/>
-        </w:rPr>
-        <w:t xml:space="preserve">increase </w:t>
-      </w:r>
-      <w:r>
-        <w:rPr>
-          <w:rFonts w:ascii="Aptos" w:hAnsi="Aptos"/>
-        </w:rPr>
-        <w:t>computational efficiency</w:t>
-      </w:r>
-      <w:r>
-        <w:rPr>
-          <w:rFonts w:ascii="Aptos" w:hAnsi="Aptos"/>
-        </w:rPr>
-        <w:t xml:space="preserve"> of the solution.</w:t>
+        <w:t xml:space="preserve">Heuristic search and metaheuristics are optimization approaches and here they conducted a study of using Mixed Integer Programming (MIP) with hose techniques. </w:t>
+      </w:r>
+      <w:r>
+        <w:rPr>
+          <w:rFonts w:ascii="Aptos" w:hAnsi="Aptos"/>
+        </w:rPr>
+        <w:t>They found that mathematical optimization with heuristic search increase computational efficiency of the solution.</w:t>
       </w:r>
     </w:p>
     <w:p>
@@ -19630,13 +19512,12 @@
       <w:r>
         <w:rPr>
           <w:rFonts w:ascii="Aptos" w:hAnsi="Aptos"/>
-          <w:noProof/>
         </w:rPr>
         <w:drawing>
-          <wp:inline distT="0" distB="0" distL="0" distR="0" wp14:anchorId="50BC9679" wp14:editId="5FBCF0EE">
+          <wp:inline distT="0" distB="0" distL="0" distR="0" wp14:anchorId="6F0EDBE2" wp14:editId="14A0CE25">
             <wp:extent cx="6120130" cy="3060065"/>
             <wp:effectExtent l="0" t="0" r="1270" b="635"/>
-            <wp:docPr id="1381259960" name="Picture 1" descr="A graph with green line&#10;&#10;AI-generated content may be incorrect."/>
+            <wp:docPr id="1449787575" name="Picture 1" descr="A graph with a green line&#10;&#10;AI-generated content may be incorrect."/>
             <wp:cNvGraphicFramePr>
               <a:graphicFrameLocks xmlns:a="http://schemas.openxmlformats.org/drawingml/2006/main" noChangeAspect="1"/>
             </wp:cNvGraphicFramePr>
@@ -19644,7 +19525,7 @@
               <a:graphicData uri="http://schemas.openxmlformats.org/drawingml/2006/picture">
                 <pic:pic xmlns:pic="http://schemas.openxmlformats.org/drawingml/2006/picture">
                   <pic:nvPicPr>
-                    <pic:cNvPr id="1381259960" name="Picture 1" descr="A graph with green line&#10;&#10;AI-generated content may be incorrect."/>
+                    <pic:cNvPr id="1449787575" name="Picture 1" descr="A graph with a green line&#10;&#10;AI-generated content may be incorrect."/>
                     <pic:cNvPicPr/>
                   </pic:nvPicPr>
                   <pic:blipFill>
@@ -19949,7 +19830,16 @@
             <w:szCs w:val="24"/>
             <w:lang w:val="en-US" w:eastAsia="zh-CN" w:bidi="hi-IN"/>
           </w:rPr>
-          <m:t>∈{50, 100, 150, 200}</m:t>
+          <m:t>∈{</m:t>
+        </m:r>
+        <m:r>
+          <w:rPr>
+            <w:rFonts w:ascii="Cambria Math" w:hAnsi="Cambria Math"/>
+            <w:sz w:val="24"/>
+            <w:szCs w:val="24"/>
+            <w:lang w:val="en-US" w:eastAsia="zh-CN" w:bidi="hi-IN"/>
+          </w:rPr>
+          <m:t>50, 100, 150, 200}</m:t>
         </m:r>
       </m:oMath>
     </w:p>
@@ -20067,7 +19957,7 @@
           <w:bCs/>
           <w:lang w:val="en-US" w:eastAsia="zh-CN" w:bidi="hi-IN"/>
         </w:rPr>
-        <w:t>200</w:t>
+        <w:t>50</w:t>
       </w:r>
       <w:r>
         <w:rPr>
@@ -20086,7 +19976,7 @@
           <w:bCs/>
           <w:lang w:val="en-US" w:eastAsia="zh-CN" w:bidi="hi-IN"/>
         </w:rPr>
-        <w:t>200</w:t>
+        <w:t>100</w:t>
       </w:r>
       <w:r>
         <w:rPr>
@@ -20122,7 +20012,25 @@
           <w:bCs/>
           <w:lang w:val="en-US" w:eastAsia="zh-CN" w:bidi="hi-IN"/>
         </w:rPr>
-        <w:t>2507K</w:t>
+        <w:t>2</w:t>
+      </w:r>
+      <w:r>
+        <w:rPr>
+          <w:rFonts w:ascii="Aptos" w:hAnsi="Aptos"/>
+          <w:b/>
+          <w:bCs/>
+          <w:lang w:val="en-US" w:eastAsia="zh-CN" w:bidi="hi-IN"/>
+        </w:rPr>
+        <w:t>497</w:t>
+      </w:r>
+      <w:r>
+        <w:rPr>
+          <w:rFonts w:ascii="Aptos" w:hAnsi="Aptos"/>
+          <w:b/>
+          <w:bCs/>
+          <w:lang w:val="en-US" w:eastAsia="zh-CN" w:bidi="hi-IN"/>
+        </w:rPr>
+        <w:t>K</w:t>
       </w:r>
     </w:p>
     <w:tbl>
@@ -20810,7 +20718,14 @@
                 <w:rFonts w:ascii="Aptos" w:hAnsi="Aptos"/>
                 <w:lang w:val="en-US" w:eastAsia="zh-CN" w:bidi="hi-IN"/>
               </w:rPr>
-              <w:t>2507.2</w:t>
+              <w:t>2497</w:t>
+            </w:r>
+            <w:r>
+              <w:rPr>
+                <w:rFonts w:ascii="Aptos" w:hAnsi="Aptos"/>
+                <w:lang w:val="en-US" w:eastAsia="zh-CN" w:bidi="hi-IN"/>
+              </w:rPr>
+              <w:t>.2</w:t>
             </w:r>
           </w:p>
         </w:tc>
@@ -20861,14 +20776,14 @@
                 <w:rFonts w:ascii="Aptos" w:hAnsi="Aptos"/>
                 <w:lang w:val="en-US" w:eastAsia="zh-CN" w:bidi="hi-IN"/>
               </w:rPr>
-              <w:t>1098</w:t>
+              <w:t>1108</w:t>
             </w:r>
             <w:r>
               <w:rPr>
                 <w:rFonts w:ascii="Aptos" w:hAnsi="Aptos"/>
                 <w:lang w:val="en-US" w:eastAsia="zh-CN" w:bidi="hi-IN"/>
               </w:rPr>
-              <w:t>K from Budget $1113.2K</w:t>
+              <w:t xml:space="preserve"> from Budget $1113.2K</w:t>
             </w:r>
           </w:p>
         </w:tc>
@@ -20919,7 +20834,14 @@
                 <w:rFonts w:ascii="Aptos" w:hAnsi="Aptos"/>
                 <w:lang w:val="en-US" w:eastAsia="zh-CN" w:bidi="hi-IN"/>
               </w:rPr>
-              <w:t>1263</w:t>
+              <w:t>12</w:t>
+            </w:r>
+            <w:r>
+              <w:rPr>
+                <w:rFonts w:ascii="Aptos" w:hAnsi="Aptos"/>
+                <w:lang w:val="en-US" w:eastAsia="zh-CN" w:bidi="hi-IN"/>
+              </w:rPr>
+              <w:t>75</w:t>
             </w:r>
             <w:r>
               <w:rPr>
@@ -21021,7 +20943,7 @@
           <w:rFonts w:ascii="Aptos" w:hAnsi="Aptos"/>
           <w:lang w:val="en-US" w:eastAsia="zh-CN" w:bidi="hi-IN"/>
         </w:rPr>
-        <w:t>16</w:t>
+        <w:t>15 projects</w:t>
       </w:r>
       <w:r>
         <w:rPr>
@@ -21045,15 +20967,14 @@
       <w:r>
         <w:rPr>
           <w:rFonts w:ascii="Aptos" w:hAnsi="Aptos"/>
-          <w:noProof/>
           <w:lang w:val="en-US" w:eastAsia="zh-CN" w:bidi="hi-IN"/>
         </w:rPr>
         <w:lastRenderedPageBreak/>
         <w:drawing>
-          <wp:inline distT="0" distB="0" distL="0" distR="0" wp14:anchorId="10D57949" wp14:editId="522F47DC">
+          <wp:inline distT="0" distB="0" distL="0" distR="0" wp14:anchorId="5332FF07" wp14:editId="04581C80">
             <wp:extent cx="6120130" cy="3060065"/>
             <wp:effectExtent l="0" t="0" r="1270" b="635"/>
-            <wp:docPr id="2044403791" name="Picture 1" descr="A graph of green and red bars&#10;&#10;AI-generated content may be incorrect."/>
+            <wp:docPr id="706617532" name="Picture 1" descr="A graph of green and red bars&#10;&#10;AI-generated content may be incorrect."/>
             <wp:cNvGraphicFramePr>
               <a:graphicFrameLocks xmlns:a="http://schemas.openxmlformats.org/drawingml/2006/main" noChangeAspect="1"/>
             </wp:cNvGraphicFramePr>
@@ -21061,7 +20982,7 @@
               <a:graphicData uri="http://schemas.openxmlformats.org/drawingml/2006/picture">
                 <pic:pic xmlns:pic="http://schemas.openxmlformats.org/drawingml/2006/picture">
                   <pic:nvPicPr>
-                    <pic:cNvPr id="2044403791" name="Picture 1" descr="A graph of green and red bars&#10;&#10;AI-generated content may be incorrect."/>
+                    <pic:cNvPr id="706617532" name="Picture 1" descr="A graph of green and red bars&#10;&#10;AI-generated content may be incorrect."/>
                     <pic:cNvPicPr/>
                   </pic:nvPicPr>
                   <pic:blipFill>
@@ -22812,7 +22733,7 @@
               <w:rPr>
                 <w:rFonts w:ascii="Aptos" w:hAnsi="Aptos"/>
               </w:rPr>
-              <w:t>2507</w:t>
+              <w:t>2497</w:t>
             </w:r>
           </w:p>
         </w:tc>
@@ -22830,7 +22751,7 @@
               <w:rPr>
                 <w:rFonts w:ascii="Aptos" w:hAnsi="Aptos"/>
               </w:rPr>
-              <w:t>1098</w:t>
+              <w:t>1113</w:t>
             </w:r>
           </w:p>
         </w:tc>
@@ -22848,7 +22769,7 @@
               <w:rPr>
                 <w:rFonts w:ascii="Aptos" w:hAnsi="Aptos"/>
               </w:rPr>
-              <w:t>1263</w:t>
+              <w:t>1275</w:t>
             </w:r>
           </w:p>
         </w:tc>
@@ -22982,7 +22903,19 @@
         <w:rPr>
           <w:rFonts w:ascii="Aptos" w:hAnsi="Aptos"/>
         </w:rPr>
-        <w:t xml:space="preserve">MIP algorithm gurantees the absolute optimum but GA finds a near optimual solution. But profit is 99.8%. </w:t>
+        <w:t>MIP algorithm gurantees the absolute optimum but GA finds a near optimual solution. But profit is 99.</w:t>
+      </w:r>
+      <w:r>
+        <w:rPr>
+          <w:rFonts w:ascii="Aptos" w:hAnsi="Aptos"/>
+        </w:rPr>
+        <w:t>4</w:t>
+      </w:r>
+      <w:r>
+        <w:rPr>
+          <w:rFonts w:ascii="Aptos" w:hAnsi="Aptos"/>
+        </w:rPr>
+        <w:t xml:space="preserve">%. </w:t>
       </w:r>
     </w:p>
     <w:p>
@@ -23345,13 +23278,7 @@
         <w:rPr>
           <w:rFonts w:ascii="Aptos" w:hAnsi="Aptos" w:cs="Angsana New"/>
         </w:rPr>
-        <w:t>K.-C. Ying, P. Pourhejazy, and K.-Y. Chen, "Revisiting the evolution of genetic algorithms in scheduling," Applied Soft Computing, vol. 201, Art. no. 115602, Jun. 2026, doi: 10.1016/j.asoc.2026.115602</w:t>
-      </w:r>
-      <w:r>
-        <w:rPr>
-          <w:rFonts w:ascii="Aptos" w:hAnsi="Aptos" w:cs="Angsana New"/>
-        </w:rPr>
-        <w:t>.</w:t>
+        <w:t>K.-C. Ying, P. Pourhejazy, and K.-Y. Chen, "Revisiting the evolution of genetic algorithms in scheduling," Applied Soft Computing, vol. 201, Art. no. 115602, Jun. 2026, doi: 10.1016/j.asoc.2026.115602.</w:t>
       </w:r>
     </w:p>
     <w:p>

</xml_diff>